<commit_message>
Allow any region pair, selected in the UI, for DR/HA
Primary and secondary regions are chosen per project in the wizard (default
us-east-1 / us-east-2); admins manage enabled regions in the UI. Adds per-pair
service availability and replication checks, us-east-1 placement for
CloudFront certificates and WAF, region onboarding, and changing regions
after creation. Regenerated Word document and overview diagram.
</commit_message>
<xml_diff>
--- a/docs/CloudInfraAutomation-Architecture.docx
+++ b/docs/CloudInfraAutomation-Architecture.docx
@@ -67,7 +67,7 @@
         <w:t xml:space="preserve"> </w:t>
       </w:r>
       <w:r>
-        <w:t xml:space="preserve">Draft v2.10 for review. No code is written until this design is approved.</w:t>
+        <w:t xml:space="preserve">Draft v2.11 for review. No code is written until this design is approved.</w:t>
       </w:r>
     </w:p>
     <w:p>
@@ -203,7 +203,23 @@
         <w:t xml:space="preserve">DR-capable</w:t>
       </w:r>
       <w:r>
-        <w:t xml:space="preserve">: it can run in one region, as DR (us-east-1 active, us-east-2 standby) or as an HA pair (both active) (§10).</w:t>
+        <w:t xml:space="preserve">: it can run in one region, as DR (primary active, secondary standby) or as an HA pair (both active), with</w:t>
+      </w:r>
+      <w:r>
+        <w:t xml:space="preserve"> </w:t>
+      </w:r>
+      <w:r>
+        <w:rPr>
+          <w:b/>
+          <w:bCs/>
+        </w:rPr>
+        <w:t xml:space="preserve">any region pair chosen in the UI</w:t>
+      </w:r>
+      <w:r>
+        <w:t xml:space="preserve"> </w:t>
+      </w:r>
+      <w:r>
+        <w:t xml:space="preserve">(default us-east-1 / us-east-2) (§10).</w:t>
       </w:r>
     </w:p>
     <w:p>
@@ -607,6 +623,34 @@
             </w:pPr>
             <w:r>
               <w:t xml:space="preserve">runtime isolation by tags (§4.10). Every component can only talk to resources with the same project and environment tag values, enforced by four layers generated into the template: the runtime role’s policy, the permissions boundary, a same-tag resource policy on the target, and an SCP.</w:t>
+            </w:r>
+          </w:p>
+        </w:tc>
+      </w:tr>
+      <w:tr>
+        <w:tc>
+          <w:tcPr>
+            <w:tcW w:type="dxa" w:w="950"/>
+          </w:tcPr>
+          <w:p>
+            <w:pPr>
+              <w:pStyle w:val="Compact"/>
+            </w:pPr>
+            <w:r>
+              <w:t xml:space="preserve">v2.11</w:t>
+            </w:r>
+          </w:p>
+        </w:tc>
+        <w:tc>
+          <w:tcPr>
+            <w:tcW w:type="dxa" w:w="9130"/>
+          </w:tcPr>
+          <w:p>
+            <w:pPr>
+              <w:pStyle w:val="Compact"/>
+            </w:pPr>
+            <w:r>
+              <w:t xml:space="preserve">any region pair is allowed. Users pick the primary and secondary regions in the UI (pre-filled with us-east-1 / us-east-2). Admins manage enabled regions in the UI. Adds per-pair availability and replication checks, us-east-1 placement for CloudFront certificates/WAF, and region changes after creation (§10.9).</w:t>
             </w:r>
           </w:p>
         </w:tc>
@@ -5086,7 +5130,50 @@
               <w:t xml:space="preserve"> </w:t>
             </w:r>
             <w:r>
-              <w:t xml:space="preserve">∈ single/dr/ha, allowed by the environment’s policy; regions from the allowed pairs (default us-east-1 / us-east-2); in HA every data store must support active/active (§10.3)</w:t>
+              <w:t xml:space="preserve">∈ single/dr/ha, allowed by the environment’s policy;</w:t>
+            </w:r>
+            <w:r>
+              <w:t xml:space="preserve"> </w:t>
+            </w:r>
+            <w:r>
+              <w:rPr>
+                <w:rStyle w:val="VerbatimChar"/>
+              </w:rPr>
+              <w:t xml:space="preserve">primaryRegion</w:t>
+            </w:r>
+            <w:r>
+              <w:t xml:space="preserve"> </w:t>
+            </w:r>
+            <w:r>
+              <w:t xml:space="preserve">/</w:t>
+            </w:r>
+            <w:r>
+              <w:t xml:space="preserve"> </w:t>
+            </w:r>
+            <w:r>
+              <w:rPr>
+                <w:rStyle w:val="VerbatimChar"/>
+              </w:rPr>
+              <w:t xml:space="preserve">secondaryRegion</w:t>
+            </w:r>
+            <w:r>
+              <w:t xml:space="preserve">:</w:t>
+            </w:r>
+            <w:r>
+              <w:t xml:space="preserve"> </w:t>
+            </w:r>
+            <w:r>
+              <w:rPr>
+                <w:b/>
+                <w:bCs/>
+              </w:rPr>
+              <w:t xml:space="preserve">any two different regions</w:t>
+            </w:r>
+            <w:r>
+              <w:t xml:space="preserve"> </w:t>
+            </w:r>
+            <w:r>
+              <w:t xml:space="preserve">from the platform’s region list, chosen in the UI (pre-filled with us-east-1 / us-east-2); every selected service must be available in both regions; in HA every data store must support active/active (§10.3, §10.9)</w:t>
             </w:r>
           </w:p>
         </w:tc>
@@ -6560,6 +6647,60 @@
       <w:pPr>
         <w:pStyle w:val="Compact"/>
         <w:numPr>
+          <w:ilvl w:val="1"/>
+          <w:numId w:val="1005"/>
+        </w:numPr>
+      </w:pPr>
+      <w:r>
+        <w:rPr>
+          <w:b/>
+          <w:bCs/>
+        </w:rPr>
+        <w:t xml:space="preserve">Resilience:</w:t>
+      </w:r>
+      <w:r>
+        <w:t xml:space="preserve"> </w:t>
+      </w:r>
+      <w:r>
+        <w:t xml:space="preserve">single region / DR / HA pair; then</w:t>
+      </w:r>
+      <w:r>
+        <w:t xml:space="preserve"> </w:t>
+      </w:r>
+      <w:r>
+        <w:rPr>
+          <w:b/>
+          <w:bCs/>
+        </w:rPr>
+        <w:t xml:space="preserve">Primary region</w:t>
+      </w:r>
+      <w:r>
+        <w:t xml:space="preserve"> </w:t>
+      </w:r>
+      <w:r>
+        <w:t xml:space="preserve">and</w:t>
+      </w:r>
+      <w:r>
+        <w:t xml:space="preserve"> </w:t>
+      </w:r>
+      <w:r>
+        <w:rPr>
+          <w:b/>
+          <w:bCs/>
+        </w:rPr>
+        <w:t xml:space="preserve">Secondary region</w:t>
+      </w:r>
+      <w:r>
+        <w:t xml:space="preserve"> </w:t>
+      </w:r>
+      <w:r>
+        <w:t xml:space="preserve">dropdowns listing every region the platform has enabled, pre-filled with us-east-1 / us-east-2 (§10.9).</w:t>
+      </w:r>
+    </w:p>
+    <w:p>
+      <w:pPr>
+        <w:pStyle w:val="Compact"/>
+        <w:numPr>
           <w:ilvl w:val="0"/>
           <w:numId w:val="1004"/>
         </w:numPr>
@@ -9786,7 +9927,20 @@
               <w:pStyle w:val="Compact"/>
             </w:pPr>
             <w:r>
-              <w:t xml:space="preserve">Only approved regions.</w:t>
+              <w:t xml:space="preserve">Only regions enabled in the platform’s region list (§10.9).</w:t>
+            </w:r>
+            <w:r>
+              <w:t xml:space="preserve"> </w:t>
+            </w:r>
+            <w:r>
+              <w:rPr>
+                <w:b/>
+                <w:bCs/>
+              </w:rPr>
+              <w:t xml:space="preserve">Generated from that list</w:t>
+            </w:r>
+            <w:r>
+              <w:t xml:space="preserve">, so enabling a region in the admin screen updates the SCP (after approval).</w:t>
             </w:r>
           </w:p>
         </w:tc>
@@ -13619,7 +13773,23 @@
               <w:pStyle w:val="Compact"/>
             </w:pPr>
             <w:r>
-              <w:t xml:space="preserve">Artifact bucket per region; its bucket policy lets org accounts’ execution roles read</w:t>
+              <w:t xml:space="preserve">Artifact bucket per</w:t>
+            </w:r>
+            <w:r>
+              <w:t xml:space="preserve"> </w:t>
+            </w:r>
+            <w:r>
+              <w:rPr>
+                <w:b/>
+                <w:bCs/>
+              </w:rPr>
+              <w:t xml:space="preserve">enabled</w:t>
+            </w:r>
+            <w:r>
+              <w:t xml:space="preserve"> </w:t>
+            </w:r>
+            <w:r>
+              <w:t xml:space="preserve">region (created when an admin enables a region, §10.9); its bucket policy lets org accounts’ execution roles read</w:t>
             </w:r>
             <w:r>
               <w:t xml:space="preserve"> </w:t>
@@ -36139,13 +36309,7 @@
           <w:b/>
           <w:bCs/>
         </w:rPr>
-        <w:t xml:space="preserve">Default regions:</w:t>
-      </w:r>
-      <w:r>
-        <w:t xml:space="preserve"> </w:t>
-      </w:r>
-      <w:r>
-        <w:t xml:space="preserve">primary</w:t>
+        <w:t xml:space="preserve">Regions are chosen in the UI.</w:t>
       </w:r>
       <w:r>
         <w:t xml:space="preserve"> </w:t>
@@ -36155,10 +36319,13 @@
           <w:b/>
           <w:bCs/>
         </w:rPr>
-        <w:t xml:space="preserve">us-east-1</w:t>
-      </w:r>
-      <w:r>
-        <w:t xml:space="preserve">, secondary</w:t>
+        <w:t xml:space="preserve">Any pair of two different regions is allowed.</w:t>
+      </w:r>
+      <w:r>
+        <w:t xml:space="preserve"> </w:t>
+      </w:r>
+      <w:r>
+        <w:t xml:space="preserve">The user picks the primary and secondary region from dropdowns in the project wizard; the selection becomes the project’s DR/HA pair. The dropdowns are</w:t>
       </w:r>
       <w:r>
         <w:t xml:space="preserve"> </w:t>
@@ -36168,10 +36335,10 @@
           <w:b/>
           <w:bCs/>
         </w:rPr>
-        <w:t xml:space="preserve">us-east-2</w:t>
-      </w:r>
-      <w:r>
-        <w:t xml:space="preserve">. Platform admins can change the defaults and the allowed region pairs in the environment configuration (§5.5); the region allow-list SCP (§4.7) must include both regions.</w:t>
+        <w:t xml:space="preserve">pre-filled with us-east-1 (primary) / us-east-2 (secondary)</w:t>
+      </w:r>
+      <w:r>
+        <w:t xml:space="preserve">. Admins manage the list of enabled regions and the default pair in the UI (§10.9).</w:t>
       </w:r>
     </w:p>
     <w:p>
@@ -36952,10 +37119,10 @@
         <w:tblLook w:firstRow="1" w:lastRow="0" w:firstColumn="0" w:lastColumn="0" w:noHBand="0" w:noVBand="0" w:val="0020"/>
       </w:tblPr>
       <w:tblGrid>
-        <w:gridCol w:w="1315"/>
-        <w:gridCol w:w="3482"/>
-        <w:gridCol w:w="2963"/>
-        <w:gridCol w:w="2320"/>
+        <w:gridCol w:w="1289"/>
+        <w:gridCol w:w="3615"/>
+        <w:gridCol w:w="2903"/>
+        <w:gridCol w:w="2273"/>
       </w:tblGrid>
       <w:tr>
         <w:trPr>
@@ -36963,7 +37130,7 @@
         </w:trPr>
         <w:tc>
           <w:tcPr>
-            <w:tcW w:type="dxa" w:w="1315"/>
+            <w:tcW w:type="dxa" w:w="1289"/>
           </w:tcPr>
           <w:p>
             <w:pPr>
@@ -36976,7 +37143,7 @@
         </w:tc>
         <w:tc>
           <w:tcPr>
-            <w:tcW w:type="dxa" w:w="3482"/>
+            <w:tcW w:type="dxa" w:w="3615"/>
           </w:tcPr>
           <w:p>
             <w:pPr>
@@ -36989,7 +37156,7 @@
         </w:tc>
         <w:tc>
           <w:tcPr>
-            <w:tcW w:type="dxa" w:w="2963"/>
+            <w:tcW w:type="dxa" w:w="2903"/>
           </w:tcPr>
           <w:p>
             <w:pPr>
@@ -37002,7 +37169,7 @@
         </w:tc>
         <w:tc>
           <w:tcPr>
-            <w:tcW w:type="dxa" w:w="2320"/>
+            <w:tcW w:type="dxa" w:w="2273"/>
           </w:tcPr>
           <w:p>
             <w:pPr>
@@ -37017,7 +37184,7 @@
       <w:tr>
         <w:tc>
           <w:tcPr>
-            <w:tcW w:type="dxa" w:w="1315"/>
+            <w:tcW w:type="dxa" w:w="1289"/>
           </w:tcPr>
           <w:p>
             <w:pPr>
@@ -37034,7 +37201,7 @@
         </w:tc>
         <w:tc>
           <w:tcPr>
-            <w:tcW w:type="dxa" w:w="3482"/>
+            <w:tcW w:type="dxa" w:w="3615"/>
           </w:tcPr>
           <w:p>
             <w:pPr>
@@ -37059,7 +37226,7 @@
         </w:tc>
         <w:tc>
           <w:tcPr>
-            <w:tcW w:type="dxa" w:w="2963"/>
+            <w:tcW w:type="dxa" w:w="2903"/>
           </w:tcPr>
           <w:p>
             <w:pPr>
@@ -37072,7 +37239,7 @@
         </w:tc>
         <w:tc>
           <w:tcPr>
-            <w:tcW w:type="dxa" w:w="2320"/>
+            <w:tcW w:type="dxa" w:w="2273"/>
           </w:tcPr>
           <w:p>
             <w:pPr>
@@ -37087,7 +37254,7 @@
       <w:tr>
         <w:tc>
           <w:tcPr>
-            <w:tcW w:type="dxa" w:w="1315"/>
+            <w:tcW w:type="dxa" w:w="1289"/>
           </w:tcPr>
           <w:p>
             <w:pPr>
@@ -37104,7 +37271,7 @@
         </w:tc>
         <w:tc>
           <w:tcPr>
-            <w:tcW w:type="dxa" w:w="3482"/>
+            <w:tcW w:type="dxa" w:w="3615"/>
           </w:tcPr>
           <w:p>
             <w:pPr>
@@ -37117,7 +37284,7 @@
         </w:tc>
         <w:tc>
           <w:tcPr>
-            <w:tcW w:type="dxa" w:w="2963"/>
+            <w:tcW w:type="dxa" w:w="2903"/>
           </w:tcPr>
           <w:p>
             <w:pPr>
@@ -37130,7 +37297,7 @@
         </w:tc>
         <w:tc>
           <w:tcPr>
-            <w:tcW w:type="dxa" w:w="2320"/>
+            <w:tcW w:type="dxa" w:w="2273"/>
           </w:tcPr>
           <w:p>
             <w:pPr>
@@ -37161,7 +37328,7 @@
       <w:tr>
         <w:tc>
           <w:tcPr>
-            <w:tcW w:type="dxa" w:w="1315"/>
+            <w:tcW w:type="dxa" w:w="1289"/>
           </w:tcPr>
           <w:p>
             <w:pPr>
@@ -37178,7 +37345,7 @@
         </w:tc>
         <w:tc>
           <w:tcPr>
-            <w:tcW w:type="dxa" w:w="3482"/>
+            <w:tcW w:type="dxa" w:w="3615"/>
           </w:tcPr>
           <w:p>
             <w:pPr>
@@ -37191,7 +37358,7 @@
         </w:tc>
         <w:tc>
           <w:tcPr>
-            <w:tcW w:type="dxa" w:w="2963"/>
+            <w:tcW w:type="dxa" w:w="2903"/>
           </w:tcPr>
           <w:p>
             <w:pPr>
@@ -37204,7 +37371,7 @@
         </w:tc>
         <w:tc>
           <w:tcPr>
-            <w:tcW w:type="dxa" w:w="2320"/>
+            <w:tcW w:type="dxa" w:w="2273"/>
           </w:tcPr>
           <w:p>
             <w:pPr>
@@ -37219,7 +37386,7 @@
       <w:tr>
         <w:tc>
           <w:tcPr>
-            <w:tcW w:type="dxa" w:w="1315"/>
+            <w:tcW w:type="dxa" w:w="1289"/>
           </w:tcPr>
           <w:p>
             <w:pPr>
@@ -37236,7 +37403,7 @@
         </w:tc>
         <w:tc>
           <w:tcPr>
-            <w:tcW w:type="dxa" w:w="3482"/>
+            <w:tcW w:type="dxa" w:w="3615"/>
           </w:tcPr>
           <w:p>
             <w:pPr>
@@ -37249,7 +37416,7 @@
         </w:tc>
         <w:tc>
           <w:tcPr>
-            <w:tcW w:type="dxa" w:w="2963"/>
+            <w:tcW w:type="dxa" w:w="2903"/>
           </w:tcPr>
           <w:p>
             <w:pPr>
@@ -37262,7 +37429,7 @@
         </w:tc>
         <w:tc>
           <w:tcPr>
-            <w:tcW w:type="dxa" w:w="2320"/>
+            <w:tcW w:type="dxa" w:w="2273"/>
           </w:tcPr>
           <w:p>
             <w:pPr>
@@ -37277,7 +37444,7 @@
       <w:tr>
         <w:tc>
           <w:tcPr>
-            <w:tcW w:type="dxa" w:w="1315"/>
+            <w:tcW w:type="dxa" w:w="1289"/>
           </w:tcPr>
           <w:p>
             <w:pPr>
@@ -37294,7 +37461,7 @@
         </w:tc>
         <w:tc>
           <w:tcPr>
-            <w:tcW w:type="dxa" w:w="3482"/>
+            <w:tcW w:type="dxa" w:w="3615"/>
           </w:tcPr>
           <w:p>
             <w:pPr>
@@ -37307,7 +37474,7 @@
         </w:tc>
         <w:tc>
           <w:tcPr>
-            <w:tcW w:type="dxa" w:w="2963"/>
+            <w:tcW w:type="dxa" w:w="2903"/>
           </w:tcPr>
           <w:p>
             <w:pPr>
@@ -37320,7 +37487,7 @@
         </w:tc>
         <w:tc>
           <w:tcPr>
-            <w:tcW w:type="dxa" w:w="2320"/>
+            <w:tcW w:type="dxa" w:w="2273"/>
           </w:tcPr>
           <w:p>
             <w:pPr>
@@ -37335,7 +37502,7 @@
       <w:tr>
         <w:tc>
           <w:tcPr>
-            <w:tcW w:type="dxa" w:w="1315"/>
+            <w:tcW w:type="dxa" w:w="1289"/>
           </w:tcPr>
           <w:p>
             <w:pPr>
@@ -37352,7 +37519,7 @@
         </w:tc>
         <w:tc>
           <w:tcPr>
-            <w:tcW w:type="dxa" w:w="3482"/>
+            <w:tcW w:type="dxa" w:w="3615"/>
           </w:tcPr>
           <w:p>
             <w:pPr>
@@ -37374,7 +37541,7 @@
         </w:tc>
         <w:tc>
           <w:tcPr>
-            <w:tcW w:type="dxa" w:w="2963"/>
+            <w:tcW w:type="dxa" w:w="2903"/>
           </w:tcPr>
           <w:p>
             <w:pPr>
@@ -37403,7 +37570,7 @@
         </w:tc>
         <w:tc>
           <w:tcPr>
-            <w:tcW w:type="dxa" w:w="2320"/>
+            <w:tcW w:type="dxa" w:w="2273"/>
           </w:tcPr>
           <w:p>
             <w:pPr>
@@ -37418,7 +37585,7 @@
       <w:tr>
         <w:tc>
           <w:tcPr>
-            <w:tcW w:type="dxa" w:w="1315"/>
+            <w:tcW w:type="dxa" w:w="1289"/>
           </w:tcPr>
           <w:p>
             <w:pPr>
@@ -37435,7 +37602,7 @@
         </w:tc>
         <w:tc>
           <w:tcPr>
-            <w:tcW w:type="dxa" w:w="3482"/>
+            <w:tcW w:type="dxa" w:w="3615"/>
           </w:tcPr>
           <w:p>
             <w:pPr>
@@ -37448,7 +37615,7 @@
         </w:tc>
         <w:tc>
           <w:tcPr>
-            <w:tcW w:type="dxa" w:w="2963"/>
+            <w:tcW w:type="dxa" w:w="2903"/>
           </w:tcPr>
           <w:p>
             <w:pPr>
@@ -37461,7 +37628,7 @@
         </w:tc>
         <w:tc>
           <w:tcPr>
-            <w:tcW w:type="dxa" w:w="2320"/>
+            <w:tcW w:type="dxa" w:w="2273"/>
           </w:tcPr>
           <w:p>
             <w:pPr>
@@ -37476,7 +37643,7 @@
       <w:tr>
         <w:tc>
           <w:tcPr>
-            <w:tcW w:type="dxa" w:w="1315"/>
+            <w:tcW w:type="dxa" w:w="1289"/>
           </w:tcPr>
           <w:p>
             <w:pPr>
@@ -37493,7 +37660,7 @@
         </w:tc>
         <w:tc>
           <w:tcPr>
-            <w:tcW w:type="dxa" w:w="3482"/>
+            <w:tcW w:type="dxa" w:w="3615"/>
           </w:tcPr>
           <w:p>
             <w:pPr>
@@ -37516,7 +37683,7 @@
         </w:tc>
         <w:tc>
           <w:tcPr>
-            <w:tcW w:type="dxa" w:w="2963"/>
+            <w:tcW w:type="dxa" w:w="2903"/>
           </w:tcPr>
           <w:p>
             <w:pPr>
@@ -37539,7 +37706,7 @@
         </w:tc>
         <w:tc>
           <w:tcPr>
-            <w:tcW w:type="dxa" w:w="2320"/>
+            <w:tcW w:type="dxa" w:w="2273"/>
           </w:tcPr>
           <w:p>
             <w:pPr>
@@ -37554,7 +37721,7 @@
       <w:tr>
         <w:tc>
           <w:tcPr>
-            <w:tcW w:type="dxa" w:w="1315"/>
+            <w:tcW w:type="dxa" w:w="1289"/>
           </w:tcPr>
           <w:p>
             <w:pPr>
@@ -37571,7 +37738,7 @@
         </w:tc>
         <w:tc>
           <w:tcPr>
-            <w:tcW w:type="dxa" w:w="3482"/>
+            <w:tcW w:type="dxa" w:w="3615"/>
           </w:tcPr>
           <w:p>
             <w:pPr>
@@ -37594,7 +37761,7 @@
         </w:tc>
         <w:tc>
           <w:tcPr>
-            <w:tcW w:type="dxa" w:w="2963"/>
+            <w:tcW w:type="dxa" w:w="2903"/>
           </w:tcPr>
           <w:p>
             <w:pPr>
@@ -37607,7 +37774,7 @@
         </w:tc>
         <w:tc>
           <w:tcPr>
-            <w:tcW w:type="dxa" w:w="2320"/>
+            <w:tcW w:type="dxa" w:w="2273"/>
           </w:tcPr>
           <w:p>
             <w:pPr>
@@ -37625,7 +37792,7 @@
       <w:tr>
         <w:tc>
           <w:tcPr>
-            <w:tcW w:type="dxa" w:w="1315"/>
+            <w:tcW w:type="dxa" w:w="1289"/>
           </w:tcPr>
           <w:p>
             <w:pPr>
@@ -37642,7 +37809,7 @@
         </w:tc>
         <w:tc>
           <w:tcPr>
-            <w:tcW w:type="dxa" w:w="3482"/>
+            <w:tcW w:type="dxa" w:w="3615"/>
           </w:tcPr>
           <w:p>
             <w:pPr>
@@ -37662,7 +37829,7 @@
         </w:tc>
         <w:tc>
           <w:tcPr>
-            <w:tcW w:type="dxa" w:w="2963"/>
+            <w:tcW w:type="dxa" w:w="2903"/>
           </w:tcPr>
           <w:p>
             <w:pPr>
@@ -37691,7 +37858,7 @@
         </w:tc>
         <w:tc>
           <w:tcPr>
-            <w:tcW w:type="dxa" w:w="2320"/>
+            <w:tcW w:type="dxa" w:w="2273"/>
           </w:tcPr>
           <w:p>
             <w:pPr>
@@ -37715,7 +37882,7 @@
       <w:tr>
         <w:tc>
           <w:tcPr>
-            <w:tcW w:type="dxa" w:w="1315"/>
+            <w:tcW w:type="dxa" w:w="1289"/>
           </w:tcPr>
           <w:p>
             <w:pPr>
@@ -37732,7 +37899,7 @@
         </w:tc>
         <w:tc>
           <w:tcPr>
-            <w:tcW w:type="dxa" w:w="3482"/>
+            <w:tcW w:type="dxa" w:w="3615"/>
           </w:tcPr>
           <w:p>
             <w:pPr>
@@ -37745,7 +37912,7 @@
         </w:tc>
         <w:tc>
           <w:tcPr>
-            <w:tcW w:type="dxa" w:w="2963"/>
+            <w:tcW w:type="dxa" w:w="2903"/>
           </w:tcPr>
           <w:p>
             <w:pPr>
@@ -37768,7 +37935,7 @@
         </w:tc>
         <w:tc>
           <w:tcPr>
-            <w:tcW w:type="dxa" w:w="2320"/>
+            <w:tcW w:type="dxa" w:w="2273"/>
           </w:tcPr>
           <w:p>
             <w:pPr>
@@ -37783,7 +37950,7 @@
       <w:tr>
         <w:tc>
           <w:tcPr>
-            <w:tcW w:type="dxa" w:w="1315"/>
+            <w:tcW w:type="dxa" w:w="1289"/>
           </w:tcPr>
           <w:p>
             <w:pPr>
@@ -37800,7 +37967,7 @@
         </w:tc>
         <w:tc>
           <w:tcPr>
-            <w:tcW w:type="dxa" w:w="3482"/>
+            <w:tcW w:type="dxa" w:w="3615"/>
           </w:tcPr>
           <w:p>
             <w:pPr>
@@ -37813,7 +37980,7 @@
         </w:tc>
         <w:tc>
           <w:tcPr>
-            <w:tcW w:type="dxa" w:w="2963"/>
+            <w:tcW w:type="dxa" w:w="2903"/>
           </w:tcPr>
           <w:p>
             <w:pPr>
@@ -37826,7 +37993,7 @@
         </w:tc>
         <w:tc>
           <w:tcPr>
-            <w:tcW w:type="dxa" w:w="2320"/>
+            <w:tcW w:type="dxa" w:w="2273"/>
           </w:tcPr>
           <w:p>
             <w:pPr>
@@ -37841,7 +38008,7 @@
       <w:tr>
         <w:tc>
           <w:tcPr>
-            <w:tcW w:type="dxa" w:w="1315"/>
+            <w:tcW w:type="dxa" w:w="1289"/>
           </w:tcPr>
           <w:p>
             <w:pPr>
@@ -37858,7 +38025,7 @@
         </w:tc>
         <w:tc>
           <w:tcPr>
-            <w:tcW w:type="dxa" w:w="3482"/>
+            <w:tcW w:type="dxa" w:w="3615"/>
           </w:tcPr>
           <w:p>
             <w:pPr>
@@ -37871,7 +38038,7 @@
         </w:tc>
         <w:tc>
           <w:tcPr>
-            <w:tcW w:type="dxa" w:w="2963"/>
+            <w:tcW w:type="dxa" w:w="2903"/>
           </w:tcPr>
           <w:p>
             <w:pPr>
@@ -37884,7 +38051,7 @@
         </w:tc>
         <w:tc>
           <w:tcPr>
-            <w:tcW w:type="dxa" w:w="2320"/>
+            <w:tcW w:type="dxa" w:w="2273"/>
           </w:tcPr>
           <w:p>
             <w:pPr>
@@ -37899,7 +38066,7 @@
       <w:tr>
         <w:tc>
           <w:tcPr>
-            <w:tcW w:type="dxa" w:w="1315"/>
+            <w:tcW w:type="dxa" w:w="1289"/>
           </w:tcPr>
           <w:p>
             <w:pPr>
@@ -37916,7 +38083,7 @@
         </w:tc>
         <w:tc>
           <w:tcPr>
-            <w:tcW w:type="dxa" w:w="3482"/>
+            <w:tcW w:type="dxa" w:w="3615"/>
           </w:tcPr>
           <w:p>
             <w:pPr>
@@ -37929,7 +38096,7 @@
         </w:tc>
         <w:tc>
           <w:tcPr>
-            <w:tcW w:type="dxa" w:w="2963"/>
+            <w:tcW w:type="dxa" w:w="2903"/>
           </w:tcPr>
           <w:p>
             <w:pPr>
@@ -37942,7 +38109,7 @@
         </w:tc>
         <w:tc>
           <w:tcPr>
-            <w:tcW w:type="dxa" w:w="2320"/>
+            <w:tcW w:type="dxa" w:w="2273"/>
           </w:tcPr>
           <w:p>
             <w:pPr>
@@ -37957,7 +38124,7 @@
       <w:tr>
         <w:tc>
           <w:tcPr>
-            <w:tcW w:type="dxa" w:w="1315"/>
+            <w:tcW w:type="dxa" w:w="1289"/>
           </w:tcPr>
           <w:p>
             <w:pPr>
@@ -37974,7 +38141,7 @@
         </w:tc>
         <w:tc>
           <w:tcPr>
-            <w:tcW w:type="dxa" w:w="3482"/>
+            <w:tcW w:type="dxa" w:w="3615"/>
           </w:tcPr>
           <w:p>
             <w:pPr>
@@ -38003,7 +38170,7 @@
         </w:tc>
         <w:tc>
           <w:tcPr>
-            <w:tcW w:type="dxa" w:w="2963"/>
+            <w:tcW w:type="dxa" w:w="2903"/>
           </w:tcPr>
           <w:p>
             <w:pPr>
@@ -38016,7 +38183,7 @@
         </w:tc>
         <w:tc>
           <w:tcPr>
-            <w:tcW w:type="dxa" w:w="2320"/>
+            <w:tcW w:type="dxa" w:w="2273"/>
           </w:tcPr>
           <w:p>
             <w:pPr>
@@ -38031,7 +38198,7 @@
       <w:tr>
         <w:tc>
           <w:tcPr>
-            <w:tcW w:type="dxa" w:w="1315"/>
+            <w:tcW w:type="dxa" w:w="1289"/>
           </w:tcPr>
           <w:p>
             <w:pPr>
@@ -38048,7 +38215,7 @@
         </w:tc>
         <w:tc>
           <w:tcPr>
-            <w:tcW w:type="dxa" w:w="3482"/>
+            <w:tcW w:type="dxa" w:w="3615"/>
           </w:tcPr>
           <w:p>
             <w:pPr>
@@ -38071,7 +38238,7 @@
         </w:tc>
         <w:tc>
           <w:tcPr>
-            <w:tcW w:type="dxa" w:w="2963"/>
+            <w:tcW w:type="dxa" w:w="2903"/>
           </w:tcPr>
           <w:p>
             <w:pPr>
@@ -38084,7 +38251,7 @@
         </w:tc>
         <w:tc>
           <w:tcPr>
-            <w:tcW w:type="dxa" w:w="2320"/>
+            <w:tcW w:type="dxa" w:w="2273"/>
           </w:tcPr>
           <w:p>
             <w:pPr>
@@ -38102,7 +38269,7 @@
       <w:tr>
         <w:tc>
           <w:tcPr>
-            <w:tcW w:type="dxa" w:w="1315"/>
+            <w:tcW w:type="dxa" w:w="1289"/>
           </w:tcPr>
           <w:p>
             <w:pPr>
@@ -38125,7 +38292,7 @@
         </w:tc>
         <w:tc>
           <w:tcPr>
-            <w:tcW w:type="dxa" w:w="3482"/>
+            <w:tcW w:type="dxa" w:w="3615"/>
           </w:tcPr>
           <w:p>
             <w:pPr>
@@ -38162,7 +38329,7 @@
         </w:tc>
         <w:tc>
           <w:tcPr>
-            <w:tcW w:type="dxa" w:w="2963"/>
+            <w:tcW w:type="dxa" w:w="2903"/>
           </w:tcPr>
           <w:p>
             <w:pPr>
@@ -38175,7 +38342,7 @@
         </w:tc>
         <w:tc>
           <w:tcPr>
-            <w:tcW w:type="dxa" w:w="2320"/>
+            <w:tcW w:type="dxa" w:w="2273"/>
           </w:tcPr>
           <w:p>
             <w:pPr>
@@ -38190,7 +38357,7 @@
       <w:tr>
         <w:tc>
           <w:tcPr>
-            <w:tcW w:type="dxa" w:w="1315"/>
+            <w:tcW w:type="dxa" w:w="1289"/>
           </w:tcPr>
           <w:p>
             <w:pPr>
@@ -38207,65 +38374,61 @@
         </w:tc>
         <w:tc>
           <w:tcPr>
-            <w:tcW w:type="dxa" w:w="3482"/>
-          </w:tcPr>
-          <w:p>
-            <w:pPr>
-              <w:pStyle w:val="Compact"/>
-            </w:pPr>
-            <w:r>
-              <w:t xml:space="preserve">Global services: deployed once, in the global stack</w:t>
-            </w:r>
-          </w:p>
-        </w:tc>
-        <w:tc>
-          <w:tcPr>
-            <w:tcW w:type="dxa" w:w="2963"/>
-          </w:tcPr>
-          <w:p>
-            <w:pPr>
-              <w:pStyle w:val="Compact"/>
-            </w:pPr>
-            <w:r>
-              <w:t xml:space="preserve">Same</w:t>
-            </w:r>
-          </w:p>
-        </w:tc>
-        <w:tc>
-          <w:tcPr>
-            <w:tcW w:type="dxa" w:w="2320"/>
-          </w:tcPr>
-          <w:p>
-            <w:pPr>
-              <w:pStyle w:val="Compact"/>
-            </w:pPr>
-            <w:r>
-              <w:t xml:space="preserve">Origin groups for origin failover</w:t>
-            </w:r>
-          </w:p>
-        </w:tc>
-      </w:tr>
-      <w:tr>
-        <w:tc>
-          <w:tcPr>
-            <w:tcW w:type="dxa" w:w="1315"/>
-          </w:tcPr>
-          <w:p>
-            <w:pPr>
-              <w:pStyle w:val="Compact"/>
-            </w:pPr>
+            <w:tcW w:type="dxa" w:w="3615"/>
+          </w:tcPr>
+          <w:p>
+            <w:pPr>
+              <w:pStyle w:val="Compact"/>
+            </w:pPr>
+            <w:r>
+              <w:t xml:space="preserve">Global services: deployed once, in the global stack. CloudFront certificates (ACM) and CloudFront-scope WAF web ACLs</w:t>
+            </w:r>
+            <w:r>
+              <w:t xml:space="preserve"> </w:t>
+            </w:r>
             <w:r>
               <w:rPr>
                 <w:b/>
                 <w:bCs/>
               </w:rPr>
-              <w:t xml:space="preserve">Cognito user pools</w:t>
-            </w:r>
-          </w:p>
-        </w:tc>
-        <w:tc>
-          <w:tcPr>
-            <w:tcW w:type="dxa" w:w="3482"/>
+              <w:t xml:space="preserve">must live in us-east-1</w:t>
+            </w:r>
+            <w:r>
+              <w:t xml:space="preserve">, whatever the selected pair (§10.9)</w:t>
+            </w:r>
+          </w:p>
+        </w:tc>
+        <w:tc>
+          <w:tcPr>
+            <w:tcW w:type="dxa" w:w="2903"/>
+          </w:tcPr>
+          <w:p>
+            <w:pPr>
+              <w:pStyle w:val="Compact"/>
+            </w:pPr>
+            <w:r>
+              <w:t xml:space="preserve">Same</w:t>
+            </w:r>
+          </w:p>
+        </w:tc>
+        <w:tc>
+          <w:tcPr>
+            <w:tcW w:type="dxa" w:w="2273"/>
+          </w:tcPr>
+          <w:p>
+            <w:pPr>
+              <w:pStyle w:val="Compact"/>
+            </w:pPr>
+            <w:r>
+              <w:t xml:space="preserve">Origin groups for origin failover</w:t>
+            </w:r>
+          </w:p>
+        </w:tc>
+      </w:tr>
+      <w:tr>
+        <w:tc>
+          <w:tcPr>
+            <w:tcW w:type="dxa" w:w="1289"/>
           </w:tcPr>
           <w:p>
             <w:pPr>
@@ -38276,6 +38439,23 @@
                 <w:b/>
                 <w:bCs/>
               </w:rPr>
+              <w:t xml:space="preserve">Cognito user pools</w:t>
+            </w:r>
+          </w:p>
+        </w:tc>
+        <w:tc>
+          <w:tcPr>
+            <w:tcW w:type="dxa" w:w="3615"/>
+          </w:tcPr>
+          <w:p>
+            <w:pPr>
+              <w:pStyle w:val="Compact"/>
+            </w:pPr>
+            <w:r>
+              <w:rPr>
+                <w:b/>
+                <w:bCs/>
+              </w:rPr>
               <w:t xml:space="preserve">Limited</w:t>
             </w:r>
             <w:r>
@@ -38285,7 +38465,7 @@
         </w:tc>
         <w:tc>
           <w:tcPr>
-            <w:tcW w:type="dxa" w:w="2963"/>
+            <w:tcW w:type="dxa" w:w="2903"/>
           </w:tcPr>
           <w:p>
             <w:pPr>
@@ -38298,7 +38478,7 @@
         </w:tc>
         <w:tc>
           <w:tcPr>
-            <w:tcW w:type="dxa" w:w="2320"/>
+            <w:tcW w:type="dxa" w:w="2273"/>
           </w:tcPr>
           <w:p>
             <w:pPr>
@@ -40100,6 +40280,1063 @@
         <w:pStyle w:val="Heading2"/>
       </w:pPr>
       <w:r>
+        <w:t xml:space="preserve">10.9 Region selection: any pair, chosen in the UI</w:t>
+      </w:r>
+    </w:p>
+    <w:p>
+      <w:pPr>
+        <w:pStyle w:val="FirstParagraph"/>
+      </w:pPr>
+      <w:r>
+        <w:rPr>
+          <w:b/>
+          <w:bCs/>
+        </w:rPr>
+        <w:t xml:space="preserve">User experience (project wizard):</w:t>
+      </w:r>
+      <w:r>
+        <w:t xml:space="preserve"> </w:t>
+      </w:r>
+      <w:r>
+        <w:t xml:space="preserve">1. Choose</w:t>
+      </w:r>
+      <w:r>
+        <w:t xml:space="preserve"> </w:t>
+      </w:r>
+      <w:r>
+        <w:rPr>
+          <w:b/>
+          <w:bCs/>
+        </w:rPr>
+        <w:t xml:space="preserve">Resilience</w:t>
+      </w:r>
+      <w:r>
+        <w:t xml:space="preserve">: single region / DR / HA pair.</w:t>
+      </w:r>
+      <w:r>
+        <w:t xml:space="preserve"> </w:t>
+      </w:r>
+      <w:r>
+        <w:t xml:space="preserve">2. Choose</w:t>
+      </w:r>
+      <w:r>
+        <w:t xml:space="preserve"> </w:t>
+      </w:r>
+      <w:r>
+        <w:rPr>
+          <w:b/>
+          <w:bCs/>
+        </w:rPr>
+        <w:t xml:space="preserve">Primary region</w:t>
+      </w:r>
+      <w:r>
+        <w:t xml:space="preserve"> </w:t>
+      </w:r>
+      <w:r>
+        <w:t xml:space="preserve">(dropdown) and, for DR/HA,</w:t>
+      </w:r>
+      <w:r>
+        <w:t xml:space="preserve"> </w:t>
+      </w:r>
+      <w:r>
+        <w:rPr>
+          <w:b/>
+          <w:bCs/>
+        </w:rPr>
+        <w:t xml:space="preserve">Secondary region</w:t>
+      </w:r>
+      <w:r>
+        <w:t xml:space="preserve"> </w:t>
+      </w:r>
+      <w:r>
+        <w:t xml:space="preserve">(dropdown). Both list every region the platform has enabled. They are pre-filled with</w:t>
+      </w:r>
+      <w:r>
+        <w:t xml:space="preserve"> </w:t>
+      </w:r>
+      <w:r>
+        <w:rPr>
+          <w:b/>
+          <w:bCs/>
+        </w:rPr>
+        <w:t xml:space="preserve">us-east-1 / us-east-2</w:t>
+      </w:r>
+      <w:r>
+        <w:t xml:space="preserve">, and any combination of two different regions can be selected.</w:t>
+      </w:r>
+      <w:r>
+        <w:t xml:space="preserve"> </w:t>
+      </w:r>
+      <w:r>
+        <w:t xml:space="preserve">3. The preview immediately shows, for the chosen pair:</w:t>
+      </w:r>
+      <w:r>
+        <w:t xml:space="preserve"> </w:t>
+      </w:r>
+      <w:r>
+        <w:t xml:space="preserve">- the target account per environment and region;</w:t>
+      </w:r>
+      <w:r>
+        <w:t xml:space="preserve"> </w:t>
+      </w:r>
+      <w:r>
+        <w:t xml:space="preserve">- service availability in both regions;</w:t>
+      </w:r>
+      <w:r>
+        <w:t xml:space="preserve"> </w:t>
+      </w:r>
+      <w:r>
+        <w:t xml:space="preserve">- replication support for each data store;</w:t>
+      </w:r>
+      <w:r>
+        <w:t xml:space="preserve"> </w:t>
+      </w:r>
+      <w:r>
+        <w:t xml:space="preserve">- indicative cost including</w:t>
+      </w:r>
+      <w:r>
+        <w:t xml:space="preserve"> </w:t>
+      </w:r>
+      <w:r>
+        <w:rPr>
+          <w:b/>
+          <w:bCs/>
+        </w:rPr>
+        <w:t xml:space="preserve">cross-region data transfer</w:t>
+      </w:r>
+      <w:r>
+        <w:t xml:space="preserve">;</w:t>
+      </w:r>
+      <w:r>
+        <w:t xml:space="preserve"> </w:t>
+      </w:r>
+      <w:r>
+        <w:t xml:space="preserve">- expected RTO/RPO.</w:t>
+      </w:r>
+    </w:p>
+    <w:p>
+      <w:pPr>
+        <w:pStyle w:val="BodyText"/>
+      </w:pPr>
+      <w:r>
+        <w:rPr>
+          <w:b/>
+          <w:bCs/>
+        </w:rPr>
+        <w:t xml:space="preserve">What the platform validates for the selected pair:</w:t>
+      </w:r>
+    </w:p>
+    <w:tbl>
+      <w:tblPr>
+        <w:tblStyle w:val="Table"/>
+        <w:tblW w:type="dxa" w:w="10080"/>
+        <w:tblLayout w:type="fixed"/>
+        <w:tblLook w:firstRow="1" w:lastRow="0" w:firstColumn="0" w:lastColumn="0" w:noHBand="0" w:noVBand="0" w:val="0020"/>
+      </w:tblPr>
+      <w:tblGrid>
+        <w:gridCol w:w="4170"/>
+        <w:gridCol w:w="3334"/>
+        <w:gridCol w:w="2576"/>
+      </w:tblGrid>
+      <w:tr>
+        <w:trPr>
+          <w:tblHeader w:val="on"/>
+        </w:trPr>
+        <w:tc>
+          <w:tcPr>
+            <w:tcW w:type="dxa" w:w="4170"/>
+          </w:tcPr>
+          <w:p>
+            <w:pPr>
+              <w:pStyle w:val="Compact"/>
+            </w:pPr>
+            <w:r>
+              <w:t xml:space="preserve">Check</w:t>
+            </w:r>
+          </w:p>
+        </w:tc>
+        <w:tc>
+          <w:tcPr>
+            <w:tcW w:type="dxa" w:w="3334"/>
+          </w:tcPr>
+          <w:p>
+            <w:pPr>
+              <w:pStyle w:val="Compact"/>
+            </w:pPr>
+            <w:r>
+              <w:t xml:space="preserve">Source</w:t>
+            </w:r>
+          </w:p>
+        </w:tc>
+        <w:tc>
+          <w:tcPr>
+            <w:tcW w:type="dxa" w:w="2576"/>
+          </w:tcPr>
+          <w:p>
+            <w:pPr>
+              <w:pStyle w:val="Compact"/>
+            </w:pPr>
+            <w:r>
+              <w:t xml:space="preserve">If it fails</w:t>
+            </w:r>
+          </w:p>
+        </w:tc>
+      </w:tr>
+      <w:tr>
+        <w:tc>
+          <w:tcPr>
+            <w:tcW w:type="dxa" w:w="4170"/>
+          </w:tcPr>
+          <w:p>
+            <w:pPr>
+              <w:pStyle w:val="Compact"/>
+            </w:pPr>
+            <w:r>
+              <w:t xml:space="preserve">Primary ≠ secondary</w:t>
+            </w:r>
+          </w:p>
+        </w:tc>
+        <w:tc>
+          <w:tcPr>
+            <w:tcW w:type="dxa" w:w="3334"/>
+          </w:tcPr>
+          <w:p>
+            <w:pPr>
+              <w:pStyle w:val="Compact"/>
+            </w:pPr>
+            <w:r>
+              <w:t xml:space="preserve">Payload</w:t>
+            </w:r>
+          </w:p>
+        </w:tc>
+        <w:tc>
+          <w:tcPr>
+            <w:tcW w:type="dxa" w:w="2576"/>
+          </w:tcPr>
+          <w:p>
+            <w:pPr>
+              <w:pStyle w:val="Compact"/>
+            </w:pPr>
+            <w:r>
+              <w:t xml:space="preserve">Rejected</w:t>
+            </w:r>
+          </w:p>
+        </w:tc>
+      </w:tr>
+      <w:tr>
+        <w:tc>
+          <w:tcPr>
+            <w:tcW w:type="dxa" w:w="4170"/>
+          </w:tcPr>
+          <w:p>
+            <w:pPr>
+              <w:pStyle w:val="Compact"/>
+            </w:pPr>
+            <w:r>
+              <w:t xml:space="preserve">Both regions are</w:t>
+            </w:r>
+            <w:r>
+              <w:t xml:space="preserve"> </w:t>
+            </w:r>
+            <w:r>
+              <w:rPr>
+                <w:b/>
+                <w:bCs/>
+              </w:rPr>
+              <w:t xml:space="preserve">enabled in the platform</w:t>
+            </w:r>
+            <w:r>
+              <w:t xml:space="preserve"> </w:t>
+            </w:r>
+            <w:r>
+              <w:t xml:space="preserve">and</w:t>
+            </w:r>
+            <w:r>
+              <w:t xml:space="preserve"> </w:t>
+            </w:r>
+            <w:r>
+              <w:rPr>
+                <w:b/>
+                <w:bCs/>
+              </w:rPr>
+              <w:t xml:space="preserve">onboarded</w:t>
+            </w:r>
+            <w:r>
+              <w:t xml:space="preserve"> </w:t>
+            </w:r>
+            <w:r>
+              <w:t xml:space="preserve">in each target account (opt-in regions enabled, account bootstrap present, artifact bucket present)</w:t>
+            </w:r>
+          </w:p>
+        </w:tc>
+        <w:tc>
+          <w:tcPr>
+            <w:tcW w:type="dxa" w:w="3334"/>
+          </w:tcPr>
+          <w:p>
+            <w:pPr>
+              <w:pStyle w:val="Compact"/>
+            </w:pPr>
+            <w:r>
+              <w:t xml:space="preserve">Environment config + onboarding checks (§5.5.3)</w:t>
+            </w:r>
+          </w:p>
+        </w:tc>
+        <w:tc>
+          <w:tcPr>
+            <w:tcW w:type="dxa" w:w="2576"/>
+          </w:tcPr>
+          <w:p>
+            <w:pPr>
+              <w:pStyle w:val="Compact"/>
+            </w:pPr>
+            <w:r>
+              <w:t xml:space="preserve">Region not selectable for that environment until onboarding completes</w:t>
+            </w:r>
+          </w:p>
+        </w:tc>
+      </w:tr>
+      <w:tr>
+        <w:tc>
+          <w:tcPr>
+            <w:tcW w:type="dxa" w:w="4170"/>
+          </w:tcPr>
+          <w:p>
+            <w:pPr>
+              <w:pStyle w:val="Compact"/>
+            </w:pPr>
+            <w:r>
+              <w:t xml:space="preserve">Every selected service, engine version and instance class</w:t>
+            </w:r>
+            <w:r>
+              <w:t xml:space="preserve"> </w:t>
+            </w:r>
+            <w:r>
+              <w:rPr>
+                <w:b/>
+                <w:bCs/>
+              </w:rPr>
+              <w:t xml:space="preserve">exists in both regions</w:t>
+            </w:r>
+          </w:p>
+        </w:tc>
+        <w:tc>
+          <w:tcPr>
+            <w:tcW w:type="dxa" w:w="3334"/>
+          </w:tcPr>
+          <w:p>
+            <w:pPr>
+              <w:pStyle w:val="Compact"/>
+            </w:pPr>
+            <w:r>
+              <w:t xml:space="preserve">AWS public SSM parameters (</w:t>
+            </w:r>
+            <w:r>
+              <w:rPr>
+                <w:rStyle w:val="VerbatimChar"/>
+              </w:rPr>
+              <w:t xml:space="preserve">/aws/service/global-infrastructure/regions/{region}/services</w:t>
+            </w:r>
+            <w:r>
+              <w:t xml:space="preserve">) + CloudFormation</w:t>
+            </w:r>
+            <w:r>
+              <w:t xml:space="preserve"> </w:t>
+            </w:r>
+            <w:r>
+              <w:rPr>
+                <w:rStyle w:val="VerbatimChar"/>
+              </w:rPr>
+              <w:t xml:space="preserve">describe-type</w:t>
+            </w:r>
+            <w:r>
+              <w:t xml:space="preserve"> </w:t>
+            </w:r>
+            <w:r>
+              <w:t xml:space="preserve">per region + RDS/ElastiCache orderable options APIs</w:t>
+            </w:r>
+          </w:p>
+        </w:tc>
+        <w:tc>
+          <w:tcPr>
+            <w:tcW w:type="dxa" w:w="2576"/>
+          </w:tcPr>
+          <w:p>
+            <w:pPr>
+              <w:pStyle w:val="Compact"/>
+            </w:pPr>
+            <w:r>
+              <w:t xml:space="preserve">Field-level error naming the missing service in the region</w:t>
+            </w:r>
+          </w:p>
+        </w:tc>
+      </w:tr>
+      <w:tr>
+        <w:tc>
+          <w:tcPr>
+            <w:tcW w:type="dxa" w:w="4170"/>
+          </w:tcPr>
+          <w:p>
+            <w:pPr>
+              <w:pStyle w:val="Compact"/>
+            </w:pPr>
+            <w:r>
+              <w:t xml:space="preserve">The data store’s</w:t>
+            </w:r>
+            <w:r>
+              <w:t xml:space="preserve"> </w:t>
+            </w:r>
+            <w:r>
+              <w:rPr>
+                <w:b/>
+                <w:bCs/>
+              </w:rPr>
+              <w:t xml:space="preserve">cross-region feature supports this pair</w:t>
+            </w:r>
+            <w:r>
+              <w:t xml:space="preserve"> </w:t>
+            </w:r>
+            <w:r>
+              <w:t xml:space="preserve">(e.g. Aurora Global Database, DynamoDB global tables, ElastiCache Global Datastore, multi-Region KMS)</w:t>
+            </w:r>
+          </w:p>
+        </w:tc>
+        <w:tc>
+          <w:tcPr>
+            <w:tcW w:type="dxa" w:w="3334"/>
+          </w:tcPr>
+          <w:p>
+            <w:pPr>
+              <w:pStyle w:val="Compact"/>
+            </w:pPr>
+            <w:r>
+              <w:t xml:space="preserve">Catalog multi-region capability (§10.3), checked per region</w:t>
+            </w:r>
+          </w:p>
+        </w:tc>
+        <w:tc>
+          <w:tcPr>
+            <w:tcW w:type="dxa" w:w="2576"/>
+          </w:tcPr>
+          <w:p>
+            <w:pPr>
+              <w:pStyle w:val="Compact"/>
+            </w:pPr>
+            <w:r>
+              <w:t xml:space="preserve">Rejected with alternatives</w:t>
+            </w:r>
+          </w:p>
+        </w:tc>
+      </w:tr>
+      <w:tr>
+        <w:tc>
+          <w:tcPr>
+            <w:tcW w:type="dxa" w:w="4170"/>
+          </w:tcPr>
+          <w:p>
+            <w:pPr>
+              <w:pStyle w:val="Compact"/>
+            </w:pPr>
+            <w:r>
+              <w:t xml:space="preserve">Optional</w:t>
+            </w:r>
+            <w:r>
+              <w:t xml:space="preserve"> </w:t>
+            </w:r>
+            <w:r>
+              <w:rPr>
+                <w:b/>
+                <w:bCs/>
+              </w:rPr>
+              <w:t xml:space="preserve">data-residency rules</w:t>
+            </w:r>
+            <w:r>
+              <w:t xml:space="preserve"> </w:t>
+            </w:r>
+            <w:r>
+              <w:t xml:space="preserve">(e.g. a classification limited to certain regions)</w:t>
+            </w:r>
+          </w:p>
+        </w:tc>
+        <w:tc>
+          <w:tcPr>
+            <w:tcW w:type="dxa" w:w="3334"/>
+          </w:tcPr>
+          <w:p>
+            <w:pPr>
+              <w:pStyle w:val="Compact"/>
+            </w:pPr>
+            <w:r>
+              <w:t xml:space="preserve">Admin-defined region groups; none by default</w:t>
+            </w:r>
+          </w:p>
+        </w:tc>
+        <w:tc>
+          <w:tcPr>
+            <w:tcW w:type="dxa" w:w="2576"/>
+          </w:tcPr>
+          <w:p>
+            <w:pPr>
+              <w:pStyle w:val="Compact"/>
+            </w:pPr>
+            <w:r>
+              <w:t xml:space="preserve">Rejected only if an admin has defined such a rule</w:t>
+            </w:r>
+          </w:p>
+        </w:tc>
+      </w:tr>
+    </w:tbl>
+    <w:p>
+      <w:pPr>
+        <w:pStyle w:val="BodyText"/>
+      </w:pPr>
+      <w:r>
+        <w:rPr>
+          <w:b/>
+          <w:bCs/>
+        </w:rPr>
+        <w:t xml:space="preserve">Global-service placement, independent of the pair:</w:t>
+      </w:r>
+      <w:r>
+        <w:t xml:space="preserve"> </w:t>
+      </w:r>
+      <w:r>
+        <w:t xml:space="preserve">-</w:t>
+      </w:r>
+      <w:r>
+        <w:t xml:space="preserve"> </w:t>
+      </w:r>
+      <w:r>
+        <w:rPr>
+          <w:b/>
+          <w:bCs/>
+        </w:rPr>
+        <w:t xml:space="preserve">CloudFront</w:t>
+      </w:r>
+      <w:r>
+        <w:t xml:space="preserve"> </w:t>
+      </w:r>
+      <w:r>
+        <w:t xml:space="preserve">certificates (ACM) and</w:t>
+      </w:r>
+      <w:r>
+        <w:t xml:space="preserve"> </w:t>
+      </w:r>
+      <w:r>
+        <w:rPr>
+          <w:b/>
+          <w:bCs/>
+        </w:rPr>
+        <w:t xml:space="preserve">CloudFront-scope WAF</w:t>
+      </w:r>
+      <w:r>
+        <w:t xml:space="preserve"> </w:t>
+      </w:r>
+      <w:r>
+        <w:t xml:space="preserve">web ACLs must be created in</w:t>
+      </w:r>
+      <w:r>
+        <w:t xml:space="preserve"> </w:t>
+      </w:r>
+      <w:r>
+        <w:rPr>
+          <w:b/>
+          <w:bCs/>
+        </w:rPr>
+        <w:t xml:space="preserve">us-east-1</w:t>
+      </w:r>
+      <w:r>
+        <w:t xml:space="preserve"> </w:t>
+      </w:r>
+      <w:r>
+        <w:t xml:space="preserve">by AWS rule. The global stack therefore deploys those specific resources to us-east-1 even when the pair is, say, eu-west-1 / eu-central-1.</w:t>
+      </w:r>
+      <w:r>
+        <w:t xml:space="preserve"> </w:t>
+      </w:r>
+      <w:r>
+        <w:t xml:space="preserve">- Route 53 is global.</w:t>
+      </w:r>
+      <w:r>
+        <w:t xml:space="preserve"> </w:t>
+      </w:r>
+      <w:r>
+        <w:t xml:space="preserve">- All other global-stack resources (DynamoDB global table definition, Aurora global cluster, multi-Region KMS primary keys, ARC controls) are created in the</w:t>
+      </w:r>
+      <w:r>
+        <w:t xml:space="preserve"> </w:t>
+      </w:r>
+      <w:r>
+        <w:rPr>
+          <w:b/>
+          <w:bCs/>
+        </w:rPr>
+        <w:t xml:space="preserve">selected primary region</w:t>
+      </w:r>
+      <w:r>
+        <w:t xml:space="preserve">.</w:t>
+      </w:r>
+    </w:p>
+    <w:p>
+      <w:pPr>
+        <w:pStyle w:val="BodyText"/>
+      </w:pPr>
+      <w:r>
+        <w:rPr>
+          <w:b/>
+          <w:bCs/>
+        </w:rPr>
+        <w:t xml:space="preserve">Admin screen: Regions</w:t>
+      </w:r>
+      <w:r>
+        <w:t xml:space="preserve"> </w:t>
+      </w:r>
+      <w:r>
+        <w:t xml:space="preserve">(part of the environment configuration, §5.5):</w:t>
+      </w:r>
+    </w:p>
+    <w:tbl>
+      <w:tblPr>
+        <w:tblStyle w:val="Table"/>
+        <w:tblW w:type="dxa" w:w="10080"/>
+        <w:tblLayout w:type="fixed"/>
+        <w:tblLook w:firstRow="1" w:lastRow="0" w:firstColumn="0" w:lastColumn="0" w:noHBand="0" w:noVBand="0" w:val="0020"/>
+      </w:tblPr>
+      <w:tblGrid>
+        <w:gridCol w:w="2076"/>
+        <w:gridCol w:w="8004"/>
+      </w:tblGrid>
+      <w:tr>
+        <w:trPr>
+          <w:tblHeader w:val="on"/>
+        </w:trPr>
+        <w:tc>
+          <w:tcPr>
+            <w:tcW w:type="dxa" w:w="2076"/>
+          </w:tcPr>
+          <w:p>
+            <w:pPr>
+              <w:pStyle w:val="Compact"/>
+            </w:pPr>
+            <w:r>
+              <w:t xml:space="preserve">Setting</w:t>
+            </w:r>
+          </w:p>
+        </w:tc>
+        <w:tc>
+          <w:tcPr>
+            <w:tcW w:type="dxa" w:w="8004"/>
+          </w:tcPr>
+          <w:p>
+            <w:pPr>
+              <w:pStyle w:val="Compact"/>
+            </w:pPr>
+            <w:r>
+              <w:t xml:space="preserve">Purpose</w:t>
+            </w:r>
+          </w:p>
+        </w:tc>
+      </w:tr>
+      <w:tr>
+        <w:tc>
+          <w:tcPr>
+            <w:tcW w:type="dxa" w:w="2076"/>
+          </w:tcPr>
+          <w:p>
+            <w:pPr>
+              <w:pStyle w:val="Compact"/>
+            </w:pPr>
+            <w:r>
+              <w:rPr>
+                <w:b/>
+                <w:bCs/>
+              </w:rPr>
+              <w:t xml:space="preserve">Enabled regions</w:t>
+            </w:r>
+          </w:p>
+        </w:tc>
+        <w:tc>
+          <w:tcPr>
+            <w:tcW w:type="dxa" w:w="8004"/>
+          </w:tcPr>
+          <w:p>
+            <w:pPr>
+              <w:pStyle w:val="Compact"/>
+            </w:pPr>
+            <w:r>
+              <w:t xml:space="preserve">The list shown in the wizard dropdowns. Enabling a region triggers onboarding: account-bootstrap StackSet instances in that region for all workload accounts, a Shared Services artifact bucket in that region, ECR replication rules, and an SCP region allow-list update (with approval, §4.7).</w:t>
+            </w:r>
+          </w:p>
+        </w:tc>
+      </w:tr>
+      <w:tr>
+        <w:tc>
+          <w:tcPr>
+            <w:tcW w:type="dxa" w:w="2076"/>
+          </w:tcPr>
+          <w:p>
+            <w:pPr>
+              <w:pStyle w:val="Compact"/>
+            </w:pPr>
+            <w:r>
+              <w:rPr>
+                <w:b/>
+                <w:bCs/>
+              </w:rPr>
+              <w:t xml:space="preserve">Default pair</w:t>
+            </w:r>
+          </w:p>
+        </w:tc>
+        <w:tc>
+          <w:tcPr>
+            <w:tcW w:type="dxa" w:w="8004"/>
+          </w:tcPr>
+          <w:p>
+            <w:pPr>
+              <w:pStyle w:val="Compact"/>
+            </w:pPr>
+            <w:r>
+              <w:t xml:space="preserve">Pre-fill for the wizard (default us-east-1 / us-east-2), per environment if needed</w:t>
+            </w:r>
+          </w:p>
+        </w:tc>
+      </w:tr>
+      <w:tr>
+        <w:tc>
+          <w:tcPr>
+            <w:tcW w:type="dxa" w:w="2076"/>
+          </w:tcPr>
+          <w:p>
+            <w:pPr>
+              <w:pStyle w:val="Compact"/>
+            </w:pPr>
+            <w:r>
+              <w:rPr>
+                <w:b/>
+                <w:bCs/>
+              </w:rPr>
+              <w:t xml:space="preserve">Region groups (optional)</w:t>
+            </w:r>
+          </w:p>
+        </w:tc>
+        <w:tc>
+          <w:tcPr>
+            <w:tcW w:type="dxa" w:w="8004"/>
+          </w:tcPr>
+          <w:p>
+            <w:pPr>
+              <w:pStyle w:val="Compact"/>
+            </w:pPr>
+            <w:r>
+              <w:t xml:space="preserve">Data-residency rules by classification; empty by default, so all pairs are allowed</w:t>
+            </w:r>
+          </w:p>
+        </w:tc>
+      </w:tr>
+      <w:tr>
+        <w:tc>
+          <w:tcPr>
+            <w:tcW w:type="dxa" w:w="2076"/>
+          </w:tcPr>
+          <w:p>
+            <w:pPr>
+              <w:pStyle w:val="Compact"/>
+            </w:pPr>
+            <w:r>
+              <w:rPr>
+                <w:b/>
+                <w:bCs/>
+              </w:rPr>
+              <w:t xml:space="preserve">Per-environment policy</w:t>
+            </w:r>
+          </w:p>
+        </w:tc>
+        <w:tc>
+          <w:tcPr>
+            <w:tcW w:type="dxa" w:w="8004"/>
+          </w:tcPr>
+          <w:p>
+            <w:pPr>
+              <w:pStyle w:val="Compact"/>
+            </w:pPr>
+            <w:r>
+              <w:t xml:space="preserve">Which resilience modes each environment allows (defaults in §10.5)</w:t>
+            </w:r>
+          </w:p>
+        </w:tc>
+      </w:tr>
+    </w:tbl>
+    <w:p>
+      <w:pPr>
+        <w:pStyle w:val="BodyText"/>
+      </w:pPr>
+      <w:r>
+        <w:rPr>
+          <w:b/>
+          <w:bCs/>
+        </w:rPr>
+        <w:t xml:space="preserve">Account bindings per region:</w:t>
+      </w:r>
+      <w:r>
+        <w:t xml:space="preserve"> </w:t>
+      </w:r>
+      <w:r>
+        <w:t xml:space="preserve">an account binding (§5.5.2) is per environment</w:t>
+      </w:r>
+      <w:r>
+        <w:t xml:space="preserve"> </w:t>
+      </w:r>
+      <w:r>
+        <w:rPr>
+          <w:b/>
+          <w:bCs/>
+        </w:rPr>
+        <w:t xml:space="preserve">and region</w:t>
+      </w:r>
+      <w:r>
+        <w:t xml:space="preserve">. By default, the same account serves every region of an environment, so a newly enabled region needs no new binding, only onboarding. A separate DR account can be bound per region if D31 chooses that.</w:t>
+      </w:r>
+    </w:p>
+    <w:p>
+      <w:pPr>
+        <w:pStyle w:val="BodyText"/>
+      </w:pPr>
+      <w:r>
+        <w:rPr>
+          <w:b/>
+          <w:bCs/>
+        </w:rPr>
+        <w:t xml:space="preserve">Changing regions later</w:t>
+      </w:r>
+      <w:r>
+        <w:t xml:space="preserve"> </w:t>
+      </w:r>
+      <w:r>
+        <w:t xml:space="preserve">(also from the UI, as an infrastructure change request with approvals):</w:t>
+      </w:r>
+    </w:p>
+    <w:tbl>
+      <w:tblPr>
+        <w:tblStyle w:val="Table"/>
+        <w:tblW w:type="dxa" w:w="10080"/>
+        <w:tblLayout w:type="fixed"/>
+        <w:tblLook w:firstRow="1" w:lastRow="0" w:firstColumn="0" w:lastColumn="0" w:noHBand="0" w:noVBand="0" w:val="0020"/>
+      </w:tblPr>
+      <w:tblGrid>
+        <w:gridCol w:w="2332"/>
+        <w:gridCol w:w="7748"/>
+      </w:tblGrid>
+      <w:tr>
+        <w:trPr>
+          <w:tblHeader w:val="on"/>
+        </w:trPr>
+        <w:tc>
+          <w:tcPr>
+            <w:tcW w:type="dxa" w:w="2332"/>
+          </w:tcPr>
+          <w:p>
+            <w:pPr>
+              <w:pStyle w:val="Compact"/>
+            </w:pPr>
+            <w:r>
+              <w:t xml:space="preserve">Change</w:t>
+            </w:r>
+          </w:p>
+        </w:tc>
+        <w:tc>
+          <w:tcPr>
+            <w:tcW w:type="dxa" w:w="7748"/>
+          </w:tcPr>
+          <w:p>
+            <w:pPr>
+              <w:pStyle w:val="Compact"/>
+            </w:pPr>
+            <w:r>
+              <w:t xml:space="preserve">How</w:t>
+            </w:r>
+          </w:p>
+        </w:tc>
+      </w:tr>
+      <w:tr>
+        <w:tc>
+          <w:tcPr>
+            <w:tcW w:type="dxa" w:w="2332"/>
+          </w:tcPr>
+          <w:p>
+            <w:pPr>
+              <w:pStyle w:val="Compact"/>
+            </w:pPr>
+            <w:r>
+              <w:t xml:space="preserve">Single region → DR/HA</w:t>
+            </w:r>
+          </w:p>
+        </w:tc>
+        <w:tc>
+          <w:tcPr>
+            <w:tcW w:type="dxa" w:w="7748"/>
+          </w:tcPr>
+          <w:p>
+            <w:pPr>
+              <w:pStyle w:val="Compact"/>
+            </w:pPr>
+            <w:r>
+              <w:t xml:space="preserve">Add the secondary region: deploy the regional stacks there in standby (DR) or active (HA), start replication, run readiness checks</w:t>
+            </w:r>
+          </w:p>
+        </w:tc>
+      </w:tr>
+      <w:tr>
+        <w:tc>
+          <w:tcPr>
+            <w:tcW w:type="dxa" w:w="2332"/>
+          </w:tcPr>
+          <w:p>
+            <w:pPr>
+              <w:pStyle w:val="Compact"/>
+            </w:pPr>
+            <w:r>
+              <w:t xml:space="preserve">Change the</w:t>
+            </w:r>
+            <w:r>
+              <w:t xml:space="preserve"> </w:t>
+            </w:r>
+            <w:r>
+              <w:rPr>
+                <w:b/>
+                <w:bCs/>
+              </w:rPr>
+              <w:t xml:space="preserve">secondary</w:t>
+            </w:r>
+            <w:r>
+              <w:t xml:space="preserve"> </w:t>
+            </w:r>
+            <w:r>
+              <w:t xml:space="preserve">region</w:t>
+            </w:r>
+          </w:p>
+        </w:tc>
+        <w:tc>
+          <w:tcPr>
+            <w:tcW w:type="dxa" w:w="7748"/>
+          </w:tcPr>
+          <w:p>
+            <w:pPr>
+              <w:pStyle w:val="Compact"/>
+            </w:pPr>
+            <w:r>
+              <w:t xml:space="preserve">Build the new secondary and wait for replication to catch up; switch the pair; then retire the old secondary</w:t>
+            </w:r>
+          </w:p>
+        </w:tc>
+      </w:tr>
+      <w:tr>
+        <w:tc>
+          <w:tcPr>
+            <w:tcW w:type="dxa" w:w="2332"/>
+          </w:tcPr>
+          <w:p>
+            <w:pPr>
+              <w:pStyle w:val="Compact"/>
+            </w:pPr>
+            <w:r>
+              <w:t xml:space="preserve">Change the</w:t>
+            </w:r>
+            <w:r>
+              <w:t xml:space="preserve"> </w:t>
+            </w:r>
+            <w:r>
+              <w:rPr>
+                <w:b/>
+                <w:bCs/>
+              </w:rPr>
+              <w:t xml:space="preserve">primary</w:t>
+            </w:r>
+            <w:r>
+              <w:t xml:space="preserve"> </w:t>
+            </w:r>
+            <w:r>
+              <w:t xml:space="preserve">region</w:t>
+            </w:r>
+          </w:p>
+        </w:tc>
+        <w:tc>
+          <w:tcPr>
+            <w:tcW w:type="dxa" w:w="7748"/>
+          </w:tcPr>
+          <w:p>
+            <w:pPr>
+              <w:pStyle w:val="Compact"/>
+            </w:pPr>
+            <w:r>
+              <w:t xml:space="preserve">A</w:t>
+            </w:r>
+            <w:r>
+              <w:t xml:space="preserve"> </w:t>
+            </w:r>
+            <w:r>
+              <w:rPr>
+                <w:b/>
+                <w:bCs/>
+              </w:rPr>
+              <w:t xml:space="preserve">planned switchover</w:t>
+            </w:r>
+            <w:r>
+              <w:t xml:space="preserve"> </w:t>
+            </w:r>
+            <w:r>
+              <w:t xml:space="preserve">(§10.6) to the secondary, then the old primary is rebuilt or retired. It is treated as a PROD release with approvals and a DR drill beforehand</w:t>
+            </w:r>
+          </w:p>
+        </w:tc>
+      </w:tr>
+    </w:tbl>
+    <w:p>
+      <w:pPr>
+        <w:pStyle w:val="BodyText"/>
+      </w:pPr>
+      <w:r>
+        <w:rPr>
+          <w:b/>
+          <w:bCs/>
+        </w:rPr>
+        <w:t xml:space="preserve">GitHub variables</w:t>
+      </w:r>
+      <w:r>
+        <w:t xml:space="preserve"> </w:t>
+      </w:r>
+      <w:r>
+        <w:t xml:space="preserve">(§10.5) carry the selection per environment:</w:t>
+      </w:r>
+      <w:r>
+        <w:t xml:space="preserve"> </w:t>
+      </w:r>
+      <w:r>
+        <w:rPr>
+          <w:rStyle w:val="VerbatimChar"/>
+        </w:rPr>
+        <w:t xml:space="preserve">AWS_PRIMARY_REGION</w:t>
+      </w:r>
+      <w:r>
+        <w:t xml:space="preserve">,</w:t>
+      </w:r>
+      <w:r>
+        <w:t xml:space="preserve"> </w:t>
+      </w:r>
+      <w:r>
+        <w:rPr>
+          <w:rStyle w:val="VerbatimChar"/>
+        </w:rPr>
+        <w:t xml:space="preserve">AWS_SECONDARY_REGION</w:t>
+      </w:r>
+      <w:r>
+        <w:t xml:space="preserve">, and the regional artifact buckets. The platform updates them when a pair changes. Workflows contain no region names.</w:t>
+      </w:r>
+    </w:p>
+    <w:p>
+      <w:pPr>
+        <w:pStyle w:val="Heading2"/>
+      </w:pPr>
+      <w:r>
         <w:t xml:space="preserve">10.8 Platform control plane is multi-region too</w:t>
       </w:r>
     </w:p>
@@ -43122,8 +44359,8 @@
       </w:tblPr>
       <w:tblGrid>
         <w:gridCol w:w="950"/>
-        <w:gridCol w:w="2373"/>
-        <w:gridCol w:w="6757"/>
+        <w:gridCol w:w="2364"/>
+        <w:gridCol w:w="6766"/>
       </w:tblGrid>
       <w:tr>
         <w:trPr>
@@ -43144,7 +44381,7 @@
         </w:tc>
         <w:tc>
           <w:tcPr>
-            <w:tcW w:type="dxa" w:w="2373"/>
+            <w:tcW w:type="dxa" w:w="2364"/>
           </w:tcPr>
           <w:p>
             <w:pPr>
@@ -43157,7 +44394,7 @@
         </w:tc>
         <w:tc>
           <w:tcPr>
-            <w:tcW w:type="dxa" w:w="6757"/>
+            <w:tcW w:type="dxa" w:w="6766"/>
           </w:tcPr>
           <w:p>
             <w:pPr>
@@ -43185,7 +44422,7 @@
         </w:tc>
         <w:tc>
           <w:tcPr>
-            <w:tcW w:type="dxa" w:w="2373"/>
+            <w:tcW w:type="dxa" w:w="2364"/>
           </w:tcPr>
           <w:p>
             <w:pPr>
@@ -43198,7 +44435,7 @@
         </w:tc>
         <w:tc>
           <w:tcPr>
-            <w:tcW w:type="dxa" w:w="6757"/>
+            <w:tcW w:type="dxa" w:w="6766"/>
           </w:tcPr>
           <w:p>
             <w:pPr>
@@ -43230,7 +44467,7 @@
         </w:tc>
         <w:tc>
           <w:tcPr>
-            <w:tcW w:type="dxa" w:w="2373"/>
+            <w:tcW w:type="dxa" w:w="2364"/>
           </w:tcPr>
           <w:p>
             <w:pPr>
@@ -43243,7 +44480,7 @@
         </w:tc>
         <w:tc>
           <w:tcPr>
-            <w:tcW w:type="dxa" w:w="6757"/>
+            <w:tcW w:type="dxa" w:w="6766"/>
           </w:tcPr>
           <w:p>
             <w:pPr>
@@ -43281,7 +44518,7 @@
         </w:tc>
         <w:tc>
           <w:tcPr>
-            <w:tcW w:type="dxa" w:w="2373"/>
+            <w:tcW w:type="dxa" w:w="2364"/>
           </w:tcPr>
           <w:p>
             <w:pPr>
@@ -43294,7 +44531,7 @@
         </w:tc>
         <w:tc>
           <w:tcPr>
-            <w:tcW w:type="dxa" w:w="6757"/>
+            <w:tcW w:type="dxa" w:w="6766"/>
           </w:tcPr>
           <w:p>
             <w:pPr>
@@ -43340,7 +44577,7 @@
         </w:tc>
         <w:tc>
           <w:tcPr>
-            <w:tcW w:type="dxa" w:w="2373"/>
+            <w:tcW w:type="dxa" w:w="2364"/>
           </w:tcPr>
           <w:p>
             <w:pPr>
@@ -43353,7 +44590,7 @@
         </w:tc>
         <w:tc>
           <w:tcPr>
-            <w:tcW w:type="dxa" w:w="6757"/>
+            <w:tcW w:type="dxa" w:w="6766"/>
           </w:tcPr>
           <w:p>
             <w:pPr>
@@ -43391,7 +44628,7 @@
         </w:tc>
         <w:tc>
           <w:tcPr>
-            <w:tcW w:type="dxa" w:w="2373"/>
+            <w:tcW w:type="dxa" w:w="2364"/>
           </w:tcPr>
           <w:p>
             <w:pPr>
@@ -43404,7 +44641,7 @@
         </w:tc>
         <w:tc>
           <w:tcPr>
-            <w:tcW w:type="dxa" w:w="6757"/>
+            <w:tcW w:type="dxa" w:w="6766"/>
           </w:tcPr>
           <w:p>
             <w:pPr>
@@ -43442,7 +44679,7 @@
         </w:tc>
         <w:tc>
           <w:tcPr>
-            <w:tcW w:type="dxa" w:w="2373"/>
+            <w:tcW w:type="dxa" w:w="2364"/>
           </w:tcPr>
           <w:p>
             <w:pPr>
@@ -43455,7 +44692,7 @@
         </w:tc>
         <w:tc>
           <w:tcPr>
-            <w:tcW w:type="dxa" w:w="6757"/>
+            <w:tcW w:type="dxa" w:w="6766"/>
           </w:tcPr>
           <w:p>
             <w:pPr>
@@ -43490,7 +44727,7 @@
         </w:tc>
         <w:tc>
           <w:tcPr>
-            <w:tcW w:type="dxa" w:w="2373"/>
+            <w:tcW w:type="dxa" w:w="2364"/>
           </w:tcPr>
           <w:p>
             <w:pPr>
@@ -43503,7 +44740,7 @@
         </w:tc>
         <w:tc>
           <w:tcPr>
-            <w:tcW w:type="dxa" w:w="6757"/>
+            <w:tcW w:type="dxa" w:w="6766"/>
           </w:tcPr>
           <w:p>
             <w:pPr>
@@ -43541,7 +44778,7 @@
         </w:tc>
         <w:tc>
           <w:tcPr>
-            <w:tcW w:type="dxa" w:w="2373"/>
+            <w:tcW w:type="dxa" w:w="2364"/>
           </w:tcPr>
           <w:p>
             <w:pPr>
@@ -43554,7 +44791,7 @@
         </w:tc>
         <w:tc>
           <w:tcPr>
-            <w:tcW w:type="dxa" w:w="6757"/>
+            <w:tcW w:type="dxa" w:w="6766"/>
           </w:tcPr>
           <w:p>
             <w:pPr>
@@ -43582,7 +44819,7 @@
         </w:tc>
         <w:tc>
           <w:tcPr>
-            <w:tcW w:type="dxa" w:w="2373"/>
+            <w:tcW w:type="dxa" w:w="2364"/>
           </w:tcPr>
           <w:p>
             <w:pPr>
@@ -43595,7 +44832,7 @@
         </w:tc>
         <w:tc>
           <w:tcPr>
-            <w:tcW w:type="dxa" w:w="6757"/>
+            <w:tcW w:type="dxa" w:w="6766"/>
           </w:tcPr>
           <w:p>
             <w:pPr>
@@ -43633,7 +44870,7 @@
         </w:tc>
         <w:tc>
           <w:tcPr>
-            <w:tcW w:type="dxa" w:w="2373"/>
+            <w:tcW w:type="dxa" w:w="2364"/>
           </w:tcPr>
           <w:p>
             <w:pPr>
@@ -43646,7 +44883,7 @@
         </w:tc>
         <w:tc>
           <w:tcPr>
-            <w:tcW w:type="dxa" w:w="6757"/>
+            <w:tcW w:type="dxa" w:w="6766"/>
           </w:tcPr>
           <w:p>
             <w:pPr>
@@ -43674,7 +44911,7 @@
         </w:tc>
         <w:tc>
           <w:tcPr>
-            <w:tcW w:type="dxa" w:w="2373"/>
+            <w:tcW w:type="dxa" w:w="2364"/>
           </w:tcPr>
           <w:p>
             <w:pPr>
@@ -43687,7 +44924,7 @@
         </w:tc>
         <w:tc>
           <w:tcPr>
-            <w:tcW w:type="dxa" w:w="6757"/>
+            <w:tcW w:type="dxa" w:w="6766"/>
           </w:tcPr>
           <w:p>
             <w:pPr>
@@ -43730,7 +44967,7 @@
         </w:tc>
         <w:tc>
           <w:tcPr>
-            <w:tcW w:type="dxa" w:w="2373"/>
+            <w:tcW w:type="dxa" w:w="2364"/>
           </w:tcPr>
           <w:p>
             <w:pPr>
@@ -43743,7 +44980,7 @@
         </w:tc>
         <w:tc>
           <w:tcPr>
-            <w:tcW w:type="dxa" w:w="6757"/>
+            <w:tcW w:type="dxa" w:w="6766"/>
           </w:tcPr>
           <w:p>
             <w:pPr>
@@ -43771,7 +45008,7 @@
         </w:tc>
         <w:tc>
           <w:tcPr>
-            <w:tcW w:type="dxa" w:w="2373"/>
+            <w:tcW w:type="dxa" w:w="2364"/>
           </w:tcPr>
           <w:p>
             <w:pPr>
@@ -43784,7 +45021,7 @@
         </w:tc>
         <w:tc>
           <w:tcPr>
-            <w:tcW w:type="dxa" w:w="6757"/>
+            <w:tcW w:type="dxa" w:w="6766"/>
           </w:tcPr>
           <w:p>
             <w:pPr>
@@ -43822,7 +45059,7 @@
         </w:tc>
         <w:tc>
           <w:tcPr>
-            <w:tcW w:type="dxa" w:w="2373"/>
+            <w:tcW w:type="dxa" w:w="2364"/>
           </w:tcPr>
           <w:p>
             <w:pPr>
@@ -43835,7 +45072,7 @@
         </w:tc>
         <w:tc>
           <w:tcPr>
-            <w:tcW w:type="dxa" w:w="6757"/>
+            <w:tcW w:type="dxa" w:w="6766"/>
           </w:tcPr>
           <w:p>
             <w:pPr>
@@ -43879,7 +45116,7 @@
         </w:tc>
         <w:tc>
           <w:tcPr>
-            <w:tcW w:type="dxa" w:w="2373"/>
+            <w:tcW w:type="dxa" w:w="2364"/>
           </w:tcPr>
           <w:p>
             <w:pPr>
@@ -43892,7 +45129,7 @@
         </w:tc>
         <w:tc>
           <w:tcPr>
-            <w:tcW w:type="dxa" w:w="6757"/>
+            <w:tcW w:type="dxa" w:w="6766"/>
           </w:tcPr>
           <w:p>
             <w:pPr>
@@ -43920,7 +45157,7 @@
         </w:tc>
         <w:tc>
           <w:tcPr>
-            <w:tcW w:type="dxa" w:w="2373"/>
+            <w:tcW w:type="dxa" w:w="2364"/>
           </w:tcPr>
           <w:p>
             <w:pPr>
@@ -43933,7 +45170,7 @@
         </w:tc>
         <w:tc>
           <w:tcPr>
-            <w:tcW w:type="dxa" w:w="6757"/>
+            <w:tcW w:type="dxa" w:w="6766"/>
           </w:tcPr>
           <w:p>
             <w:pPr>
@@ -43961,7 +45198,7 @@
         </w:tc>
         <w:tc>
           <w:tcPr>
-            <w:tcW w:type="dxa" w:w="2373"/>
+            <w:tcW w:type="dxa" w:w="2364"/>
           </w:tcPr>
           <w:p>
             <w:pPr>
@@ -43974,7 +45211,7 @@
         </w:tc>
         <w:tc>
           <w:tcPr>
-            <w:tcW w:type="dxa" w:w="6757"/>
+            <w:tcW w:type="dxa" w:w="6766"/>
           </w:tcPr>
           <w:p>
             <w:pPr>
@@ -44002,7 +45239,7 @@
         </w:tc>
         <w:tc>
           <w:tcPr>
-            <w:tcW w:type="dxa" w:w="2373"/>
+            <w:tcW w:type="dxa" w:w="2364"/>
           </w:tcPr>
           <w:p>
             <w:pPr>
@@ -44015,7 +45252,7 @@
         </w:tc>
         <w:tc>
           <w:tcPr>
-            <w:tcW w:type="dxa" w:w="6757"/>
+            <w:tcW w:type="dxa" w:w="6766"/>
           </w:tcPr>
           <w:p>
             <w:pPr>
@@ -44053,7 +45290,7 @@
         </w:tc>
         <w:tc>
           <w:tcPr>
-            <w:tcW w:type="dxa" w:w="2373"/>
+            <w:tcW w:type="dxa" w:w="2364"/>
           </w:tcPr>
           <w:p>
             <w:pPr>
@@ -44066,7 +45303,7 @@
         </w:tc>
         <w:tc>
           <w:tcPr>
-            <w:tcW w:type="dxa" w:w="6757"/>
+            <w:tcW w:type="dxa" w:w="6766"/>
           </w:tcPr>
           <w:p>
             <w:pPr>
@@ -44094,7 +45331,7 @@
         </w:tc>
         <w:tc>
           <w:tcPr>
-            <w:tcW w:type="dxa" w:w="2373"/>
+            <w:tcW w:type="dxa" w:w="2364"/>
           </w:tcPr>
           <w:p>
             <w:pPr>
@@ -44107,7 +45344,7 @@
         </w:tc>
         <w:tc>
           <w:tcPr>
-            <w:tcW w:type="dxa" w:w="6757"/>
+            <w:tcW w:type="dxa" w:w="6766"/>
           </w:tcPr>
           <w:p>
             <w:pPr>
@@ -44157,7 +45394,7 @@
         </w:tc>
         <w:tc>
           <w:tcPr>
-            <w:tcW w:type="dxa" w:w="2373"/>
+            <w:tcW w:type="dxa" w:w="2364"/>
           </w:tcPr>
           <w:p>
             <w:pPr>
@@ -44170,7 +45407,7 @@
         </w:tc>
         <w:tc>
           <w:tcPr>
-            <w:tcW w:type="dxa" w:w="6757"/>
+            <w:tcW w:type="dxa" w:w="6766"/>
           </w:tcPr>
           <w:p>
             <w:pPr>
@@ -44198,7 +45435,7 @@
         </w:tc>
         <w:tc>
           <w:tcPr>
-            <w:tcW w:type="dxa" w:w="2373"/>
+            <w:tcW w:type="dxa" w:w="2364"/>
           </w:tcPr>
           <w:p>
             <w:pPr>
@@ -44211,7 +45448,7 @@
         </w:tc>
         <w:tc>
           <w:tcPr>
-            <w:tcW w:type="dxa" w:w="6757"/>
+            <w:tcW w:type="dxa" w:w="6766"/>
           </w:tcPr>
           <w:p>
             <w:pPr>
@@ -44251,7 +45488,7 @@
         </w:tc>
         <w:tc>
           <w:tcPr>
-            <w:tcW w:type="dxa" w:w="2373"/>
+            <w:tcW w:type="dxa" w:w="2364"/>
           </w:tcPr>
           <w:p>
             <w:pPr>
@@ -44264,7 +45501,7 @@
         </w:tc>
         <w:tc>
           <w:tcPr>
-            <w:tcW w:type="dxa" w:w="6757"/>
+            <w:tcW w:type="dxa" w:w="6766"/>
           </w:tcPr>
           <w:p>
             <w:pPr>
@@ -44292,7 +45529,7 @@
         </w:tc>
         <w:tc>
           <w:tcPr>
-            <w:tcW w:type="dxa" w:w="2373"/>
+            <w:tcW w:type="dxa" w:w="2364"/>
           </w:tcPr>
           <w:p>
             <w:pPr>
@@ -44305,7 +45542,7 @@
         </w:tc>
         <w:tc>
           <w:tcPr>
-            <w:tcW w:type="dxa" w:w="6757"/>
+            <w:tcW w:type="dxa" w:w="6766"/>
           </w:tcPr>
           <w:p>
             <w:pPr>
@@ -44333,7 +45570,7 @@
         </w:tc>
         <w:tc>
           <w:tcPr>
-            <w:tcW w:type="dxa" w:w="2373"/>
+            <w:tcW w:type="dxa" w:w="2364"/>
           </w:tcPr>
           <w:p>
             <w:pPr>
@@ -44346,7 +45583,7 @@
         </w:tc>
         <w:tc>
           <w:tcPr>
-            <w:tcW w:type="dxa" w:w="6757"/>
+            <w:tcW w:type="dxa" w:w="6766"/>
           </w:tcPr>
           <w:p>
             <w:pPr>
@@ -44374,7 +45611,7 @@
         </w:tc>
         <w:tc>
           <w:tcPr>
-            <w:tcW w:type="dxa" w:w="2373"/>
+            <w:tcW w:type="dxa" w:w="2364"/>
           </w:tcPr>
           <w:p>
             <w:pPr>
@@ -44387,7 +45624,7 @@
         </w:tc>
         <w:tc>
           <w:tcPr>
-            <w:tcW w:type="dxa" w:w="6757"/>
+            <w:tcW w:type="dxa" w:w="6766"/>
           </w:tcPr>
           <w:p>
             <w:pPr>
@@ -44415,7 +45652,7 @@
         </w:tc>
         <w:tc>
           <w:tcPr>
-            <w:tcW w:type="dxa" w:w="2373"/>
+            <w:tcW w:type="dxa" w:w="2364"/>
           </w:tcPr>
           <w:p>
             <w:pPr>
@@ -44428,7 +45665,7 @@
         </w:tc>
         <w:tc>
           <w:tcPr>
-            <w:tcW w:type="dxa" w:w="6757"/>
+            <w:tcW w:type="dxa" w:w="6766"/>
           </w:tcPr>
           <w:p>
             <w:pPr>
@@ -44456,7 +45693,7 @@
         </w:tc>
         <w:tc>
           <w:tcPr>
-            <w:tcW w:type="dxa" w:w="2373"/>
+            <w:tcW w:type="dxa" w:w="2364"/>
           </w:tcPr>
           <w:p>
             <w:pPr>
@@ -44469,7 +45706,7 @@
         </w:tc>
         <w:tc>
           <w:tcPr>
-            <w:tcW w:type="dxa" w:w="6757"/>
+            <w:tcW w:type="dxa" w:w="6766"/>
           </w:tcPr>
           <w:p>
             <w:pPr>
@@ -44497,20 +45734,20 @@
         </w:tc>
         <w:tc>
           <w:tcPr>
-            <w:tcW w:type="dxa" w:w="2373"/>
-          </w:tcPr>
-          <w:p>
-            <w:pPr>
-              <w:pStyle w:val="Compact"/>
-            </w:pPr>
-            <w:r>
-              <w:t xml:space="preserve">Default region pair</w:t>
-            </w:r>
-          </w:p>
-        </w:tc>
-        <w:tc>
-          <w:tcPr>
-            <w:tcW w:type="dxa" w:w="6757"/>
+            <w:tcW w:type="dxa" w:w="2364"/>
+          </w:tcPr>
+          <w:p>
+            <w:pPr>
+              <w:pStyle w:val="Compact"/>
+            </w:pPr>
+            <w:r>
+              <w:t xml:space="preserve">Region pairs</w:t>
+            </w:r>
+          </w:p>
+        </w:tc>
+        <w:tc>
+          <w:tcPr>
+            <w:tcW w:type="dxa" w:w="6766"/>
           </w:tcPr>
           <w:p>
             <w:pPr>
@@ -44521,13 +45758,13 @@
                 <w:b/>
                 <w:bCs/>
               </w:rPr>
-              <w:t xml:space="preserve">us-east-1 (primary) / us-east-2 (secondary)</w:t>
-            </w:r>
-            <w:r>
-              <w:t xml:space="preserve"> </w:t>
-            </w:r>
-            <w:r>
-              <w:t xml:space="preserve">as default; any other allowed pairs?</w:t>
+              <w:t xml:space="preserve">Decided:</w:t>
+            </w:r>
+            <w:r>
+              <w:t xml:space="preserve"> </w:t>
+            </w:r>
+            <w:r>
+              <w:t xml:space="preserve">any two different regions, chosen in the UI per project; default pre-fill us-east-1 / us-east-2; admins manage the enabled-region list</w:t>
             </w:r>
           </w:p>
         </w:tc>
@@ -44548,7 +45785,7 @@
         </w:tc>
         <w:tc>
           <w:tcPr>
-            <w:tcW w:type="dxa" w:w="2373"/>
+            <w:tcW w:type="dxa" w:w="2364"/>
           </w:tcPr>
           <w:p>
             <w:pPr>
@@ -44561,7 +45798,7 @@
         </w:tc>
         <w:tc>
           <w:tcPr>
-            <w:tcW w:type="dxa" w:w="6757"/>
+            <w:tcW w:type="dxa" w:w="6766"/>
           </w:tcPr>
           <w:p>
             <w:pPr>
@@ -44589,7 +45826,7 @@
         </w:tc>
         <w:tc>
           <w:tcPr>
-            <w:tcW w:type="dxa" w:w="2373"/>
+            <w:tcW w:type="dxa" w:w="2364"/>
           </w:tcPr>
           <w:p>
             <w:pPr>
@@ -44602,7 +45839,7 @@
         </w:tc>
         <w:tc>
           <w:tcPr>
-            <w:tcW w:type="dxa" w:w="6757"/>
+            <w:tcW w:type="dxa" w:w="6766"/>
           </w:tcPr>
           <w:p>
             <w:pPr>
@@ -44630,7 +45867,7 @@
         </w:tc>
         <w:tc>
           <w:tcPr>
-            <w:tcW w:type="dxa" w:w="2373"/>
+            <w:tcW w:type="dxa" w:w="2364"/>
           </w:tcPr>
           <w:p>
             <w:pPr>
@@ -44643,7 +45880,7 @@
         </w:tc>
         <w:tc>
           <w:tcPr>
-            <w:tcW w:type="dxa" w:w="6757"/>
+            <w:tcW w:type="dxa" w:w="6766"/>
           </w:tcPr>
           <w:p>
             <w:pPr>
@@ -44671,7 +45908,7 @@
         </w:tc>
         <w:tc>
           <w:tcPr>
-            <w:tcW w:type="dxa" w:w="2373"/>
+            <w:tcW w:type="dxa" w:w="2364"/>
           </w:tcPr>
           <w:p>
             <w:pPr>
@@ -44684,7 +45921,7 @@
         </w:tc>
         <w:tc>
           <w:tcPr>
-            <w:tcW w:type="dxa" w:w="6757"/>
+            <w:tcW w:type="dxa" w:w="6766"/>
           </w:tcPr>
           <w:p>
             <w:pPr>

</xml_diff>

<commit_message>
Mark region decision as decided and order decisions table
</commit_message>
<xml_diff>
--- a/docs/CloudInfraAutomation-Architecture.docx
+++ b/docs/CloudInfraAutomation-Architecture.docx
@@ -44890,155 +44890,17 @@
               <w:pStyle w:val="Compact"/>
             </w:pPr>
             <w:r>
-              <w:t xml:space="preserve">Single region in v1, or multi-region from the start?</w:t>
-            </w:r>
-          </w:p>
-        </w:tc>
-      </w:tr>
-      <w:tr>
-        <w:tc>
-          <w:tcPr>
-            <w:tcW w:type="dxa" w:w="950"/>
-          </w:tcPr>
-          <w:p>
-            <w:pPr>
-              <w:pStyle w:val="Compact"/>
-            </w:pPr>
-            <w:r>
-              <w:t xml:space="preserve">D11</w:t>
-            </w:r>
-          </w:p>
-        </w:tc>
-        <w:tc>
-          <w:tcPr>
-            <w:tcW w:type="dxa" w:w="2364"/>
-          </w:tcPr>
-          <w:p>
-            <w:pPr>
-              <w:pStyle w:val="Compact"/>
-            </w:pPr>
-            <w:r>
-              <w:t xml:space="preserve">Onboarded today?</w:t>
-            </w:r>
-          </w:p>
-        </w:tc>
-        <w:tc>
-          <w:tcPr>
-            <w:tcW w:type="dxa" w:w="6766"/>
-          </w:tcPr>
-          <w:p>
-            <w:pPr>
-              <w:pStyle w:val="Compact"/>
-            </w:pPr>
-            <w:r>
-              <w:t xml:space="preserve">Do Control Tower / OUs per environment already exist, or does</w:t>
-            </w:r>
-            <w:r>
-              <w:t xml:space="preserve"> </w:t>
-            </w:r>
-            <w:r>
-              <w:rPr>
-                <w:rStyle w:val="VerbatimChar"/>
-              </w:rPr>
-              <w:t xml:space="preserve">org/</w:t>
-            </w:r>
-            <w:r>
-              <w:t xml:space="preserve"> </w:t>
-            </w:r>
-            <w:r>
-              <w:t xml:space="preserve">need to create the OU structure too?</w:t>
-            </w:r>
-          </w:p>
-        </w:tc>
-      </w:tr>
-      <w:tr>
-        <w:tc>
-          <w:tcPr>
-            <w:tcW w:type="dxa" w:w="950"/>
-          </w:tcPr>
-          <w:p>
-            <w:pPr>
-              <w:pStyle w:val="Compact"/>
-            </w:pPr>
-            <w:r>
-              <w:t xml:space="preserve">D12</w:t>
-            </w:r>
-          </w:p>
-        </w:tc>
-        <w:tc>
-          <w:tcPr>
-            <w:tcW w:type="dxa" w:w="2364"/>
-          </w:tcPr>
-          <w:p>
-            <w:pPr>
-              <w:pStyle w:val="Compact"/>
-            </w:pPr>
-            <w:r>
-              <w:t xml:space="preserve">LLM</w:t>
-            </w:r>
-          </w:p>
-        </w:tc>
-        <w:tc>
-          <w:tcPr>
-            <w:tcW w:type="dxa" w:w="6766"/>
-          </w:tcPr>
-          <w:p>
-            <w:pPr>
-              <w:pStyle w:val="Compact"/>
-            </w:pPr>
-            <w:r>
-              <w:t xml:space="preserve">Exclude from v1, or NL → draft payload only?</w:t>
-            </w:r>
-          </w:p>
-        </w:tc>
-      </w:tr>
-      <w:tr>
-        <w:tc>
-          <w:tcPr>
-            <w:tcW w:type="dxa" w:w="950"/>
-          </w:tcPr>
-          <w:p>
-            <w:pPr>
-              <w:pStyle w:val="Compact"/>
-            </w:pPr>
-            <w:r>
-              <w:t xml:space="preserve">D13</w:t>
-            </w:r>
-          </w:p>
-        </w:tc>
-        <w:tc>
-          <w:tcPr>
-            <w:tcW w:type="dxa" w:w="2364"/>
-          </w:tcPr>
-          <w:p>
-            <w:pPr>
-              <w:pStyle w:val="Compact"/>
-            </w:pPr>
-            <w:r>
-              <w:t xml:space="preserve">Who can configure environments and accounts</w:t>
-            </w:r>
-          </w:p>
-        </w:tc>
-        <w:tc>
-          <w:tcPr>
-            <w:tcW w:type="dxa" w:w="6766"/>
-          </w:tcPr>
-          <w:p>
-            <w:pPr>
-              <w:pStyle w:val="Compact"/>
-            </w:pPr>
-            <w:r>
               <w:rPr>
                 <w:b/>
                 <w:bCs/>
               </w:rPr>
-              <w:t xml:space="preserve">Platform admins only, with a second-person approval</w:t>
-            </w:r>
-            <w:r>
-              <w:t xml:space="preserve"> </w:t>
-            </w:r>
-            <w:r>
-              <w:t xml:space="preserve">for changes to production-tier environments. Normal users see environments read-only. (If you meant every user should configure them, note that whoever binds an account decides where code deploys.)</w:t>
+              <w:t xml:space="preserve">Decided:</w:t>
+            </w:r>
+            <w:r>
+              <w:t xml:space="preserve"> </w:t>
+            </w:r>
+            <w:r>
+              <w:t xml:space="preserve">multi-region from the start: single region, DR or HA per project, any region pair chosen in the UI (§10)</w:t>
             </w:r>
           </w:p>
         </w:tc>
@@ -45053,7 +44915,7 @@
               <w:pStyle w:val="Compact"/>
             </w:pPr>
             <w:r>
-              <w:t xml:space="preserve">D14</w:t>
+              <w:t xml:space="preserve">D11</w:t>
             </w:r>
           </w:p>
         </w:tc>
@@ -45066,7 +44928,7 @@
               <w:pStyle w:val="Compact"/>
             </w:pPr>
             <w:r>
-              <w:t xml:space="preserve">Binding scope</w:t>
+              <w:t xml:space="preserve">Onboarded today?</w:t>
             </w:r>
           </w:p>
         </w:tc>
@@ -45079,23 +44941,114 @@
               <w:pStyle w:val="Compact"/>
             </w:pPr>
             <w:r>
-              <w:t xml:space="preserve">Bind accounts per</w:t>
-            </w:r>
-            <w:r>
-              <w:t xml:space="preserve"> </w:t>
-            </w:r>
+              <w:t xml:space="preserve">Do Control Tower / OUs per environment already exist, or does</w:t>
+            </w:r>
+            <w:r>
+              <w:t xml:space="preserve"> </w:t>
+            </w:r>
+            <w:r>
+              <w:rPr>
+                <w:rStyle w:val="VerbatimChar"/>
+              </w:rPr>
+              <w:t xml:space="preserve">org/</w:t>
+            </w:r>
+            <w:r>
+              <w:t xml:space="preserve"> </w:t>
+            </w:r>
+            <w:r>
+              <w:t xml:space="preserve">need to create the OU structure too?</w:t>
+            </w:r>
+          </w:p>
+        </w:tc>
+      </w:tr>
+      <w:tr>
+        <w:tc>
+          <w:tcPr>
+            <w:tcW w:type="dxa" w:w="950"/>
+          </w:tcPr>
+          <w:p>
+            <w:pPr>
+              <w:pStyle w:val="Compact"/>
+            </w:pPr>
+            <w:r>
+              <w:t xml:space="preserve">D12</w:t>
+            </w:r>
+          </w:p>
+        </w:tc>
+        <w:tc>
+          <w:tcPr>
+            <w:tcW w:type="dxa" w:w="2364"/>
+          </w:tcPr>
+          <w:p>
+            <w:pPr>
+              <w:pStyle w:val="Compact"/>
+            </w:pPr>
+            <w:r>
+              <w:t xml:space="preserve">LLM</w:t>
+            </w:r>
+          </w:p>
+        </w:tc>
+        <w:tc>
+          <w:tcPr>
+            <w:tcW w:type="dxa" w:w="6766"/>
+          </w:tcPr>
+          <w:p>
+            <w:pPr>
+              <w:pStyle w:val="Compact"/>
+            </w:pPr>
+            <w:r>
+              <w:t xml:space="preserve">Exclude from v1, or NL → draft payload only?</w:t>
+            </w:r>
+          </w:p>
+        </w:tc>
+      </w:tr>
+      <w:tr>
+        <w:tc>
+          <w:tcPr>
+            <w:tcW w:type="dxa" w:w="950"/>
+          </w:tcPr>
+          <w:p>
+            <w:pPr>
+              <w:pStyle w:val="Compact"/>
+            </w:pPr>
+            <w:r>
+              <w:t xml:space="preserve">D13</w:t>
+            </w:r>
+          </w:p>
+        </w:tc>
+        <w:tc>
+          <w:tcPr>
+            <w:tcW w:type="dxa" w:w="2364"/>
+          </w:tcPr>
+          <w:p>
+            <w:pPr>
+              <w:pStyle w:val="Compact"/>
+            </w:pPr>
+            <w:r>
+              <w:t xml:space="preserve">Who can configure environments and accounts</w:t>
+            </w:r>
+          </w:p>
+        </w:tc>
+        <w:tc>
+          <w:tcPr>
+            <w:tcW w:type="dxa" w:w="6766"/>
+          </w:tcPr>
+          <w:p>
+            <w:pPr>
+              <w:pStyle w:val="Compact"/>
+            </w:pPr>
             <w:r>
               <w:rPr>
                 <w:b/>
                 <w:bCs/>
               </w:rPr>
-              <w:t xml:space="preserve">portfolio</w:t>
-            </w:r>
-            <w:r>
-              <w:t xml:space="preserve"> </w:t>
-            </w:r>
-            <w:r>
-              <w:t xml:space="preserve">by default, with a per-product override (matches D6), or per product only?</w:t>
+              <w:t xml:space="preserve">Platform admins only, with a second-person approval</w:t>
+            </w:r>
+            <w:r>
+              <w:t xml:space="preserve"> </w:t>
+            </w:r>
+            <w:r>
+              <w:t xml:space="preserve">for changes to production-tier environments. Normal users see environments read-only. (If you meant every user should configure them, note that whoever binds an account decides where code deploys.)</w:t>
             </w:r>
           </w:p>
         </w:tc>
@@ -45110,7 +45063,7 @@
               <w:pStyle w:val="Compact"/>
             </w:pPr>
             <w:r>
-              <w:t xml:space="preserve">D15</w:t>
+              <w:t xml:space="preserve">D14</w:t>
             </w:r>
           </w:p>
         </w:tc>
@@ -45123,7 +45076,7 @@
               <w:pStyle w:val="Compact"/>
             </w:pPr>
             <w:r>
-              <w:t xml:space="preserve">GitHub plan</w:t>
+              <w:t xml:space="preserve">Binding scope</w:t>
             </w:r>
           </w:p>
         </w:tc>
@@ -45136,140 +45089,23 @@
               <w:pStyle w:val="Compact"/>
             </w:pPr>
             <w:r>
-              <w:t xml:space="preserve">Not a blocker: Mode A works on any plan. If you have GitHub Enterprise, should Mode B (GitHub environment reviewers in addition) be turned on?</w:t>
-            </w:r>
-          </w:p>
-        </w:tc>
-      </w:tr>
-      <w:tr>
-        <w:tc>
-          <w:tcPr>
-            <w:tcW w:type="dxa" w:w="950"/>
-          </w:tcPr>
-          <w:p>
-            <w:pPr>
-              <w:pStyle w:val="Compact"/>
-            </w:pPr>
-            <w:r>
-              <w:t xml:space="preserve">D16</w:t>
-            </w:r>
-          </w:p>
-        </w:tc>
-        <w:tc>
-          <w:tcPr>
-            <w:tcW w:type="dxa" w:w="2364"/>
-          </w:tcPr>
-          <w:p>
-            <w:pPr>
-              <w:pStyle w:val="Compact"/>
-            </w:pPr>
-            <w:r>
-              <w:t xml:space="preserve">Quality-gate thresholds</w:t>
-            </w:r>
-          </w:p>
-        </w:tc>
-        <w:tc>
-          <w:tcPr>
-            <w:tcW w:type="dxa" w:w="6766"/>
-          </w:tcPr>
-          <w:p>
-            <w:pPr>
-              <w:pStyle w:val="Compact"/>
-            </w:pPr>
-            <w:r>
-              <w:t xml:space="preserve">Coverage minimum (e.g. 80%), vulnerability policy (block critical/high), STAGE bake time before PROD (e.g. 24 h), change windows / freeze calendar, built-in change record required for PROD?</w:t>
-            </w:r>
-          </w:p>
-        </w:tc>
-      </w:tr>
-      <w:tr>
-        <w:tc>
-          <w:tcPr>
-            <w:tcW w:type="dxa" w:w="950"/>
-          </w:tcPr>
-          <w:p>
-            <w:pPr>
-              <w:pStyle w:val="Compact"/>
-            </w:pPr>
-            <w:r>
-              <w:t xml:space="preserve">D17</w:t>
-            </w:r>
-          </w:p>
-        </w:tc>
-        <w:tc>
-          <w:tcPr>
-            <w:tcW w:type="dxa" w:w="2364"/>
-          </w:tcPr>
-          <w:p>
-            <w:pPr>
-              <w:pStyle w:val="Compact"/>
-            </w:pPr>
-            <w:r>
-              <w:t xml:space="preserve">PROD approvals</w:t>
-            </w:r>
-          </w:p>
-        </w:tc>
-        <w:tc>
-          <w:tcPr>
-            <w:tcW w:type="dxa" w:w="6766"/>
-          </w:tcPr>
-          <w:p>
-            <w:pPr>
-              <w:pStyle w:val="Compact"/>
-            </w:pPr>
-            <w:r>
-              <w:t xml:space="preserve">One GitHub approval (simplest), or two approvals from different groups collected in the release console (§8.5.4)?</w:t>
-            </w:r>
-          </w:p>
-        </w:tc>
-      </w:tr>
-      <w:tr>
-        <w:tc>
-          <w:tcPr>
-            <w:tcW w:type="dxa" w:w="950"/>
-          </w:tcPr>
-          <w:p>
-            <w:pPr>
-              <w:pStyle w:val="Compact"/>
-            </w:pPr>
-            <w:r>
-              <w:t xml:space="preserve">D18</w:t>
-            </w:r>
-          </w:p>
-        </w:tc>
-        <w:tc>
-          <w:tcPr>
-            <w:tcW w:type="dxa" w:w="2364"/>
-          </w:tcPr>
-          <w:p>
-            <w:pPr>
-              <w:pStyle w:val="Compact"/>
-            </w:pPr>
-            <w:r>
-              <w:t xml:space="preserve">Notifications</w:t>
-            </w:r>
-          </w:p>
-        </w:tc>
-        <w:tc>
-          <w:tcPr>
-            <w:tcW w:type="dxa" w:w="6766"/>
-          </w:tcPr>
-          <w:p>
-            <w:pPr>
-              <w:pStyle w:val="Compact"/>
-            </w:pPr>
+              <w:t xml:space="preserve">Bind accounts per</w:t>
+            </w:r>
+            <w:r>
+              <w:t xml:space="preserve"> </w:t>
+            </w:r>
             <w:r>
               <w:rPr>
                 <w:b/>
                 <w:bCs/>
               </w:rPr>
-              <w:t xml:space="preserve">Decided:</w:t>
-            </w:r>
-            <w:r>
-              <w:t xml:space="preserve"> </w:t>
-            </w:r>
-            <w:r>
-              <w:t xml:space="preserve">in-app inbox + email via Amazon SES + optional signed webhooks</w:t>
+              <w:t xml:space="preserve">portfolio</w:t>
+            </w:r>
+            <w:r>
+              <w:t xml:space="preserve"> </w:t>
+            </w:r>
+            <w:r>
+              <w:t xml:space="preserve">by default, with a per-product override (matches D6), or per product only?</w:t>
             </w:r>
           </w:p>
         </w:tc>
@@ -45284,7 +45120,7 @@
               <w:pStyle w:val="Compact"/>
             </w:pPr>
             <w:r>
-              <w:t xml:space="preserve">D19</w:t>
+              <w:t xml:space="preserve">D15</w:t>
             </w:r>
           </w:p>
         </w:tc>
@@ -45297,7 +45133,7 @@
               <w:pStyle w:val="Compact"/>
             </w:pPr>
             <w:r>
-              <w:t xml:space="preserve">Application repo granularity</w:t>
+              <w:t xml:space="preserve">GitHub plan</w:t>
             </w:r>
           </w:p>
         </w:tc>
@@ -45310,7 +45146,7 @@
               <w:pStyle w:val="Compact"/>
             </w:pPr>
             <w:r>
-              <w:t xml:space="preserve">One repo per compute slot (simplest permissions), or allow monorepos serving several slots?</w:t>
+              <w:t xml:space="preserve">Not a blocker: Mode A works on any plan. If you have GitHub Enterprise, should Mode B (GitHub environment reviewers in addition) be turned on?</w:t>
             </w:r>
           </w:p>
         </w:tc>
@@ -45325,7 +45161,7 @@
               <w:pStyle w:val="Compact"/>
             </w:pPr>
             <w:r>
-              <w:t xml:space="preserve">D20</w:t>
+              <w:t xml:space="preserve">D16</w:t>
             </w:r>
           </w:p>
         </w:tc>
@@ -45338,7 +45174,89 @@
               <w:pStyle w:val="Compact"/>
             </w:pPr>
             <w:r>
-              <w:t xml:space="preserve">EKS deploy model</w:t>
+              <w:t xml:space="preserve">Quality-gate thresholds</w:t>
+            </w:r>
+          </w:p>
+        </w:tc>
+        <w:tc>
+          <w:tcPr>
+            <w:tcW w:type="dxa" w:w="6766"/>
+          </w:tcPr>
+          <w:p>
+            <w:pPr>
+              <w:pStyle w:val="Compact"/>
+            </w:pPr>
+            <w:r>
+              <w:t xml:space="preserve">Coverage minimum (e.g. 80%), vulnerability policy (block critical/high), STAGE bake time before PROD (e.g. 24 h), change windows / freeze calendar, built-in change record required for PROD?</w:t>
+            </w:r>
+          </w:p>
+        </w:tc>
+      </w:tr>
+      <w:tr>
+        <w:tc>
+          <w:tcPr>
+            <w:tcW w:type="dxa" w:w="950"/>
+          </w:tcPr>
+          <w:p>
+            <w:pPr>
+              <w:pStyle w:val="Compact"/>
+            </w:pPr>
+            <w:r>
+              <w:t xml:space="preserve">D17</w:t>
+            </w:r>
+          </w:p>
+        </w:tc>
+        <w:tc>
+          <w:tcPr>
+            <w:tcW w:type="dxa" w:w="2364"/>
+          </w:tcPr>
+          <w:p>
+            <w:pPr>
+              <w:pStyle w:val="Compact"/>
+            </w:pPr>
+            <w:r>
+              <w:t xml:space="preserve">PROD approvals</w:t>
+            </w:r>
+          </w:p>
+        </w:tc>
+        <w:tc>
+          <w:tcPr>
+            <w:tcW w:type="dxa" w:w="6766"/>
+          </w:tcPr>
+          <w:p>
+            <w:pPr>
+              <w:pStyle w:val="Compact"/>
+            </w:pPr>
+            <w:r>
+              <w:t xml:space="preserve">One GitHub approval (simplest), or two approvals from different groups collected in the release console (§8.5.4)?</w:t>
+            </w:r>
+          </w:p>
+        </w:tc>
+      </w:tr>
+      <w:tr>
+        <w:tc>
+          <w:tcPr>
+            <w:tcW w:type="dxa" w:w="950"/>
+          </w:tcPr>
+          <w:p>
+            <w:pPr>
+              <w:pStyle w:val="Compact"/>
+            </w:pPr>
+            <w:r>
+              <w:t xml:space="preserve">D18</w:t>
+            </w:r>
+          </w:p>
+        </w:tc>
+        <w:tc>
+          <w:tcPr>
+            <w:tcW w:type="dxa" w:w="2364"/>
+          </w:tcPr>
+          <w:p>
+            <w:pPr>
+              <w:pStyle w:val="Compact"/>
+            </w:pPr>
+            <w:r>
+              <w:t xml:space="preserve">Notifications</w:t>
             </w:r>
           </w:p>
         </w:tc>
@@ -45355,25 +45273,13 @@
                 <w:b/>
                 <w:bCs/>
               </w:rPr>
-              <w:t xml:space="preserve">Argo CD GitOps</w:t>
-            </w:r>
-            <w:r>
-              <w:t xml:space="preserve"> </w:t>
-            </w:r>
-            <w:r>
-              <w:t xml:space="preserve">(recommended) or pipeline-driven</w:t>
-            </w:r>
-            <w:r>
-              <w:t xml:space="preserve"> </w:t>
-            </w:r>
-            <w:r>
-              <w:rPr>
-                <w:rStyle w:val="VerbatimChar"/>
-              </w:rPr>
-              <w:t xml:space="preserve">helm upgrade</w:t>
-            </w:r>
-            <w:r>
-              <w:t xml:space="preserve">? Does a shared EKS cluster per portfolio per environment already exist, and who runs it?</w:t>
+              <w:t xml:space="preserve">Decided:</w:t>
+            </w:r>
+            <w:r>
+              <w:t xml:space="preserve"> </w:t>
+            </w:r>
+            <w:r>
+              <w:t xml:space="preserve">in-app inbox + email via Amazon SES + optional signed webhooks</w:t>
             </w:r>
           </w:p>
         </w:tc>
@@ -45388,7 +45294,7 @@
               <w:pStyle w:val="Compact"/>
             </w:pPr>
             <w:r>
-              <w:t xml:space="preserve">D21</w:t>
+              <w:t xml:space="preserve">D19</w:t>
             </w:r>
           </w:p>
         </w:tc>
@@ -45401,7 +45307,7 @@
               <w:pStyle w:val="Compact"/>
             </w:pPr>
             <w:r>
-              <w:t xml:space="preserve">Languages in v1</w:t>
+              <w:t xml:space="preserve">Application repo granularity</w:t>
             </w:r>
           </w:p>
         </w:tc>
@@ -45414,7 +45320,7 @@
               <w:pStyle w:val="Compact"/>
             </w:pPr>
             <w:r>
-              <w:t xml:space="preserve">Python, Java, Go, Rust, Node.js all at once, or start with two (e.g. Python + Java)?</w:t>
+              <w:t xml:space="preserve">One repo per compute slot (simplest permissions), or allow monorepos serving several slots?</w:t>
             </w:r>
           </w:p>
         </w:tc>
@@ -45429,7 +45335,7 @@
               <w:pStyle w:val="Compact"/>
             </w:pPr>
             <w:r>
-              <w:t xml:space="preserve">D22</w:t>
+              <w:t xml:space="preserve">D20</w:t>
             </w:r>
           </w:p>
         </w:tc>
@@ -45442,306 +45348,7 @@
               <w:pStyle w:val="Compact"/>
             </w:pPr>
             <w:r>
-              <w:t xml:space="preserve">Developer portal</w:t>
-            </w:r>
-          </w:p>
-        </w:tc>
-        <w:tc>
-          <w:tcPr>
-            <w:tcW w:type="dxa" w:w="6766"/>
-          </w:tcPr>
-          <w:p>
-            <w:pPr>
-              <w:pStyle w:val="Compact"/>
-            </w:pPr>
-            <w:r>
-              <w:t xml:space="preserve">Platform UI only (default), or also open-source Backstage (</w:t>
-            </w:r>
-            <w:r>
-              <w:rPr>
-                <w:rStyle w:val="VerbatimChar"/>
-              </w:rPr>
-              <w:t xml:space="preserve">catalog-info.yaml</w:t>
-            </w:r>
-            <w:r>
-              <w:t xml:space="preserve"> </w:t>
-            </w:r>
-            <w:r>
-              <w:t xml:space="preserve">generated either way)?</w:t>
-            </w:r>
-          </w:p>
-        </w:tc>
-      </w:tr>
-      <w:tr>
-        <w:tc>
-          <w:tcPr>
-            <w:tcW w:type="dxa" w:w="950"/>
-          </w:tcPr>
-          <w:p>
-            <w:pPr>
-              <w:pStyle w:val="Compact"/>
-            </w:pPr>
-            <w:r>
-              <w:t xml:space="preserve">D23</w:t>
-            </w:r>
-          </w:p>
-        </w:tc>
-        <w:tc>
-          <w:tcPr>
-            <w:tcW w:type="dxa" w:w="2364"/>
-          </w:tcPr>
-          <w:p>
-            <w:pPr>
-              <w:pStyle w:val="Compact"/>
-            </w:pPr>
-            <w:r>
-              <w:t xml:space="preserve">Networking for ECS/EKS</w:t>
-            </w:r>
-          </w:p>
-        </w:tc>
-        <w:tc>
-          <w:tcPr>
-            <w:tcW w:type="dxa" w:w="6766"/>
-          </w:tcPr>
-          <w:p>
-            <w:pPr>
-              <w:pStyle w:val="Compact"/>
-            </w:pPr>
-            <w:r>
-              <w:t xml:space="preserve">Shared VPC from the landing zone (subnets/SGs published to SSM by the network team)?</w:t>
-            </w:r>
-          </w:p>
-        </w:tc>
-      </w:tr>
-      <w:tr>
-        <w:tc>
-          <w:tcPr>
-            <w:tcW w:type="dxa" w:w="950"/>
-          </w:tcPr>
-          <w:p>
-            <w:pPr>
-              <w:pStyle w:val="Compact"/>
-            </w:pPr>
-            <w:r>
-              <w:t xml:space="preserve">D24</w:t>
-            </w:r>
-          </w:p>
-        </w:tc>
-        <w:tc>
-          <w:tcPr>
-            <w:tcW w:type="dxa" w:w="2364"/>
-          </w:tcPr>
-          <w:p>
-            <w:pPr>
-              <w:pStyle w:val="Compact"/>
-            </w:pPr>
-            <w:r>
-              <w:t xml:space="preserve">Deprecation window</w:t>
-            </w:r>
-          </w:p>
-        </w:tc>
-        <w:tc>
-          <w:tcPr>
-            <w:tcW w:type="dxa" w:w="6766"/>
-          </w:tcPr>
-          <w:p>
-            <w:pPr>
-              <w:pStyle w:val="Compact"/>
-            </w:pPr>
-            <w:r>
-              <w:t xml:space="preserve">Minimum time a deprecated contract value stays after it becomes unused in an environment (e.g. 0 days in DEV/TEST, 14 days in STAGE/PROD)?</w:t>
-            </w:r>
-          </w:p>
-        </w:tc>
-      </w:tr>
-      <w:tr>
-        <w:tc>
-          <w:tcPr>
-            <w:tcW w:type="dxa" w:w="950"/>
-          </w:tcPr>
-          <w:p>
-            <w:pPr>
-              <w:pStyle w:val="Compact"/>
-            </w:pPr>
-            <w:r>
-              <w:t xml:space="preserve">D25</w:t>
-            </w:r>
-          </w:p>
-        </w:tc>
-        <w:tc>
-          <w:tcPr>
-            <w:tcW w:type="dxa" w:w="2364"/>
-          </w:tcPr>
-          <w:p>
-            <w:pPr>
-              <w:pStyle w:val="Compact"/>
-            </w:pPr>
-            <w:r>
-              <w:t xml:space="preserve">Infra approvals</w:t>
-            </w:r>
-          </w:p>
-        </w:tc>
-        <w:tc>
-          <w:tcPr>
-            <w:tcW w:type="dxa" w:w="6766"/>
-          </w:tcPr>
-          <w:p>
-            <w:pPr>
-              <w:pStyle w:val="Compact"/>
-            </w:pPr>
-            <w:r>
-              <w:t xml:space="preserve">Should product reviewers also approve infra deploys to STAGE/PROD, or the platform team only?</w:t>
-            </w:r>
-          </w:p>
-        </w:tc>
-      </w:tr>
-      <w:tr>
-        <w:tc>
-          <w:tcPr>
-            <w:tcW w:type="dxa" w:w="950"/>
-          </w:tcPr>
-          <w:p>
-            <w:pPr>
-              <w:pStyle w:val="Compact"/>
-            </w:pPr>
-            <w:r>
-              <w:t xml:space="preserve">D26</w:t>
-            </w:r>
-          </w:p>
-        </w:tc>
-        <w:tc>
-          <w:tcPr>
-            <w:tcW w:type="dxa" w:w="2364"/>
-          </w:tcPr>
-          <w:p>
-            <w:pPr>
-              <w:pStyle w:val="Compact"/>
-            </w:pPr>
-            <w:r>
-              <w:t xml:space="preserve">Open-source license policy</w:t>
-            </w:r>
-          </w:p>
-        </w:tc>
-        <w:tc>
-          <w:tcPr>
-            <w:tcW w:type="dxa" w:w="6766"/>
-          </w:tcPr>
-          <w:p>
-            <w:pPr>
-              <w:pStyle w:val="Compact"/>
-            </w:pPr>
-            <w:r>
-              <w:t xml:space="preserve">Allow Apache-2.0, MIT, BSD, MPL-2.0 and LGPL (as libraries); exclude AGPL and source-available licenses unless approved?</w:t>
-            </w:r>
-          </w:p>
-        </w:tc>
-      </w:tr>
-      <w:tr>
-        <w:tc>
-          <w:tcPr>
-            <w:tcW w:type="dxa" w:w="950"/>
-          </w:tcPr>
-          <w:p>
-            <w:pPr>
-              <w:pStyle w:val="Compact"/>
-            </w:pPr>
-            <w:r>
-              <w:t xml:space="preserve">D27</w:t>
-            </w:r>
-          </w:p>
-        </w:tc>
-        <w:tc>
-          <w:tcPr>
-            <w:tcW w:type="dxa" w:w="2364"/>
-          </w:tcPr>
-          <w:p>
-            <w:pPr>
-              <w:pStyle w:val="Compact"/>
-            </w:pPr>
-            <w:r>
-              <w:t xml:space="preserve">Tier 1 services at launch</w:t>
-            </w:r>
-          </w:p>
-        </w:tc>
-        <w:tc>
-          <w:tcPr>
-            <w:tcW w:type="dxa" w:w="6766"/>
-          </w:tcPr>
-          <w:p>
-            <w:pPr>
-              <w:pStyle w:val="Compact"/>
-            </w:pPr>
-            <w:r>
-              <w:t xml:space="preserve">Confirm the proposed curated list (§6.8.2), or start smaller (e.g. compute + integration + Aurora/RDS PostgreSQL + DynamoDB) and grow?</w:t>
-            </w:r>
-          </w:p>
-        </w:tc>
-      </w:tr>
-      <w:tr>
-        <w:tc>
-          <w:tcPr>
-            <w:tcW w:type="dxa" w:w="950"/>
-          </w:tcPr>
-          <w:p>
-            <w:pPr>
-              <w:pStyle w:val="Compact"/>
-            </w:pPr>
-            <w:r>
-              <w:t xml:space="preserve">D28</w:t>
-            </w:r>
-          </w:p>
-        </w:tc>
-        <w:tc>
-          <w:tcPr>
-            <w:tcW w:type="dxa" w:w="2364"/>
-          </w:tcPr>
-          <w:p>
-            <w:pPr>
-              <w:pStyle w:val="Compact"/>
-            </w:pPr>
-            <w:r>
-              <w:t xml:space="preserve">Commercial DB engines</w:t>
-            </w:r>
-          </w:p>
-        </w:tc>
-        <w:tc>
-          <w:tcPr>
-            <w:tcW w:type="dxa" w:w="6766"/>
-          </w:tcPr>
-          <w:p>
-            <w:pPr>
-              <w:pStyle w:val="Compact"/>
-            </w:pPr>
-            <w:r>
-              <w:t xml:space="preserve">Exclude RDS for Oracle / SQL Server (default, per open-source policy), or allow them?</w:t>
-            </w:r>
-          </w:p>
-        </w:tc>
-      </w:tr>
-      <w:tr>
-        <w:tc>
-          <w:tcPr>
-            <w:tcW w:type="dxa" w:w="950"/>
-          </w:tcPr>
-          <w:p>
-            <w:pPr>
-              <w:pStyle w:val="Compact"/>
-            </w:pPr>
-            <w:r>
-              <w:t xml:space="preserve">D30</w:t>
-            </w:r>
-          </w:p>
-        </w:tc>
-        <w:tc>
-          <w:tcPr>
-            <w:tcW w:type="dxa" w:w="2364"/>
-          </w:tcPr>
-          <w:p>
-            <w:pPr>
-              <w:pStyle w:val="Compact"/>
-            </w:pPr>
-            <w:r>
-              <w:t xml:space="preserve">Region pairs</w:t>
+              <w:t xml:space="preserve">EKS deploy model</w:t>
             </w:r>
           </w:p>
         </w:tc>
@@ -45758,6 +45365,450 @@
                 <w:b/>
                 <w:bCs/>
               </w:rPr>
+              <w:t xml:space="preserve">Argo CD GitOps</w:t>
+            </w:r>
+            <w:r>
+              <w:t xml:space="preserve"> </w:t>
+            </w:r>
+            <w:r>
+              <w:t xml:space="preserve">(recommended) or pipeline-driven</w:t>
+            </w:r>
+            <w:r>
+              <w:t xml:space="preserve"> </w:t>
+            </w:r>
+            <w:r>
+              <w:rPr>
+                <w:rStyle w:val="VerbatimChar"/>
+              </w:rPr>
+              <w:t xml:space="preserve">helm upgrade</w:t>
+            </w:r>
+            <w:r>
+              <w:t xml:space="preserve">? Does a shared EKS cluster per portfolio per environment already exist, and who runs it?</w:t>
+            </w:r>
+          </w:p>
+        </w:tc>
+      </w:tr>
+      <w:tr>
+        <w:tc>
+          <w:tcPr>
+            <w:tcW w:type="dxa" w:w="950"/>
+          </w:tcPr>
+          <w:p>
+            <w:pPr>
+              <w:pStyle w:val="Compact"/>
+            </w:pPr>
+            <w:r>
+              <w:t xml:space="preserve">D21</w:t>
+            </w:r>
+          </w:p>
+        </w:tc>
+        <w:tc>
+          <w:tcPr>
+            <w:tcW w:type="dxa" w:w="2364"/>
+          </w:tcPr>
+          <w:p>
+            <w:pPr>
+              <w:pStyle w:val="Compact"/>
+            </w:pPr>
+            <w:r>
+              <w:t xml:space="preserve">Languages in v1</w:t>
+            </w:r>
+          </w:p>
+        </w:tc>
+        <w:tc>
+          <w:tcPr>
+            <w:tcW w:type="dxa" w:w="6766"/>
+          </w:tcPr>
+          <w:p>
+            <w:pPr>
+              <w:pStyle w:val="Compact"/>
+            </w:pPr>
+            <w:r>
+              <w:t xml:space="preserve">Python, Java, Go, Rust, Node.js all at once, or start with two (e.g. Python + Java)?</w:t>
+            </w:r>
+          </w:p>
+        </w:tc>
+      </w:tr>
+      <w:tr>
+        <w:tc>
+          <w:tcPr>
+            <w:tcW w:type="dxa" w:w="950"/>
+          </w:tcPr>
+          <w:p>
+            <w:pPr>
+              <w:pStyle w:val="Compact"/>
+            </w:pPr>
+            <w:r>
+              <w:t xml:space="preserve">D22</w:t>
+            </w:r>
+          </w:p>
+        </w:tc>
+        <w:tc>
+          <w:tcPr>
+            <w:tcW w:type="dxa" w:w="2364"/>
+          </w:tcPr>
+          <w:p>
+            <w:pPr>
+              <w:pStyle w:val="Compact"/>
+            </w:pPr>
+            <w:r>
+              <w:t xml:space="preserve">Developer portal</w:t>
+            </w:r>
+          </w:p>
+        </w:tc>
+        <w:tc>
+          <w:tcPr>
+            <w:tcW w:type="dxa" w:w="6766"/>
+          </w:tcPr>
+          <w:p>
+            <w:pPr>
+              <w:pStyle w:val="Compact"/>
+            </w:pPr>
+            <w:r>
+              <w:t xml:space="preserve">Platform UI only (default), or also open-source Backstage (</w:t>
+            </w:r>
+            <w:r>
+              <w:rPr>
+                <w:rStyle w:val="VerbatimChar"/>
+              </w:rPr>
+              <w:t xml:space="preserve">catalog-info.yaml</w:t>
+            </w:r>
+            <w:r>
+              <w:t xml:space="preserve"> </w:t>
+            </w:r>
+            <w:r>
+              <w:t xml:space="preserve">generated either way)?</w:t>
+            </w:r>
+          </w:p>
+        </w:tc>
+      </w:tr>
+      <w:tr>
+        <w:tc>
+          <w:tcPr>
+            <w:tcW w:type="dxa" w:w="950"/>
+          </w:tcPr>
+          <w:p>
+            <w:pPr>
+              <w:pStyle w:val="Compact"/>
+            </w:pPr>
+            <w:r>
+              <w:t xml:space="preserve">D23</w:t>
+            </w:r>
+          </w:p>
+        </w:tc>
+        <w:tc>
+          <w:tcPr>
+            <w:tcW w:type="dxa" w:w="2364"/>
+          </w:tcPr>
+          <w:p>
+            <w:pPr>
+              <w:pStyle w:val="Compact"/>
+            </w:pPr>
+            <w:r>
+              <w:t xml:space="preserve">Networking for ECS/EKS</w:t>
+            </w:r>
+          </w:p>
+        </w:tc>
+        <w:tc>
+          <w:tcPr>
+            <w:tcW w:type="dxa" w:w="6766"/>
+          </w:tcPr>
+          <w:p>
+            <w:pPr>
+              <w:pStyle w:val="Compact"/>
+            </w:pPr>
+            <w:r>
+              <w:t xml:space="preserve">Shared VPC from the landing zone (subnets/SGs published to SSM by the network team)?</w:t>
+            </w:r>
+          </w:p>
+        </w:tc>
+      </w:tr>
+      <w:tr>
+        <w:tc>
+          <w:tcPr>
+            <w:tcW w:type="dxa" w:w="950"/>
+          </w:tcPr>
+          <w:p>
+            <w:pPr>
+              <w:pStyle w:val="Compact"/>
+            </w:pPr>
+            <w:r>
+              <w:t xml:space="preserve">D24</w:t>
+            </w:r>
+          </w:p>
+        </w:tc>
+        <w:tc>
+          <w:tcPr>
+            <w:tcW w:type="dxa" w:w="2364"/>
+          </w:tcPr>
+          <w:p>
+            <w:pPr>
+              <w:pStyle w:val="Compact"/>
+            </w:pPr>
+            <w:r>
+              <w:t xml:space="preserve">Deprecation window</w:t>
+            </w:r>
+          </w:p>
+        </w:tc>
+        <w:tc>
+          <w:tcPr>
+            <w:tcW w:type="dxa" w:w="6766"/>
+          </w:tcPr>
+          <w:p>
+            <w:pPr>
+              <w:pStyle w:val="Compact"/>
+            </w:pPr>
+            <w:r>
+              <w:t xml:space="preserve">Minimum time a deprecated contract value stays after it becomes unused in an environment (e.g. 0 days in DEV/TEST, 14 days in STAGE/PROD)?</w:t>
+            </w:r>
+          </w:p>
+        </w:tc>
+      </w:tr>
+      <w:tr>
+        <w:tc>
+          <w:tcPr>
+            <w:tcW w:type="dxa" w:w="950"/>
+          </w:tcPr>
+          <w:p>
+            <w:pPr>
+              <w:pStyle w:val="Compact"/>
+            </w:pPr>
+            <w:r>
+              <w:t xml:space="preserve">D25</w:t>
+            </w:r>
+          </w:p>
+        </w:tc>
+        <w:tc>
+          <w:tcPr>
+            <w:tcW w:type="dxa" w:w="2364"/>
+          </w:tcPr>
+          <w:p>
+            <w:pPr>
+              <w:pStyle w:val="Compact"/>
+            </w:pPr>
+            <w:r>
+              <w:t xml:space="preserve">Infra approvals</w:t>
+            </w:r>
+          </w:p>
+        </w:tc>
+        <w:tc>
+          <w:tcPr>
+            <w:tcW w:type="dxa" w:w="6766"/>
+          </w:tcPr>
+          <w:p>
+            <w:pPr>
+              <w:pStyle w:val="Compact"/>
+            </w:pPr>
+            <w:r>
+              <w:t xml:space="preserve">Should product reviewers also approve infra deploys to STAGE/PROD, or the platform team only?</w:t>
+            </w:r>
+          </w:p>
+        </w:tc>
+      </w:tr>
+      <w:tr>
+        <w:tc>
+          <w:tcPr>
+            <w:tcW w:type="dxa" w:w="950"/>
+          </w:tcPr>
+          <w:p>
+            <w:pPr>
+              <w:pStyle w:val="Compact"/>
+            </w:pPr>
+            <w:r>
+              <w:t xml:space="preserve">D26</w:t>
+            </w:r>
+          </w:p>
+        </w:tc>
+        <w:tc>
+          <w:tcPr>
+            <w:tcW w:type="dxa" w:w="2364"/>
+          </w:tcPr>
+          <w:p>
+            <w:pPr>
+              <w:pStyle w:val="Compact"/>
+            </w:pPr>
+            <w:r>
+              <w:t xml:space="preserve">Open-source license policy</w:t>
+            </w:r>
+          </w:p>
+        </w:tc>
+        <w:tc>
+          <w:tcPr>
+            <w:tcW w:type="dxa" w:w="6766"/>
+          </w:tcPr>
+          <w:p>
+            <w:pPr>
+              <w:pStyle w:val="Compact"/>
+            </w:pPr>
+            <w:r>
+              <w:t xml:space="preserve">Allow Apache-2.0, MIT, BSD, MPL-2.0 and LGPL (as libraries); exclude AGPL and source-available licenses unless approved?</w:t>
+            </w:r>
+          </w:p>
+        </w:tc>
+      </w:tr>
+      <w:tr>
+        <w:tc>
+          <w:tcPr>
+            <w:tcW w:type="dxa" w:w="950"/>
+          </w:tcPr>
+          <w:p>
+            <w:pPr>
+              <w:pStyle w:val="Compact"/>
+            </w:pPr>
+            <w:r>
+              <w:t xml:space="preserve">D27</w:t>
+            </w:r>
+          </w:p>
+        </w:tc>
+        <w:tc>
+          <w:tcPr>
+            <w:tcW w:type="dxa" w:w="2364"/>
+          </w:tcPr>
+          <w:p>
+            <w:pPr>
+              <w:pStyle w:val="Compact"/>
+            </w:pPr>
+            <w:r>
+              <w:t xml:space="preserve">Tier 1 services at launch</w:t>
+            </w:r>
+          </w:p>
+        </w:tc>
+        <w:tc>
+          <w:tcPr>
+            <w:tcW w:type="dxa" w:w="6766"/>
+          </w:tcPr>
+          <w:p>
+            <w:pPr>
+              <w:pStyle w:val="Compact"/>
+            </w:pPr>
+            <w:r>
+              <w:t xml:space="preserve">Confirm the proposed curated list (§6.8.2), or start smaller (e.g. compute + integration + Aurora/RDS PostgreSQL + DynamoDB) and grow?</w:t>
+            </w:r>
+          </w:p>
+        </w:tc>
+      </w:tr>
+      <w:tr>
+        <w:tc>
+          <w:tcPr>
+            <w:tcW w:type="dxa" w:w="950"/>
+          </w:tcPr>
+          <w:p>
+            <w:pPr>
+              <w:pStyle w:val="Compact"/>
+            </w:pPr>
+            <w:r>
+              <w:t xml:space="preserve">D28</w:t>
+            </w:r>
+          </w:p>
+        </w:tc>
+        <w:tc>
+          <w:tcPr>
+            <w:tcW w:type="dxa" w:w="2364"/>
+          </w:tcPr>
+          <w:p>
+            <w:pPr>
+              <w:pStyle w:val="Compact"/>
+            </w:pPr>
+            <w:r>
+              <w:t xml:space="preserve">Commercial DB engines</w:t>
+            </w:r>
+          </w:p>
+        </w:tc>
+        <w:tc>
+          <w:tcPr>
+            <w:tcW w:type="dxa" w:w="6766"/>
+          </w:tcPr>
+          <w:p>
+            <w:pPr>
+              <w:pStyle w:val="Compact"/>
+            </w:pPr>
+            <w:r>
+              <w:t xml:space="preserve">Exclude RDS for Oracle / SQL Server (default, per open-source policy), or allow them?</w:t>
+            </w:r>
+          </w:p>
+        </w:tc>
+      </w:tr>
+      <w:tr>
+        <w:tc>
+          <w:tcPr>
+            <w:tcW w:type="dxa" w:w="950"/>
+          </w:tcPr>
+          <w:p>
+            <w:pPr>
+              <w:pStyle w:val="Compact"/>
+            </w:pPr>
+            <w:r>
+              <w:t xml:space="preserve">D29</w:t>
+            </w:r>
+          </w:p>
+        </w:tc>
+        <w:tc>
+          <w:tcPr>
+            <w:tcW w:type="dxa" w:w="2364"/>
+          </w:tcPr>
+          <w:p>
+            <w:pPr>
+              <w:pStyle w:val="Compact"/>
+            </w:pPr>
+            <w:r>
+              <w:t xml:space="preserve">Network ownership</w:t>
+            </w:r>
+          </w:p>
+        </w:tc>
+        <w:tc>
+          <w:tcPr>
+            <w:tcW w:type="dxa" w:w="6766"/>
+          </w:tcPr>
+          <w:p>
+            <w:pPr>
+              <w:pStyle w:val="Compact"/>
+            </w:pPr>
+            <w:r>
+              <w:t xml:space="preserve">Does the landing zone provide shared VPCs with database/private subnets per environment account, or must the platform create project VPCs?</w:t>
+            </w:r>
+          </w:p>
+        </w:tc>
+      </w:tr>
+      <w:tr>
+        <w:tc>
+          <w:tcPr>
+            <w:tcW w:type="dxa" w:w="950"/>
+          </w:tcPr>
+          <w:p>
+            <w:pPr>
+              <w:pStyle w:val="Compact"/>
+            </w:pPr>
+            <w:r>
+              <w:t xml:space="preserve">D30</w:t>
+            </w:r>
+          </w:p>
+        </w:tc>
+        <w:tc>
+          <w:tcPr>
+            <w:tcW w:type="dxa" w:w="2364"/>
+          </w:tcPr>
+          <w:p>
+            <w:pPr>
+              <w:pStyle w:val="Compact"/>
+            </w:pPr>
+            <w:r>
+              <w:t xml:space="preserve">Region pairs</w:t>
+            </w:r>
+          </w:p>
+        </w:tc>
+        <w:tc>
+          <w:tcPr>
+            <w:tcW w:type="dxa" w:w="6766"/>
+          </w:tcPr>
+          <w:p>
+            <w:pPr>
+              <w:pStyle w:val="Compact"/>
+            </w:pPr>
+            <w:r>
+              <w:rPr>
+                <w:b/>
+                <w:bCs/>
+              </w:rPr>
               <w:t xml:space="preserve">Decided:</w:t>
             </w:r>
             <w:r>
@@ -45888,47 +45939,6 @@
             </w:pPr>
             <w:r>
               <w:t xml:space="preserve">Exclude from DR/HA projects, or allow with a documented recovery pattern?</w:t>
-            </w:r>
-          </w:p>
-        </w:tc>
-      </w:tr>
-      <w:tr>
-        <w:tc>
-          <w:tcPr>
-            <w:tcW w:type="dxa" w:w="950"/>
-          </w:tcPr>
-          <w:p>
-            <w:pPr>
-              <w:pStyle w:val="Compact"/>
-            </w:pPr>
-            <w:r>
-              <w:t xml:space="preserve">D29</w:t>
-            </w:r>
-          </w:p>
-        </w:tc>
-        <w:tc>
-          <w:tcPr>
-            <w:tcW w:type="dxa" w:w="2364"/>
-          </w:tcPr>
-          <w:p>
-            <w:pPr>
-              <w:pStyle w:val="Compact"/>
-            </w:pPr>
-            <w:r>
-              <w:t xml:space="preserve">Network ownership</w:t>
-            </w:r>
-          </w:p>
-        </w:tc>
-        <w:tc>
-          <w:tcPr>
-            <w:tcW w:type="dxa" w:w="6766"/>
-          </w:tcPr>
-          <w:p>
-            <w:pPr>
-              <w:pStyle w:val="Compact"/>
-            </w:pPr>
-            <w:r>
-              <w:t xml:space="preserve">Does the landing zone provide shared VPCs with database/private subnets per environment account, or must the platform create project VPCs?</w:t>
             </w:r>
           </w:p>
         </w:tc>

</xml_diff>

<commit_message>
Add sharing by tags across projects and accounts
Providers set org:share-scope (product/portfolio/organization) and
org:share-access on a resource; consumers in any account whose tags match
(same environment, inside the organization) connect self-service. Resource
policies, KMS grants, cross-account role trust and consumer statements are
generated from the tags. Agreements remain for cases tags cannot express.
Regenerated Word document.
</commit_message>
<xml_diff>
--- a/docs/CloudInfraAutomation-Architecture.docx
+++ b/docs/CloudInfraAutomation-Architecture.docx
@@ -67,7 +67,7 @@
         <w:t xml:space="preserve"> </w:t>
       </w:r>
       <w:r>
-        <w:t xml:space="preserve">Draft v2.12 for review. No code is written until this design is approved.</w:t>
+        <w:t xml:space="preserve">Draft v2.13 for review. No code is written until this design is approved.</w:t>
       </w:r>
     </w:p>
     <w:p>
@@ -679,6 +679,64 @@
             </w:pPr>
             <w:r>
               <w:t xml:space="preserve">cross-account access (§4.11). Infrastructure can use assets in other AWS accounts (S3, SQS, SNS, KMS, DynamoDB, secrets, events, private APIs) through approved sharing agreements. Both sides are generated with tag conditions, inside the organization by default, with expiry, revocation and audit.</w:t>
+            </w:r>
+          </w:p>
+        </w:tc>
+      </w:tr>
+      <w:tr>
+        <w:tc>
+          <w:tcPr>
+            <w:tcW w:type="dxa" w:w="950"/>
+          </w:tcPr>
+          <w:p>
+            <w:pPr>
+              <w:pStyle w:val="Compact"/>
+            </w:pPr>
+            <w:r>
+              <w:t xml:space="preserve">v2.13</w:t>
+            </w:r>
+          </w:p>
+        </w:tc>
+        <w:tc>
+          <w:tcPr>
+            <w:tcW w:type="dxa" w:w="9130"/>
+          </w:tcPr>
+          <w:p>
+            <w:pPr>
+              <w:pStyle w:val="Compact"/>
+            </w:pPr>
+            <w:r>
+              <w:t xml:space="preserve">sharing by tags (§4.11.1). Providers set</w:t>
+            </w:r>
+            <w:r>
+              <w:t xml:space="preserve"> </w:t>
+            </w:r>
+            <w:r>
+              <w:rPr>
+                <w:rStyle w:val="VerbatimChar"/>
+              </w:rPr>
+              <w:t xml:space="preserve">org:share-scope</w:t>
+            </w:r>
+            <w:r>
+              <w:t xml:space="preserve"> </w:t>
+            </w:r>
+            <w:r>
+              <w:t xml:space="preserve">(product / portfolio / organization) and</w:t>
+            </w:r>
+            <w:r>
+              <w:t xml:space="preserve"> </w:t>
+            </w:r>
+            <w:r>
+              <w:rPr>
+                <w:rStyle w:val="VerbatimChar"/>
+              </w:rPr>
+              <w:t xml:space="preserve">org:share-access</w:t>
+            </w:r>
+            <w:r>
+              <w:t xml:space="preserve"> </w:t>
+            </w:r>
+            <w:r>
+              <w:t xml:space="preserve">on a resource, and any consumer in any account whose tags match (same environment, inside the organization) can connect self-service. Agreements remain for everything tags cannot express.</w:t>
             </w:r>
           </w:p>
         </w:tc>
@@ -6977,11 +7035,11 @@
         <w:tblLook w:firstRow="1" w:lastRow="0" w:firstColumn="0" w:lastColumn="0" w:noHBand="0" w:noVBand="0" w:val="0020"/>
       </w:tblPr>
       <w:tblGrid>
-        <w:gridCol w:w="1811"/>
-        <w:gridCol w:w="1422"/>
-        <w:gridCol w:w="2137"/>
+        <w:gridCol w:w="1488"/>
+        <w:gridCol w:w="2034"/>
+        <w:gridCol w:w="1853"/>
         <w:gridCol w:w="950"/>
-        <w:gridCol w:w="3760"/>
+        <w:gridCol w:w="3755"/>
       </w:tblGrid>
       <w:tr>
         <w:trPr>
@@ -6989,7 +7047,7 @@
         </w:trPr>
         <w:tc>
           <w:tcPr>
-            <w:tcW w:type="dxa" w:w="1811"/>
+            <w:tcW w:type="dxa" w:w="1488"/>
           </w:tcPr>
           <w:p>
             <w:pPr>
@@ -7002,7 +7060,7 @@
         </w:tc>
         <w:tc>
           <w:tcPr>
-            <w:tcW w:type="dxa" w:w="1422"/>
+            <w:tcW w:type="dxa" w:w="2034"/>
           </w:tcPr>
           <w:p>
             <w:pPr>
@@ -7015,7 +7073,7 @@
         </w:tc>
         <w:tc>
           <w:tcPr>
-            <w:tcW w:type="dxa" w:w="2137"/>
+            <w:tcW w:type="dxa" w:w="1853"/>
           </w:tcPr>
           <w:p>
             <w:pPr>
@@ -7041,7 +7099,7 @@
         </w:tc>
         <w:tc>
           <w:tcPr>
-            <w:tcW w:type="dxa" w:w="3760"/>
+            <w:tcW w:type="dxa" w:w="3755"/>
           </w:tcPr>
           <w:p>
             <w:pPr>
@@ -7056,7 +7114,7 @@
       <w:tr>
         <w:tc>
           <w:tcPr>
-            <w:tcW w:type="dxa" w:w="1811"/>
+            <w:tcW w:type="dxa" w:w="1488"/>
           </w:tcPr>
           <w:p>
             <w:pPr>
@@ -7072,7 +7130,7 @@
         </w:tc>
         <w:tc>
           <w:tcPr>
-            <w:tcW w:type="dxa" w:w="1422"/>
+            <w:tcW w:type="dxa" w:w="2034"/>
           </w:tcPr>
           <w:p>
             <w:pPr>
@@ -7088,7 +7146,7 @@
         </w:tc>
         <w:tc>
           <w:tcPr>
-            <w:tcW w:type="dxa" w:w="2137"/>
+            <w:tcW w:type="dxa" w:w="1853"/>
           </w:tcPr>
           <w:p>
             <w:pPr>
@@ -7114,7 +7172,7 @@
         </w:tc>
         <w:tc>
           <w:tcPr>
-            <w:tcW w:type="dxa" w:w="3760"/>
+            <w:tcW w:type="dxa" w:w="3755"/>
           </w:tcPr>
           <w:p>
             <w:pPr>
@@ -7129,7 +7187,7 @@
       <w:tr>
         <w:tc>
           <w:tcPr>
-            <w:tcW w:type="dxa" w:w="1811"/>
+            <w:tcW w:type="dxa" w:w="1488"/>
           </w:tcPr>
           <w:p>
             <w:pPr>
@@ -7145,7 +7203,7 @@
         </w:tc>
         <w:tc>
           <w:tcPr>
-            <w:tcW w:type="dxa" w:w="1422"/>
+            <w:tcW w:type="dxa" w:w="2034"/>
           </w:tcPr>
           <w:p>
             <w:pPr>
@@ -7161,7 +7219,7 @@
         </w:tc>
         <w:tc>
           <w:tcPr>
-            <w:tcW w:type="dxa" w:w="2137"/>
+            <w:tcW w:type="dxa" w:w="1853"/>
           </w:tcPr>
           <w:p>
             <w:pPr>
@@ -7187,7 +7245,7 @@
         </w:tc>
         <w:tc>
           <w:tcPr>
-            <w:tcW w:type="dxa" w:w="3760"/>
+            <w:tcW w:type="dxa" w:w="3755"/>
           </w:tcPr>
           <w:p>
             <w:pPr>
@@ -7202,7 +7260,7 @@
       <w:tr>
         <w:tc>
           <w:tcPr>
-            <w:tcW w:type="dxa" w:w="1811"/>
+            <w:tcW w:type="dxa" w:w="1488"/>
           </w:tcPr>
           <w:p>
             <w:pPr>
@@ -7218,7 +7276,7 @@
         </w:tc>
         <w:tc>
           <w:tcPr>
-            <w:tcW w:type="dxa" w:w="1422"/>
+            <w:tcW w:type="dxa" w:w="2034"/>
           </w:tcPr>
           <w:p>
             <w:pPr>
@@ -7234,7 +7292,7 @@
         </w:tc>
         <w:tc>
           <w:tcPr>
-            <w:tcW w:type="dxa" w:w="2137"/>
+            <w:tcW w:type="dxa" w:w="1853"/>
           </w:tcPr>
           <w:p>
             <w:pPr>
@@ -7260,7 +7318,7 @@
         </w:tc>
         <w:tc>
           <w:tcPr>
-            <w:tcW w:type="dxa" w:w="3760"/>
+            <w:tcW w:type="dxa" w:w="3755"/>
           </w:tcPr>
           <w:p>
             <w:pPr>
@@ -7279,7 +7337,7 @@
       <w:tr>
         <w:tc>
           <w:tcPr>
-            <w:tcW w:type="dxa" w:w="1811"/>
+            <w:tcW w:type="dxa" w:w="1488"/>
           </w:tcPr>
           <w:p>
             <w:pPr>
@@ -7295,7 +7353,7 @@
         </w:tc>
         <w:tc>
           <w:tcPr>
-            <w:tcW w:type="dxa" w:w="1422"/>
+            <w:tcW w:type="dxa" w:w="2034"/>
           </w:tcPr>
           <w:p>
             <w:pPr>
@@ -7311,7 +7369,7 @@
         </w:tc>
         <w:tc>
           <w:tcPr>
-            <w:tcW w:type="dxa" w:w="2137"/>
+            <w:tcW w:type="dxa" w:w="1853"/>
           </w:tcPr>
           <w:p>
             <w:pPr>
@@ -7337,7 +7395,7 @@
         </w:tc>
         <w:tc>
           <w:tcPr>
-            <w:tcW w:type="dxa" w:w="3760"/>
+            <w:tcW w:type="dxa" w:w="3755"/>
           </w:tcPr>
           <w:p>
             <w:pPr>
@@ -7352,7 +7410,7 @@
       <w:tr>
         <w:tc>
           <w:tcPr>
-            <w:tcW w:type="dxa" w:w="1811"/>
+            <w:tcW w:type="dxa" w:w="1488"/>
           </w:tcPr>
           <w:p>
             <w:pPr>
@@ -7368,7 +7426,7 @@
         </w:tc>
         <w:tc>
           <w:tcPr>
-            <w:tcW w:type="dxa" w:w="1422"/>
+            <w:tcW w:type="dxa" w:w="2034"/>
           </w:tcPr>
           <w:p>
             <w:pPr>
@@ -7384,7 +7442,7 @@
         </w:tc>
         <w:tc>
           <w:tcPr>
-            <w:tcW w:type="dxa" w:w="2137"/>
+            <w:tcW w:type="dxa" w:w="1853"/>
           </w:tcPr>
           <w:p>
             <w:pPr>
@@ -7410,7 +7468,7 @@
         </w:tc>
         <w:tc>
           <w:tcPr>
-            <w:tcW w:type="dxa" w:w="3760"/>
+            <w:tcW w:type="dxa" w:w="3755"/>
           </w:tcPr>
           <w:p>
             <w:pPr>
@@ -7425,7 +7483,7 @@
       <w:tr>
         <w:tc>
           <w:tcPr>
-            <w:tcW w:type="dxa" w:w="1811"/>
+            <w:tcW w:type="dxa" w:w="1488"/>
           </w:tcPr>
           <w:p>
             <w:pPr>
@@ -7441,7 +7499,7 @@
         </w:tc>
         <w:tc>
           <w:tcPr>
-            <w:tcW w:type="dxa" w:w="1422"/>
+            <w:tcW w:type="dxa" w:w="2034"/>
           </w:tcPr>
           <w:p>
             <w:pPr>
@@ -7457,7 +7515,7 @@
         </w:tc>
         <w:tc>
           <w:tcPr>
-            <w:tcW w:type="dxa" w:w="2137"/>
+            <w:tcW w:type="dxa" w:w="1853"/>
           </w:tcPr>
           <w:p>
             <w:pPr>
@@ -7483,7 +7541,7 @@
         </w:tc>
         <w:tc>
           <w:tcPr>
-            <w:tcW w:type="dxa" w:w="3760"/>
+            <w:tcW w:type="dxa" w:w="3755"/>
           </w:tcPr>
           <w:p>
             <w:pPr>
@@ -7498,7 +7556,7 @@
       <w:tr>
         <w:tc>
           <w:tcPr>
-            <w:tcW w:type="dxa" w:w="1811"/>
+            <w:tcW w:type="dxa" w:w="1488"/>
           </w:tcPr>
           <w:p>
             <w:pPr>
@@ -7514,7 +7572,7 @@
         </w:tc>
         <w:tc>
           <w:tcPr>
-            <w:tcW w:type="dxa" w:w="1422"/>
+            <w:tcW w:type="dxa" w:w="2034"/>
           </w:tcPr>
           <w:p>
             <w:pPr>
@@ -7530,7 +7588,7 @@
         </w:tc>
         <w:tc>
           <w:tcPr>
-            <w:tcW w:type="dxa" w:w="2137"/>
+            <w:tcW w:type="dxa" w:w="1853"/>
           </w:tcPr>
           <w:p>
             <w:pPr>
@@ -7556,7 +7614,7 @@
         </w:tc>
         <w:tc>
           <w:tcPr>
-            <w:tcW w:type="dxa" w:w="3760"/>
+            <w:tcW w:type="dxa" w:w="3755"/>
           </w:tcPr>
           <w:p>
             <w:pPr>
@@ -7571,7 +7629,7 @@
       <w:tr>
         <w:tc>
           <w:tcPr>
-            <w:tcW w:type="dxa" w:w="1811"/>
+            <w:tcW w:type="dxa" w:w="1488"/>
           </w:tcPr>
           <w:p>
             <w:pPr>
@@ -7587,30 +7645,75 @@
         </w:tc>
         <w:tc>
           <w:tcPr>
-            <w:tcW w:type="dxa" w:w="1422"/>
-          </w:tcPr>
-          <w:p>
-            <w:pPr>
-              <w:pStyle w:val="Compact"/>
-            </w:pPr>
+            <w:tcW w:type="dxa" w:w="2034"/>
+          </w:tcPr>
+          <w:p>
+            <w:pPr>
+              <w:pStyle w:val="Compact"/>
+            </w:pPr>
+            <w:r>
+              <w:rPr>
+                <w:rStyle w:val="VerbatimChar"/>
+              </w:rPr>
+              <w:t xml:space="preserve">none</w:t>
+            </w:r>
+            <w:r>
+              <w:t xml:space="preserve"> </w:t>
+            </w:r>
+            <w:r>
+              <w:t xml:space="preserve">/</w:t>
+            </w:r>
+            <w:r>
+              <w:t xml:space="preserve"> </w:t>
+            </w:r>
             <w:r>
               <w:rPr>
                 <w:rStyle w:val="VerbatimChar"/>
               </w:rPr>
               <w:t xml:space="preserve">product</w:t>
             </w:r>
-          </w:p>
-        </w:tc>
-        <w:tc>
-          <w:tcPr>
-            <w:tcW w:type="dxa" w:w="2137"/>
-          </w:tcPr>
-          <w:p>
-            <w:pPr>
-              <w:pStyle w:val="Compact"/>
-            </w:pPr>
-            <w:r>
-              <w:t xml:space="preserve">Binder (opt-in)</w:t>
+            <w:r>
+              <w:t xml:space="preserve"> </w:t>
+            </w:r>
+            <w:r>
+              <w:t xml:space="preserve">/</w:t>
+            </w:r>
+            <w:r>
+              <w:t xml:space="preserve"> </w:t>
+            </w:r>
+            <w:r>
+              <w:rPr>
+                <w:rStyle w:val="VerbatimChar"/>
+              </w:rPr>
+              <w:t xml:space="preserve">portfolio</w:t>
+            </w:r>
+            <w:r>
+              <w:t xml:space="preserve"> </w:t>
+            </w:r>
+            <w:r>
+              <w:t xml:space="preserve">/</w:t>
+            </w:r>
+            <w:r>
+              <w:t xml:space="preserve"> </w:t>
+            </w:r>
+            <w:r>
+              <w:rPr>
+                <w:rStyle w:val="VerbatimChar"/>
+              </w:rPr>
+              <w:t xml:space="preserve">organization</w:t>
+            </w:r>
+          </w:p>
+        </w:tc>
+        <w:tc>
+          <w:tcPr>
+            <w:tcW w:type="dxa" w:w="1853"/>
+          </w:tcPr>
+          <w:p>
+            <w:pPr>
+              <w:pStyle w:val="Compact"/>
+            </w:pPr>
+            <w:r>
+              <w:t xml:space="preserve">Provider (UI, via infra PR)</w:t>
             </w:r>
           </w:p>
         </w:tc>
@@ -7623,28 +7726,192 @@
               <w:pStyle w:val="Compact"/>
             </w:pPr>
             <w:r>
-              <w:t xml:space="preserve">No</w:t>
-            </w:r>
-          </w:p>
-        </w:tc>
-        <w:tc>
-          <w:tcPr>
-            <w:tcW w:type="dxa" w:w="3760"/>
-          </w:tcPr>
-          <w:p>
-            <w:pPr>
-              <w:pStyle w:val="Compact"/>
-            </w:pPr>
-            <w:r>
-              <w:t xml:space="preserve">Allows read by other projects in the same product (§4.6)</w:t>
-            </w:r>
-          </w:p>
-        </w:tc>
-      </w:tr>
-      <w:tr>
-        <w:tc>
-          <w:tcPr>
-            <w:tcW w:type="dxa" w:w="1811"/>
+              <w:t xml:space="preserve">No (default</w:t>
+            </w:r>
+            <w:r>
+              <w:t xml:space="preserve"> </w:t>
+            </w:r>
+            <w:r>
+              <w:rPr>
+                <w:rStyle w:val="VerbatimChar"/>
+              </w:rPr>
+              <w:t xml:space="preserve">none</w:t>
+            </w:r>
+            <w:r>
+              <w:t xml:space="preserve">)</w:t>
+            </w:r>
+          </w:p>
+        </w:tc>
+        <w:tc>
+          <w:tcPr>
+            <w:tcW w:type="dxa" w:w="3755"/>
+          </w:tcPr>
+          <w:p>
+            <w:pPr>
+              <w:pStyle w:val="Compact"/>
+            </w:pPr>
+            <w:r>
+              <w:rPr>
+                <w:b/>
+                <w:bCs/>
+              </w:rPr>
+              <w:t xml:space="preserve">Sharing by tags</w:t>
+            </w:r>
+            <w:r>
+              <w:t xml:space="preserve">: who outside the project may use the resource, across accounts (§4.11.1)</w:t>
+            </w:r>
+          </w:p>
+        </w:tc>
+      </w:tr>
+      <w:tr>
+        <w:tc>
+          <w:tcPr>
+            <w:tcW w:type="dxa" w:w="1488"/>
+          </w:tcPr>
+          <w:p>
+            <w:pPr>
+              <w:pStyle w:val="Compact"/>
+            </w:pPr>
+            <w:r>
+              <w:rPr>
+                <w:rStyle w:val="VerbatimChar"/>
+              </w:rPr>
+              <w:t xml:space="preserve">org:share-access</w:t>
+            </w:r>
+          </w:p>
+        </w:tc>
+        <w:tc>
+          <w:tcPr>
+            <w:tcW w:type="dxa" w:w="2034"/>
+          </w:tcPr>
+          <w:p>
+            <w:pPr>
+              <w:pStyle w:val="Compact"/>
+            </w:pPr>
+            <w:r>
+              <w:rPr>
+                <w:rStyle w:val="VerbatimChar"/>
+              </w:rPr>
+              <w:t xml:space="preserve">read</w:t>
+            </w:r>
+            <w:r>
+              <w:t xml:space="preserve"> </w:t>
+            </w:r>
+            <w:r>
+              <w:t xml:space="preserve">/</w:t>
+            </w:r>
+            <w:r>
+              <w:t xml:space="preserve"> </w:t>
+            </w:r>
+            <w:r>
+              <w:rPr>
+                <w:rStyle w:val="VerbatimChar"/>
+              </w:rPr>
+              <w:t xml:space="preserve">readwrite</w:t>
+            </w:r>
+            <w:r>
+              <w:t xml:space="preserve"> </w:t>
+            </w:r>
+            <w:r>
+              <w:t xml:space="preserve">/</w:t>
+            </w:r>
+            <w:r>
+              <w:t xml:space="preserve"> </w:t>
+            </w:r>
+            <w:r>
+              <w:rPr>
+                <w:rStyle w:val="VerbatimChar"/>
+              </w:rPr>
+              <w:t xml:space="preserve">invoke</w:t>
+            </w:r>
+            <w:r>
+              <w:t xml:space="preserve"> </w:t>
+            </w:r>
+            <w:r>
+              <w:t xml:space="preserve">/</w:t>
+            </w:r>
+            <w:r>
+              <w:t xml:space="preserve"> </w:t>
+            </w:r>
+            <w:r>
+              <w:rPr>
+                <w:rStyle w:val="VerbatimChar"/>
+              </w:rPr>
+              <w:t xml:space="preserve">publish</w:t>
+            </w:r>
+            <w:r>
+              <w:t xml:space="preserve"> </w:t>
+            </w:r>
+            <w:r>
+              <w:t xml:space="preserve">/</w:t>
+            </w:r>
+            <w:r>
+              <w:t xml:space="preserve"> </w:t>
+            </w:r>
+            <w:r>
+              <w:rPr>
+                <w:rStyle w:val="VerbatimChar"/>
+              </w:rPr>
+              <w:t xml:space="preserve">consume</w:t>
+            </w:r>
+          </w:p>
+        </w:tc>
+        <w:tc>
+          <w:tcPr>
+            <w:tcW w:type="dxa" w:w="1853"/>
+          </w:tcPr>
+          <w:p>
+            <w:pPr>
+              <w:pStyle w:val="Compact"/>
+            </w:pPr>
+            <w:r>
+              <w:t xml:space="preserve">Provider (UI, via infra PR)</w:t>
+            </w:r>
+          </w:p>
+        </w:tc>
+        <w:tc>
+          <w:tcPr>
+            <w:tcW w:type="dxa" w:w="950"/>
+          </w:tcPr>
+          <w:p>
+            <w:pPr>
+              <w:pStyle w:val="Compact"/>
+            </w:pPr>
+            <w:r>
+              <w:t xml:space="preserve">No (default</w:t>
+            </w:r>
+            <w:r>
+              <w:t xml:space="preserve"> </w:t>
+            </w:r>
+            <w:r>
+              <w:rPr>
+                <w:rStyle w:val="VerbatimChar"/>
+              </w:rPr>
+              <w:t xml:space="preserve">read</w:t>
+            </w:r>
+            <w:r>
+              <w:t xml:space="preserve">)</w:t>
+            </w:r>
+          </w:p>
+        </w:tc>
+        <w:tc>
+          <w:tcPr>
+            <w:tcW w:type="dxa" w:w="3755"/>
+          </w:tcPr>
+          <w:p>
+            <w:pPr>
+              <w:pStyle w:val="Compact"/>
+            </w:pPr>
+            <w:r>
+              <w:t xml:space="preserve">What shared consumers may do (§4.11.1)</w:t>
+            </w:r>
+          </w:p>
+        </w:tc>
+      </w:tr>
+      <w:tr>
+        <w:tc>
+          <w:tcPr>
+            <w:tcW w:type="dxa" w:w="1488"/>
           </w:tcPr>
           <w:p>
             <w:pPr>
@@ -7660,7 +7927,7 @@
         </w:tc>
         <w:tc>
           <w:tcPr>
-            <w:tcW w:type="dxa" w:w="1422"/>
+            <w:tcW w:type="dxa" w:w="2034"/>
           </w:tcPr>
           <w:p>
             <w:pPr>
@@ -7676,7 +7943,7 @@
         </w:tc>
         <w:tc>
           <w:tcPr>
-            <w:tcW w:type="dxa" w:w="2137"/>
+            <w:tcW w:type="dxa" w:w="1853"/>
           </w:tcPr>
           <w:p>
             <w:pPr>
@@ -7702,7 +7969,7 @@
         </w:tc>
         <w:tc>
           <w:tcPr>
-            <w:tcW w:type="dxa" w:w="3760"/>
+            <w:tcW w:type="dxa" w:w="3755"/>
           </w:tcPr>
           <w:p>
             <w:pPr>
@@ -7717,7 +7984,7 @@
       <w:tr>
         <w:tc>
           <w:tcPr>
-            <w:tcW w:type="dxa" w:w="1811"/>
+            <w:tcW w:type="dxa" w:w="1488"/>
           </w:tcPr>
           <w:p>
             <w:pPr>
@@ -7733,7 +8000,7 @@
         </w:tc>
         <w:tc>
           <w:tcPr>
-            <w:tcW w:type="dxa" w:w="1422"/>
+            <w:tcW w:type="dxa" w:w="2034"/>
           </w:tcPr>
           <w:p>
             <w:pPr>
@@ -7764,7 +8031,7 @@
         </w:tc>
         <w:tc>
           <w:tcPr>
-            <w:tcW w:type="dxa" w:w="2137"/>
+            <w:tcW w:type="dxa" w:w="1853"/>
           </w:tcPr>
           <w:p>
             <w:pPr>
@@ -7790,7 +8057,7 @@
         </w:tc>
         <w:tc>
           <w:tcPr>
-            <w:tcW w:type="dxa" w:w="3760"/>
+            <w:tcW w:type="dxa" w:w="3755"/>
           </w:tcPr>
           <w:p>
             <w:pPr>
@@ -7805,7 +8072,7 @@
       <w:tr>
         <w:tc>
           <w:tcPr>
-            <w:tcW w:type="dxa" w:w="1811"/>
+            <w:tcW w:type="dxa" w:w="1488"/>
           </w:tcPr>
           <w:p>
             <w:pPr>
@@ -7821,7 +8088,7 @@
         </w:tc>
         <w:tc>
           <w:tcPr>
-            <w:tcW w:type="dxa" w:w="1422"/>
+            <w:tcW w:type="dxa" w:w="2034"/>
           </w:tcPr>
           <w:p>
             <w:pPr>
@@ -7837,7 +8104,7 @@
         </w:tc>
         <w:tc>
           <w:tcPr>
-            <w:tcW w:type="dxa" w:w="2137"/>
+            <w:tcW w:type="dxa" w:w="1853"/>
           </w:tcPr>
           <w:p>
             <w:pPr>
@@ -7863,7 +8130,7 @@
         </w:tc>
         <w:tc>
           <w:tcPr>
-            <w:tcW w:type="dxa" w:w="3760"/>
+            <w:tcW w:type="dxa" w:w="3755"/>
           </w:tcPr>
           <w:p>
             <w:pPr>
@@ -9406,13 +9673,13 @@
           <w:b/>
           <w:bCs/>
         </w:rPr>
-        <w:t xml:space="preserve">Sharing within a product (opt-in):</w:t>
-      </w:r>
-      <w:r>
-        <w:t xml:space="preserve"> </w:t>
-      </w:r>
-      <w:r>
-        <w:t xml:space="preserve">an</w:t>
+        <w:t xml:space="preserve">Sharing with other projects</w:t>
+      </w:r>
+      <w:r>
+        <w:t xml:space="preserve"> </w:t>
+      </w:r>
+      <w:r>
+        <w:t xml:space="preserve">is done by share tags or by agreement (§4.11). For example, an</w:t>
       </w:r>
       <w:r>
         <w:t xml:space="preserve"> </w:t>
@@ -9459,7 +9726,7 @@
         <w:t xml:space="preserve"> </w:t>
       </w:r>
       <w:r>
-        <w:t xml:space="preserve">product is allowed only if:</w:t>
+        <w:t xml:space="preserve">product is allowed when:</w:t>
       </w:r>
       <w:r>
         <w:t xml:space="preserve"> </w:t>
@@ -9477,13 +9744,31 @@
         <w:t xml:space="preserve">org:share-scope=product</w:t>
       </w:r>
       <w:r>
-        <w:t xml:space="preserve">.</w:t>
-      </w:r>
-      <w:r>
-        <w:t xml:space="preserve"> </w:t>
-      </w:r>
-      <w:r>
-        <w:t xml:space="preserve">2. The access is read-only (unless an approved exception exists).</w:t>
+        <w:t xml:space="preserve"> </w:t>
+      </w:r>
+      <w:r>
+        <w:t xml:space="preserve">(or wider).</w:t>
+      </w:r>
+      <w:r>
+        <w:t xml:space="preserve"> </w:t>
+      </w:r>
+      <w:r>
+        <w:t xml:space="preserve">2. The access is within its</w:t>
+      </w:r>
+      <w:r>
+        <w:t xml:space="preserve"> </w:t>
+      </w:r>
+      <w:r>
+        <w:rPr>
+          <w:rStyle w:val="VerbatimChar"/>
+        </w:rPr>
+        <w:t xml:space="preserve">org:share-access</w:t>
+      </w:r>
+      <w:r>
+        <w:t xml:space="preserve"> </w:t>
+      </w:r>
+      <w:r>
+        <w:t xml:space="preserve">level (read by default).</w:t>
       </w:r>
       <w:r>
         <w:t xml:space="preserve"> </w:t>
@@ -11820,7 +12105,7 @@
               <w:pStyle w:val="Compact"/>
             </w:pPr>
             <w:r>
-              <w:t xml:space="preserve">Opt-in sharing within a product (§4.6)</w:t>
+              <w:t xml:space="preserve">Sharing with other projects / accounts</w:t>
             </w:r>
           </w:p>
         </w:tc>
@@ -11832,24 +12117,18 @@
             <w:pPr>
               <w:pStyle w:val="Compact"/>
             </w:pPr>
-            <w:r>
-              <w:t xml:space="preserve">Resource policy gets one extra</w:t>
-            </w:r>
-            <w:r>
-              <w:t xml:space="preserve"> </w:t>
-            </w:r>
             <w:r>
               <w:rPr>
                 <w:b/>
                 <w:bCs/>
               </w:rPr>
-              <w:t xml:space="preserve">Allow-path</w:t>
-            </w:r>
-            <w:r>
-              <w:t xml:space="preserve"> </w:t>
-            </w:r>
-            <w:r>
-              <w:t xml:space="preserve">exception: principals with the same</w:t>
+              <w:t xml:space="preserve">By tags</w:t>
+            </w:r>
+            <w:r>
+              <w:t xml:space="preserve"> </w:t>
+            </w:r>
+            <w:r>
+              <w:t xml:space="preserve">(§4.11.1): the resource policy allows principals whose</w:t>
             </w:r>
             <w:r>
               <w:t xml:space="preserve"> </w:t>
@@ -11864,29 +12143,49 @@
               <w:t xml:space="preserve"> </w:t>
             </w:r>
             <w:r>
-              <w:rPr>
-                <w:i/>
-                <w:iCs/>
-              </w:rPr>
-              <w:t xml:space="preserve">and</w:t>
-            </w:r>
-            <w:r>
-              <w:t xml:space="preserve"> </w:t>
-            </w:r>
-            <w:r>
-              <w:t xml:space="preserve">the target tagged</w:t>
-            </w:r>
-            <w:r>
-              <w:t xml:space="preserve"> </w:t>
-            </w:r>
-            <w:r>
-              <w:rPr>
-                <w:rStyle w:val="VerbatimChar"/>
-              </w:rPr>
-              <w:t xml:space="preserve">org:share-scope=product</w:t>
-            </w:r>
-            <w:r>
-              <w:t xml:space="preserve">,</w:t>
+              <w:t xml:space="preserve">/</w:t>
+            </w:r>
+            <w:r>
+              <w:t xml:space="preserve"> </w:t>
+            </w:r>
+            <w:r>
+              <w:rPr>
+                <w:rStyle w:val="VerbatimChar"/>
+              </w:rPr>
+              <w:t xml:space="preserve">org:portfolio</w:t>
+            </w:r>
+            <w:r>
+              <w:t xml:space="preserve"> </w:t>
+            </w:r>
+            <w:r>
+              <w:t xml:space="preserve">tags match the resource’s</w:t>
+            </w:r>
+            <w:r>
+              <w:t xml:space="preserve"> </w:t>
+            </w:r>
+            <w:r>
+              <w:rPr>
+                <w:rStyle w:val="VerbatimChar"/>
+              </w:rPr>
+              <w:t xml:space="preserve">org:share-scope</w:t>
+            </w:r>
+            <w:r>
+              <w:t xml:space="preserve">, same environment, inside the organization, limited to</w:t>
+            </w:r>
+            <w:r>
+              <w:t xml:space="preserve"> </w:t>
+            </w:r>
+            <w:r>
+              <w:rPr>
+                <w:rStyle w:val="VerbatimChar"/>
+              </w:rPr>
+              <w:t xml:space="preserve">org:share-access</w:t>
+            </w:r>
+            <w:r>
+              <w:t xml:space="preserve"> </w:t>
+            </w:r>
+            <w:r>
+              <w:t xml:space="preserve">actions.</w:t>
             </w:r>
             <w:r>
               <w:t xml:space="preserve"> </w:t>
@@ -11896,10 +12195,13 @@
                 <w:b/>
                 <w:bCs/>
               </w:rPr>
-              <w:t xml:space="preserve">read-only actions only</w:t>
-            </w:r>
-            <w:r>
-              <w:t xml:space="preserve">, added only when such a connection exists</w:t>
+              <w:t xml:space="preserve">By agreement</w:t>
+            </w:r>
+            <w:r>
+              <w:t xml:space="preserve"> </w:t>
+            </w:r>
+            <w:r>
+              <w:t xml:space="preserve">(§4.11.2) for anything else</w:t>
             </w:r>
           </w:p>
         </w:tc>
@@ -12218,7 +12520,7 @@
         <w:pStyle w:val="Heading2"/>
       </w:pPr>
       <w:r>
-        <w:t xml:space="preserve">4.11 Cross-account access: sharing agreements</w:t>
+        <w:t xml:space="preserve">4.11 Sharing across projects and accounts: by tags or by agreement</w:t>
       </w:r>
     </w:p>
     <w:p>
@@ -12226,7 +12528,7 @@
         <w:pStyle w:val="FirstParagraph"/>
       </w:pPr>
       <w:r>
-        <w:t xml:space="preserve">Infrastructure created by the platform often needs assets in</w:t>
+        <w:t xml:space="preserve">Infrastructure created by the platform often needs assets owned by</w:t>
       </w:r>
       <w:r>
         <w:t xml:space="preserve"> </w:t>
@@ -12236,10 +12538,10 @@
           <w:b/>
           <w:bCs/>
         </w:rPr>
-        <w:t xml:space="preserve">other AWS accounts</w:t>
-      </w:r>
-      <w:r>
-        <w:t xml:space="preserve">, for example a central data-lake bucket, a shared SQS queue owned by another team, or another product’s KMS-encrypted dataset. This is supported, and it</w:t>
+        <w:t xml:space="preserve">other projects</w:t>
+      </w:r>
+      <w:r>
+        <w:t xml:space="preserve">, in the same or in</w:t>
       </w:r>
       <w:r>
         <w:t xml:space="preserve"> </w:t>
@@ -12249,10 +12551,10 @@
           <w:b/>
           <w:bCs/>
         </w:rPr>
-        <w:t xml:space="preserve">keeps the tag-based isolation of §4.10</w:t>
-      </w:r>
-      <w:r>
-        <w:t xml:space="preserve">: cross-account access exists only through an explicit, approved</w:t>
+        <w:t xml:space="preserve">other AWS accounts</w:t>
+      </w:r>
+      <w:r>
+        <w:t xml:space="preserve">: a central data-lake bucket, a shared SQS queue, another product’s KMS-encrypted dataset. Sharing is supported in two ways, and both</w:t>
       </w:r>
       <w:r>
         <w:t xml:space="preserve"> </w:t>
@@ -12262,10 +12564,247 @@
           <w:b/>
           <w:bCs/>
         </w:rPr>
-        <w:t xml:space="preserve">sharing agreement</w:t>
-      </w:r>
-      <w:r>
-        <w:t xml:space="preserve">, and the platform generates the permissions on</w:t>
+        <w:t xml:space="preserve">keep the tag-based isolation of §4.10</w:t>
+      </w:r>
+      <w:r>
+        <w:t xml:space="preserve">:</w:t>
+      </w:r>
+    </w:p>
+    <w:tbl>
+      <w:tblPr>
+        <w:tblStyle w:val="Table"/>
+        <w:tblW w:type="dxa" w:w="10080"/>
+        <w:tblLayout w:type="fixed"/>
+        <w:tblLook w:firstRow="1" w:lastRow="0" w:firstColumn="0" w:lastColumn="0" w:noHBand="0" w:noVBand="0" w:val="0020"/>
+      </w:tblPr>
+      <w:tblGrid>
+        <w:gridCol w:w="1067"/>
+        <w:gridCol w:w="3195"/>
+        <w:gridCol w:w="2538"/>
+        <w:gridCol w:w="3280"/>
+      </w:tblGrid>
+      <w:tr>
+        <w:trPr>
+          <w:tblHeader w:val="on"/>
+        </w:trPr>
+        <w:tc>
+          <w:tcPr>
+            <w:tcW w:type="dxa" w:w="1067"/>
+          </w:tcPr>
+          <w:p>
+            <w:pPr>
+              <w:pStyle w:val="Compact"/>
+            </w:pPr>
+            <w:r>
+              <w:t xml:space="preserve">Way</w:t>
+            </w:r>
+          </w:p>
+        </w:tc>
+        <w:tc>
+          <w:tcPr>
+            <w:tcW w:type="dxa" w:w="3195"/>
+          </w:tcPr>
+          <w:p>
+            <w:pPr>
+              <w:pStyle w:val="Compact"/>
+            </w:pPr>
+            <w:r>
+              <w:t xml:space="preserve">How it is decided</w:t>
+            </w:r>
+          </w:p>
+        </w:tc>
+        <w:tc>
+          <w:tcPr>
+            <w:tcW w:type="dxa" w:w="2538"/>
+          </w:tcPr>
+          <w:p>
+            <w:pPr>
+              <w:pStyle w:val="Compact"/>
+            </w:pPr>
+            <w:r>
+              <w:t xml:space="preserve">Approval per consumer</w:t>
+            </w:r>
+          </w:p>
+        </w:tc>
+        <w:tc>
+          <w:tcPr>
+            <w:tcW w:type="dxa" w:w="3280"/>
+          </w:tcPr>
+          <w:p>
+            <w:pPr>
+              <w:pStyle w:val="Compact"/>
+            </w:pPr>
+            <w:r>
+              <w:t xml:space="preserve">Use for</w:t>
+            </w:r>
+          </w:p>
+        </w:tc>
+      </w:tr>
+      <w:tr>
+        <w:tc>
+          <w:tcPr>
+            <w:tcW w:type="dxa" w:w="1067"/>
+          </w:tcPr>
+          <w:p>
+            <w:pPr>
+              <w:pStyle w:val="Compact"/>
+            </w:pPr>
+            <w:r>
+              <w:rPr>
+                <w:b/>
+                <w:bCs/>
+              </w:rPr>
+              <w:t xml:space="preserve">1. Sharing by tags</w:t>
+            </w:r>
+            <w:r>
+              <w:t xml:space="preserve"> </w:t>
+            </w:r>
+            <w:r>
+              <w:t xml:space="preserve">(default)</w:t>
+            </w:r>
+          </w:p>
+        </w:tc>
+        <w:tc>
+          <w:tcPr>
+            <w:tcW w:type="dxa" w:w="3195"/>
+          </w:tcPr>
+          <w:p>
+            <w:pPr>
+              <w:pStyle w:val="Compact"/>
+            </w:pPr>
+            <w:r>
+              <w:t xml:space="preserve">The provider puts</w:t>
+            </w:r>
+            <w:r>
+              <w:t xml:space="preserve"> </w:t>
+            </w:r>
+            <w:r>
+              <w:rPr>
+                <w:b/>
+                <w:bCs/>
+              </w:rPr>
+              <w:t xml:space="preserve">share tags</w:t>
+            </w:r>
+            <w:r>
+              <w:t xml:space="preserve"> </w:t>
+            </w:r>
+            <w:r>
+              <w:t xml:space="preserve">on its resource. Any consumer whose own tags match the share rule gets access, in any account of the organization.</w:t>
+            </w:r>
+          </w:p>
+        </w:tc>
+        <w:tc>
+          <w:tcPr>
+            <w:tcW w:type="dxa" w:w="2538"/>
+          </w:tcPr>
+          <w:p>
+            <w:pPr>
+              <w:pStyle w:val="Compact"/>
+            </w:pPr>
+            <w:r>
+              <w:rPr>
+                <w:b/>
+                <w:bCs/>
+              </w:rPr>
+              <w:t xml:space="preserve">No.</w:t>
+            </w:r>
+            <w:r>
+              <w:t xml:space="preserve"> </w:t>
+            </w:r>
+            <w:r>
+              <w:t xml:space="preserve">The provider decided once, through the tag; consumers connect self-service</w:t>
+            </w:r>
+          </w:p>
+        </w:tc>
+        <w:tc>
+          <w:tcPr>
+            <w:tcW w:type="dxa" w:w="3280"/>
+          </w:tcPr>
+          <w:p>
+            <w:pPr>
+              <w:pStyle w:val="Compact"/>
+            </w:pPr>
+            <w:r>
+              <w:t xml:space="preserve">Common, predictable sharing: within a product, within a portfolio, organization-wide reference data</w:t>
+            </w:r>
+          </w:p>
+        </w:tc>
+      </w:tr>
+      <w:tr>
+        <w:tc>
+          <w:tcPr>
+            <w:tcW w:type="dxa" w:w="1067"/>
+          </w:tcPr>
+          <w:p>
+            <w:pPr>
+              <w:pStyle w:val="Compact"/>
+            </w:pPr>
+            <w:r>
+              <w:rPr>
+                <w:b/>
+                <w:bCs/>
+              </w:rPr>
+              <w:t xml:space="preserve">2. Sharing by agreement</w:t>
+            </w:r>
+          </w:p>
+        </w:tc>
+        <w:tc>
+          <w:tcPr>
+            <w:tcW w:type="dxa" w:w="3195"/>
+          </w:tcPr>
+          <w:p>
+            <w:pPr>
+              <w:pStyle w:val="Compact"/>
+            </w:pPr>
+            <w:r>
+              <w:t xml:space="preserve">An explicit record naming one provider resource and one consumer</w:t>
+            </w:r>
+          </w:p>
+        </w:tc>
+        <w:tc>
+          <w:tcPr>
+            <w:tcW w:type="dxa" w:w="2538"/>
+          </w:tcPr>
+          <w:p>
+            <w:pPr>
+              <w:pStyle w:val="Compact"/>
+            </w:pPr>
+            <w:r>
+              <w:rPr>
+                <w:b/>
+                <w:bCs/>
+              </w:rPr>
+              <w:t xml:space="preserve">Yes</w:t>
+            </w:r>
+            <w:r>
+              <w:t xml:space="preserve"> </w:t>
+            </w:r>
+            <w:r>
+              <w:t xml:space="preserve">(provider owner, plus security where required)</w:t>
+            </w:r>
+          </w:p>
+        </w:tc>
+        <w:tc>
+          <w:tcPr>
+            <w:tcW w:type="dxa" w:w="3280"/>
+          </w:tcPr>
+          <w:p>
+            <w:pPr>
+              <w:pStyle w:val="Compact"/>
+            </w:pPr>
+            <w:r>
+              <w:t xml:space="preserve">Anything the tag rules cannot express: one specific consumer, write access across products, outside the organization, exceptions</w:t>
+            </w:r>
+          </w:p>
+        </w:tc>
+      </w:tr>
+    </w:tbl>
+    <w:p>
+      <w:pPr>
+        <w:pStyle w:val="BodyText"/>
+      </w:pPr>
+      <w:r>
+        <w:t xml:space="preserve">In both cases the platform</w:t>
       </w:r>
       <w:r>
         <w:t xml:space="preserve"> </w:t>
@@ -12275,13 +12814,13 @@
           <w:b/>
           <w:bCs/>
         </w:rPr>
-        <w:t xml:space="preserve">both sides</w:t>
-      </w:r>
-      <w:r>
-        <w:t xml:space="preserve"> </w:t>
-      </w:r>
-      <w:r>
-        <w:t xml:space="preserve">from it.</w:t>
+        <w:t xml:space="preserve">generates</w:t>
+      </w:r>
+      <w:r>
+        <w:t xml:space="preserve"> </w:t>
+      </w:r>
+      <w:r>
+        <w:t xml:space="preserve">the permissions on both sides. Nobody hand-edits a policy.</w:t>
       </w:r>
     </w:p>
     <w:p>
@@ -12289,7 +12828,1709 @@
         <w:pStyle w:val="Heading3"/>
       </w:pPr>
       <w:r>
-        <w:t xml:space="preserve">4.11.1 Sharing agreement</w:t>
+        <w:t xml:space="preserve">4.11.1 Sharing by tags</w:t>
+      </w:r>
+    </w:p>
+    <w:p>
+      <w:pPr>
+        <w:pStyle w:val="FirstParagraph"/>
+      </w:pPr>
+      <w:r>
+        <w:rPr>
+          <w:b/>
+          <w:bCs/>
+        </w:rPr>
+        <w:t xml:space="preserve">Share tags on the provider resource</w:t>
+      </w:r>
+      <w:r>
+        <w:t xml:space="preserve"> </w:t>
+      </w:r>
+      <w:r>
+        <w:t xml:space="preserve">(set in the platform UI, deployed through the provider’s normal infrastructure PR, gates and approvals):</w:t>
+      </w:r>
+    </w:p>
+    <w:tbl>
+      <w:tblPr>
+        <w:tblStyle w:val="Table"/>
+        <w:tblW w:type="dxa" w:w="10080"/>
+        <w:tblLayout w:type="fixed"/>
+        <w:tblLook w:firstRow="1" w:lastRow="0" w:firstColumn="0" w:lastColumn="0" w:noHBand="0" w:noVBand="0" w:val="0020"/>
+      </w:tblPr>
+      <w:tblGrid>
+        <w:gridCol w:w="1561"/>
+        <w:gridCol w:w="2793"/>
+        <w:gridCol w:w="5726"/>
+      </w:tblGrid>
+      <w:tr>
+        <w:trPr>
+          <w:tblHeader w:val="on"/>
+        </w:trPr>
+        <w:tc>
+          <w:tcPr>
+            <w:tcW w:type="dxa" w:w="1561"/>
+          </w:tcPr>
+          <w:p>
+            <w:pPr>
+              <w:pStyle w:val="Compact"/>
+            </w:pPr>
+            <w:r>
+              <w:t xml:space="preserve">Tag</w:t>
+            </w:r>
+          </w:p>
+        </w:tc>
+        <w:tc>
+          <w:tcPr>
+            <w:tcW w:type="dxa" w:w="2793"/>
+          </w:tcPr>
+          <w:p>
+            <w:pPr>
+              <w:pStyle w:val="Compact"/>
+            </w:pPr>
+            <w:r>
+              <w:t xml:space="preserve">Values</w:t>
+            </w:r>
+          </w:p>
+        </w:tc>
+        <w:tc>
+          <w:tcPr>
+            <w:tcW w:type="dxa" w:w="5726"/>
+          </w:tcPr>
+          <w:p>
+            <w:pPr>
+              <w:pStyle w:val="Compact"/>
+            </w:pPr>
+            <w:r>
+              <w:t xml:space="preserve">Meaning</w:t>
+            </w:r>
+          </w:p>
+        </w:tc>
+      </w:tr>
+      <w:tr>
+        <w:tc>
+          <w:tcPr>
+            <w:tcW w:type="dxa" w:w="1561"/>
+          </w:tcPr>
+          <w:p>
+            <w:pPr>
+              <w:pStyle w:val="Compact"/>
+            </w:pPr>
+            <w:r>
+              <w:rPr>
+                <w:rStyle w:val="VerbatimChar"/>
+              </w:rPr>
+              <w:t xml:space="preserve">org:share-scope</w:t>
+            </w:r>
+          </w:p>
+        </w:tc>
+        <w:tc>
+          <w:tcPr>
+            <w:tcW w:type="dxa" w:w="2793"/>
+          </w:tcPr>
+          <w:p>
+            <w:pPr>
+              <w:pStyle w:val="Compact"/>
+            </w:pPr>
+            <w:r>
+              <w:rPr>
+                <w:rStyle w:val="VerbatimChar"/>
+              </w:rPr>
+              <w:t xml:space="preserve">none</w:t>
+            </w:r>
+            <w:r>
+              <w:t xml:space="preserve"> </w:t>
+            </w:r>
+            <w:r>
+              <w:t xml:space="preserve">(default) |</w:t>
+            </w:r>
+            <w:r>
+              <w:t xml:space="preserve"> </w:t>
+            </w:r>
+            <w:r>
+              <w:rPr>
+                <w:rStyle w:val="VerbatimChar"/>
+              </w:rPr>
+              <w:t xml:space="preserve">product</w:t>
+            </w:r>
+            <w:r>
+              <w:t xml:space="preserve"> </w:t>
+            </w:r>
+            <w:r>
+              <w:t xml:space="preserve">|</w:t>
+            </w:r>
+            <w:r>
+              <w:t xml:space="preserve"> </w:t>
+            </w:r>
+            <w:r>
+              <w:rPr>
+                <w:rStyle w:val="VerbatimChar"/>
+              </w:rPr>
+              <w:t xml:space="preserve">portfolio</w:t>
+            </w:r>
+            <w:r>
+              <w:t xml:space="preserve"> </w:t>
+            </w:r>
+            <w:r>
+              <w:t xml:space="preserve">|</w:t>
+            </w:r>
+            <w:r>
+              <w:t xml:space="preserve"> </w:t>
+            </w:r>
+            <w:r>
+              <w:rPr>
+                <w:rStyle w:val="VerbatimChar"/>
+              </w:rPr>
+              <w:t xml:space="preserve">organization</w:t>
+            </w:r>
+          </w:p>
+        </w:tc>
+        <w:tc>
+          <w:tcPr>
+            <w:tcW w:type="dxa" w:w="5726"/>
+          </w:tcPr>
+          <w:p>
+            <w:pPr>
+              <w:pStyle w:val="Compact"/>
+            </w:pPr>
+            <w:r>
+              <w:rPr>
+                <w:b/>
+                <w:bCs/>
+              </w:rPr>
+              <w:t xml:space="preserve">Who</w:t>
+            </w:r>
+            <w:r>
+              <w:t xml:space="preserve"> </w:t>
+            </w:r>
+            <w:r>
+              <w:t xml:space="preserve">may use the resource: principals whose</w:t>
+            </w:r>
+            <w:r>
+              <w:t xml:space="preserve"> </w:t>
+            </w:r>
+            <w:r>
+              <w:rPr>
+                <w:rStyle w:val="VerbatimChar"/>
+              </w:rPr>
+              <w:t xml:space="preserve">org:product</w:t>
+            </w:r>
+            <w:r>
+              <w:t xml:space="preserve"> </w:t>
+            </w:r>
+            <w:r>
+              <w:t xml:space="preserve">(or</w:t>
+            </w:r>
+            <w:r>
+              <w:t xml:space="preserve"> </w:t>
+            </w:r>
+            <w:r>
+              <w:rPr>
+                <w:rStyle w:val="VerbatimChar"/>
+              </w:rPr>
+              <w:t xml:space="preserve">org:portfolio</w:t>
+            </w:r>
+            <w:r>
+              <w:t xml:space="preserve">) equals the resource’s value, or any platform principal in the organization</w:t>
+            </w:r>
+          </w:p>
+        </w:tc>
+      </w:tr>
+      <w:tr>
+        <w:tc>
+          <w:tcPr>
+            <w:tcW w:type="dxa" w:w="1561"/>
+          </w:tcPr>
+          <w:p>
+            <w:pPr>
+              <w:pStyle w:val="Compact"/>
+            </w:pPr>
+            <w:r>
+              <w:rPr>
+                <w:rStyle w:val="VerbatimChar"/>
+              </w:rPr>
+              <w:t xml:space="preserve">org:share-access</w:t>
+            </w:r>
+          </w:p>
+        </w:tc>
+        <w:tc>
+          <w:tcPr>
+            <w:tcW w:type="dxa" w:w="2793"/>
+          </w:tcPr>
+          <w:p>
+            <w:pPr>
+              <w:pStyle w:val="Compact"/>
+            </w:pPr>
+            <w:r>
+              <w:rPr>
+                <w:rStyle w:val="VerbatimChar"/>
+              </w:rPr>
+              <w:t xml:space="preserve">read</w:t>
+            </w:r>
+            <w:r>
+              <w:t xml:space="preserve"> </w:t>
+            </w:r>
+            <w:r>
+              <w:t xml:space="preserve">(default) |</w:t>
+            </w:r>
+            <w:r>
+              <w:t xml:space="preserve"> </w:t>
+            </w:r>
+            <w:r>
+              <w:rPr>
+                <w:rStyle w:val="VerbatimChar"/>
+              </w:rPr>
+              <w:t xml:space="preserve">readwrite</w:t>
+            </w:r>
+            <w:r>
+              <w:t xml:space="preserve"> </w:t>
+            </w:r>
+            <w:r>
+              <w:t xml:space="preserve">|</w:t>
+            </w:r>
+            <w:r>
+              <w:t xml:space="preserve"> </w:t>
+            </w:r>
+            <w:r>
+              <w:rPr>
+                <w:rStyle w:val="VerbatimChar"/>
+              </w:rPr>
+              <w:t xml:space="preserve">invoke</w:t>
+            </w:r>
+            <w:r>
+              <w:t xml:space="preserve"> </w:t>
+            </w:r>
+            <w:r>
+              <w:t xml:space="preserve">|</w:t>
+            </w:r>
+            <w:r>
+              <w:t xml:space="preserve"> </w:t>
+            </w:r>
+            <w:r>
+              <w:rPr>
+                <w:rStyle w:val="VerbatimChar"/>
+              </w:rPr>
+              <w:t xml:space="preserve">publish</w:t>
+            </w:r>
+            <w:r>
+              <w:t xml:space="preserve"> </w:t>
+            </w:r>
+            <w:r>
+              <w:t xml:space="preserve">|</w:t>
+            </w:r>
+            <w:r>
+              <w:t xml:space="preserve"> </w:t>
+            </w:r>
+            <w:r>
+              <w:rPr>
+                <w:rStyle w:val="VerbatimChar"/>
+              </w:rPr>
+              <w:t xml:space="preserve">consume</w:t>
+            </w:r>
+          </w:p>
+        </w:tc>
+        <w:tc>
+          <w:tcPr>
+            <w:tcW w:type="dxa" w:w="5726"/>
+          </w:tcPr>
+          <w:p>
+            <w:pPr>
+              <w:pStyle w:val="Compact"/>
+            </w:pPr>
+            <w:r>
+              <w:rPr>
+                <w:b/>
+                <w:bCs/>
+              </w:rPr>
+              <w:t xml:space="preserve">What</w:t>
+            </w:r>
+            <w:r>
+              <w:t xml:space="preserve"> </w:t>
+            </w:r>
+            <w:r>
+              <w:t xml:space="preserve">they may do; mapped to exact actions per service (§6.8.1)</w:t>
+            </w:r>
+          </w:p>
+        </w:tc>
+      </w:tr>
+      <w:tr>
+        <w:tc>
+          <w:tcPr>
+            <w:tcW w:type="dxa" w:w="1561"/>
+          </w:tcPr>
+          <w:p>
+            <w:pPr>
+              <w:pStyle w:val="Compact"/>
+            </w:pPr>
+            <w:r>
+              <w:rPr>
+                <w:rStyle w:val="VerbatimChar"/>
+              </w:rPr>
+              <w:t xml:space="preserve">org:environment</w:t>
+            </w:r>
+            <w:r>
+              <w:t xml:space="preserve"> </w:t>
+            </w:r>
+            <w:r>
+              <w:t xml:space="preserve">(existing)</w:t>
+            </w:r>
+          </w:p>
+        </w:tc>
+        <w:tc>
+          <w:tcPr>
+            <w:tcW w:type="dxa" w:w="2793"/>
+          </w:tcPr>
+          <w:p>
+            <w:pPr>
+              <w:pStyle w:val="Compact"/>
+            </w:pPr>
+            <w:r>
+              <w:t xml:space="preserve">—</w:t>
+            </w:r>
+          </w:p>
+        </w:tc>
+        <w:tc>
+          <w:tcPr>
+            <w:tcW w:type="dxa" w:w="5726"/>
+          </w:tcPr>
+          <w:p>
+            <w:pPr>
+              <w:pStyle w:val="Compact"/>
+            </w:pPr>
+            <w:r>
+              <w:t xml:space="preserve">Sharing by tags is</w:t>
+            </w:r>
+            <w:r>
+              <w:t xml:space="preserve"> </w:t>
+            </w:r>
+            <w:r>
+              <w:rPr>
+                <w:b/>
+                <w:bCs/>
+              </w:rPr>
+              <w:t xml:space="preserve">always same-environment</w:t>
+            </w:r>
+            <w:r>
+              <w:t xml:space="preserve">: the consumer’s</w:t>
+            </w:r>
+            <w:r>
+              <w:t xml:space="preserve"> </w:t>
+            </w:r>
+            <w:r>
+              <w:rPr>
+                <w:rStyle w:val="VerbatimChar"/>
+              </w:rPr>
+              <w:t xml:space="preserve">org:environment</w:t>
+            </w:r>
+            <w:r>
+              <w:t xml:space="preserve"> </w:t>
+            </w:r>
+            <w:r>
+              <w:t xml:space="preserve">must equal the resource’s. Never configurable by tag.</w:t>
+            </w:r>
+          </w:p>
+        </w:tc>
+      </w:tr>
+    </w:tbl>
+    <w:p>
+      <w:pPr>
+        <w:pStyle w:val="BodyText"/>
+      </w:pPr>
+      <w:r>
+        <w:rPr>
+          <w:b/>
+          <w:bCs/>
+        </w:rPr>
+        <w:t xml:space="preserve">The rule AWS evaluates</w:t>
+      </w:r>
+      <w:r>
+        <w:t xml:space="preserve"> </w:t>
+      </w:r>
+      <w:r>
+        <w:t xml:space="preserve">for a consumer principal</w:t>
+      </w:r>
+      <w:r>
+        <w:t xml:space="preserve"> </w:t>
+      </w:r>
+      <w:r>
+        <w:rPr>
+          <w:i/>
+          <w:iCs/>
+        </w:rPr>
+        <w:t xml:space="preserve">P</w:t>
+      </w:r>
+      <w:r>
+        <w:t xml:space="preserve"> </w:t>
+      </w:r>
+      <w:r>
+        <w:t xml:space="preserve">and a provider resource</w:t>
+      </w:r>
+      <w:r>
+        <w:t xml:space="preserve"> </w:t>
+      </w:r>
+      <w:r>
+        <w:rPr>
+          <w:i/>
+          <w:iCs/>
+        </w:rPr>
+        <w:t xml:space="preserve">R</w:t>
+      </w:r>
+      <w:r>
+        <w:t xml:space="preserve">:</w:t>
+      </w:r>
+    </w:p>
+    <w:p>
+      <w:pPr>
+        <w:pStyle w:val="BlockText"/>
+      </w:pPr>
+      <w:r>
+        <w:t xml:space="preserve">allow the</w:t>
+      </w:r>
+      <w:r>
+        <w:t xml:space="preserve"> </w:t>
+      </w:r>
+      <w:r>
+        <w:rPr>
+          <w:rStyle w:val="VerbatimChar"/>
+        </w:rPr>
+        <w:t xml:space="preserve">org:share-access</w:t>
+      </w:r>
+      <w:r>
+        <w:t xml:space="preserve"> </w:t>
+      </w:r>
+      <w:r>
+        <w:t xml:space="preserve">actions</w:t>
+      </w:r>
+      <w:r>
+        <w:t xml:space="preserve"> </w:t>
+      </w:r>
+      <w:r>
+        <w:rPr>
+          <w:b/>
+          <w:bCs/>
+        </w:rPr>
+        <w:t xml:space="preserve">if</w:t>
+      </w:r>
+      <w:r>
+        <w:t xml:space="preserve"> </w:t>
+      </w:r>
+      <w:r>
+        <w:t xml:space="preserve">P’s</w:t>
+      </w:r>
+      <w:r>
+        <w:t xml:space="preserve"> </w:t>
+      </w:r>
+      <w:r>
+        <w:rPr>
+          <w:rStyle w:val="VerbatimChar"/>
+        </w:rPr>
+        <w:t xml:space="preserve">org:environment</w:t>
+      </w:r>
+      <w:r>
+        <w:t xml:space="preserve"> </w:t>
+      </w:r>
+      <w:r>
+        <w:t xml:space="preserve">= R’s</w:t>
+      </w:r>
+      <w:r>
+        <w:t xml:space="preserve"> </w:t>
+      </w:r>
+      <w:r>
+        <w:rPr>
+          <w:rStyle w:val="VerbatimChar"/>
+        </w:rPr>
+        <w:t xml:space="preserve">org:environment</w:t>
+      </w:r>
+      <w:r>
+        <w:t xml:space="preserve"> </w:t>
+      </w:r>
+      <w:r>
+        <w:rPr>
+          <w:b/>
+          <w:bCs/>
+        </w:rPr>
+        <w:t xml:space="preserve">and</w:t>
+      </w:r>
+      <w:r>
+        <w:t xml:space="preserve"> </w:t>
+      </w:r>
+      <w:r>
+        <w:t xml:space="preserve">P is in the organization (</w:t>
+      </w:r>
+      <w:r>
+        <w:rPr>
+          <w:rStyle w:val="VerbatimChar"/>
+        </w:rPr>
+        <w:t xml:space="preserve">aws:PrincipalOrgID</w:t>
+      </w:r>
+      <w:r>
+        <w:t xml:space="preserve">)</w:t>
+      </w:r>
+      <w:r>
+        <w:t xml:space="preserve"> </w:t>
+      </w:r>
+      <w:r>
+        <w:rPr>
+          <w:b/>
+          <w:bCs/>
+        </w:rPr>
+        <w:t xml:space="preserve">and</w:t>
+      </w:r>
+      <w:r>
+        <w:t xml:space="preserve"> </w:t>
+      </w:r>
+      <w:r>
+        <w:t xml:space="preserve">(</w:t>
+      </w:r>
+      <w:r>
+        <w:rPr>
+          <w:rStyle w:val="VerbatimChar"/>
+        </w:rPr>
+        <w:t xml:space="preserve">org:share-scope = product</w:t>
+      </w:r>
+      <w:r>
+        <w:t xml:space="preserve"> </w:t>
+      </w:r>
+      <w:r>
+        <w:t xml:space="preserve">and P’s</w:t>
+      </w:r>
+      <w:r>
+        <w:t xml:space="preserve"> </w:t>
+      </w:r>
+      <w:r>
+        <w:rPr>
+          <w:rStyle w:val="VerbatimChar"/>
+        </w:rPr>
+        <w:t xml:space="preserve">org:product</w:t>
+      </w:r>
+      <w:r>
+        <w:t xml:space="preserve"> </w:t>
+      </w:r>
+      <w:r>
+        <w:t xml:space="preserve">= R’s</w:t>
+      </w:r>
+      <w:r>
+        <w:t xml:space="preserve"> </w:t>
+      </w:r>
+      <w:r>
+        <w:rPr>
+          <w:rStyle w:val="VerbatimChar"/>
+        </w:rPr>
+        <w:t xml:space="preserve">org:product</w:t>
+      </w:r>
+      <w:r>
+        <w:t xml:space="preserve">)</w:t>
+      </w:r>
+      <w:r>
+        <w:t xml:space="preserve"> </w:t>
+      </w:r>
+      <w:r>
+        <w:rPr>
+          <w:b/>
+          <w:bCs/>
+        </w:rPr>
+        <w:t xml:space="preserve">or</w:t>
+      </w:r>
+      <w:r>
+        <w:t xml:space="preserve"> </w:t>
+      </w:r>
+      <w:r>
+        <w:t xml:space="preserve">(</w:t>
+      </w:r>
+      <w:r>
+        <w:rPr>
+          <w:rStyle w:val="VerbatimChar"/>
+        </w:rPr>
+        <w:t xml:space="preserve">org:share-scope = portfolio</w:t>
+      </w:r>
+      <w:r>
+        <w:t xml:space="preserve"> </w:t>
+      </w:r>
+      <w:r>
+        <w:t xml:space="preserve">and P’s</w:t>
+      </w:r>
+      <w:r>
+        <w:t xml:space="preserve"> </w:t>
+      </w:r>
+      <w:r>
+        <w:rPr>
+          <w:rStyle w:val="VerbatimChar"/>
+        </w:rPr>
+        <w:t xml:space="preserve">org:portfolio</w:t>
+      </w:r>
+      <w:r>
+        <w:t xml:space="preserve"> </w:t>
+      </w:r>
+      <w:r>
+        <w:t xml:space="preserve">= R’s</w:t>
+      </w:r>
+      <w:r>
+        <w:t xml:space="preserve"> </w:t>
+      </w:r>
+      <w:r>
+        <w:rPr>
+          <w:rStyle w:val="VerbatimChar"/>
+        </w:rPr>
+        <w:t xml:space="preserve">org:portfolio</w:t>
+      </w:r>
+      <w:r>
+        <w:t xml:space="preserve">)</w:t>
+      </w:r>
+      <w:r>
+        <w:t xml:space="preserve"> </w:t>
+      </w:r>
+      <w:r>
+        <w:rPr>
+          <w:b/>
+          <w:bCs/>
+        </w:rPr>
+        <w:t xml:space="preserve">or</w:t>
+      </w:r>
+      <w:r>
+        <w:t xml:space="preserve"> </w:t>
+      </w:r>
+      <w:r>
+        <w:t xml:space="preserve">(</w:t>
+      </w:r>
+      <w:r>
+        <w:rPr>
+          <w:rStyle w:val="VerbatimChar"/>
+        </w:rPr>
+        <w:t xml:space="preserve">org:share-scope = organization</w:t>
+      </w:r>
+      <w:r>
+        <w:t xml:space="preserve">)</w:t>
+      </w:r>
+    </w:p>
+    <w:p>
+      <w:pPr>
+        <w:pStyle w:val="FirstParagraph"/>
+      </w:pPr>
+      <w:r>
+        <w:t xml:space="preserve">The rule needs no consumer ARNs or account IDs. It works</w:t>
+      </w:r>
+      <w:r>
+        <w:t xml:space="preserve"> </w:t>
+      </w:r>
+      <w:r>
+        <w:rPr>
+          <w:b/>
+          <w:bCs/>
+        </w:rPr>
+        <w:t xml:space="preserve">across accounts</w:t>
+      </w:r>
+      <w:r>
+        <w:t xml:space="preserve">, because AWS evaluates the caller’s principal tags (</w:t>
+      </w:r>
+      <w:r>
+        <w:rPr>
+          <w:rStyle w:val="VerbatimChar"/>
+        </w:rPr>
+        <w:t xml:space="preserve">aws:PrincipalTag/...</w:t>
+      </w:r>
+      <w:r>
+        <w:t xml:space="preserve">) in the resource account’s policy. A new project or account in the same product gets access automatically, and a project that moves to another product loses it automatically.</w:t>
+      </w:r>
+    </w:p>
+    <w:p>
+      <w:pPr>
+        <w:pStyle w:val="BodyText"/>
+      </w:pPr>
+      <w:r>
+        <w:rPr>
+          <w:b/>
+          <w:bCs/>
+        </w:rPr>
+        <w:t xml:space="preserve">What the platform generates:</w:t>
+      </w:r>
+    </w:p>
+    <w:tbl>
+      <w:tblPr>
+        <w:tblStyle w:val="Table"/>
+        <w:tblW w:type="dxa" w:w="10080"/>
+        <w:tblLayout w:type="fixed"/>
+        <w:tblLook w:firstRow="1" w:lastRow="0" w:firstColumn="0" w:lastColumn="0" w:noHBand="0" w:noVBand="0" w:val="0020"/>
+      </w:tblPr>
+      <w:tblGrid>
+        <w:gridCol w:w="4149"/>
+        <w:gridCol w:w="5931"/>
+      </w:tblGrid>
+      <w:tr>
+        <w:trPr>
+          <w:tblHeader w:val="on"/>
+        </w:trPr>
+        <w:tc>
+          <w:tcPr>
+            <w:tcW w:type="dxa" w:w="4149"/>
+          </w:tcPr>
+          <w:p>
+            <w:pPr>
+              <w:pStyle w:val="Compact"/>
+            </w:pPr>
+            <w:r>
+              <w:t xml:space="preserve">Side</w:t>
+            </w:r>
+          </w:p>
+        </w:tc>
+        <w:tc>
+          <w:tcPr>
+            <w:tcW w:type="dxa" w:w="5931"/>
+          </w:tcPr>
+          <w:p>
+            <w:pPr>
+              <w:pStyle w:val="Compact"/>
+            </w:pPr>
+            <w:r>
+              <w:t xml:space="preserve">Generated from the tags</w:t>
+            </w:r>
+          </w:p>
+        </w:tc>
+      </w:tr>
+      <w:tr>
+        <w:tc>
+          <w:tcPr>
+            <w:tcW w:type="dxa" w:w="4149"/>
+          </w:tcPr>
+          <w:p>
+            <w:pPr>
+              <w:pStyle w:val="Compact"/>
+            </w:pPr>
+            <w:r>
+              <w:rPr>
+                <w:b/>
+                <w:bCs/>
+              </w:rPr>
+              <w:t xml:space="preserve">Provider resource policy</w:t>
+            </w:r>
+            <w:r>
+              <w:t xml:space="preserve"> </w:t>
+            </w:r>
+            <w:r>
+              <w:t xml:space="preserve">(S3, SQS, SNS, KMS, Secrets Manager, DynamoDB, EventBridge, Lambda, ECR, Kinesis, OpenSearch, …)</w:t>
+            </w:r>
+          </w:p>
+        </w:tc>
+        <w:tc>
+          <w:tcPr>
+            <w:tcW w:type="dxa" w:w="5931"/>
+          </w:tcPr>
+          <w:p>
+            <w:pPr>
+              <w:pStyle w:val="Compact"/>
+            </w:pPr>
+            <w:r>
+              <w:t xml:space="preserve">An Allow for the share rule above, with the resource’s</w:t>
+            </w:r>
+            <w:r>
+              <w:t xml:space="preserve"> </w:t>
+            </w:r>
+            <w:r>
+              <w:rPr>
+                <w:b/>
+                <w:bCs/>
+              </w:rPr>
+              <w:t xml:space="preserve">own tag values written in</w:t>
+            </w:r>
+            <w:r>
+              <w:t xml:space="preserve"> </w:t>
+            </w:r>
+            <w:r>
+              <w:t xml:space="preserve">at synthesis time (e.g. </w:t>
+            </w:r>
+            <w:r>
+              <w:rPr>
+                <w:rStyle w:val="VerbatimChar"/>
+              </w:rPr>
+              <w:t xml:space="preserve">aws:PrincipalTag/org:product = "pr-invoicing"</w:t>
+            </w:r>
+            <w:r>
+              <w:t xml:space="preserve">). The §4.10 deny statements are widened only to the same scope. For</w:t>
+            </w:r>
+            <w:r>
+              <w:t xml:space="preserve"> </w:t>
+            </w:r>
+            <w:r>
+              <w:rPr>
+                <w:rStyle w:val="VerbatimChar"/>
+              </w:rPr>
+              <w:t xml:space="preserve">read</w:t>
+            </w:r>
+            <w:r>
+              <w:t xml:space="preserve"> </w:t>
+            </w:r>
+            <w:r>
+              <w:t xml:space="preserve">sharing, an extra deny blocks every write action for anyone but the owning project.</w:t>
+            </w:r>
+          </w:p>
+        </w:tc>
+      </w:tr>
+      <w:tr>
+        <w:tc>
+          <w:tcPr>
+            <w:tcW w:type="dxa" w:w="4149"/>
+          </w:tcPr>
+          <w:p>
+            <w:pPr>
+              <w:pStyle w:val="Compact"/>
+            </w:pPr>
+            <w:r>
+              <w:rPr>
+                <w:b/>
+                <w:bCs/>
+              </w:rPr>
+              <w:t xml:space="preserve">Provider KMS key</w:t>
+            </w:r>
+            <w:r>
+              <w:t xml:space="preserve"> </w:t>
+            </w:r>
+            <w:r>
+              <w:t xml:space="preserve">(if the data is encrypted)</w:t>
+            </w:r>
+          </w:p>
+        </w:tc>
+        <w:tc>
+          <w:tcPr>
+            <w:tcW w:type="dxa" w:w="5931"/>
+          </w:tcPr>
+          <w:p>
+            <w:pPr>
+              <w:pStyle w:val="Compact"/>
+            </w:pPr>
+            <w:r>
+              <w:t xml:space="preserve">Key policy grant for the same share rule, limited with</w:t>
+            </w:r>
+            <w:r>
+              <w:t xml:space="preserve"> </w:t>
+            </w:r>
+            <w:r>
+              <w:rPr>
+                <w:rStyle w:val="VerbatimChar"/>
+              </w:rPr>
+              <w:t xml:space="preserve">kms:ViaService</w:t>
+            </w:r>
+            <w:r>
+              <w:t xml:space="preserve"> </w:t>
+            </w:r>
+            <w:r>
+              <w:t xml:space="preserve">to the service in use</w:t>
+            </w:r>
+          </w:p>
+        </w:tc>
+      </w:tr>
+      <w:tr>
+        <w:tc>
+          <w:tcPr>
+            <w:tcW w:type="dxa" w:w="4149"/>
+          </w:tcPr>
+          <w:p>
+            <w:pPr>
+              <w:pStyle w:val="Compact"/>
+            </w:pPr>
+            <w:r>
+              <w:rPr>
+                <w:b/>
+                <w:bCs/>
+              </w:rPr>
+              <w:t xml:space="preserve">Cross-account role</w:t>
+            </w:r>
+            <w:r>
+              <w:t xml:space="preserve"> </w:t>
+            </w:r>
+            <w:r>
+              <w:t xml:space="preserve">(pattern B, for services without resource policies)</w:t>
+            </w:r>
+          </w:p>
+        </w:tc>
+        <w:tc>
+          <w:tcPr>
+            <w:tcW w:type="dxa" w:w="5931"/>
+          </w:tcPr>
+          <w:p>
+            <w:pPr>
+              <w:pStyle w:val="Compact"/>
+            </w:pPr>
+            <w:r>
+              <w:t xml:space="preserve">Trust policy: any principal in the organization</w:t>
+            </w:r>
+            <w:r>
+              <w:t xml:space="preserve"> </w:t>
+            </w:r>
+            <w:r>
+              <w:rPr>
+                <w:b/>
+                <w:bCs/>
+              </w:rPr>
+              <w:t xml:space="preserve">with matching</w:t>
+            </w:r>
+            <w:r>
+              <w:rPr>
+                <w:b/>
+                <w:bCs/>
+              </w:rPr>
+              <w:t xml:space="preserve"> </w:t>
+            </w:r>
+            <w:r>
+              <w:rPr>
+                <w:rStyle w:val="VerbatimChar"/>
+                <w:b/>
+                <w:bCs/>
+              </w:rPr>
+              <w:t xml:space="preserve">org:product</w:t>
+            </w:r>
+            <w:r>
+              <w:rPr>
+                <w:b/>
+                <w:bCs/>
+              </w:rPr>
+              <w:t xml:space="preserve"> </w:t>
+            </w:r>
+            <w:r>
+              <w:rPr>
+                <w:b/>
+                <w:bCs/>
+              </w:rPr>
+              <w:t xml:space="preserve">/</w:t>
+            </w:r>
+            <w:r>
+              <w:rPr>
+                <w:b/>
+                <w:bCs/>
+              </w:rPr>
+              <w:t xml:space="preserve"> </w:t>
+            </w:r>
+            <w:r>
+              <w:rPr>
+                <w:rStyle w:val="VerbatimChar"/>
+                <w:b/>
+                <w:bCs/>
+              </w:rPr>
+              <w:t xml:space="preserve">org:portfolio</w:t>
+            </w:r>
+            <w:r>
+              <w:rPr>
+                <w:b/>
+                <w:bCs/>
+              </w:rPr>
+              <w:t xml:space="preserve"> </w:t>
+            </w:r>
+            <w:r>
+              <w:rPr>
+                <w:b/>
+                <w:bCs/>
+              </w:rPr>
+              <w:t xml:space="preserve">and</w:t>
+            </w:r>
+            <w:r>
+              <w:rPr>
+                <w:b/>
+                <w:bCs/>
+              </w:rPr>
+              <w:t xml:space="preserve"> </w:t>
+            </w:r>
+            <w:r>
+              <w:rPr>
+                <w:rStyle w:val="VerbatimChar"/>
+                <w:b/>
+                <w:bCs/>
+              </w:rPr>
+              <w:t xml:space="preserve">org:environment</w:t>
+            </w:r>
+            <w:r>
+              <w:rPr>
+                <w:b/>
+                <w:bCs/>
+              </w:rPr>
+              <w:t xml:space="preserve"> </w:t>
+            </w:r>
+            <w:r>
+              <w:rPr>
+                <w:b/>
+                <w:bCs/>
+              </w:rPr>
+              <w:t xml:space="preserve">tags</w:t>
+            </w:r>
+            <w:r>
+              <w:t xml:space="preserve">, instead of named consumer roles</w:t>
+            </w:r>
+          </w:p>
+        </w:tc>
+      </w:tr>
+      <w:tr>
+        <w:tc>
+          <w:tcPr>
+            <w:tcW w:type="dxa" w:w="4149"/>
+          </w:tcPr>
+          <w:p>
+            <w:pPr>
+              <w:pStyle w:val="Compact"/>
+            </w:pPr>
+            <w:r>
+              <w:rPr>
+                <w:b/>
+                <w:bCs/>
+              </w:rPr>
+              <w:t xml:space="preserve">Consumer side</w:t>
+            </w:r>
+          </w:p>
+        </w:tc>
+        <w:tc>
+          <w:tcPr>
+            <w:tcW w:type="dxa" w:w="5931"/>
+          </w:tcPr>
+          <w:p>
+            <w:pPr>
+              <w:pStyle w:val="Compact"/>
+            </w:pPr>
+            <w:r>
+              <w:t xml:space="preserve">When a consumer draws a connection to a shared resource (picked from the</w:t>
+            </w:r>
+            <w:r>
+              <w:t xml:space="preserve"> </w:t>
+            </w:r>
+            <w:r>
+              <w:rPr>
+                <w:b/>
+                <w:bCs/>
+              </w:rPr>
+              <w:t xml:space="preserve">shareable-resource catalog</w:t>
+            </w:r>
+            <w:r>
+              <w:t xml:space="preserve">, which is built from share tags), the platform checks the tags match, then generates the exact-ARN statements and the contract binding</w:t>
+            </w:r>
+            <w:r>
+              <w:t xml:space="preserve"> </w:t>
+            </w:r>
+            <w:r>
+              <w:rPr>
+                <w:b/>
+                <w:bCs/>
+              </w:rPr>
+              <w:t xml:space="preserve">without asking the provider</w:t>
+            </w:r>
+            <w:r>
+              <w:t xml:space="preserve">. The consumer’s boundary allows cross-project access only to resources whose</w:t>
+            </w:r>
+            <w:r>
+              <w:t xml:space="preserve"> </w:t>
+            </w:r>
+            <w:r>
+              <w:rPr>
+                <w:rStyle w:val="VerbatimChar"/>
+              </w:rPr>
+              <w:t xml:space="preserve">aws:ResourceTag/org:share-scope</w:t>
+            </w:r>
+            <w:r>
+              <w:t xml:space="preserve"> </w:t>
+            </w:r>
+            <w:r>
+              <w:t xml:space="preserve">and product/portfolio match the consumer’s tags (where the service supports resource-tag conditions), and only inside the organization.</w:t>
+            </w:r>
+          </w:p>
+        </w:tc>
+      </w:tr>
+    </w:tbl>
+    <w:p>
+      <w:pPr>
+        <w:pStyle w:val="BodyText"/>
+      </w:pPr>
+      <w:r>
+        <w:rPr>
+          <w:b/>
+          <w:bCs/>
+        </w:rPr>
+        <w:t xml:space="preserve">Example: generated statements for a bucket tagged</w:t>
+      </w:r>
+      <w:r>
+        <w:rPr>
+          <w:b/>
+          <w:bCs/>
+        </w:rPr>
+        <w:t xml:space="preserve"> </w:t>
+      </w:r>
+      <w:r>
+        <w:rPr>
+          <w:rStyle w:val="VerbatimChar"/>
+          <w:b/>
+          <w:bCs/>
+        </w:rPr>
+        <w:t xml:space="preserve">org:product=pr-invoicing</w:t>
+      </w:r>
+      <w:r>
+        <w:rPr>
+          <w:b/>
+          <w:bCs/>
+        </w:rPr>
+        <w:t xml:space="preserve">,</w:t>
+      </w:r>
+      <w:r>
+        <w:rPr>
+          <w:b/>
+          <w:bCs/>
+        </w:rPr>
+        <w:t xml:space="preserve"> </w:t>
+      </w:r>
+      <w:r>
+        <w:rPr>
+          <w:rStyle w:val="VerbatimChar"/>
+          <w:b/>
+          <w:bCs/>
+        </w:rPr>
+        <w:t xml:space="preserve">org:share-scope=product</w:t>
+      </w:r>
+      <w:r>
+        <w:rPr>
+          <w:b/>
+          <w:bCs/>
+        </w:rPr>
+        <w:t xml:space="preserve">,</w:t>
+      </w:r>
+      <w:r>
+        <w:rPr>
+          <w:b/>
+          <w:bCs/>
+        </w:rPr>
+        <w:t xml:space="preserve"> </w:t>
+      </w:r>
+      <w:r>
+        <w:rPr>
+          <w:rStyle w:val="VerbatimChar"/>
+          <w:b/>
+          <w:bCs/>
+        </w:rPr>
+        <w:t xml:space="preserve">org:share-access=read</w:t>
+      </w:r>
+      <w:r>
+        <w:rPr>
+          <w:b/>
+          <w:bCs/>
+        </w:rPr>
+        <w:t xml:space="preserve">,</w:t>
+      </w:r>
+      <w:r>
+        <w:rPr>
+          <w:b/>
+          <w:bCs/>
+        </w:rPr>
+        <w:t xml:space="preserve"> </w:t>
+      </w:r>
+      <w:r>
+        <w:rPr>
+          <w:rStyle w:val="VerbatimChar"/>
+          <w:b/>
+          <w:bCs/>
+        </w:rPr>
+        <w:t xml:space="preserve">org:environment=prod</w:t>
+      </w:r>
+      <w:r>
+        <w:rPr>
+          <w:b/>
+          <w:bCs/>
+        </w:rPr>
+        <w:t xml:space="preserve"> </w:t>
+      </w:r>
+      <w:r>
+        <w:rPr>
+          <w:b/>
+          <w:bCs/>
+        </w:rPr>
+        <w:t xml:space="preserve">(illustrative):</w:t>
+      </w:r>
+    </w:p>
+    <w:p>
+      <w:pPr>
+        <w:pStyle w:val="SourceCode"/>
+      </w:pPr>
+      <w:r>
+        <w:rPr>
+          <w:rStyle w:val="VerbatimChar"/>
+        </w:rPr>
+        <w:t xml:space="preserve">[</w:t>
+      </w:r>
+      <w:r>
+        <w:br/>
+      </w:r>
+      <w:r>
+        <w:rPr>
+          <w:rStyle w:val="VerbatimChar"/>
+        </w:rPr>
+        <w:t xml:space="preserve">  { "Sid": "ShareByTagRead", "Effect": "Allow", "Principal": "*",</w:t>
+      </w:r>
+      <w:r>
+        <w:br/>
+      </w:r>
+      <w:r>
+        <w:rPr>
+          <w:rStyle w:val="VerbatimChar"/>
+        </w:rPr>
+        <w:t xml:space="preserve">    "Action": ["s3:GetObject", "s3:ListBucket"],</w:t>
+      </w:r>
+      <w:r>
+        <w:br/>
+      </w:r>
+      <w:r>
+        <w:rPr>
+          <w:rStyle w:val="VerbatimChar"/>
+        </w:rPr>
+        <w:t xml:space="preserve">    "Resource": ["arn:aws:s3:::invoice-ingest--uploads-555555555555-us-east-1",</w:t>
+      </w:r>
+      <w:r>
+        <w:br/>
+      </w:r>
+      <w:r>
+        <w:rPr>
+          <w:rStyle w:val="VerbatimChar"/>
+        </w:rPr>
+        <w:t xml:space="preserve">                 "arn:aws:s3:::invoice-ingest--uploads-555555555555-us-east-1/*"],</w:t>
+      </w:r>
+      <w:r>
+        <w:br/>
+      </w:r>
+      <w:r>
+        <w:rPr>
+          <w:rStyle w:val="VerbatimChar"/>
+        </w:rPr>
+        <w:t xml:space="preserve">    "Condition": { "StringEquals": { "aws:PrincipalOrgID": "o-exampleorg",</w:t>
+      </w:r>
+      <w:r>
+        <w:br/>
+      </w:r>
+      <w:r>
+        <w:rPr>
+          <w:rStyle w:val="VerbatimChar"/>
+        </w:rPr>
+        <w:t xml:space="preserve">                                     "aws:PrincipalTag/org:product": "pr-invoicing",</w:t>
+      </w:r>
+      <w:r>
+        <w:br/>
+      </w:r>
+      <w:r>
+        <w:rPr>
+          <w:rStyle w:val="VerbatimChar"/>
+        </w:rPr>
+        <w:t xml:space="preserve">                                     "aws:PrincipalTag/org:environment": "prod" } } },</w:t>
+      </w:r>
+      <w:r>
+        <w:br/>
+      </w:r>
+      <w:r>
+        <w:rPr>
+          <w:rStyle w:val="VerbatimChar"/>
+        </w:rPr>
+        <w:t xml:space="preserve">  { "Sid": "DenyOutsideShareScope", "Effect": "Deny", "Principal": "*", "Action": "s3:*",</w:t>
+      </w:r>
+      <w:r>
+        <w:br/>
+      </w:r>
+      <w:r>
+        <w:rPr>
+          <w:rStyle w:val="VerbatimChar"/>
+        </w:rPr>
+        <w:t xml:space="preserve">    "Resource": ["arn:aws:s3:::invoice-ingest--uploads-555555555555-us-east-1",</w:t>
+      </w:r>
+      <w:r>
+        <w:br/>
+      </w:r>
+      <w:r>
+        <w:rPr>
+          <w:rStyle w:val="VerbatimChar"/>
+        </w:rPr>
+        <w:t xml:space="preserve">                 "arn:aws:s3:::invoice-ingest--uploads-555555555555-us-east-1/*"],</w:t>
+      </w:r>
+      <w:r>
+        <w:br/>
+      </w:r>
+      <w:r>
+        <w:rPr>
+          <w:rStyle w:val="VerbatimChar"/>
+        </w:rPr>
+        <w:t xml:space="preserve">    "Condition": { "StringNotEquals": { "aws:PrincipalTag/org:product": "pr-invoicing" },</w:t>
+      </w:r>
+      <w:r>
+        <w:br/>
+      </w:r>
+      <w:r>
+        <w:rPr>
+          <w:rStyle w:val="VerbatimChar"/>
+        </w:rPr>
+        <w:t xml:space="preserve">                   "BoolIfExists": { "aws:PrincipalIsAWSService": "false" } } },</w:t>
+      </w:r>
+      <w:r>
+        <w:br/>
+      </w:r>
+      <w:r>
+        <w:rPr>
+          <w:rStyle w:val="VerbatimChar"/>
+        </w:rPr>
+        <w:t xml:space="preserve">  { "Sid": "DenyWritesExceptOwner", "Effect": "Deny", "Principal": "*",</w:t>
+      </w:r>
+      <w:r>
+        <w:br/>
+      </w:r>
+      <w:r>
+        <w:rPr>
+          <w:rStyle w:val="VerbatimChar"/>
+        </w:rPr>
+        <w:t xml:space="preserve">    "Action": ["s3:PutObject", "s3:DeleteObject", "s3:PutObjectAcl"],</w:t>
+      </w:r>
+      <w:r>
+        <w:br/>
+      </w:r>
+      <w:r>
+        <w:rPr>
+          <w:rStyle w:val="VerbatimChar"/>
+        </w:rPr>
+        <w:t xml:space="preserve">    "Resource": "arn:aws:s3:::invoice-ingest--uploads-555555555555-us-east-1/*",</w:t>
+      </w:r>
+      <w:r>
+        <w:br/>
+      </w:r>
+      <w:r>
+        <w:rPr>
+          <w:rStyle w:val="VerbatimChar"/>
+        </w:rPr>
+        <w:t xml:space="preserve">    "Condition": { "StringNotEquals": { "aws:PrincipalTag/org:project": "invoice-ingest" },</w:t>
+      </w:r>
+      <w:r>
+        <w:br/>
+      </w:r>
+      <w:r>
+        <w:rPr>
+          <w:rStyle w:val="VerbatimChar"/>
+        </w:rPr>
+        <w:t xml:space="preserve">                   "BoolIfExists": { "aws:PrincipalIsAWSService": "false" } } }</w:t>
+      </w:r>
+      <w:r>
+        <w:br/>
+      </w:r>
+      <w:r>
+        <w:rPr>
+          <w:rStyle w:val="VerbatimChar"/>
+        </w:rPr>
+        <w:t xml:space="preserve">]</w:t>
+      </w:r>
+    </w:p>
+    <w:p>
+      <w:pPr>
+        <w:pStyle w:val="FirstParagraph"/>
+      </w:pPr>
+      <w:r>
+        <w:t xml:space="preserve">The environment deny statement from §4.10.2 stays unchanged, and the service-linked-role and break-glass exceptions apply as before.</w:t>
+      </w:r>
+    </w:p>
+    <w:p>
+      <w:pPr>
+        <w:pStyle w:val="BodyText"/>
+      </w:pPr>
+      <w:r>
+        <w:rPr>
+          <w:b/>
+          <w:bCs/>
+        </w:rPr>
+        <w:t xml:space="preserve">Guardrails on share tags:</w:t>
+      </w:r>
+      <w:r>
+        <w:t xml:space="preserve"> </w:t>
+      </w:r>
+      <w:r>
+        <w:t xml:space="preserve">- Share tags are</w:t>
+      </w:r>
+      <w:r>
+        <w:t xml:space="preserve"> </w:t>
+      </w:r>
+      <w:r>
+        <w:rPr>
+          <w:rStyle w:val="VerbatimChar"/>
+        </w:rPr>
+        <w:t xml:space="preserve">org:*</w:t>
+      </w:r>
+      <w:r>
+        <w:t xml:space="preserve"> </w:t>
+      </w:r>
+      <w:r>
+        <w:t xml:space="preserve">tags, so</w:t>
+      </w:r>
+      <w:r>
+        <w:t xml:space="preserve"> </w:t>
+      </w:r>
+      <w:r>
+        <w:rPr>
+          <w:b/>
+          <w:bCs/>
+        </w:rPr>
+        <w:t xml:space="preserve">only the platform pipeline can set or change them</w:t>
+      </w:r>
+      <w:r>
+        <w:t xml:space="preserve"> </w:t>
+      </w:r>
+      <w:r>
+        <w:t xml:space="preserve">(SCP §4.7). Changing a share tag is an infrastructure change with the normal gates and approvals.</w:t>
+      </w:r>
+      <w:r>
+        <w:t xml:space="preserve"> </w:t>
+      </w:r>
+      <w:r>
+        <w:t xml:space="preserve">-</w:t>
+      </w:r>
+      <w:r>
+        <w:t xml:space="preserve"> </w:t>
+      </w:r>
+      <w:r>
+        <w:rPr>
+          <w:b/>
+          <w:bCs/>
+        </w:rPr>
+        <w:t xml:space="preserve">Classification limits</w:t>
+      </w:r>
+      <w:r>
+        <w:t xml:space="preserve"> </w:t>
+      </w:r>
+      <w:r>
+        <w:t xml:space="preserve">(defaults, configurable, D37):</w:t>
+      </w:r>
+      <w:r>
+        <w:t xml:space="preserve"> </w:t>
+      </w:r>
+      <w:r>
+        <w:t xml:space="preserve">-</w:t>
+      </w:r>
+      <w:r>
+        <w:t xml:space="preserve"> </w:t>
+      </w:r>
+      <w:r>
+        <w:rPr>
+          <w:rStyle w:val="VerbatimChar"/>
+        </w:rPr>
+        <w:t xml:space="preserve">public</w:t>
+      </w:r>
+      <w:r>
+        <w:t xml:space="preserve">/</w:t>
+      </w:r>
+      <w:r>
+        <w:rPr>
+          <w:rStyle w:val="VerbatimChar"/>
+        </w:rPr>
+        <w:t xml:space="preserve">internal</w:t>
+      </w:r>
+      <w:r>
+        <w:t xml:space="preserve"> </w:t>
+      </w:r>
+      <w:r>
+        <w:t xml:space="preserve">data: any scope.</w:t>
+      </w:r>
+      <w:r>
+        <w:t xml:space="preserve"> </w:t>
+      </w:r>
+      <w:r>
+        <w:t xml:space="preserve">-</w:t>
+      </w:r>
+      <w:r>
+        <w:t xml:space="preserve"> </w:t>
+      </w:r>
+      <w:r>
+        <w:rPr>
+          <w:rStyle w:val="VerbatimChar"/>
+        </w:rPr>
+        <w:t xml:space="preserve">confidential</w:t>
+      </w:r>
+      <w:r>
+        <w:t xml:space="preserve">: up to</w:t>
+      </w:r>
+      <w:r>
+        <w:t xml:space="preserve"> </w:t>
+      </w:r>
+      <w:r>
+        <w:rPr>
+          <w:rStyle w:val="VerbatimChar"/>
+        </w:rPr>
+        <w:t xml:space="preserve">product</w:t>
+      </w:r>
+      <w:r>
+        <w:t xml:space="preserve">.</w:t>
+      </w:r>
+      <w:r>
+        <w:t xml:space="preserve"> </w:t>
+      </w:r>
+      <w:r>
+        <w:t xml:space="preserve">-</w:t>
+      </w:r>
+      <w:r>
+        <w:t xml:space="preserve"> </w:t>
+      </w:r>
+      <w:r>
+        <w:rPr>
+          <w:rStyle w:val="VerbatimChar"/>
+        </w:rPr>
+        <w:t xml:space="preserve">restricted</w:t>
+      </w:r>
+      <w:r>
+        <w:t xml:space="preserve">:</w:t>
+      </w:r>
+      <w:r>
+        <w:t xml:space="preserve"> </w:t>
+      </w:r>
+      <w:r>
+        <w:rPr>
+          <w:rStyle w:val="VerbatimChar"/>
+        </w:rPr>
+        <w:t xml:space="preserve">none</w:t>
+      </w:r>
+      <w:r>
+        <w:t xml:space="preserve">, so agreements only.</w:t>
+      </w:r>
+      <w:r>
+        <w:t xml:space="preserve"> </w:t>
+      </w:r>
+      <w:r>
+        <w:t xml:space="preserve">-</w:t>
+      </w:r>
+      <w:r>
+        <w:t xml:space="preserve"> </w:t>
+      </w:r>
+      <w:r>
+        <w:rPr>
+          <w:b/>
+          <w:bCs/>
+        </w:rPr>
+        <w:t xml:space="preserve">Extra approval</w:t>
+      </w:r>
+      <w:r>
+        <w:t xml:space="preserve"> </w:t>
+      </w:r>
+      <w:r>
+        <w:t xml:space="preserve">from a security reviewer when widening scope beyond</w:t>
+      </w:r>
+      <w:r>
+        <w:t xml:space="preserve"> </w:t>
+      </w:r>
+      <w:r>
+        <w:rPr>
+          <w:rStyle w:val="VerbatimChar"/>
+        </w:rPr>
+        <w:t xml:space="preserve">product</w:t>
+      </w:r>
+      <w:r>
+        <w:t xml:space="preserve"> </w:t>
+      </w:r>
+      <w:r>
+        <w:t xml:space="preserve">or granting anything other than</w:t>
+      </w:r>
+      <w:r>
+        <w:t xml:space="preserve"> </w:t>
+      </w:r>
+      <w:r>
+        <w:rPr>
+          <w:rStyle w:val="VerbatimChar"/>
+        </w:rPr>
+        <w:t xml:space="preserve">read</w:t>
+      </w:r>
+      <w:r>
+        <w:t xml:space="preserve">.</w:t>
+      </w:r>
+      <w:r>
+        <w:t xml:space="preserve"> </w:t>
+      </w:r>
+      <w:r>
+        <w:t xml:space="preserve">-</w:t>
+      </w:r>
+      <w:r>
+        <w:t xml:space="preserve"> </w:t>
+      </w:r>
+      <w:r>
+        <w:rPr>
+          <w:b/>
+          <w:bCs/>
+        </w:rPr>
+        <w:t xml:space="preserve">Tag Policies</w:t>
+      </w:r>
+      <w:r>
+        <w:t xml:space="preserve"> </w:t>
+      </w:r>
+      <w:r>
+        <w:t xml:space="preserve">enforce the allowed values. The</w:t>
+      </w:r>
+      <w:r>
+        <w:t xml:space="preserve"> </w:t>
+      </w:r>
+      <w:r>
+        <w:rPr>
+          <w:b/>
+          <w:bCs/>
+        </w:rPr>
+        <w:t xml:space="preserve">shareable-resource catalog</w:t>
+      </w:r>
+      <w:r>
+        <w:t xml:space="preserve"> </w:t>
+      </w:r>
+      <w:r>
+        <w:t xml:space="preserve">in the UI lists every resource with a share scope, its owner, access level and classification.</w:t>
+      </w:r>
+      <w:r>
+        <w:t xml:space="preserve"> </w:t>
+      </w:r>
+      <w:r>
+        <w:t xml:space="preserve">-</w:t>
+      </w:r>
+      <w:r>
+        <w:t xml:space="preserve"> </w:t>
+      </w:r>
+      <w:r>
+        <w:rPr>
+          <w:b/>
+          <w:bCs/>
+        </w:rPr>
+        <w:t xml:space="preserve">IAM Access Analyzer:</w:t>
+      </w:r>
+      <w:r>
+        <w:t xml:space="preserve"> </w:t>
+      </w:r>
+      <w:r>
+        <w:t xml:space="preserve">archive rules are generated from the share tags, so expected access (e.g. </w:t>
+      </w:r>
+      <w:r>
+        <w:t xml:space="preserve">“principals in o-exampleorg with product pr-invoicing, read”</w:t>
+      </w:r>
+      <w:r>
+        <w:t xml:space="preserve">) is archived automatically, and anything else alerts.</w:t>
+      </w:r>
+      <w:r>
+        <w:t xml:space="preserve"> </w:t>
+      </w:r>
+      <w:r>
+        <w:t xml:space="preserve">-</w:t>
+      </w:r>
+      <w:r>
+        <w:t xml:space="preserve"> </w:t>
+      </w:r>
+      <w:r>
+        <w:rPr>
+          <w:b/>
+          <w:bCs/>
+        </w:rPr>
+        <w:t xml:space="preserve">Revoking</w:t>
+      </w:r>
+      <w:r>
+        <w:t xml:space="preserve"> </w:t>
+      </w:r>
+      <w:r>
+        <w:t xml:space="preserve">= setting</w:t>
+      </w:r>
+      <w:r>
+        <w:t xml:space="preserve"> </w:t>
+      </w:r>
+      <w:r>
+        <w:rPr>
+          <w:rStyle w:val="VerbatimChar"/>
+        </w:rPr>
+        <w:t xml:space="preserve">org:share-scope=none</w:t>
+      </w:r>
+      <w:r>
+        <w:t xml:space="preserve">. The next deploy regenerates the policies and access stops for everyone at once. The consumers’ connections are flagged in their projects.</w:t>
+      </w:r>
+    </w:p>
+    <w:p>
+      <w:pPr>
+        <w:pStyle w:val="Heading3"/>
+      </w:pPr>
+      <w:r>
+        <w:t xml:space="preserve">4.11.2 Sharing by agreement (explicit, for everything tags don’t cover)</w:t>
       </w:r>
     </w:p>
     <w:p>
@@ -12915,7 +15156,7 @@
         <w:pStyle w:val="Heading3"/>
       </w:pPr>
       <w:r>
-        <w:t xml:space="preserve">4.11.2 How access is granted (per service)</w:t>
+        <w:t xml:space="preserve">4.11.3 How access is granted (per service)</w:t>
       </w:r>
     </w:p>
     <w:tbl>
@@ -13697,7 +15938,7 @@
         <w:pStyle w:val="Heading3"/>
       </w:pPr>
       <w:r>
-        <w:t xml:space="preserve">4.11.3 How it fits the four isolation layers (§4.10)</w:t>
+        <w:t xml:space="preserve">4.11.4 How sharing fits the four isolation layers (§4.10)</w:t>
       </w:r>
     </w:p>
     <w:tbl>
@@ -13886,23 +16127,33 @@
               <w:pStyle w:val="Compact"/>
             </w:pPr>
             <w:r>
-              <w:t xml:space="preserve">Its deny-other-projects statements list</w:t>
-            </w:r>
-            <w:r>
-              <w:t xml:space="preserve"> </w:t>
-            </w:r>
-            <w:r>
               <w:rPr>
                 <w:b/>
                 <w:bCs/>
               </w:rPr>
-              <w:t xml:space="preserve">only</w:t>
-            </w:r>
-            <w:r>
-              <w:t xml:space="preserve"> </w:t>
-            </w:r>
-            <w:r>
-              <w:t xml:space="preserve">its own project plus approved consumers (account + project + environment), and a precise Allow is added per agreement.</w:t>
+              <w:t xml:space="preserve">By tags:</w:t>
+            </w:r>
+            <w:r>
+              <w:t xml:space="preserve"> </w:t>
+            </w:r>
+            <w:r>
+              <w:t xml:space="preserve">one Allow for the share rule, with the deny statements widened to the share scope only.</w:t>
+            </w:r>
+            <w:r>
+              <w:t xml:space="preserve"> </w:t>
+            </w:r>
+            <w:r>
+              <w:rPr>
+                <w:b/>
+                <w:bCs/>
+              </w:rPr>
+              <w:t xml:space="preserve">By agreement:</w:t>
+            </w:r>
+            <w:r>
+              <w:t xml:space="preserve"> </w:t>
+            </w:r>
+            <w:r>
+              <w:t xml:space="preserve">the deny statements list only the owning project plus approved consumers (account + project + environment), and a precise Allow is added per agreement.</w:t>
             </w:r>
           </w:p>
         </w:tc>
@@ -13949,7 +16200,7 @@
         <w:pStyle w:val="Heading3"/>
       </w:pPr>
       <w:r>
-        <w:t xml:space="preserve">4.11.4 Workflow in the UI</w:t>
+        <w:t xml:space="preserve">4.11.5 Agreement workflow in the UI</w:t>
       </w:r>
     </w:p>
     <w:p>
@@ -13961,7 +16212,7 @@
           <wp:inline>
             <wp:extent cx="6309360" cy="2671426"/>
             <wp:effectExtent b="0" l="0" r="0" t="0"/>
-            <wp:docPr descr="Figure 7. 4.11.4 Workflow in the UI" title="" id="28" name="Picture"/>
+            <wp:docPr descr="Figure 7. 4.11.5 Agreement workflow in the UI" title="" id="28" name="Picture"/>
             <a:graphic>
               <a:graphicData uri="http://schemas.openxmlformats.org/drawingml/2006/picture">
                 <pic:pic>
@@ -14004,7 +16255,7 @@
         <w:pStyle w:val="ImageCaption"/>
       </w:pPr>
       <w:r>
-        <w:t xml:space="preserve">Figure 7. 4.11.4 Workflow in the UI</w:t>
+        <w:t xml:space="preserve">Figure 7. 4.11.5 Agreement workflow in the UI</w:t>
       </w:r>
     </w:p>
     <w:p>
@@ -14026,22 +16277,7 @@
         <w:t xml:space="preserve"> </w:t>
       </w:r>
       <w:r>
-        <w:t xml:space="preserve">a provider marks resources as</w:t>
-      </w:r>
-      <w:r>
-        <w:t xml:space="preserve"> </w:t>
-      </w:r>
-      <w:r>
-        <w:rPr>
-          <w:rStyle w:val="VerbatimChar"/>
-        </w:rPr>
-        <w:t xml:space="preserve">shareable</w:t>
-      </w:r>
-      <w:r>
-        <w:t xml:space="preserve"> </w:t>
-      </w:r>
-      <w:r>
-        <w:t xml:space="preserve">in its project (with allowed access levels). They appear in a searchable catalog in the UI for consumers.</w:t>
+        <w:t xml:space="preserve">the catalog shows resources with share tags (self-service connect, §4.11.1) and resources marked as available by agreement (request and approve).</w:t>
       </w:r>
     </w:p>
     <w:p>
@@ -46549,8 +48785,8 @@
       </w:tblPr>
       <w:tblGrid>
         <w:gridCol w:w="950"/>
-        <w:gridCol w:w="2409"/>
-        <w:gridCol w:w="6721"/>
+        <w:gridCol w:w="2406"/>
+        <w:gridCol w:w="6724"/>
       </w:tblGrid>
       <w:tr>
         <w:trPr>
@@ -46571,7 +48807,7 @@
         </w:tc>
         <w:tc>
           <w:tcPr>
-            <w:tcW w:type="dxa" w:w="2409"/>
+            <w:tcW w:type="dxa" w:w="2406"/>
           </w:tcPr>
           <w:p>
             <w:pPr>
@@ -46584,7 +48820,7 @@
         </w:tc>
         <w:tc>
           <w:tcPr>
-            <w:tcW w:type="dxa" w:w="6721"/>
+            <w:tcW w:type="dxa" w:w="6724"/>
           </w:tcPr>
           <w:p>
             <w:pPr>
@@ -46612,7 +48848,7 @@
         </w:tc>
         <w:tc>
           <w:tcPr>
-            <w:tcW w:type="dxa" w:w="2409"/>
+            <w:tcW w:type="dxa" w:w="2406"/>
           </w:tcPr>
           <w:p>
             <w:pPr>
@@ -46625,7 +48861,7 @@
         </w:tc>
         <w:tc>
           <w:tcPr>
-            <w:tcW w:type="dxa" w:w="6721"/>
+            <w:tcW w:type="dxa" w:w="6724"/>
           </w:tcPr>
           <w:p>
             <w:pPr>
@@ -46657,7 +48893,7 @@
         </w:tc>
         <w:tc>
           <w:tcPr>
-            <w:tcW w:type="dxa" w:w="2409"/>
+            <w:tcW w:type="dxa" w:w="2406"/>
           </w:tcPr>
           <w:p>
             <w:pPr>
@@ -46670,7 +48906,7 @@
         </w:tc>
         <w:tc>
           <w:tcPr>
-            <w:tcW w:type="dxa" w:w="6721"/>
+            <w:tcW w:type="dxa" w:w="6724"/>
           </w:tcPr>
           <w:p>
             <w:pPr>
@@ -46708,7 +48944,7 @@
         </w:tc>
         <w:tc>
           <w:tcPr>
-            <w:tcW w:type="dxa" w:w="2409"/>
+            <w:tcW w:type="dxa" w:w="2406"/>
           </w:tcPr>
           <w:p>
             <w:pPr>
@@ -46721,7 +48957,7 @@
         </w:tc>
         <w:tc>
           <w:tcPr>
-            <w:tcW w:type="dxa" w:w="6721"/>
+            <w:tcW w:type="dxa" w:w="6724"/>
           </w:tcPr>
           <w:p>
             <w:pPr>
@@ -46767,7 +49003,7 @@
         </w:tc>
         <w:tc>
           <w:tcPr>
-            <w:tcW w:type="dxa" w:w="2409"/>
+            <w:tcW w:type="dxa" w:w="2406"/>
           </w:tcPr>
           <w:p>
             <w:pPr>
@@ -46780,7 +49016,7 @@
         </w:tc>
         <w:tc>
           <w:tcPr>
-            <w:tcW w:type="dxa" w:w="6721"/>
+            <w:tcW w:type="dxa" w:w="6724"/>
           </w:tcPr>
           <w:p>
             <w:pPr>
@@ -46818,7 +49054,7 @@
         </w:tc>
         <w:tc>
           <w:tcPr>
-            <w:tcW w:type="dxa" w:w="2409"/>
+            <w:tcW w:type="dxa" w:w="2406"/>
           </w:tcPr>
           <w:p>
             <w:pPr>
@@ -46831,7 +49067,7 @@
         </w:tc>
         <w:tc>
           <w:tcPr>
-            <w:tcW w:type="dxa" w:w="6721"/>
+            <w:tcW w:type="dxa" w:w="6724"/>
           </w:tcPr>
           <w:p>
             <w:pPr>
@@ -46869,7 +49105,7 @@
         </w:tc>
         <w:tc>
           <w:tcPr>
-            <w:tcW w:type="dxa" w:w="2409"/>
+            <w:tcW w:type="dxa" w:w="2406"/>
           </w:tcPr>
           <w:p>
             <w:pPr>
@@ -46882,7 +49118,7 @@
         </w:tc>
         <w:tc>
           <w:tcPr>
-            <w:tcW w:type="dxa" w:w="6721"/>
+            <w:tcW w:type="dxa" w:w="6724"/>
           </w:tcPr>
           <w:p>
             <w:pPr>
@@ -46917,7 +49153,7 @@
         </w:tc>
         <w:tc>
           <w:tcPr>
-            <w:tcW w:type="dxa" w:w="2409"/>
+            <w:tcW w:type="dxa" w:w="2406"/>
           </w:tcPr>
           <w:p>
             <w:pPr>
@@ -46930,7 +49166,7 @@
         </w:tc>
         <w:tc>
           <w:tcPr>
-            <w:tcW w:type="dxa" w:w="6721"/>
+            <w:tcW w:type="dxa" w:w="6724"/>
           </w:tcPr>
           <w:p>
             <w:pPr>
@@ -46968,7 +49204,7 @@
         </w:tc>
         <w:tc>
           <w:tcPr>
-            <w:tcW w:type="dxa" w:w="2409"/>
+            <w:tcW w:type="dxa" w:w="2406"/>
           </w:tcPr>
           <w:p>
             <w:pPr>
@@ -46981,7 +49217,7 @@
         </w:tc>
         <w:tc>
           <w:tcPr>
-            <w:tcW w:type="dxa" w:w="6721"/>
+            <w:tcW w:type="dxa" w:w="6724"/>
           </w:tcPr>
           <w:p>
             <w:pPr>
@@ -47009,7 +49245,7 @@
         </w:tc>
         <w:tc>
           <w:tcPr>
-            <w:tcW w:type="dxa" w:w="2409"/>
+            <w:tcW w:type="dxa" w:w="2406"/>
           </w:tcPr>
           <w:p>
             <w:pPr>
@@ -47022,7 +49258,7 @@
         </w:tc>
         <w:tc>
           <w:tcPr>
-            <w:tcW w:type="dxa" w:w="6721"/>
+            <w:tcW w:type="dxa" w:w="6724"/>
           </w:tcPr>
           <w:p>
             <w:pPr>
@@ -47060,7 +49296,7 @@
         </w:tc>
         <w:tc>
           <w:tcPr>
-            <w:tcW w:type="dxa" w:w="2409"/>
+            <w:tcW w:type="dxa" w:w="2406"/>
           </w:tcPr>
           <w:p>
             <w:pPr>
@@ -47073,7 +49309,7 @@
         </w:tc>
         <w:tc>
           <w:tcPr>
-            <w:tcW w:type="dxa" w:w="6721"/>
+            <w:tcW w:type="dxa" w:w="6724"/>
           </w:tcPr>
           <w:p>
             <w:pPr>
@@ -47111,7 +49347,7 @@
         </w:tc>
         <w:tc>
           <w:tcPr>
-            <w:tcW w:type="dxa" w:w="2409"/>
+            <w:tcW w:type="dxa" w:w="2406"/>
           </w:tcPr>
           <w:p>
             <w:pPr>
@@ -47124,7 +49360,7 @@
         </w:tc>
         <w:tc>
           <w:tcPr>
-            <w:tcW w:type="dxa" w:w="6721"/>
+            <w:tcW w:type="dxa" w:w="6724"/>
           </w:tcPr>
           <w:p>
             <w:pPr>
@@ -47167,7 +49403,7 @@
         </w:tc>
         <w:tc>
           <w:tcPr>
-            <w:tcW w:type="dxa" w:w="2409"/>
+            <w:tcW w:type="dxa" w:w="2406"/>
           </w:tcPr>
           <w:p>
             <w:pPr>
@@ -47180,7 +49416,7 @@
         </w:tc>
         <w:tc>
           <w:tcPr>
-            <w:tcW w:type="dxa" w:w="6721"/>
+            <w:tcW w:type="dxa" w:w="6724"/>
           </w:tcPr>
           <w:p>
             <w:pPr>
@@ -47208,7 +49444,7 @@
         </w:tc>
         <w:tc>
           <w:tcPr>
-            <w:tcW w:type="dxa" w:w="2409"/>
+            <w:tcW w:type="dxa" w:w="2406"/>
           </w:tcPr>
           <w:p>
             <w:pPr>
@@ -47221,7 +49457,7 @@
         </w:tc>
         <w:tc>
           <w:tcPr>
-            <w:tcW w:type="dxa" w:w="6721"/>
+            <w:tcW w:type="dxa" w:w="6724"/>
           </w:tcPr>
           <w:p>
             <w:pPr>
@@ -47259,7 +49495,7 @@
         </w:tc>
         <w:tc>
           <w:tcPr>
-            <w:tcW w:type="dxa" w:w="2409"/>
+            <w:tcW w:type="dxa" w:w="2406"/>
           </w:tcPr>
           <w:p>
             <w:pPr>
@@ -47272,7 +49508,7 @@
         </w:tc>
         <w:tc>
           <w:tcPr>
-            <w:tcW w:type="dxa" w:w="6721"/>
+            <w:tcW w:type="dxa" w:w="6724"/>
           </w:tcPr>
           <w:p>
             <w:pPr>
@@ -47316,7 +49552,7 @@
         </w:tc>
         <w:tc>
           <w:tcPr>
-            <w:tcW w:type="dxa" w:w="2409"/>
+            <w:tcW w:type="dxa" w:w="2406"/>
           </w:tcPr>
           <w:p>
             <w:pPr>
@@ -47329,7 +49565,7 @@
         </w:tc>
         <w:tc>
           <w:tcPr>
-            <w:tcW w:type="dxa" w:w="6721"/>
+            <w:tcW w:type="dxa" w:w="6724"/>
           </w:tcPr>
           <w:p>
             <w:pPr>
@@ -47357,7 +49593,7 @@
         </w:tc>
         <w:tc>
           <w:tcPr>
-            <w:tcW w:type="dxa" w:w="2409"/>
+            <w:tcW w:type="dxa" w:w="2406"/>
           </w:tcPr>
           <w:p>
             <w:pPr>
@@ -47370,7 +49606,7 @@
         </w:tc>
         <w:tc>
           <w:tcPr>
-            <w:tcW w:type="dxa" w:w="6721"/>
+            <w:tcW w:type="dxa" w:w="6724"/>
           </w:tcPr>
           <w:p>
             <w:pPr>
@@ -47398,7 +49634,7 @@
         </w:tc>
         <w:tc>
           <w:tcPr>
-            <w:tcW w:type="dxa" w:w="2409"/>
+            <w:tcW w:type="dxa" w:w="2406"/>
           </w:tcPr>
           <w:p>
             <w:pPr>
@@ -47411,7 +49647,7 @@
         </w:tc>
         <w:tc>
           <w:tcPr>
-            <w:tcW w:type="dxa" w:w="6721"/>
+            <w:tcW w:type="dxa" w:w="6724"/>
           </w:tcPr>
           <w:p>
             <w:pPr>
@@ -47439,7 +49675,7 @@
         </w:tc>
         <w:tc>
           <w:tcPr>
-            <w:tcW w:type="dxa" w:w="2409"/>
+            <w:tcW w:type="dxa" w:w="2406"/>
           </w:tcPr>
           <w:p>
             <w:pPr>
@@ -47452,7 +49688,7 @@
         </w:tc>
         <w:tc>
           <w:tcPr>
-            <w:tcW w:type="dxa" w:w="6721"/>
+            <w:tcW w:type="dxa" w:w="6724"/>
           </w:tcPr>
           <w:p>
             <w:pPr>
@@ -47490,7 +49726,7 @@
         </w:tc>
         <w:tc>
           <w:tcPr>
-            <w:tcW w:type="dxa" w:w="2409"/>
+            <w:tcW w:type="dxa" w:w="2406"/>
           </w:tcPr>
           <w:p>
             <w:pPr>
@@ -47503,7 +49739,7 @@
         </w:tc>
         <w:tc>
           <w:tcPr>
-            <w:tcW w:type="dxa" w:w="6721"/>
+            <w:tcW w:type="dxa" w:w="6724"/>
           </w:tcPr>
           <w:p>
             <w:pPr>
@@ -47531,7 +49767,7 @@
         </w:tc>
         <w:tc>
           <w:tcPr>
-            <w:tcW w:type="dxa" w:w="2409"/>
+            <w:tcW w:type="dxa" w:w="2406"/>
           </w:tcPr>
           <w:p>
             <w:pPr>
@@ -47544,7 +49780,7 @@
         </w:tc>
         <w:tc>
           <w:tcPr>
-            <w:tcW w:type="dxa" w:w="6721"/>
+            <w:tcW w:type="dxa" w:w="6724"/>
           </w:tcPr>
           <w:p>
             <w:pPr>
@@ -47594,7 +49830,7 @@
         </w:tc>
         <w:tc>
           <w:tcPr>
-            <w:tcW w:type="dxa" w:w="2409"/>
+            <w:tcW w:type="dxa" w:w="2406"/>
           </w:tcPr>
           <w:p>
             <w:pPr>
@@ -47607,7 +49843,7 @@
         </w:tc>
         <w:tc>
           <w:tcPr>
-            <w:tcW w:type="dxa" w:w="6721"/>
+            <w:tcW w:type="dxa" w:w="6724"/>
           </w:tcPr>
           <w:p>
             <w:pPr>
@@ -47635,7 +49871,7 @@
         </w:tc>
         <w:tc>
           <w:tcPr>
-            <w:tcW w:type="dxa" w:w="2409"/>
+            <w:tcW w:type="dxa" w:w="2406"/>
           </w:tcPr>
           <w:p>
             <w:pPr>
@@ -47648,7 +49884,7 @@
         </w:tc>
         <w:tc>
           <w:tcPr>
-            <w:tcW w:type="dxa" w:w="6721"/>
+            <w:tcW w:type="dxa" w:w="6724"/>
           </w:tcPr>
           <w:p>
             <w:pPr>
@@ -47688,7 +49924,7 @@
         </w:tc>
         <w:tc>
           <w:tcPr>
-            <w:tcW w:type="dxa" w:w="2409"/>
+            <w:tcW w:type="dxa" w:w="2406"/>
           </w:tcPr>
           <w:p>
             <w:pPr>
@@ -47701,7 +49937,7 @@
         </w:tc>
         <w:tc>
           <w:tcPr>
-            <w:tcW w:type="dxa" w:w="6721"/>
+            <w:tcW w:type="dxa" w:w="6724"/>
           </w:tcPr>
           <w:p>
             <w:pPr>
@@ -47729,7 +49965,7 @@
         </w:tc>
         <w:tc>
           <w:tcPr>
-            <w:tcW w:type="dxa" w:w="2409"/>
+            <w:tcW w:type="dxa" w:w="2406"/>
           </w:tcPr>
           <w:p>
             <w:pPr>
@@ -47742,7 +49978,7 @@
         </w:tc>
         <w:tc>
           <w:tcPr>
-            <w:tcW w:type="dxa" w:w="6721"/>
+            <w:tcW w:type="dxa" w:w="6724"/>
           </w:tcPr>
           <w:p>
             <w:pPr>
@@ -47770,7 +50006,7 @@
         </w:tc>
         <w:tc>
           <w:tcPr>
-            <w:tcW w:type="dxa" w:w="2409"/>
+            <w:tcW w:type="dxa" w:w="2406"/>
           </w:tcPr>
           <w:p>
             <w:pPr>
@@ -47783,7 +50019,7 @@
         </w:tc>
         <w:tc>
           <w:tcPr>
-            <w:tcW w:type="dxa" w:w="6721"/>
+            <w:tcW w:type="dxa" w:w="6724"/>
           </w:tcPr>
           <w:p>
             <w:pPr>
@@ -47811,7 +50047,7 @@
         </w:tc>
         <w:tc>
           <w:tcPr>
-            <w:tcW w:type="dxa" w:w="2409"/>
+            <w:tcW w:type="dxa" w:w="2406"/>
           </w:tcPr>
           <w:p>
             <w:pPr>
@@ -47824,7 +50060,7 @@
         </w:tc>
         <w:tc>
           <w:tcPr>
-            <w:tcW w:type="dxa" w:w="6721"/>
+            <w:tcW w:type="dxa" w:w="6724"/>
           </w:tcPr>
           <w:p>
             <w:pPr>
@@ -47852,7 +50088,7 @@
         </w:tc>
         <w:tc>
           <w:tcPr>
-            <w:tcW w:type="dxa" w:w="2409"/>
+            <w:tcW w:type="dxa" w:w="2406"/>
           </w:tcPr>
           <w:p>
             <w:pPr>
@@ -47865,7 +50101,7 @@
         </w:tc>
         <w:tc>
           <w:tcPr>
-            <w:tcW w:type="dxa" w:w="6721"/>
+            <w:tcW w:type="dxa" w:w="6724"/>
           </w:tcPr>
           <w:p>
             <w:pPr>
@@ -47893,7 +50129,7 @@
         </w:tc>
         <w:tc>
           <w:tcPr>
-            <w:tcW w:type="dxa" w:w="2409"/>
+            <w:tcW w:type="dxa" w:w="2406"/>
           </w:tcPr>
           <w:p>
             <w:pPr>
@@ -47906,7 +50142,7 @@
         </w:tc>
         <w:tc>
           <w:tcPr>
-            <w:tcW w:type="dxa" w:w="6721"/>
+            <w:tcW w:type="dxa" w:w="6724"/>
           </w:tcPr>
           <w:p>
             <w:pPr>
@@ -47934,7 +50170,7 @@
         </w:tc>
         <w:tc>
           <w:tcPr>
-            <w:tcW w:type="dxa" w:w="2409"/>
+            <w:tcW w:type="dxa" w:w="2406"/>
           </w:tcPr>
           <w:p>
             <w:pPr>
@@ -47947,7 +50183,7 @@
         </w:tc>
         <w:tc>
           <w:tcPr>
-            <w:tcW w:type="dxa" w:w="6721"/>
+            <w:tcW w:type="dxa" w:w="6724"/>
           </w:tcPr>
           <w:p>
             <w:pPr>
@@ -47975,7 +50211,7 @@
         </w:tc>
         <w:tc>
           <w:tcPr>
-            <w:tcW w:type="dxa" w:w="2409"/>
+            <w:tcW w:type="dxa" w:w="2406"/>
           </w:tcPr>
           <w:p>
             <w:pPr>
@@ -47988,7 +50224,7 @@
         </w:tc>
         <w:tc>
           <w:tcPr>
-            <w:tcW w:type="dxa" w:w="6721"/>
+            <w:tcW w:type="dxa" w:w="6724"/>
           </w:tcPr>
           <w:p>
             <w:pPr>
@@ -48026,7 +50262,7 @@
         </w:tc>
         <w:tc>
           <w:tcPr>
-            <w:tcW w:type="dxa" w:w="2409"/>
+            <w:tcW w:type="dxa" w:w="2406"/>
           </w:tcPr>
           <w:p>
             <w:pPr>
@@ -48039,7 +50275,7 @@
         </w:tc>
         <w:tc>
           <w:tcPr>
-            <w:tcW w:type="dxa" w:w="6721"/>
+            <w:tcW w:type="dxa" w:w="6724"/>
           </w:tcPr>
           <w:p>
             <w:pPr>
@@ -48067,7 +50303,7 @@
         </w:tc>
         <w:tc>
           <w:tcPr>
-            <w:tcW w:type="dxa" w:w="2409"/>
+            <w:tcW w:type="dxa" w:w="2406"/>
           </w:tcPr>
           <w:p>
             <w:pPr>
@@ -48080,7 +50316,7 @@
         </w:tc>
         <w:tc>
           <w:tcPr>
-            <w:tcW w:type="dxa" w:w="6721"/>
+            <w:tcW w:type="dxa" w:w="6724"/>
           </w:tcPr>
           <w:p>
             <w:pPr>
@@ -48108,7 +50344,7 @@
         </w:tc>
         <w:tc>
           <w:tcPr>
-            <w:tcW w:type="dxa" w:w="2409"/>
+            <w:tcW w:type="dxa" w:w="2406"/>
           </w:tcPr>
           <w:p>
             <w:pPr>
@@ -48121,7 +50357,7 @@
         </w:tc>
         <w:tc>
           <w:tcPr>
-            <w:tcW w:type="dxa" w:w="6721"/>
+            <w:tcW w:type="dxa" w:w="6724"/>
           </w:tcPr>
           <w:p>
             <w:pPr>
@@ -48149,7 +50385,7 @@
         </w:tc>
         <w:tc>
           <w:tcPr>
-            <w:tcW w:type="dxa" w:w="2409"/>
+            <w:tcW w:type="dxa" w:w="2406"/>
           </w:tcPr>
           <w:p>
             <w:pPr>
@@ -48162,7 +50398,7 @@
         </w:tc>
         <w:tc>
           <w:tcPr>
-            <w:tcW w:type="dxa" w:w="6721"/>
+            <w:tcW w:type="dxa" w:w="6724"/>
           </w:tcPr>
           <w:p>
             <w:pPr>
@@ -48190,7 +50426,7 @@
         </w:tc>
         <w:tc>
           <w:tcPr>
-            <w:tcW w:type="dxa" w:w="2409"/>
+            <w:tcW w:type="dxa" w:w="2406"/>
           </w:tcPr>
           <w:p>
             <w:pPr>
@@ -48203,7 +50439,7 @@
         </w:tc>
         <w:tc>
           <w:tcPr>
-            <w:tcW w:type="dxa" w:w="6721"/>
+            <w:tcW w:type="dxa" w:w="6724"/>
           </w:tcPr>
           <w:p>
             <w:pPr>
@@ -48243,7 +50479,7 @@
         </w:tc>
         <w:tc>
           <w:tcPr>
-            <w:tcW w:type="dxa" w:w="2409"/>
+            <w:tcW w:type="dxa" w:w="2406"/>
           </w:tcPr>
           <w:p>
             <w:pPr>
@@ -48256,7 +50492,7 @@
         </w:tc>
         <w:tc>
           <w:tcPr>
-            <w:tcW w:type="dxa" w:w="6721"/>
+            <w:tcW w:type="dxa" w:w="6724"/>
           </w:tcPr>
           <w:p>
             <w:pPr>
@@ -48264,6 +50500,77 @@
             </w:pPr>
             <w:r>
               <w:t xml:space="preserve">Allow same-tier only (recommended), or permit specific exceptions such as PROD → non-PROD read of anonymized data?</w:t>
+            </w:r>
+          </w:p>
+        </w:tc>
+      </w:tr>
+      <w:tr>
+        <w:tc>
+          <w:tcPr>
+            <w:tcW w:type="dxa" w:w="950"/>
+          </w:tcPr>
+          <w:p>
+            <w:pPr>
+              <w:pStyle w:val="Compact"/>
+            </w:pPr>
+            <w:r>
+              <w:t xml:space="preserve">D37</w:t>
+            </w:r>
+          </w:p>
+        </w:tc>
+        <w:tc>
+          <w:tcPr>
+            <w:tcW w:type="dxa" w:w="2406"/>
+          </w:tcPr>
+          <w:p>
+            <w:pPr>
+              <w:pStyle w:val="Compact"/>
+            </w:pPr>
+            <w:r>
+              <w:t xml:space="preserve">Share-tag limits</w:t>
+            </w:r>
+          </w:p>
+        </w:tc>
+        <w:tc>
+          <w:tcPr>
+            <w:tcW w:type="dxa" w:w="6724"/>
+          </w:tcPr>
+          <w:p>
+            <w:pPr>
+              <w:pStyle w:val="Compact"/>
+            </w:pPr>
+            <w:r>
+              <w:t xml:space="preserve">Maximum</w:t>
+            </w:r>
+            <w:r>
+              <w:t xml:space="preserve"> </w:t>
+            </w:r>
+            <w:r>
+              <w:rPr>
+                <w:rStyle w:val="VerbatimChar"/>
+              </w:rPr>
+              <w:t xml:space="preserve">org:share-scope</w:t>
+            </w:r>
+            <w:r>
+              <w:t xml:space="preserve"> </w:t>
+            </w:r>
+            <w:r>
+              <w:t xml:space="preserve">per data classification (default: public/internal any, confidential ≤ product, restricted none) and whether</w:t>
+            </w:r>
+            <w:r>
+              <w:t xml:space="preserve"> </w:t>
+            </w:r>
+            <w:r>
+              <w:rPr>
+                <w:rStyle w:val="VerbatimChar"/>
+              </w:rPr>
+              <w:t xml:space="preserve">organization</w:t>
+            </w:r>
+            <w:r>
+              <w:t xml:space="preserve"> </w:t>
+            </w:r>
+            <w:r>
+              <w:t xml:space="preserve">scope is allowed at all?</w:t>
             </w:r>
           </w:p>
         </w:tc>

</xml_diff>

<commit_message>
Grant all sharing through an approval workflow
Share offers, access requests, agreements, renewals and revocations go
through one sharing approval workflow with risk-based routing, optional
auto-approval within an approved tag offer, separation of duties,
recertification and audit. Regenerated Word document.
</commit_message>
<xml_diff>
--- a/docs/CloudInfraAutomation-Architecture.docx
+++ b/docs/CloudInfraAutomation-Architecture.docx
@@ -67,7 +67,7 @@
         <w:t xml:space="preserve"> </w:t>
       </w:r>
       <w:r>
-        <w:t xml:space="preserve">Draft v2.13 for review. No code is written until this design is approved.</w:t>
+        <w:t xml:space="preserve">Draft v2.14 for review. No code is written until this design is approved.</w:t>
       </w:r>
     </w:p>
     <w:p>
@@ -737,6 +737,34 @@
             </w:r>
             <w:r>
               <w:t xml:space="preserve">on a resource, and any consumer in any account whose tags match (same environment, inside the organization) can connect self-service. Agreements remain for everything tags cannot express.</w:t>
+            </w:r>
+          </w:p>
+        </w:tc>
+      </w:tr>
+      <w:tr>
+        <w:tc>
+          <w:tcPr>
+            <w:tcW w:type="dxa" w:w="950"/>
+          </w:tcPr>
+          <w:p>
+            <w:pPr>
+              <w:pStyle w:val="Compact"/>
+            </w:pPr>
+            <w:r>
+              <w:t xml:space="preserve">v2.14</w:t>
+            </w:r>
+          </w:p>
+        </w:tc>
+        <w:tc>
+          <w:tcPr>
+            <w:tcW w:type="dxa" w:w="9130"/>
+          </w:tcPr>
+          <w:p>
+            <w:pPr>
+              <w:pStyle w:val="Compact"/>
+            </w:pPr>
+            <w:r>
+              <w:t xml:space="preserve">all sharing is granted through a sharing approval workflow (§4.11.6). Covers share offers, access requests, agreements, renewal and revocation, with risk-based routing, optional auto-approval within an approved tag offer, recertification and audit.</w:t>
             </w:r>
           </w:p>
         </w:tc>
@@ -3349,8 +3377,8 @@
         <w:tblLook w:firstRow="1" w:lastRow="0" w:firstColumn="0" w:lastColumn="0" w:noHBand="0" w:noVBand="0" w:val="0020"/>
       </w:tblPr>
       <w:tblGrid>
-        <w:gridCol w:w="3802"/>
-        <w:gridCol w:w="6278"/>
+        <w:gridCol w:w="4292"/>
+        <w:gridCol w:w="5788"/>
       </w:tblGrid>
       <w:tr>
         <w:trPr>
@@ -3358,7 +3386,7 @@
         </w:trPr>
         <w:tc>
           <w:tcPr>
-            <w:tcW w:type="dxa" w:w="3802"/>
+            <w:tcW w:type="dxa" w:w="4292"/>
           </w:tcPr>
           <w:p>
             <w:pPr>
@@ -3371,7 +3399,7 @@
         </w:tc>
         <w:tc>
           <w:tcPr>
-            <w:tcW w:type="dxa" w:w="6278"/>
+            <w:tcW w:type="dxa" w:w="5788"/>
           </w:tcPr>
           <w:p>
             <w:pPr>
@@ -3386,7 +3414,7 @@
       <w:tr>
         <w:tc>
           <w:tcPr>
-            <w:tcW w:type="dxa" w:w="3802"/>
+            <w:tcW w:type="dxa" w:w="4292"/>
           </w:tcPr>
           <w:p>
             <w:pPr>
@@ -3402,7 +3430,7 @@
         </w:tc>
         <w:tc>
           <w:tcPr>
-            <w:tcW w:type="dxa" w:w="6278"/>
+            <w:tcW w:type="dxa" w:w="5788"/>
           </w:tcPr>
           <w:p>
             <w:pPr>
@@ -3430,7 +3458,7 @@
       <w:tr>
         <w:tc>
           <w:tcPr>
-            <w:tcW w:type="dxa" w:w="3802"/>
+            <w:tcW w:type="dxa" w:w="4292"/>
           </w:tcPr>
           <w:p>
             <w:pPr>
@@ -3446,7 +3474,7 @@
         </w:tc>
         <w:tc>
           <w:tcPr>
-            <w:tcW w:type="dxa" w:w="6278"/>
+            <w:tcW w:type="dxa" w:w="5788"/>
           </w:tcPr>
           <w:p>
             <w:pPr>
@@ -3461,7 +3489,7 @@
       <w:tr>
         <w:tc>
           <w:tcPr>
-            <w:tcW w:type="dxa" w:w="3802"/>
+            <w:tcW w:type="dxa" w:w="4292"/>
           </w:tcPr>
           <w:p>
             <w:pPr>
@@ -3477,7 +3505,7 @@
         </w:tc>
         <w:tc>
           <w:tcPr>
-            <w:tcW w:type="dxa" w:w="6278"/>
+            <w:tcW w:type="dxa" w:w="5788"/>
           </w:tcPr>
           <w:p>
             <w:pPr>
@@ -3492,7 +3520,7 @@
       <w:tr>
         <w:tc>
           <w:tcPr>
-            <w:tcW w:type="dxa" w:w="3802"/>
+            <w:tcW w:type="dxa" w:w="4292"/>
           </w:tcPr>
           <w:p>
             <w:pPr>
@@ -3508,7 +3536,7 @@
         </w:tc>
         <w:tc>
           <w:tcPr>
-            <w:tcW w:type="dxa" w:w="6278"/>
+            <w:tcW w:type="dxa" w:w="5788"/>
           </w:tcPr>
           <w:p>
             <w:pPr>
@@ -3533,7 +3561,7 @@
       <w:tr>
         <w:tc>
           <w:tcPr>
-            <w:tcW w:type="dxa" w:w="3802"/>
+            <w:tcW w:type="dxa" w:w="4292"/>
           </w:tcPr>
           <w:p>
             <w:pPr>
@@ -3549,7 +3577,7 @@
         </w:tc>
         <w:tc>
           <w:tcPr>
-            <w:tcW w:type="dxa" w:w="6278"/>
+            <w:tcW w:type="dxa" w:w="5788"/>
           </w:tcPr>
           <w:p>
             <w:pPr>
@@ -3574,7 +3602,7 @@
       <w:tr>
         <w:tc>
           <w:tcPr>
-            <w:tcW w:type="dxa" w:w="3802"/>
+            <w:tcW w:type="dxa" w:w="4292"/>
           </w:tcPr>
           <w:p>
             <w:pPr>
@@ -3590,7 +3618,7 @@
         </w:tc>
         <w:tc>
           <w:tcPr>
-            <w:tcW w:type="dxa" w:w="6278"/>
+            <w:tcW w:type="dxa" w:w="5788"/>
           </w:tcPr>
           <w:p>
             <w:pPr>
@@ -3615,7 +3643,7 @@
       <w:tr>
         <w:tc>
           <w:tcPr>
-            <w:tcW w:type="dxa" w:w="3802"/>
+            <w:tcW w:type="dxa" w:w="4292"/>
           </w:tcPr>
           <w:p>
             <w:pPr>
@@ -3631,7 +3659,7 @@
         </w:tc>
         <w:tc>
           <w:tcPr>
-            <w:tcW w:type="dxa" w:w="6278"/>
+            <w:tcW w:type="dxa" w:w="5788"/>
           </w:tcPr>
           <w:p>
             <w:pPr>
@@ -3646,7 +3674,7 @@
       <w:tr>
         <w:tc>
           <w:tcPr>
-            <w:tcW w:type="dxa" w:w="3802"/>
+            <w:tcW w:type="dxa" w:w="4292"/>
           </w:tcPr>
           <w:p>
             <w:pPr>
@@ -3662,7 +3690,7 @@
         </w:tc>
         <w:tc>
           <w:tcPr>
-            <w:tcW w:type="dxa" w:w="6278"/>
+            <w:tcW w:type="dxa" w:w="5788"/>
           </w:tcPr>
           <w:p>
             <w:pPr>
@@ -3701,7 +3729,7 @@
       <w:tr>
         <w:tc>
           <w:tcPr>
-            <w:tcW w:type="dxa" w:w="3802"/>
+            <w:tcW w:type="dxa" w:w="4292"/>
           </w:tcPr>
           <w:p>
             <w:pPr>
@@ -3732,7 +3760,7 @@
         </w:tc>
         <w:tc>
           <w:tcPr>
-            <w:tcW w:type="dxa" w:w="6278"/>
+            <w:tcW w:type="dxa" w:w="5788"/>
           </w:tcPr>
           <w:p>
             <w:pPr>
@@ -3747,7 +3775,7 @@
       <w:tr>
         <w:tc>
           <w:tcPr>
-            <w:tcW w:type="dxa" w:w="3802"/>
+            <w:tcW w:type="dxa" w:w="4292"/>
           </w:tcPr>
           <w:p>
             <w:pPr>
@@ -3763,7 +3791,7 @@
         </w:tc>
         <w:tc>
           <w:tcPr>
-            <w:tcW w:type="dxa" w:w="6278"/>
+            <w:tcW w:type="dxa" w:w="5788"/>
           </w:tcPr>
           <w:p>
             <w:pPr>
@@ -3778,7 +3806,7 @@
       <w:tr>
         <w:tc>
           <w:tcPr>
-            <w:tcW w:type="dxa" w:w="3802"/>
+            <w:tcW w:type="dxa" w:w="4292"/>
           </w:tcPr>
           <w:p>
             <w:pPr>
@@ -3794,7 +3822,7 @@
         </w:tc>
         <w:tc>
           <w:tcPr>
-            <w:tcW w:type="dxa" w:w="6278"/>
+            <w:tcW w:type="dxa" w:w="5788"/>
           </w:tcPr>
           <w:p>
             <w:pPr>
@@ -3809,7 +3837,7 @@
       <w:tr>
         <w:tc>
           <w:tcPr>
-            <w:tcW w:type="dxa" w:w="3802"/>
+            <w:tcW w:type="dxa" w:w="4292"/>
           </w:tcPr>
           <w:p>
             <w:pPr>
@@ -3840,7 +3868,7 @@
         </w:tc>
         <w:tc>
           <w:tcPr>
-            <w:tcW w:type="dxa" w:w="6278"/>
+            <w:tcW w:type="dxa" w:w="5788"/>
           </w:tcPr>
           <w:p>
             <w:pPr>
@@ -3855,7 +3883,7 @@
       <w:tr>
         <w:tc>
           <w:tcPr>
-            <w:tcW w:type="dxa" w:w="3802"/>
+            <w:tcW w:type="dxa" w:w="4292"/>
           </w:tcPr>
           <w:p>
             <w:pPr>
@@ -3871,7 +3899,7 @@
         </w:tc>
         <w:tc>
           <w:tcPr>
-            <w:tcW w:type="dxa" w:w="6278"/>
+            <w:tcW w:type="dxa" w:w="5788"/>
           </w:tcPr>
           <w:p>
             <w:pPr>
@@ -3901,7 +3929,7 @@
       <w:tr>
         <w:tc>
           <w:tcPr>
-            <w:tcW w:type="dxa" w:w="3802"/>
+            <w:tcW w:type="dxa" w:w="4292"/>
           </w:tcPr>
           <w:p>
             <w:pPr>
@@ -3932,7 +3960,7 @@
         </w:tc>
         <w:tc>
           <w:tcPr>
-            <w:tcW w:type="dxa" w:w="6278"/>
+            <w:tcW w:type="dxa" w:w="5788"/>
           </w:tcPr>
           <w:p>
             <w:pPr>
@@ -3947,7 +3975,7 @@
       <w:tr>
         <w:tc>
           <w:tcPr>
-            <w:tcW w:type="dxa" w:w="3802"/>
+            <w:tcW w:type="dxa" w:w="4292"/>
           </w:tcPr>
           <w:p>
             <w:pPr>
@@ -3963,7 +3991,7 @@
         </w:tc>
         <w:tc>
           <w:tcPr>
-            <w:tcW w:type="dxa" w:w="6278"/>
+            <w:tcW w:type="dxa" w:w="5788"/>
           </w:tcPr>
           <w:p>
             <w:pPr>
@@ -3978,17 +4006,48 @@
       <w:tr>
         <w:tc>
           <w:tcPr>
-            <w:tcW w:type="dxa" w:w="3802"/>
-          </w:tcPr>
-          <w:p>
-            <w:pPr>
-              <w:pStyle w:val="Compact"/>
-            </w:pPr>
-            <w:r>
-              <w:rPr>
-                <w:rStyle w:val="VerbatimChar"/>
-              </w:rPr>
-              <w:t xml:space="preserve">POST /v1/sharing-agreements</w:t>
+            <w:tcW w:type="dxa" w:w="4292"/>
+          </w:tcPr>
+          <w:p>
+            <w:pPr>
+              <w:pStyle w:val="Compact"/>
+            </w:pPr>
+            <w:r>
+              <w:rPr>
+                <w:rStyle w:val="VerbatimChar"/>
+              </w:rPr>
+              <w:t xml:space="preserve">POST /v1/sharing-requests</w:t>
+            </w:r>
+          </w:p>
+        </w:tc>
+        <w:tc>
+          <w:tcPr>
+            <w:tcW w:type="dxa" w:w="5788"/>
+          </w:tcPr>
+          <w:p>
+            <w:pPr>
+              <w:pStyle w:val="Compact"/>
+            </w:pPr>
+            <w:r>
+              <w:t xml:space="preserve">Create a sharing request: share offer, access request, agreement, renewal or revocation (§4.11.6).</w:t>
+            </w:r>
+          </w:p>
+        </w:tc>
+      </w:tr>
+      <w:tr>
+        <w:tc>
+          <w:tcPr>
+            <w:tcW w:type="dxa" w:w="4292"/>
+          </w:tcPr>
+          <w:p>
+            <w:pPr>
+              <w:pStyle w:val="Compact"/>
+            </w:pPr>
+            <w:r>
+              <w:rPr>
+                <w:rStyle w:val="VerbatimChar"/>
+              </w:rPr>
+              <w:t xml:space="preserve">GET /v1/sharing-requests?mine=true</w:t>
             </w:r>
             <w:r>
               <w:t xml:space="preserve"> </w:t>
@@ -4003,7 +4062,7 @@
               <w:rPr>
                 <w:rStyle w:val="VerbatimChar"/>
               </w:rPr>
-              <w:t xml:space="preserve">:approve</w:t>
+              <w:t xml:space="preserve">POST /v1/sharing-requests/{id}:approve</w:t>
             </w:r>
             <w:r>
               <w:t xml:space="preserve"> </w:t>
@@ -4018,28 +4077,28 @@
               <w:rPr>
                 <w:rStyle w:val="VerbatimChar"/>
               </w:rPr>
-              <w:t xml:space="preserve">:revoke</w:t>
-            </w:r>
-          </w:p>
-        </w:tc>
-        <w:tc>
-          <w:tcPr>
-            <w:tcW w:type="dxa" w:w="6278"/>
-          </w:tcPr>
-          <w:p>
-            <w:pPr>
-              <w:pStyle w:val="Compact"/>
-            </w:pPr>
-            <w:r>
-              <w:t xml:space="preserve">Request, approve (provider, security) and revoke cross-account sharing agreements.</w:t>
-            </w:r>
-          </w:p>
-        </w:tc>
-      </w:tr>
-      <w:tr>
-        <w:tc>
-          <w:tcPr>
-            <w:tcW w:type="dxa" w:w="3802"/>
+              <w:t xml:space="preserve">:reject</w:t>
+            </w:r>
+          </w:p>
+        </w:tc>
+        <w:tc>
+          <w:tcPr>
+            <w:tcW w:type="dxa" w:w="5788"/>
+          </w:tcPr>
+          <w:p>
+            <w:pPr>
+              <w:pStyle w:val="Compact"/>
+            </w:pPr>
+            <w:r>
+              <w:t xml:space="preserve">Sharing approval inbox and decisions.</w:t>
+            </w:r>
+          </w:p>
+        </w:tc>
+      </w:tr>
+      <w:tr>
+        <w:tc>
+          <w:tcPr>
+            <w:tcW w:type="dxa" w:w="4292"/>
           </w:tcPr>
           <w:p>
             <w:pPr>
@@ -4055,7 +4114,7 @@
         </w:tc>
         <w:tc>
           <w:tcPr>
-            <w:tcW w:type="dxa" w:w="6278"/>
+            <w:tcW w:type="dxa" w:w="5788"/>
           </w:tcPr>
           <w:p>
             <w:pPr>
@@ -7035,11 +7094,11 @@
         <w:tblLook w:firstRow="1" w:lastRow="0" w:firstColumn="0" w:lastColumn="0" w:noHBand="0" w:noVBand="0" w:val="0020"/>
       </w:tblPr>
       <w:tblGrid>
-        <w:gridCol w:w="1488"/>
-        <w:gridCol w:w="2034"/>
-        <w:gridCol w:w="1853"/>
+        <w:gridCol w:w="1451"/>
+        <w:gridCol w:w="1997"/>
+        <w:gridCol w:w="1864"/>
         <w:gridCol w:w="950"/>
-        <w:gridCol w:w="3755"/>
+        <w:gridCol w:w="3818"/>
       </w:tblGrid>
       <w:tr>
         <w:trPr>
@@ -7047,7 +7106,7 @@
         </w:trPr>
         <w:tc>
           <w:tcPr>
-            <w:tcW w:type="dxa" w:w="1488"/>
+            <w:tcW w:type="dxa" w:w="1451"/>
           </w:tcPr>
           <w:p>
             <w:pPr>
@@ -7060,7 +7119,7 @@
         </w:tc>
         <w:tc>
           <w:tcPr>
-            <w:tcW w:type="dxa" w:w="2034"/>
+            <w:tcW w:type="dxa" w:w="1997"/>
           </w:tcPr>
           <w:p>
             <w:pPr>
@@ -7073,7 +7132,7 @@
         </w:tc>
         <w:tc>
           <w:tcPr>
-            <w:tcW w:type="dxa" w:w="1853"/>
+            <w:tcW w:type="dxa" w:w="1864"/>
           </w:tcPr>
           <w:p>
             <w:pPr>
@@ -7099,7 +7158,7 @@
         </w:tc>
         <w:tc>
           <w:tcPr>
-            <w:tcW w:type="dxa" w:w="3755"/>
+            <w:tcW w:type="dxa" w:w="3818"/>
           </w:tcPr>
           <w:p>
             <w:pPr>
@@ -7114,7 +7173,7 @@
       <w:tr>
         <w:tc>
           <w:tcPr>
-            <w:tcW w:type="dxa" w:w="1488"/>
+            <w:tcW w:type="dxa" w:w="1451"/>
           </w:tcPr>
           <w:p>
             <w:pPr>
@@ -7130,7 +7189,7 @@
         </w:tc>
         <w:tc>
           <w:tcPr>
-            <w:tcW w:type="dxa" w:w="2034"/>
+            <w:tcW w:type="dxa" w:w="1997"/>
           </w:tcPr>
           <w:p>
             <w:pPr>
@@ -7146,7 +7205,7 @@
         </w:tc>
         <w:tc>
           <w:tcPr>
-            <w:tcW w:type="dxa" w:w="1853"/>
+            <w:tcW w:type="dxa" w:w="1864"/>
           </w:tcPr>
           <w:p>
             <w:pPr>
@@ -7172,7 +7231,7 @@
         </w:tc>
         <w:tc>
           <w:tcPr>
-            <w:tcW w:type="dxa" w:w="3755"/>
+            <w:tcW w:type="dxa" w:w="3818"/>
           </w:tcPr>
           <w:p>
             <w:pPr>
@@ -7187,7 +7246,7 @@
       <w:tr>
         <w:tc>
           <w:tcPr>
-            <w:tcW w:type="dxa" w:w="1488"/>
+            <w:tcW w:type="dxa" w:w="1451"/>
           </w:tcPr>
           <w:p>
             <w:pPr>
@@ -7203,7 +7262,7 @@
         </w:tc>
         <w:tc>
           <w:tcPr>
-            <w:tcW w:type="dxa" w:w="2034"/>
+            <w:tcW w:type="dxa" w:w="1997"/>
           </w:tcPr>
           <w:p>
             <w:pPr>
@@ -7219,7 +7278,7 @@
         </w:tc>
         <w:tc>
           <w:tcPr>
-            <w:tcW w:type="dxa" w:w="1853"/>
+            <w:tcW w:type="dxa" w:w="1864"/>
           </w:tcPr>
           <w:p>
             <w:pPr>
@@ -7245,7 +7304,7 @@
         </w:tc>
         <w:tc>
           <w:tcPr>
-            <w:tcW w:type="dxa" w:w="3755"/>
+            <w:tcW w:type="dxa" w:w="3818"/>
           </w:tcPr>
           <w:p>
             <w:pPr>
@@ -7260,7 +7319,7 @@
       <w:tr>
         <w:tc>
           <w:tcPr>
-            <w:tcW w:type="dxa" w:w="1488"/>
+            <w:tcW w:type="dxa" w:w="1451"/>
           </w:tcPr>
           <w:p>
             <w:pPr>
@@ -7276,7 +7335,7 @@
         </w:tc>
         <w:tc>
           <w:tcPr>
-            <w:tcW w:type="dxa" w:w="2034"/>
+            <w:tcW w:type="dxa" w:w="1997"/>
           </w:tcPr>
           <w:p>
             <w:pPr>
@@ -7292,7 +7351,7 @@
         </w:tc>
         <w:tc>
           <w:tcPr>
-            <w:tcW w:type="dxa" w:w="1853"/>
+            <w:tcW w:type="dxa" w:w="1864"/>
           </w:tcPr>
           <w:p>
             <w:pPr>
@@ -7318,7 +7377,7 @@
         </w:tc>
         <w:tc>
           <w:tcPr>
-            <w:tcW w:type="dxa" w:w="3755"/>
+            <w:tcW w:type="dxa" w:w="3818"/>
           </w:tcPr>
           <w:p>
             <w:pPr>
@@ -7337,7 +7396,7 @@
       <w:tr>
         <w:tc>
           <w:tcPr>
-            <w:tcW w:type="dxa" w:w="1488"/>
+            <w:tcW w:type="dxa" w:w="1451"/>
           </w:tcPr>
           <w:p>
             <w:pPr>
@@ -7353,7 +7412,7 @@
         </w:tc>
         <w:tc>
           <w:tcPr>
-            <w:tcW w:type="dxa" w:w="2034"/>
+            <w:tcW w:type="dxa" w:w="1997"/>
           </w:tcPr>
           <w:p>
             <w:pPr>
@@ -7369,7 +7428,7 @@
         </w:tc>
         <w:tc>
           <w:tcPr>
-            <w:tcW w:type="dxa" w:w="1853"/>
+            <w:tcW w:type="dxa" w:w="1864"/>
           </w:tcPr>
           <w:p>
             <w:pPr>
@@ -7395,7 +7454,7 @@
         </w:tc>
         <w:tc>
           <w:tcPr>
-            <w:tcW w:type="dxa" w:w="3755"/>
+            <w:tcW w:type="dxa" w:w="3818"/>
           </w:tcPr>
           <w:p>
             <w:pPr>
@@ -7410,7 +7469,7 @@
       <w:tr>
         <w:tc>
           <w:tcPr>
-            <w:tcW w:type="dxa" w:w="1488"/>
+            <w:tcW w:type="dxa" w:w="1451"/>
           </w:tcPr>
           <w:p>
             <w:pPr>
@@ -7426,7 +7485,7 @@
         </w:tc>
         <w:tc>
           <w:tcPr>
-            <w:tcW w:type="dxa" w:w="2034"/>
+            <w:tcW w:type="dxa" w:w="1997"/>
           </w:tcPr>
           <w:p>
             <w:pPr>
@@ -7442,7 +7501,7 @@
         </w:tc>
         <w:tc>
           <w:tcPr>
-            <w:tcW w:type="dxa" w:w="1853"/>
+            <w:tcW w:type="dxa" w:w="1864"/>
           </w:tcPr>
           <w:p>
             <w:pPr>
@@ -7468,7 +7527,7 @@
         </w:tc>
         <w:tc>
           <w:tcPr>
-            <w:tcW w:type="dxa" w:w="3755"/>
+            <w:tcW w:type="dxa" w:w="3818"/>
           </w:tcPr>
           <w:p>
             <w:pPr>
@@ -7483,7 +7542,7 @@
       <w:tr>
         <w:tc>
           <w:tcPr>
-            <w:tcW w:type="dxa" w:w="1488"/>
+            <w:tcW w:type="dxa" w:w="1451"/>
           </w:tcPr>
           <w:p>
             <w:pPr>
@@ -7499,7 +7558,7 @@
         </w:tc>
         <w:tc>
           <w:tcPr>
-            <w:tcW w:type="dxa" w:w="2034"/>
+            <w:tcW w:type="dxa" w:w="1997"/>
           </w:tcPr>
           <w:p>
             <w:pPr>
@@ -7515,7 +7574,7 @@
         </w:tc>
         <w:tc>
           <w:tcPr>
-            <w:tcW w:type="dxa" w:w="1853"/>
+            <w:tcW w:type="dxa" w:w="1864"/>
           </w:tcPr>
           <w:p>
             <w:pPr>
@@ -7541,7 +7600,7 @@
         </w:tc>
         <w:tc>
           <w:tcPr>
-            <w:tcW w:type="dxa" w:w="3755"/>
+            <w:tcW w:type="dxa" w:w="3818"/>
           </w:tcPr>
           <w:p>
             <w:pPr>
@@ -7556,7 +7615,7 @@
       <w:tr>
         <w:tc>
           <w:tcPr>
-            <w:tcW w:type="dxa" w:w="1488"/>
+            <w:tcW w:type="dxa" w:w="1451"/>
           </w:tcPr>
           <w:p>
             <w:pPr>
@@ -7572,7 +7631,7 @@
         </w:tc>
         <w:tc>
           <w:tcPr>
-            <w:tcW w:type="dxa" w:w="2034"/>
+            <w:tcW w:type="dxa" w:w="1997"/>
           </w:tcPr>
           <w:p>
             <w:pPr>
@@ -7588,7 +7647,7 @@
         </w:tc>
         <w:tc>
           <w:tcPr>
-            <w:tcW w:type="dxa" w:w="1853"/>
+            <w:tcW w:type="dxa" w:w="1864"/>
           </w:tcPr>
           <w:p>
             <w:pPr>
@@ -7614,7 +7673,7 @@
         </w:tc>
         <w:tc>
           <w:tcPr>
-            <w:tcW w:type="dxa" w:w="3755"/>
+            <w:tcW w:type="dxa" w:w="3818"/>
           </w:tcPr>
           <w:p>
             <w:pPr>
@@ -7629,7 +7688,7 @@
       <w:tr>
         <w:tc>
           <w:tcPr>
-            <w:tcW w:type="dxa" w:w="1488"/>
+            <w:tcW w:type="dxa" w:w="1451"/>
           </w:tcPr>
           <w:p>
             <w:pPr>
@@ -7645,7 +7704,7 @@
         </w:tc>
         <w:tc>
           <w:tcPr>
-            <w:tcW w:type="dxa" w:w="2034"/>
+            <w:tcW w:type="dxa" w:w="1997"/>
           </w:tcPr>
           <w:p>
             <w:pPr>
@@ -7706,7 +7765,7 @@
         </w:tc>
         <w:tc>
           <w:tcPr>
-            <w:tcW w:type="dxa" w:w="1853"/>
+            <w:tcW w:type="dxa" w:w="1864"/>
           </w:tcPr>
           <w:p>
             <w:pPr>
@@ -7744,7 +7803,7 @@
         </w:tc>
         <w:tc>
           <w:tcPr>
-            <w:tcW w:type="dxa" w:w="3755"/>
+            <w:tcW w:type="dxa" w:w="3818"/>
           </w:tcPr>
           <w:p>
             <w:pPr>
@@ -7766,7 +7825,7 @@
       <w:tr>
         <w:tc>
           <w:tcPr>
-            <w:tcW w:type="dxa" w:w="1488"/>
+            <w:tcW w:type="dxa" w:w="1451"/>
           </w:tcPr>
           <w:p>
             <w:pPr>
@@ -7782,7 +7841,7 @@
         </w:tc>
         <w:tc>
           <w:tcPr>
-            <w:tcW w:type="dxa" w:w="2034"/>
+            <w:tcW w:type="dxa" w:w="1997"/>
           </w:tcPr>
           <w:p>
             <w:pPr>
@@ -7858,7 +7917,7 @@
         </w:tc>
         <w:tc>
           <w:tcPr>
-            <w:tcW w:type="dxa" w:w="1853"/>
+            <w:tcW w:type="dxa" w:w="1864"/>
           </w:tcPr>
           <w:p>
             <w:pPr>
@@ -7896,7 +7955,7 @@
         </w:tc>
         <w:tc>
           <w:tcPr>
-            <w:tcW w:type="dxa" w:w="3755"/>
+            <w:tcW w:type="dxa" w:w="3818"/>
           </w:tcPr>
           <w:p>
             <w:pPr>
@@ -7911,7 +7970,95 @@
       <w:tr>
         <w:tc>
           <w:tcPr>
-            <w:tcW w:type="dxa" w:w="1488"/>
+            <w:tcW w:type="dxa" w:w="1451"/>
+          </w:tcPr>
+          <w:p>
+            <w:pPr>
+              <w:pStyle w:val="Compact"/>
+            </w:pPr>
+            <w:r>
+              <w:rPr>
+                <w:rStyle w:val="VerbatimChar"/>
+              </w:rPr>
+              <w:t xml:space="preserve">org:share-approval</w:t>
+            </w:r>
+          </w:p>
+        </w:tc>
+        <w:tc>
+          <w:tcPr>
+            <w:tcW w:type="dxa" w:w="1997"/>
+          </w:tcPr>
+          <w:p>
+            <w:pPr>
+              <w:pStyle w:val="Compact"/>
+            </w:pPr>
+            <w:r>
+              <w:rPr>
+                <w:rStyle w:val="VerbatimChar"/>
+              </w:rPr>
+              <w:t xml:space="preserve">required</w:t>
+            </w:r>
+            <w:r>
+              <w:t xml:space="preserve"> </w:t>
+            </w:r>
+            <w:r>
+              <w:t xml:space="preserve">(default) /</w:t>
+            </w:r>
+            <w:r>
+              <w:t xml:space="preserve"> </w:t>
+            </w:r>
+            <w:r>
+              <w:rPr>
+                <w:rStyle w:val="VerbatimChar"/>
+              </w:rPr>
+              <w:t xml:space="preserve">auto</w:t>
+            </w:r>
+          </w:p>
+        </w:tc>
+        <w:tc>
+          <w:tcPr>
+            <w:tcW w:type="dxa" w:w="1864"/>
+          </w:tcPr>
+          <w:p>
+            <w:pPr>
+              <w:pStyle w:val="Compact"/>
+            </w:pPr>
+            <w:r>
+              <w:t xml:space="preserve">Provider (UI, approved offer)</w:t>
+            </w:r>
+          </w:p>
+        </w:tc>
+        <w:tc>
+          <w:tcPr>
+            <w:tcW w:type="dxa" w:w="950"/>
+          </w:tcPr>
+          <w:p>
+            <w:pPr>
+              <w:pStyle w:val="Compact"/>
+            </w:pPr>
+            <w:r>
+              <w:t xml:space="preserve">No</w:t>
+            </w:r>
+          </w:p>
+        </w:tc>
+        <w:tc>
+          <w:tcPr>
+            <w:tcW w:type="dxa" w:w="3818"/>
+          </w:tcPr>
+          <w:p>
+            <w:pPr>
+              <w:pStyle w:val="Compact"/>
+            </w:pPr>
+            <w:r>
+              <w:t xml:space="preserve">Whether each consumer access request needs the provider’s approval or is auto-approved within the tag rule (§4.11.6)</w:t>
+            </w:r>
+          </w:p>
+        </w:tc>
+      </w:tr>
+      <w:tr>
+        <w:tc>
+          <w:tcPr>
+            <w:tcW w:type="dxa" w:w="1451"/>
           </w:tcPr>
           <w:p>
             <w:pPr>
@@ -7927,7 +8074,7 @@
         </w:tc>
         <w:tc>
           <w:tcPr>
-            <w:tcW w:type="dxa" w:w="2034"/>
+            <w:tcW w:type="dxa" w:w="1997"/>
           </w:tcPr>
           <w:p>
             <w:pPr>
@@ -7943,7 +8090,7 @@
         </w:tc>
         <w:tc>
           <w:tcPr>
-            <w:tcW w:type="dxa" w:w="1853"/>
+            <w:tcW w:type="dxa" w:w="1864"/>
           </w:tcPr>
           <w:p>
             <w:pPr>
@@ -7969,7 +8116,7 @@
         </w:tc>
         <w:tc>
           <w:tcPr>
-            <w:tcW w:type="dxa" w:w="3755"/>
+            <w:tcW w:type="dxa" w:w="3818"/>
           </w:tcPr>
           <w:p>
             <w:pPr>
@@ -7984,7 +8131,7 @@
       <w:tr>
         <w:tc>
           <w:tcPr>
-            <w:tcW w:type="dxa" w:w="1488"/>
+            <w:tcW w:type="dxa" w:w="1451"/>
           </w:tcPr>
           <w:p>
             <w:pPr>
@@ -8000,7 +8147,7 @@
         </w:tc>
         <w:tc>
           <w:tcPr>
-            <w:tcW w:type="dxa" w:w="2034"/>
+            <w:tcW w:type="dxa" w:w="1997"/>
           </w:tcPr>
           <w:p>
             <w:pPr>
@@ -8031,7 +8178,7 @@
         </w:tc>
         <w:tc>
           <w:tcPr>
-            <w:tcW w:type="dxa" w:w="1853"/>
+            <w:tcW w:type="dxa" w:w="1864"/>
           </w:tcPr>
           <w:p>
             <w:pPr>
@@ -8057,7 +8204,7 @@
         </w:tc>
         <w:tc>
           <w:tcPr>
-            <w:tcW w:type="dxa" w:w="3755"/>
+            <w:tcW w:type="dxa" w:w="3818"/>
           </w:tcPr>
           <w:p>
             <w:pPr>
@@ -8072,7 +8219,7 @@
       <w:tr>
         <w:tc>
           <w:tcPr>
-            <w:tcW w:type="dxa" w:w="1488"/>
+            <w:tcW w:type="dxa" w:w="1451"/>
           </w:tcPr>
           <w:p>
             <w:pPr>
@@ -8088,7 +8235,7 @@
         </w:tc>
         <w:tc>
           <w:tcPr>
-            <w:tcW w:type="dxa" w:w="2034"/>
+            <w:tcW w:type="dxa" w:w="1997"/>
           </w:tcPr>
           <w:p>
             <w:pPr>
@@ -8104,7 +8251,7 @@
         </w:tc>
         <w:tc>
           <w:tcPr>
-            <w:tcW w:type="dxa" w:w="1853"/>
+            <w:tcW w:type="dxa" w:w="1864"/>
           </w:tcPr>
           <w:p>
             <w:pPr>
@@ -8130,7 +8277,7 @@
         </w:tc>
         <w:tc>
           <w:tcPr>
-            <w:tcW w:type="dxa" w:w="3755"/>
+            <w:tcW w:type="dxa" w:w="3818"/>
           </w:tcPr>
           <w:p>
             <w:pPr>
@@ -12578,10 +12725,10 @@
         <w:tblLook w:firstRow="1" w:lastRow="0" w:firstColumn="0" w:lastColumn="0" w:noHBand="0" w:noVBand="0" w:val="0020"/>
       </w:tblPr>
       <w:tblGrid>
-        <w:gridCol w:w="1067"/>
-        <w:gridCol w:w="3195"/>
-        <w:gridCol w:w="2538"/>
-        <w:gridCol w:w="3280"/>
+        <w:gridCol w:w="957"/>
+        <w:gridCol w:w="2881"/>
+        <w:gridCol w:w="3302"/>
+        <w:gridCol w:w="2940"/>
       </w:tblGrid>
       <w:tr>
         <w:trPr>
@@ -12589,7 +12736,7 @@
         </w:trPr>
         <w:tc>
           <w:tcPr>
-            <w:tcW w:type="dxa" w:w="1067"/>
+            <w:tcW w:type="dxa" w:w="957"/>
           </w:tcPr>
           <w:p>
             <w:pPr>
@@ -12602,7 +12749,7 @@
         </w:tc>
         <w:tc>
           <w:tcPr>
-            <w:tcW w:type="dxa" w:w="3195"/>
+            <w:tcW w:type="dxa" w:w="2881"/>
           </w:tcPr>
           <w:p>
             <w:pPr>
@@ -12615,7 +12762,7 @@
         </w:tc>
         <w:tc>
           <w:tcPr>
-            <w:tcW w:type="dxa" w:w="2538"/>
+            <w:tcW w:type="dxa" w:w="3302"/>
           </w:tcPr>
           <w:p>
             <w:pPr>
@@ -12628,7 +12775,7 @@
         </w:tc>
         <w:tc>
           <w:tcPr>
-            <w:tcW w:type="dxa" w:w="3280"/>
+            <w:tcW w:type="dxa" w:w="2940"/>
           </w:tcPr>
           <w:p>
             <w:pPr>
@@ -12643,7 +12790,7 @@
       <w:tr>
         <w:tc>
           <w:tcPr>
-            <w:tcW w:type="dxa" w:w="1067"/>
+            <w:tcW w:type="dxa" w:w="957"/>
           </w:tcPr>
           <w:p>
             <w:pPr>
@@ -12666,7 +12813,7 @@
         </w:tc>
         <w:tc>
           <w:tcPr>
-            <w:tcW w:type="dxa" w:w="3195"/>
+            <w:tcW w:type="dxa" w:w="2881"/>
           </w:tcPr>
           <w:p>
             <w:pPr>
@@ -12689,13 +12836,29 @@
               <w:t xml:space="preserve"> </w:t>
             </w:r>
             <w:r>
-              <w:t xml:space="preserve">on its resource. Any consumer whose own tags match the share rule gets access, in any account of the organization.</w:t>
-            </w:r>
-          </w:p>
-        </w:tc>
-        <w:tc>
-          <w:tcPr>
-            <w:tcW w:type="dxa" w:w="2538"/>
+              <w:t xml:space="preserve">on its resource. They define which consumers</w:t>
+            </w:r>
+            <w:r>
+              <w:t xml:space="preserve"> </w:t>
+            </w:r>
+            <w:r>
+              <w:rPr>
+                <w:i/>
+                <w:iCs/>
+              </w:rPr>
+              <w:t xml:space="preserve">can</w:t>
+            </w:r>
+            <w:r>
+              <w:t xml:space="preserve"> </w:t>
+            </w:r>
+            <w:r>
+              <w:t xml:space="preserve">be granted access (matching tags, any account of the organization).</w:t>
+            </w:r>
+          </w:p>
+        </w:tc>
+        <w:tc>
+          <w:tcPr>
+            <w:tcW w:type="dxa" w:w="3302"/>
           </w:tcPr>
           <w:p>
             <w:pPr>
@@ -12706,19 +12869,28 @@
                 <w:b/>
                 <w:bCs/>
               </w:rPr>
-              <w:t xml:space="preserve">No.</w:t>
-            </w:r>
-            <w:r>
-              <w:t xml:space="preserve"> </w:t>
-            </w:r>
-            <w:r>
-              <w:t xml:space="preserve">The provider decided once, through the tag; consumers connect self-service</w:t>
-            </w:r>
-          </w:p>
-        </w:tc>
-        <w:tc>
-          <w:tcPr>
-            <w:tcW w:type="dxa" w:w="3280"/>
+              <w:t xml:space="preserve">Yes, through the sharing approval workflow (§4.11.6).</w:t>
+            </w:r>
+            <w:r>
+              <w:t xml:space="preserve"> </w:t>
+            </w:r>
+            <w:r>
+              <w:t xml:space="preserve">The offer (share tags) is approved once; each consumer’s access request is approved by the provider, or auto-approved if the provider chose</w:t>
+            </w:r>
+            <w:r>
+              <w:t xml:space="preserve"> </w:t>
+            </w:r>
+            <w:r>
+              <w:rPr>
+                <w:rStyle w:val="VerbatimChar"/>
+              </w:rPr>
+              <w:t xml:space="preserve">org:share-approval=auto</w:t>
+            </w:r>
+          </w:p>
+        </w:tc>
+        <w:tc>
+          <w:tcPr>
+            <w:tcW w:type="dxa" w:w="2940"/>
           </w:tcPr>
           <w:p>
             <w:pPr>
@@ -12733,7 +12905,7 @@
       <w:tr>
         <w:tc>
           <w:tcPr>
-            <w:tcW w:type="dxa" w:w="1067"/>
+            <w:tcW w:type="dxa" w:w="957"/>
           </w:tcPr>
           <w:p>
             <w:pPr>
@@ -12750,7 +12922,7 @@
         </w:tc>
         <w:tc>
           <w:tcPr>
-            <w:tcW w:type="dxa" w:w="3195"/>
+            <w:tcW w:type="dxa" w:w="2881"/>
           </w:tcPr>
           <w:p>
             <w:pPr>
@@ -12763,7 +12935,7 @@
         </w:tc>
         <w:tc>
           <w:tcPr>
-            <w:tcW w:type="dxa" w:w="2538"/>
+            <w:tcW w:type="dxa" w:w="3302"/>
           </w:tcPr>
           <w:p>
             <w:pPr>
@@ -12774,19 +12946,19 @@
                 <w:b/>
                 <w:bCs/>
               </w:rPr>
-              <w:t xml:space="preserve">Yes</w:t>
-            </w:r>
-            <w:r>
-              <w:t xml:space="preserve"> </w:t>
-            </w:r>
-            <w:r>
-              <w:t xml:space="preserve">(provider owner, plus security where required)</w:t>
-            </w:r>
-          </w:p>
-        </w:tc>
-        <w:tc>
-          <w:tcPr>
-            <w:tcW w:type="dxa" w:w="3280"/>
+              <w:t xml:space="preserve">Yes, through the same workflow</w:t>
+            </w:r>
+            <w:r>
+              <w:t xml:space="preserve"> </w:t>
+            </w:r>
+            <w:r>
+              <w:t xml:space="preserve">(provider owner, plus security / platform admin where required)</w:t>
+            </w:r>
+          </w:p>
+        </w:tc>
+        <w:tc>
+          <w:tcPr>
+            <w:tcW w:type="dxa" w:w="2940"/>
           </w:tcPr>
           <w:p>
             <w:pPr>
@@ -13893,7 +14065,7 @@
               <w:t xml:space="preserve">shareable-resource catalog</w:t>
             </w:r>
             <w:r>
-              <w:t xml:space="preserve">, which is built from share tags), the platform checks the tags match, then generates the exact-ARN statements and the contract binding</w:t>
+              <w:t xml:space="preserve">, which is built from share tags), the platform checks the tags match, then raises an</w:t>
             </w:r>
             <w:r>
               <w:t xml:space="preserve"> </w:t>
@@ -13903,10 +14075,38 @@
                 <w:b/>
                 <w:bCs/>
               </w:rPr>
-              <w:t xml:space="preserve">without asking the provider</w:t>
-            </w:r>
-            <w:r>
-              <w:t xml:space="preserve">. The consumer’s boundary allows cross-project access only to resources whose</w:t>
+              <w:t xml:space="preserve">access request</w:t>
+            </w:r>
+            <w:r>
+              <w:t xml:space="preserve"> </w:t>
+            </w:r>
+            <w:r>
+              <w:t xml:space="preserve">in the sharing approval workflow (§4.11.6). Only after approval does it generate the exact-ARN statements and the contract binding (auto-approved, with a notification to the provider, if the resource is tagged</w:t>
+            </w:r>
+            <w:r>
+              <w:t xml:space="preserve"> </w:t>
+            </w:r>
+            <w:r>
+              <w:rPr>
+                <w:rStyle w:val="VerbatimChar"/>
+              </w:rPr>
+              <w:t xml:space="preserve">org:share-approval=auto</w:t>
+            </w:r>
+            <w:r>
+              <w:t xml:space="preserve">). Because only the platform creates runtime roles and their policies,</w:t>
+            </w:r>
+            <w:r>
+              <w:t xml:space="preserve"> </w:t>
+            </w:r>
+            <w:r>
+              <w:rPr>
+                <w:b/>
+                <w:bCs/>
+              </w:rPr>
+              <w:t xml:space="preserve">no consumer can use a shared resource without an approved request</w:t>
+            </w:r>
+            <w:r>
+              <w:t xml:space="preserve">, even when the tags would match. The consumer’s boundary allows cross-project access only to resources whose</w:t>
             </w:r>
             <w:r>
               <w:t xml:space="preserve"> </w:t>
@@ -14389,13 +14589,13 @@
           <w:b/>
           <w:bCs/>
         </w:rPr>
-        <w:t xml:space="preserve">Extra approval</w:t>
-      </w:r>
-      <w:r>
-        <w:t xml:space="preserve"> </w:t>
-      </w:r>
-      <w:r>
-        <w:t xml:space="preserve">from a security reviewer when widening scope beyond</w:t>
+        <w:t xml:space="preserve">Every change to share tags is a share-offer request</w:t>
+      </w:r>
+      <w:r>
+        <w:t xml:space="preserve"> </w:t>
+      </w:r>
+      <w:r>
+        <w:t xml:space="preserve">in the approval workflow (§4.11.6). It needs a security reviewer when widening scope beyond</w:t>
       </w:r>
       <w:r>
         <w:t xml:space="preserve"> </w:t>
@@ -16401,18 +16601,1113 @@
     </w:p>
     <w:p>
       <w:pPr>
-        <w:pStyle w:val="Heading1"/>
+        <w:pStyle w:val="Heading3"/>
       </w:pPr>
       <w:r>
-        <w:t xml:space="preserve">5. Multi-account environment strategy</w:t>
+        <w:t xml:space="preserve">4.11.6 Sharing approval workflow</w:t>
       </w:r>
     </w:p>
     <w:p>
       <w:pPr>
-        <w:pStyle w:val="Heading2"/>
+        <w:pStyle w:val="FirstParagraph"/>
       </w:pPr>
       <w:r>
-        <w:t xml:space="preserve">5.1 Organization structure</w:t>
+        <w:rPr>
+          <w:b/>
+          <w:bCs/>
+        </w:rPr>
+        <w:t xml:space="preserve">All sharing is granted through one approval workflow in the platform UI.</w:t>
+      </w:r>
+      <w:r>
+        <w:t xml:space="preserve"> </w:t>
+      </w:r>
+      <w:r>
+        <w:t xml:space="preserve">Tags (and agreements) define what</w:t>
+      </w:r>
+      <w:r>
+        <w:t xml:space="preserve"> </w:t>
+      </w:r>
+      <w:r>
+        <w:rPr>
+          <w:i/>
+          <w:iCs/>
+        </w:rPr>
+        <w:t xml:space="preserve">can</w:t>
+      </w:r>
+      <w:r>
+        <w:t xml:space="preserve"> </w:t>
+      </w:r>
+      <w:r>
+        <w:t xml:space="preserve">be shared. The workflow decides what</w:t>
+      </w:r>
+      <w:r>
+        <w:t xml:space="preserve"> </w:t>
+      </w:r>
+      <w:r>
+        <w:rPr>
+          <w:i/>
+          <w:iCs/>
+        </w:rPr>
+        <w:t xml:space="preserve">is</w:t>
+      </w:r>
+      <w:r>
+        <w:t xml:space="preserve"> </w:t>
+      </w:r>
+      <w:r>
+        <w:t xml:space="preserve">shared, by whom, and records why.</w:t>
+      </w:r>
+    </w:p>
+    <w:p>
+      <w:pPr>
+        <w:pStyle w:val="BodyText"/>
+      </w:pPr>
+      <w:r>
+        <w:rPr>
+          <w:b/>
+          <w:bCs/>
+        </w:rPr>
+        <w:t xml:space="preserve">Request types:</w:t>
+      </w:r>
+    </w:p>
+    <w:tbl>
+      <w:tblPr>
+        <w:tblStyle w:val="Table"/>
+        <w:tblW w:type="dxa" w:w="10080"/>
+        <w:tblLayout w:type="fixed"/>
+        <w:tblLook w:firstRow="1" w:lastRow="0" w:firstColumn="0" w:lastColumn="0" w:noHBand="0" w:noVBand="0" w:val="0020"/>
+      </w:tblPr>
+      <w:tblGrid>
+        <w:gridCol w:w="1184"/>
+        <w:gridCol w:w="3002"/>
+        <w:gridCol w:w="5894"/>
+      </w:tblGrid>
+      <w:tr>
+        <w:trPr>
+          <w:tblHeader w:val="on"/>
+        </w:trPr>
+        <w:tc>
+          <w:tcPr>
+            <w:tcW w:type="dxa" w:w="1184"/>
+          </w:tcPr>
+          <w:p>
+            <w:pPr>
+              <w:pStyle w:val="Compact"/>
+            </w:pPr>
+            <w:r>
+              <w:t xml:space="preserve">Request</w:t>
+            </w:r>
+          </w:p>
+        </w:tc>
+        <w:tc>
+          <w:tcPr>
+            <w:tcW w:type="dxa" w:w="3002"/>
+          </w:tcPr>
+          <w:p>
+            <w:pPr>
+              <w:pStyle w:val="Compact"/>
+            </w:pPr>
+            <w:r>
+              <w:t xml:space="preserve">Raised by</w:t>
+            </w:r>
+          </w:p>
+        </w:tc>
+        <w:tc>
+          <w:tcPr>
+            <w:tcW w:type="dxa" w:w="5894"/>
+          </w:tcPr>
+          <w:p>
+            <w:pPr>
+              <w:pStyle w:val="Compact"/>
+            </w:pPr>
+            <w:r>
+              <w:t xml:space="preserve">Effect when approved</w:t>
+            </w:r>
+          </w:p>
+        </w:tc>
+      </w:tr>
+      <w:tr>
+        <w:tc>
+          <w:tcPr>
+            <w:tcW w:type="dxa" w:w="1184"/>
+          </w:tcPr>
+          <w:p>
+            <w:pPr>
+              <w:pStyle w:val="Compact"/>
+            </w:pPr>
+            <w:r>
+              <w:rPr>
+                <w:b/>
+                <w:bCs/>
+              </w:rPr>
+              <w:t xml:space="preserve">Share offer</w:t>
+            </w:r>
+          </w:p>
+        </w:tc>
+        <w:tc>
+          <w:tcPr>
+            <w:tcW w:type="dxa" w:w="3002"/>
+          </w:tcPr>
+          <w:p>
+            <w:pPr>
+              <w:pStyle w:val="Compact"/>
+            </w:pPr>
+            <w:r>
+              <w:t xml:space="preserve">Provider owner</w:t>
+            </w:r>
+          </w:p>
+        </w:tc>
+        <w:tc>
+          <w:tcPr>
+            <w:tcW w:type="dxa" w:w="5894"/>
+          </w:tcPr>
+          <w:p>
+            <w:pPr>
+              <w:pStyle w:val="Compact"/>
+            </w:pPr>
+            <w:r>
+              <w:t xml:space="preserve">Sets or changes</w:t>
+            </w:r>
+            <w:r>
+              <w:t xml:space="preserve"> </w:t>
+            </w:r>
+            <w:r>
+              <w:rPr>
+                <w:rStyle w:val="VerbatimChar"/>
+              </w:rPr>
+              <w:t xml:space="preserve">org:share-scope</w:t>
+            </w:r>
+            <w:r>
+              <w:t xml:space="preserve"> </w:t>
+            </w:r>
+            <w:r>
+              <w:t xml:space="preserve">/</w:t>
+            </w:r>
+            <w:r>
+              <w:t xml:space="preserve"> </w:t>
+            </w:r>
+            <w:r>
+              <w:rPr>
+                <w:rStyle w:val="VerbatimChar"/>
+              </w:rPr>
+              <w:t xml:space="preserve">org:share-access</w:t>
+            </w:r>
+            <w:r>
+              <w:t xml:space="preserve"> </w:t>
+            </w:r>
+            <w:r>
+              <w:t xml:space="preserve">/</w:t>
+            </w:r>
+            <w:r>
+              <w:t xml:space="preserve"> </w:t>
+            </w:r>
+            <w:r>
+              <w:rPr>
+                <w:rStyle w:val="VerbatimChar"/>
+              </w:rPr>
+              <w:t xml:space="preserve">org:share-approval</w:t>
+            </w:r>
+            <w:r>
+              <w:t xml:space="preserve"> </w:t>
+            </w:r>
+            <w:r>
+              <w:t xml:space="preserve">on a resource. Opens the provider infra PR</w:t>
+            </w:r>
+          </w:p>
+        </w:tc>
+      </w:tr>
+      <w:tr>
+        <w:tc>
+          <w:tcPr>
+            <w:tcW w:type="dxa" w:w="1184"/>
+          </w:tcPr>
+          <w:p>
+            <w:pPr>
+              <w:pStyle w:val="Compact"/>
+            </w:pPr>
+            <w:r>
+              <w:rPr>
+                <w:b/>
+                <w:bCs/>
+              </w:rPr>
+              <w:t xml:space="preserve">Access request</w:t>
+            </w:r>
+          </w:p>
+        </w:tc>
+        <w:tc>
+          <w:tcPr>
+            <w:tcW w:type="dxa" w:w="3002"/>
+          </w:tcPr>
+          <w:p>
+            <w:pPr>
+              <w:pStyle w:val="Compact"/>
+            </w:pPr>
+            <w:r>
+              <w:t xml:space="preserve">Consumer owner (by drawing a connection to a shared resource)</w:t>
+            </w:r>
+          </w:p>
+        </w:tc>
+        <w:tc>
+          <w:tcPr>
+            <w:tcW w:type="dxa" w:w="5894"/>
+          </w:tcPr>
+          <w:p>
+            <w:pPr>
+              <w:pStyle w:val="Compact"/>
+            </w:pPr>
+            <w:r>
+              <w:t xml:space="preserve">Grants one consumer component access within the tag rule. Opens the consumer infra PR (and the provider PR where a per-consumer grant is needed, e.g. a KMS grant)</w:t>
+            </w:r>
+          </w:p>
+        </w:tc>
+      </w:tr>
+      <w:tr>
+        <w:tc>
+          <w:tcPr>
+            <w:tcW w:type="dxa" w:w="1184"/>
+          </w:tcPr>
+          <w:p>
+            <w:pPr>
+              <w:pStyle w:val="Compact"/>
+            </w:pPr>
+            <w:r>
+              <w:rPr>
+                <w:b/>
+                <w:bCs/>
+              </w:rPr>
+              <w:t xml:space="preserve">Agreement request</w:t>
+            </w:r>
+          </w:p>
+        </w:tc>
+        <w:tc>
+          <w:tcPr>
+            <w:tcW w:type="dxa" w:w="3002"/>
+          </w:tcPr>
+          <w:p>
+            <w:pPr>
+              <w:pStyle w:val="Compact"/>
+            </w:pPr>
+            <w:r>
+              <w:t xml:space="preserve">Consumer owner</w:t>
+            </w:r>
+          </w:p>
+        </w:tc>
+        <w:tc>
+          <w:tcPr>
+            <w:tcW w:type="dxa" w:w="5894"/>
+          </w:tcPr>
+          <w:p>
+            <w:pPr>
+              <w:pStyle w:val="Compact"/>
+            </w:pPr>
+            <w:r>
+              <w:t xml:space="preserve">Creates a sharing agreement (§4.11.2). Opens both PRs</w:t>
+            </w:r>
+          </w:p>
+        </w:tc>
+      </w:tr>
+      <w:tr>
+        <w:tc>
+          <w:tcPr>
+            <w:tcW w:type="dxa" w:w="1184"/>
+          </w:tcPr>
+          <w:p>
+            <w:pPr>
+              <w:pStyle w:val="Compact"/>
+            </w:pPr>
+            <w:r>
+              <w:rPr>
+                <w:b/>
+                <w:bCs/>
+              </w:rPr>
+              <w:t xml:space="preserve">Renewal</w:t>
+            </w:r>
+          </w:p>
+        </w:tc>
+        <w:tc>
+          <w:tcPr>
+            <w:tcW w:type="dxa" w:w="3002"/>
+          </w:tcPr>
+          <w:p>
+            <w:pPr>
+              <w:pStyle w:val="Compact"/>
+            </w:pPr>
+            <w:r>
+              <w:t xml:space="preserve">Platform (before expiry / at recertification)</w:t>
+            </w:r>
+          </w:p>
+        </w:tc>
+        <w:tc>
+          <w:tcPr>
+            <w:tcW w:type="dxa" w:w="5894"/>
+          </w:tcPr>
+          <w:p>
+            <w:pPr>
+              <w:pStyle w:val="Compact"/>
+            </w:pPr>
+            <w:r>
+              <w:t xml:space="preserve">Extends the access or agreement; if not approved in time, access is removed</w:t>
+            </w:r>
+          </w:p>
+        </w:tc>
+      </w:tr>
+      <w:tr>
+        <w:tc>
+          <w:tcPr>
+            <w:tcW w:type="dxa" w:w="1184"/>
+          </w:tcPr>
+          <w:p>
+            <w:pPr>
+              <w:pStyle w:val="Compact"/>
+            </w:pPr>
+            <w:r>
+              <w:rPr>
+                <w:b/>
+                <w:bCs/>
+              </w:rPr>
+              <w:t xml:space="preserve">Revocation</w:t>
+            </w:r>
+          </w:p>
+        </w:tc>
+        <w:tc>
+          <w:tcPr>
+            <w:tcW w:type="dxa" w:w="3002"/>
+          </w:tcPr>
+          <w:p>
+            <w:pPr>
+              <w:pStyle w:val="Compact"/>
+            </w:pPr>
+            <w:r>
+              <w:t xml:space="preserve">Provider, consumer, security</w:t>
+            </w:r>
+          </w:p>
+        </w:tc>
+        <w:tc>
+          <w:tcPr>
+            <w:tcW w:type="dxa" w:w="5894"/>
+          </w:tcPr>
+          <w:p>
+            <w:pPr>
+              <w:pStyle w:val="Compact"/>
+            </w:pPr>
+            <w:r>
+              <w:t xml:space="preserve">Removes access on both sides. Emergency revocation needs only security and takes effect at once</w:t>
+            </w:r>
+          </w:p>
+        </w:tc>
+      </w:tr>
+    </w:tbl>
+    <w:p>
+      <w:pPr>
+        <w:pStyle w:val="BodyText"/>
+      </w:pPr>
+      <w:r>
+        <w:rPr>
+          <w:b/>
+          <w:bCs/>
+        </w:rPr>
+        <w:t xml:space="preserve">Approval routing</w:t>
+      </w:r>
+      <w:r>
+        <w:t xml:space="preserve"> </w:t>
+      </w:r>
+      <w:r>
+        <w:t xml:space="preserve">(defaults; configurable by platform admins, D38):</w:t>
+      </w:r>
+    </w:p>
+    <w:tbl>
+      <w:tblPr>
+        <w:tblStyle w:val="Table"/>
+        <w:tblW w:type="dxa" w:w="10080"/>
+        <w:tblLayout w:type="fixed"/>
+        <w:tblLook w:firstRow="1" w:lastRow="0" w:firstColumn="0" w:lastColumn="0" w:noHBand="0" w:noVBand="0" w:val="0020"/>
+      </w:tblPr>
+      <w:tblGrid>
+        <w:gridCol w:w="5769"/>
+        <w:gridCol w:w="4311"/>
+      </w:tblGrid>
+      <w:tr>
+        <w:trPr>
+          <w:tblHeader w:val="on"/>
+        </w:trPr>
+        <w:tc>
+          <w:tcPr>
+            <w:tcW w:type="dxa" w:w="5769"/>
+          </w:tcPr>
+          <w:p>
+            <w:pPr>
+              <w:pStyle w:val="Compact"/>
+            </w:pPr>
+            <w:r>
+              <w:t xml:space="preserve">Situation</w:t>
+            </w:r>
+          </w:p>
+        </w:tc>
+        <w:tc>
+          <w:tcPr>
+            <w:tcW w:type="dxa" w:w="4311"/>
+          </w:tcPr>
+          <w:p>
+            <w:pPr>
+              <w:pStyle w:val="Compact"/>
+            </w:pPr>
+            <w:r>
+              <w:t xml:space="preserve">Approvers</w:t>
+            </w:r>
+          </w:p>
+        </w:tc>
+      </w:tr>
+      <w:tr>
+        <w:tc>
+          <w:tcPr>
+            <w:tcW w:type="dxa" w:w="5769"/>
+          </w:tcPr>
+          <w:p>
+            <w:pPr>
+              <w:pStyle w:val="Compact"/>
+            </w:pPr>
+            <w:r>
+              <w:t xml:space="preserve">Share offer, scope</w:t>
+            </w:r>
+            <w:r>
+              <w:t xml:space="preserve"> </w:t>
+            </w:r>
+            <w:r>
+              <w:rPr>
+                <w:rStyle w:val="VerbatimChar"/>
+              </w:rPr>
+              <w:t xml:space="preserve">product</w:t>
+            </w:r>
+            <w:r>
+              <w:t xml:space="preserve">, access</w:t>
+            </w:r>
+            <w:r>
+              <w:t xml:space="preserve"> </w:t>
+            </w:r>
+            <w:r>
+              <w:rPr>
+                <w:rStyle w:val="VerbatimChar"/>
+              </w:rPr>
+              <w:t xml:space="preserve">read</w:t>
+            </w:r>
+            <w:r>
+              <w:t xml:space="preserve">, data ≤</w:t>
+            </w:r>
+            <w:r>
+              <w:t xml:space="preserve"> </w:t>
+            </w:r>
+            <w:r>
+              <w:rPr>
+                <w:rStyle w:val="VerbatimChar"/>
+              </w:rPr>
+              <w:t xml:space="preserve">internal</w:t>
+            </w:r>
+          </w:p>
+        </w:tc>
+        <w:tc>
+          <w:tcPr>
+            <w:tcW w:type="dxa" w:w="4311"/>
+          </w:tcPr>
+          <w:p>
+            <w:pPr>
+              <w:pStyle w:val="Compact"/>
+            </w:pPr>
+            <w:r>
+              <w:t xml:space="preserve">Provider product owner</w:t>
+            </w:r>
+          </w:p>
+        </w:tc>
+      </w:tr>
+      <w:tr>
+        <w:tc>
+          <w:tcPr>
+            <w:tcW w:type="dxa" w:w="5769"/>
+          </w:tcPr>
+          <w:p>
+            <w:pPr>
+              <w:pStyle w:val="Compact"/>
+            </w:pPr>
+            <w:r>
+              <w:t xml:space="preserve">Share offer, scope</w:t>
+            </w:r>
+            <w:r>
+              <w:t xml:space="preserve"> </w:t>
+            </w:r>
+            <w:r>
+              <w:rPr>
+                <w:rStyle w:val="VerbatimChar"/>
+              </w:rPr>
+              <w:t xml:space="preserve">portfolio</w:t>
+            </w:r>
+            <w:r>
+              <w:t xml:space="preserve">/</w:t>
+            </w:r>
+            <w:r>
+              <w:rPr>
+                <w:rStyle w:val="VerbatimChar"/>
+              </w:rPr>
+              <w:t xml:space="preserve">organization</w:t>
+            </w:r>
+            <w:r>
+              <w:t xml:space="preserve">,</w:t>
+            </w:r>
+            <w:r>
+              <w:t xml:space="preserve"> </w:t>
+            </w:r>
+            <w:r>
+              <w:rPr>
+                <w:b/>
+                <w:bCs/>
+              </w:rPr>
+              <w:t xml:space="preserve">or</w:t>
+            </w:r>
+            <w:r>
+              <w:t xml:space="preserve"> </w:t>
+            </w:r>
+            <w:r>
+              <w:t xml:space="preserve">any access beyond</w:t>
+            </w:r>
+            <w:r>
+              <w:t xml:space="preserve"> </w:t>
+            </w:r>
+            <w:r>
+              <w:rPr>
+                <w:rStyle w:val="VerbatimChar"/>
+              </w:rPr>
+              <w:t xml:space="preserve">read</w:t>
+            </w:r>
+            <w:r>
+              <w:t xml:space="preserve">,</w:t>
+            </w:r>
+            <w:r>
+              <w:t xml:space="preserve"> </w:t>
+            </w:r>
+            <w:r>
+              <w:rPr>
+                <w:b/>
+                <w:bCs/>
+              </w:rPr>
+              <w:t xml:space="preserve">or</w:t>
+            </w:r>
+            <w:r>
+              <w:t xml:space="preserve"> </w:t>
+            </w:r>
+            <w:r>
+              <w:t xml:space="preserve">data</w:t>
+            </w:r>
+            <w:r>
+              <w:t xml:space="preserve"> </w:t>
+            </w:r>
+            <w:r>
+              <w:rPr>
+                <w:rStyle w:val="VerbatimChar"/>
+              </w:rPr>
+              <w:t xml:space="preserve">confidential</w:t>
+            </w:r>
+          </w:p>
+        </w:tc>
+        <w:tc>
+          <w:tcPr>
+            <w:tcW w:type="dxa" w:w="4311"/>
+          </w:tcPr>
+          <w:p>
+            <w:pPr>
+              <w:pStyle w:val="Compact"/>
+            </w:pPr>
+            <w:r>
+              <w:t xml:space="preserve">Provider product owner</w:t>
+            </w:r>
+            <w:r>
+              <w:t xml:space="preserve"> </w:t>
+            </w:r>
+            <w:r>
+              <w:rPr>
+                <w:b/>
+                <w:bCs/>
+              </w:rPr>
+              <w:t xml:space="preserve">+ security reviewer</w:t>
+            </w:r>
+          </w:p>
+        </w:tc>
+      </w:tr>
+      <w:tr>
+        <w:tc>
+          <w:tcPr>
+            <w:tcW w:type="dxa" w:w="5769"/>
+          </w:tcPr>
+          <w:p>
+            <w:pPr>
+              <w:pStyle w:val="Compact"/>
+            </w:pPr>
+            <w:r>
+              <w:t xml:space="preserve">Access request within an approved offer, resource tagged</w:t>
+            </w:r>
+            <w:r>
+              <w:t xml:space="preserve"> </w:t>
+            </w:r>
+            <w:r>
+              <w:rPr>
+                <w:rStyle w:val="VerbatimChar"/>
+              </w:rPr>
+              <w:t xml:space="preserve">org:share-approval=auto</w:t>
+            </w:r>
+          </w:p>
+        </w:tc>
+        <w:tc>
+          <w:tcPr>
+            <w:tcW w:type="dxa" w:w="4311"/>
+          </w:tcPr>
+          <w:p>
+            <w:pPr>
+              <w:pStyle w:val="Compact"/>
+            </w:pPr>
+            <w:r>
+              <w:rPr>
+                <w:b/>
+                <w:bCs/>
+              </w:rPr>
+              <w:t xml:space="preserve">Auto-approved</w:t>
+            </w:r>
+            <w:r>
+              <w:t xml:space="preserve"> </w:t>
+            </w:r>
+            <w:r>
+              <w:t xml:space="preserve">(provider notified; request still recorded)</w:t>
+            </w:r>
+          </w:p>
+        </w:tc>
+      </w:tr>
+      <w:tr>
+        <w:tc>
+          <w:tcPr>
+            <w:tcW w:type="dxa" w:w="5769"/>
+          </w:tcPr>
+          <w:p>
+            <w:pPr>
+              <w:pStyle w:val="Compact"/>
+            </w:pPr>
+            <w:r>
+              <w:t xml:space="preserve">Access request within an approved offer,</w:t>
+            </w:r>
+            <w:r>
+              <w:t xml:space="preserve"> </w:t>
+            </w:r>
+            <w:r>
+              <w:rPr>
+                <w:rStyle w:val="VerbatimChar"/>
+              </w:rPr>
+              <w:t xml:space="preserve">org:share-approval=required</w:t>
+            </w:r>
+            <w:r>
+              <w:t xml:space="preserve"> </w:t>
+            </w:r>
+            <w:r>
+              <w:t xml:space="preserve">(default)</w:t>
+            </w:r>
+          </w:p>
+        </w:tc>
+        <w:tc>
+          <w:tcPr>
+            <w:tcW w:type="dxa" w:w="4311"/>
+          </w:tcPr>
+          <w:p>
+            <w:pPr>
+              <w:pStyle w:val="Compact"/>
+            </w:pPr>
+            <w:r>
+              <w:t xml:space="preserve">Provider product owner</w:t>
+            </w:r>
+          </w:p>
+        </w:tc>
+      </w:tr>
+      <w:tr>
+        <w:tc>
+          <w:tcPr>
+            <w:tcW w:type="dxa" w:w="5769"/>
+          </w:tcPr>
+          <w:p>
+            <w:pPr>
+              <w:pStyle w:val="Compact"/>
+            </w:pPr>
+            <w:r>
+              <w:t xml:space="preserve">Access request or agreement for</w:t>
+            </w:r>
+            <w:r>
+              <w:t xml:space="preserve"> </w:t>
+            </w:r>
+            <w:r>
+              <w:rPr>
+                <w:b/>
+                <w:bCs/>
+              </w:rPr>
+              <w:t xml:space="preserve">PROD</w:t>
+            </w:r>
+            <w:r>
+              <w:t xml:space="preserve"> </w:t>
+            </w:r>
+            <w:r>
+              <w:t xml:space="preserve">with</w:t>
+            </w:r>
+            <w:r>
+              <w:t xml:space="preserve"> </w:t>
+            </w:r>
+            <w:r>
+              <w:rPr>
+                <w:rStyle w:val="VerbatimChar"/>
+              </w:rPr>
+              <w:t xml:space="preserve">confidential</w:t>
+            </w:r>
+            <w:r>
+              <w:t xml:space="preserve"> </w:t>
+            </w:r>
+            <w:r>
+              <w:t xml:space="preserve">data</w:t>
+            </w:r>
+          </w:p>
+        </w:tc>
+        <w:tc>
+          <w:tcPr>
+            <w:tcW w:type="dxa" w:w="4311"/>
+          </w:tcPr>
+          <w:p>
+            <w:pPr>
+              <w:pStyle w:val="Compact"/>
+            </w:pPr>
+            <w:r>
+              <w:t xml:space="preserve">Provider product owner</w:t>
+            </w:r>
+            <w:r>
+              <w:t xml:space="preserve"> </w:t>
+            </w:r>
+            <w:r>
+              <w:rPr>
+                <w:b/>
+                <w:bCs/>
+              </w:rPr>
+              <w:t xml:space="preserve">+ security reviewer</w:t>
+            </w:r>
+          </w:p>
+        </w:tc>
+      </w:tr>
+      <w:tr>
+        <w:tc>
+          <w:tcPr>
+            <w:tcW w:type="dxa" w:w="5769"/>
+          </w:tcPr>
+          <w:p>
+            <w:pPr>
+              <w:pStyle w:val="Compact"/>
+            </w:pPr>
+            <w:r>
+              <w:t xml:space="preserve">Agreement</w:t>
+            </w:r>
+            <w:r>
+              <w:t xml:space="preserve"> </w:t>
+            </w:r>
+            <w:r>
+              <w:rPr>
+                <w:b/>
+                <w:bCs/>
+              </w:rPr>
+              <w:t xml:space="preserve">outside the AWS Organization</w:t>
+            </w:r>
+            <w:r>
+              <w:t xml:space="preserve">, or a cross-environment exception</w:t>
+            </w:r>
+          </w:p>
+        </w:tc>
+        <w:tc>
+          <w:tcPr>
+            <w:tcW w:type="dxa" w:w="4311"/>
+          </w:tcPr>
+          <w:p>
+            <w:pPr>
+              <w:pStyle w:val="Compact"/>
+            </w:pPr>
+            <w:r>
+              <w:t xml:space="preserve">Provider product owner + security reviewer</w:t>
+            </w:r>
+            <w:r>
+              <w:t xml:space="preserve"> </w:t>
+            </w:r>
+            <w:r>
+              <w:rPr>
+                <w:b/>
+                <w:bCs/>
+              </w:rPr>
+              <w:t xml:space="preserve">+ platform admin</w:t>
+            </w:r>
+          </w:p>
+        </w:tc>
+      </w:tr>
+      <w:tr>
+        <w:tc>
+          <w:tcPr>
+            <w:tcW w:type="dxa" w:w="5769"/>
+          </w:tcPr>
+          <w:p>
+            <w:pPr>
+              <w:pStyle w:val="Compact"/>
+            </w:pPr>
+            <w:r>
+              <w:t xml:space="preserve">Renewal</w:t>
+            </w:r>
+          </w:p>
+        </w:tc>
+        <w:tc>
+          <w:tcPr>
+            <w:tcW w:type="dxa" w:w="4311"/>
+          </w:tcPr>
+          <w:p>
+            <w:pPr>
+              <w:pStyle w:val="Compact"/>
+            </w:pPr>
+            <w:r>
+              <w:t xml:space="preserve">Same approvers as the original request</w:t>
+            </w:r>
+          </w:p>
+        </w:tc>
+      </w:tr>
+      <w:tr>
+        <w:tc>
+          <w:tcPr>
+            <w:tcW w:type="dxa" w:w="5769"/>
+          </w:tcPr>
+          <w:p>
+            <w:pPr>
+              <w:pStyle w:val="Compact"/>
+            </w:pPr>
+            <w:r>
+              <w:t xml:space="preserve">Emergency revocation</w:t>
+            </w:r>
+          </w:p>
+        </w:tc>
+        <w:tc>
+          <w:tcPr>
+            <w:tcW w:type="dxa" w:w="4311"/>
+          </w:tcPr>
+          <w:p>
+            <w:pPr>
+              <w:pStyle w:val="Compact"/>
+            </w:pPr>
+            <w:r>
+              <w:t xml:space="preserve">Security reviewer (single approver)</w:t>
+            </w:r>
+          </w:p>
+        </w:tc>
+      </w:tr>
+    </w:tbl>
+    <w:p>
+      <w:pPr>
+        <w:pStyle w:val="BodyText"/>
+      </w:pPr>
+      <w:r>
+        <w:rPr>
+          <w:b/>
+          <w:bCs/>
+        </w:rPr>
+        <w:t xml:space="preserve">Workflow rules:</w:t>
+      </w:r>
+      <w:r>
+        <w:t xml:space="preserve"> </w:t>
+      </w:r>
+      <w:r>
+        <w:t xml:space="preserve">-</w:t>
+      </w:r>
+      <w:r>
+        <w:t xml:space="preserve"> </w:t>
+      </w:r>
+      <w:r>
+        <w:rPr>
+          <w:b/>
+          <w:bCs/>
+        </w:rPr>
+        <w:t xml:space="preserve">Separation of duties:</w:t>
+      </w:r>
+      <w:r>
+        <w:t xml:space="preserve"> </w:t>
+      </w:r>
+      <w:r>
+        <w:t xml:space="preserve">the requester cannot approve their own request; two-approver steps need two different people. Approvers come from the registry groups of the provider product (owners) and from the security group.</w:t>
+      </w:r>
+      <w:r>
+        <w:t xml:space="preserve"> </w:t>
+      </w:r>
+      <w:r>
+        <w:t xml:space="preserve">-</w:t>
+      </w:r>
+      <w:r>
+        <w:t xml:space="preserve"> </w:t>
+      </w:r>
+      <w:r>
+        <w:rPr>
+          <w:b/>
+          <w:bCs/>
+        </w:rPr>
+        <w:t xml:space="preserve">Evidence on one page:</w:t>
+      </w:r>
+      <w:r>
+        <w:t xml:space="preserve"> </w:t>
+      </w:r>
+      <w:r>
+        <w:t xml:space="preserve">- what is shared and with whom (project, product, account, environment);</w:t>
+      </w:r>
+      <w:r>
+        <w:t xml:space="preserve"> </w:t>
+      </w:r>
+      <w:r>
+        <w:t xml:space="preserve">- access level → exact actions;</w:t>
+      </w:r>
+      <w:r>
+        <w:t xml:space="preserve"> </w:t>
+      </w:r>
+      <w:r>
+        <w:t xml:space="preserve">- data classification;</w:t>
+      </w:r>
+      <w:r>
+        <w:t xml:space="preserve"> </w:t>
+      </w:r>
+      <w:r>
+        <w:t xml:space="preserve">- the</w:t>
+      </w:r>
+      <w:r>
+        <w:t xml:space="preserve"> </w:t>
+      </w:r>
+      <w:r>
+        <w:rPr>
+          <w:b/>
+          <w:bCs/>
+        </w:rPr>
+        <w:t xml:space="preserve">generated policy diff</w:t>
+      </w:r>
+      <w:r>
+        <w:t xml:space="preserve"> </w:t>
+      </w:r>
+      <w:r>
+        <w:t xml:space="preserve">for both sides;</w:t>
+      </w:r>
+      <w:r>
+        <w:t xml:space="preserve"> </w:t>
+      </w:r>
+      <w:r>
+        <w:t xml:space="preserve">- the Access Analyzer preview of the resulting access.</w:t>
+      </w:r>
+      <w:r>
+        <w:t xml:space="preserve"> </w:t>
+      </w:r>
+      <w:r>
+        <w:t xml:space="preserve">-</w:t>
+      </w:r>
+      <w:r>
+        <w:t xml:space="preserve"> </w:t>
+      </w:r>
+      <w:r>
+        <w:rPr>
+          <w:b/>
+          <w:bCs/>
+        </w:rPr>
+        <w:t xml:space="preserve">Timeouts and escalation:</w:t>
+      </w:r>
+      <w:r>
+        <w:t xml:space="preserve"> </w:t>
+      </w:r>
+      <w:r>
+        <w:t xml:space="preserve">reminders after 2 business days; escalation to the product’s secondary owner after 5; pending requests expire after 30 days.</w:t>
+      </w:r>
+      <w:r>
+        <w:t xml:space="preserve"> </w:t>
+      </w:r>
+      <w:r>
+        <w:t xml:space="preserve">-</w:t>
+      </w:r>
+      <w:r>
+        <w:t xml:space="preserve"> </w:t>
+      </w:r>
+      <w:r>
+        <w:rPr>
+          <w:b/>
+          <w:bCs/>
+        </w:rPr>
+        <w:t xml:space="preserve">Approval leads to deployment, never manual edits:</w:t>
+      </w:r>
+      <w:r>
+        <w:t xml:space="preserve"> </w:t>
+      </w:r>
+      <w:r>
+        <w:t xml:space="preserve">an approved request opens the infra PRs, which go through the normal gates. For STAGE/PROD they also need the usual release approval (§8.3). The release reviewer sees the sharing approval as evidence, so the decision is not asked twice: release approval checks the change, sharing approval checks the access.</w:t>
+      </w:r>
+      <w:r>
+        <w:t xml:space="preserve"> </w:t>
+      </w:r>
+      <w:r>
+        <w:t xml:space="preserve">-</w:t>
+      </w:r>
+      <w:r>
+        <w:t xml:space="preserve"> </w:t>
+      </w:r>
+      <w:r>
+        <w:rPr>
+          <w:b/>
+          <w:bCs/>
+        </w:rPr>
+        <w:t xml:space="preserve">Recertification:</w:t>
+      </w:r>
+      <w:r>
+        <w:t xml:space="preserve"> </w:t>
+      </w:r>
+      <w:r>
+        <w:t xml:space="preserve">every active access and agreement is re-approved periodically (default quarterly, by the provider owner). Anything not recertified is removed automatically.</w:t>
+      </w:r>
+      <w:r>
+        <w:t xml:space="preserve"> </w:t>
+      </w:r>
+      <w:r>
+        <w:t xml:space="preserve">-</w:t>
+      </w:r>
+      <w:r>
+        <w:t xml:space="preserve"> </w:t>
+      </w:r>
+      <w:r>
+        <w:rPr>
+          <w:b/>
+          <w:bCs/>
+        </w:rPr>
+        <w:t xml:space="preserve">Audit:</w:t>
+      </w:r>
+      <w:r>
+        <w:t xml:space="preserve"> </w:t>
+      </w:r>
+      <w:r>
+        <w:t xml:space="preserve">every request, decision, comment, generated policy and deployment is in the release records. Exportable per resource (</w:t>
+      </w:r>
+      <w:r>
+        <w:t xml:space="preserve">“who can access this and who approved it”</w:t>
+      </w:r>
+      <w:r>
+        <w:t xml:space="preserve">) and per consumer (</w:t>
+      </w:r>
+      <w:r>
+        <w:t xml:space="preserve">“what does this project use and who approved it”</w:t>
+      </w:r>
+      <w:r>
+        <w:t xml:space="preserve">).</w:t>
+      </w:r>
+    </w:p>
+    <w:p>
+      <w:pPr>
+        <w:pStyle w:val="BodyText"/>
+      </w:pPr>
+      <w:r>
+        <w:rPr>
+          <w:b/>
+          <w:bCs/>
+        </w:rPr>
+        <w:t xml:space="preserve">Engine:</w:t>
+      </w:r>
+      <w:r>
+        <w:t xml:space="preserve"> </w:t>
+      </w:r>
+      <w:r>
+        <w:t xml:space="preserve">AWS Step Functions (human approval steps with task tokens), state in DynamoDB, notifications through the in-app inbox and Amazon SES. These are the same AWS services as the rest of the control plane (§1).</w:t>
       </w:r>
     </w:p>
     <w:p>
@@ -16422,9 +17717,9 @@
       <w:r>
         <w:drawing>
           <wp:inline>
-            <wp:extent cx="6309360" cy="2330578"/>
+            <wp:extent cx="5888736" cy="7866983"/>
             <wp:effectExtent b="0" l="0" r="0" t="0"/>
-            <wp:docPr descr="Figure 8. 5.1 Organization structure" title="" id="31" name="Picture"/>
+            <wp:docPr descr="Figure 8. 4.11.6 Sharing approval workflow" title="" id="31" name="Picture"/>
             <a:graphic>
               <a:graphicData uri="http://schemas.openxmlformats.org/drawingml/2006/picture">
                 <pic:pic>
@@ -16436,6 +17731,77 @@
                   </pic:nvPicPr>
                   <pic:blipFill>
                     <a:blip r:embed="rId30"/>
+                    <a:stretch>
+                      <a:fillRect/>
+                    </a:stretch>
+                  </pic:blipFill>
+                  <pic:spPr bwMode="auto">
+                    <a:xfrm>
+                      <a:off x="0" y="0"/>
+                      <a:ext cx="5888736" cy="7866983"/>
+                    </a:xfrm>
+                    <a:prstGeom prst="rect">
+                      <a:avLst/>
+                    </a:prstGeom>
+                    <a:noFill/>
+                    <a:ln w="9525">
+                      <a:noFill/>
+                      <a:headEnd/>
+                      <a:tailEnd/>
+                    </a:ln>
+                  </pic:spPr>
+                </pic:pic>
+              </a:graphicData>
+            </a:graphic>
+          </wp:inline>
+        </w:drawing>
+      </w:r>
+    </w:p>
+    <w:p>
+      <w:pPr>
+        <w:pStyle w:val="ImageCaption"/>
+      </w:pPr>
+      <w:r>
+        <w:t xml:space="preserve">Figure 8. 4.11.6 Sharing approval workflow</w:t>
+      </w:r>
+    </w:p>
+    <w:p>
+      <w:pPr>
+        <w:pStyle w:val="Heading1"/>
+      </w:pPr>
+      <w:r>
+        <w:t xml:space="preserve">5. Multi-account environment strategy</w:t>
+      </w:r>
+    </w:p>
+    <w:p>
+      <w:pPr>
+        <w:pStyle w:val="Heading2"/>
+      </w:pPr>
+      <w:r>
+        <w:t xml:space="preserve">5.1 Organization structure</w:t>
+      </w:r>
+    </w:p>
+    <w:p>
+      <w:pPr>
+        <w:pStyle w:val="CaptionedFigure"/>
+      </w:pPr>
+      <w:r>
+        <w:drawing>
+          <wp:inline>
+            <wp:extent cx="6309360" cy="2330578"/>
+            <wp:effectExtent b="0" l="0" r="0" t="0"/>
+            <wp:docPr descr="Figure 9. 5.1 Organization structure" title="" id="34" name="Picture"/>
+            <a:graphic>
+              <a:graphicData uri="http://schemas.openxmlformats.org/drawingml/2006/picture">
+                <pic:pic>
+                  <pic:nvPicPr>
+                    <pic:cNvPr descr="m08.png" id="35" name="Picture"/>
+                    <pic:cNvPicPr>
+                      <a:picLocks noChangeArrowheads="1" noChangeAspect="1"/>
+                    </pic:cNvPicPr>
+                  </pic:nvPicPr>
+                  <pic:blipFill>
+                    <a:blip r:embed="rId33"/>
                     <a:stretch>
                       <a:fillRect/>
                     </a:stretch>
@@ -16467,7 +17833,7 @@
         <w:pStyle w:val="ImageCaption"/>
       </w:pPr>
       <w:r>
-        <w:t xml:space="preserve">Figure 8. 5.1 Organization structure</w:t>
+        <w:t xml:space="preserve">Figure 9. 5.1 Organization structure</w:t>
       </w:r>
     </w:p>
     <w:p>
@@ -21366,18 +22732,18 @@
           <wp:inline>
             <wp:extent cx="6309360" cy="6408053"/>
             <wp:effectExtent b="0" l="0" r="0" t="0"/>
-            <wp:docPr descr="Figure 9. 6.1 Approach: building blocks + connection binders" title="" id="34" name="Picture"/>
+            <wp:docPr descr="Figure 10. 6.1 Approach: building blocks + connection binders" title="" id="37" name="Picture"/>
             <a:graphic>
               <a:graphicData uri="http://schemas.openxmlformats.org/drawingml/2006/picture">
                 <pic:pic>
                   <pic:nvPicPr>
-                    <pic:cNvPr descr="m08.png" id="35" name="Picture"/>
+                    <pic:cNvPr descr="m09.png" id="38" name="Picture"/>
                     <pic:cNvPicPr>
                       <a:picLocks noChangeArrowheads="1" noChangeAspect="1"/>
                     </pic:cNvPicPr>
                   </pic:nvPicPr>
                   <pic:blipFill>
-                    <a:blip r:embed="rId33"/>
+                    <a:blip r:embed="rId36"/>
                     <a:stretch>
                       <a:fillRect/>
                     </a:stretch>
@@ -21409,7 +22775,7 @@
         <w:pStyle w:val="ImageCaption"/>
       </w:pPr>
       <w:r>
-        <w:t xml:space="preserve">Figure 9. 6.1 Approach: building blocks + connection binders</w:t>
+        <w:t xml:space="preserve">Figure 10. 6.1 Approach: building blocks + connection binders</w:t>
       </w:r>
     </w:p>
     <w:p>
@@ -22177,18 +23543,18 @@
           <wp:inline>
             <wp:extent cx="6309360" cy="3195561"/>
             <wp:effectExtent b="0" l="0" r="0" t="0"/>
-            <wp:docPr descr="Figure 10. 6.3 S3 → Lambda wiring (and the circular dependency trap)" title="" id="37" name="Picture"/>
+            <wp:docPr descr="Figure 11. 6.3 S3 → Lambda wiring (and the circular dependency trap)" title="" id="40" name="Picture"/>
             <a:graphic>
               <a:graphicData uri="http://schemas.openxmlformats.org/drawingml/2006/picture">
                 <pic:pic>
                   <pic:nvPicPr>
-                    <pic:cNvPr descr="m09.png" id="38" name="Picture"/>
+                    <pic:cNvPr descr="m10.png" id="41" name="Picture"/>
                     <pic:cNvPicPr>
                       <a:picLocks noChangeArrowheads="1" noChangeAspect="1"/>
                     </pic:cNvPicPr>
                   </pic:nvPicPr>
                   <pic:blipFill>
-                    <a:blip r:embed="rId36"/>
+                    <a:blip r:embed="rId39"/>
                     <a:stretch>
                       <a:fillRect/>
                     </a:stretch>
@@ -22220,7 +23586,7 @@
         <w:pStyle w:val="ImageCaption"/>
       </w:pPr>
       <w:r>
-        <w:t xml:space="preserve">Figure 10. 6.3 S3 → Lambda wiring (and the circular dependency trap)</w:t>
+        <w:t xml:space="preserve">Figure 11. 6.3 S3 → Lambda wiring (and the circular dependency trap)</w:t>
       </w:r>
     </w:p>
     <w:p>
@@ -23444,18 +24810,18 @@
           <wp:inline>
             <wp:extent cx="6309360" cy="7356662"/>
             <wp:effectExtent b="0" l="0" r="0" t="0"/>
-            <wp:docPr descr="Figure 11. 6.8.1 Two inputs published by AWS" title="" id="40" name="Picture"/>
+            <wp:docPr descr="Figure 12. 6.8.1 Two inputs published by AWS" title="" id="43" name="Picture"/>
             <a:graphic>
               <a:graphicData uri="http://schemas.openxmlformats.org/drawingml/2006/picture">
                 <pic:pic>
                   <pic:nvPicPr>
-                    <pic:cNvPr descr="m10.png" id="41" name="Picture"/>
+                    <pic:cNvPr descr="m11.png" id="44" name="Picture"/>
                     <pic:cNvPicPr>
                       <a:picLocks noChangeArrowheads="1" noChangeAspect="1"/>
                     </pic:cNvPicPr>
                   </pic:nvPicPr>
                   <pic:blipFill>
-                    <a:blip r:embed="rId39"/>
+                    <a:blip r:embed="rId42"/>
                     <a:stretch>
                       <a:fillRect/>
                     </a:stretch>
@@ -23487,7 +24853,7 @@
         <w:pStyle w:val="ImageCaption"/>
       </w:pPr>
       <w:r>
-        <w:t xml:space="preserve">Figure 11. 6.8.1 Two inputs published by AWS</w:t>
+        <w:t xml:space="preserve">Figure 12. 6.8.1 Two inputs published by AWS</w:t>
       </w:r>
     </w:p>
     <w:p>
@@ -27838,18 +29204,18 @@
           <wp:inline>
             <wp:extent cx="6309360" cy="2390217"/>
             <wp:effectExtent b="0" l="0" r="0" t="0"/>
-            <wp:docPr descr="Figure 12. 8.1 Trust model per environment" title="" id="43" name="Picture"/>
+            <wp:docPr descr="Figure 13. 8.1 Trust model per environment" title="" id="46" name="Picture"/>
             <a:graphic>
               <a:graphicData uri="http://schemas.openxmlformats.org/drawingml/2006/picture">
                 <pic:pic>
                   <pic:nvPicPr>
-                    <pic:cNvPr descr="m11.png" id="44" name="Picture"/>
+                    <pic:cNvPr descr="m12.png" id="47" name="Picture"/>
                     <pic:cNvPicPr>
                       <a:picLocks noChangeArrowheads="1" noChangeAspect="1"/>
                     </pic:cNvPicPr>
                   </pic:nvPicPr>
                   <pic:blipFill>
-                    <a:blip r:embed="rId42"/>
+                    <a:blip r:embed="rId45"/>
                     <a:stretch>
                       <a:fillRect/>
                     </a:stretch>
@@ -27881,7 +29247,7 @@
         <w:pStyle w:val="ImageCaption"/>
       </w:pPr>
       <w:r>
-        <w:t xml:space="preserve">Figure 12. 8.1 Trust model per environment</w:t>
+        <w:t xml:space="preserve">Figure 13. 8.1 Trust model per environment</w:t>
       </w:r>
     </w:p>
     <w:p>
@@ -27998,18 +29364,18 @@
           <wp:inline>
             <wp:extent cx="6309360" cy="3656560"/>
             <wp:effectExtent b="0" l="0" r="0" t="0"/>
-            <wp:docPr descr="Figure 13. 8.2 Promotion flow" title="" id="46" name="Picture"/>
+            <wp:docPr descr="Figure 14. 8.2 Promotion flow" title="" id="49" name="Picture"/>
             <a:graphic>
               <a:graphicData uri="http://schemas.openxmlformats.org/drawingml/2006/picture">
                 <pic:pic>
                   <pic:nvPicPr>
-                    <pic:cNvPr descr="m12.png" id="47" name="Picture"/>
+                    <pic:cNvPr descr="m13.png" id="50" name="Picture"/>
                     <pic:cNvPicPr>
                       <a:picLocks noChangeArrowheads="1" noChangeAspect="1"/>
                     </pic:cNvPicPr>
                   </pic:nvPicPr>
                   <pic:blipFill>
-                    <a:blip r:embed="rId45"/>
+                    <a:blip r:embed="rId48"/>
                     <a:stretch>
                       <a:fillRect/>
                     </a:stretch>
@@ -28041,7 +29407,7 @@
         <w:pStyle w:val="ImageCaption"/>
       </w:pPr>
       <w:r>
-        <w:t xml:space="preserve">Figure 13. 8.2 Promotion flow</w:t>
+        <w:t xml:space="preserve">Figure 14. 8.2 Promotion flow</w:t>
       </w:r>
     </w:p>
     <w:p>
@@ -28233,18 +29599,18 @@
           <wp:inline>
             <wp:extent cx="6309360" cy="1955118"/>
             <wp:effectExtent b="0" l="0" r="0" t="0"/>
-            <wp:docPr descr="Figure 14. 8.3 Approval gates: STAGE and PROD require GitHub reviewer approval before deployment" title="" id="49" name="Picture"/>
+            <wp:docPr descr="Figure 15. 8.3 Approval gates: STAGE and PROD require GitHub reviewer approval before deployment" title="" id="52" name="Picture"/>
             <a:graphic>
               <a:graphicData uri="http://schemas.openxmlformats.org/drawingml/2006/picture">
                 <pic:pic>
                   <pic:nvPicPr>
-                    <pic:cNvPr descr="m13.png" id="50" name="Picture"/>
+                    <pic:cNvPr descr="m14.png" id="53" name="Picture"/>
                     <pic:cNvPicPr>
                       <a:picLocks noChangeArrowheads="1" noChangeAspect="1"/>
                     </pic:cNvPicPr>
                   </pic:nvPicPr>
                   <pic:blipFill>
-                    <a:blip r:embed="rId48"/>
+                    <a:blip r:embed="rId51"/>
                     <a:stretch>
                       <a:fillRect/>
                     </a:stretch>
@@ -28276,7 +29642,7 @@
         <w:pStyle w:val="ImageCaption"/>
       </w:pPr>
       <w:r>
-        <w:t xml:space="preserve">Figure 14. 8.3 Approval gates: STAGE and PROD require GitHub reviewer approval before deployment</w:t>
+        <w:t xml:space="preserve">Figure 15. 8.3 Approval gates: STAGE and PROD require GitHub reviewer approval before deployment</w:t>
       </w:r>
     </w:p>
     <w:tbl>
@@ -29989,18 +31355,18 @@
           <wp:inline>
             <wp:extent cx="6309360" cy="2586153"/>
             <wp:effectExtent b="0" l="0" r="0" t="0"/>
-            <wp:docPr descr="Figure 15. 8.4.1 The gate layers" title="" id="52" name="Picture"/>
+            <wp:docPr descr="Figure 16. 8.4.1 The gate layers" title="" id="55" name="Picture"/>
             <a:graphic>
               <a:graphicData uri="http://schemas.openxmlformats.org/drawingml/2006/picture">
                 <pic:pic>
                   <pic:nvPicPr>
-                    <pic:cNvPr descr="m14.png" id="53" name="Picture"/>
+                    <pic:cNvPr descr="m15.png" id="56" name="Picture"/>
                     <pic:cNvPicPr>
                       <a:picLocks noChangeArrowheads="1" noChangeAspect="1"/>
                     </pic:cNvPicPr>
                   </pic:nvPicPr>
                   <pic:blipFill>
-                    <a:blip r:embed="rId51"/>
+                    <a:blip r:embed="rId54"/>
                     <a:stretch>
                       <a:fillRect/>
                     </a:stretch>
@@ -30032,7 +31398,7 @@
         <w:pStyle w:val="ImageCaption"/>
       </w:pPr>
       <w:r>
-        <w:t xml:space="preserve">Figure 15. 8.4.1 The gate layers</w:t>
+        <w:t xml:space="preserve">Figure 16. 8.4.1 The gate layers</w:t>
       </w:r>
     </w:p>
     <w:tbl>
@@ -32104,18 +33470,18 @@
           <wp:inline>
             <wp:extent cx="6309360" cy="5266212"/>
             <wp:effectExtent b="0" l="0" r="0" t="0"/>
-            <wp:docPr descr="Figure 16. 8.5.2 Promotion state machine (per commit, per gated environment)" title="" id="55" name="Picture"/>
+            <wp:docPr descr="Figure 17. 8.5.2 Promotion state machine (per commit, per gated environment)" title="" id="58" name="Picture"/>
             <a:graphic>
               <a:graphicData uri="http://schemas.openxmlformats.org/drawingml/2006/picture">
                 <pic:pic>
                   <pic:nvPicPr>
-                    <pic:cNvPr descr="m15.png" id="56" name="Picture"/>
+                    <pic:cNvPr descr="m16.png" id="59" name="Picture"/>
                     <pic:cNvPicPr>
                       <a:picLocks noChangeArrowheads="1" noChangeAspect="1"/>
                     </pic:cNvPicPr>
                   </pic:nvPicPr>
                   <pic:blipFill>
-                    <a:blip r:embed="rId54"/>
+                    <a:blip r:embed="rId57"/>
                     <a:stretch>
                       <a:fillRect/>
                     </a:stretch>
@@ -32147,7 +33513,7 @@
         <w:pStyle w:val="ImageCaption"/>
       </w:pPr>
       <w:r>
-        <w:t xml:space="preserve">Figure 16. 8.5.2 Promotion state machine (per commit, per gated environment)</w:t>
+        <w:t xml:space="preserve">Figure 17. 8.5.2 Promotion state machine (per commit, per gated environment)</w:t>
       </w:r>
     </w:p>
     <w:p>
@@ -32282,18 +33648,18 @@
           <wp:inline>
             <wp:extent cx="6309360" cy="2895363"/>
             <wp:effectExtent b="0" l="0" r="0" t="0"/>
-            <wp:docPr descr="Figure 17. 8.5.3 How an approval in the UI reaches GitHub (Mode B only)" title="" id="58" name="Picture"/>
+            <wp:docPr descr="Figure 18. 8.5.3 How an approval in the UI reaches GitHub (Mode B only)" title="" id="61" name="Picture"/>
             <a:graphic>
               <a:graphicData uri="http://schemas.openxmlformats.org/drawingml/2006/picture">
                 <pic:pic>
                   <pic:nvPicPr>
-                    <pic:cNvPr descr="m16.png" id="59" name="Picture"/>
+                    <pic:cNvPr descr="m17.png" id="62" name="Picture"/>
                     <pic:cNvPicPr>
                       <a:picLocks noChangeArrowheads="1" noChangeAspect="1"/>
                     </pic:cNvPicPr>
                   </pic:nvPicPr>
                   <pic:blipFill>
-                    <a:blip r:embed="rId57"/>
+                    <a:blip r:embed="rId60"/>
                     <a:stretch>
                       <a:fillRect/>
                     </a:stretch>
@@ -32325,7 +33691,7 @@
         <w:pStyle w:val="ImageCaption"/>
       </w:pPr>
       <w:r>
-        <w:t xml:space="preserve">Figure 17. 8.5.3 How an approval in the UI reaches GitHub (Mode B only)</w:t>
+        <w:t xml:space="preserve">Figure 18. 8.5.3 How an approval in the UI reaches GitHub (Mode B only)</w:t>
       </w:r>
     </w:p>
     <w:p>
@@ -33843,18 +35209,18 @@
           <wp:inline>
             <wp:extent cx="6309360" cy="3222394"/>
             <wp:effectExtent b="0" l="0" r="0" t="0"/>
-            <wp:docPr descr="Figure 18. 9.1 The problem and the recommended model" title="" id="61" name="Picture"/>
+            <wp:docPr descr="Figure 19. 9.1 The problem and the recommended model" title="" id="64" name="Picture"/>
             <a:graphic>
               <a:graphicData uri="http://schemas.openxmlformats.org/drawingml/2006/picture">
                 <pic:pic>
                   <pic:nvPicPr>
-                    <pic:cNvPr descr="m17.png" id="62" name="Picture"/>
+                    <pic:cNvPr descr="m18.png" id="65" name="Picture"/>
                     <pic:cNvPicPr>
                       <a:picLocks noChangeArrowheads="1" noChangeAspect="1"/>
                     </pic:cNvPicPr>
                   </pic:nvPicPr>
                   <pic:blipFill>
-                    <a:blip r:embed="rId60"/>
+                    <a:blip r:embed="rId63"/>
                     <a:stretch>
                       <a:fillRect/>
                     </a:stretch>
@@ -33886,7 +35252,7 @@
         <w:pStyle w:val="ImageCaption"/>
       </w:pPr>
       <w:r>
-        <w:t xml:space="preserve">Figure 18. 9.1 The problem and the recommended model</w:t>
+        <w:t xml:space="preserve">Figure 19. 9.1 The problem and the recommended model</w:t>
       </w:r>
     </w:p>
     <w:p>
@@ -41371,18 +42737,18 @@
           <wp:inline>
             <wp:extent cx="3858767" cy="7866523"/>
             <wp:effectExtent b="0" l="0" r="0" t="0"/>
-            <wp:docPr descr="Figure 19. 10.2 What “deployed but inactive” means" title="" id="64" name="Picture"/>
+            <wp:docPr descr="Figure 20. 10.2 What “deployed but inactive” means" title="" id="67" name="Picture"/>
             <a:graphic>
               <a:graphicData uri="http://schemas.openxmlformats.org/drawingml/2006/picture">
                 <pic:pic>
                   <pic:nvPicPr>
-                    <pic:cNvPr descr="m18.png" id="65" name="Picture"/>
+                    <pic:cNvPr descr="m19.png" id="68" name="Picture"/>
                     <pic:cNvPicPr>
                       <a:picLocks noChangeArrowheads="1" noChangeAspect="1"/>
                     </pic:cNvPicPr>
                   </pic:nvPicPr>
                   <pic:blipFill>
-                    <a:blip r:embed="rId63"/>
+                    <a:blip r:embed="rId66"/>
                     <a:stretch>
                       <a:fillRect/>
                     </a:stretch>
@@ -41414,7 +42780,7 @@
         <w:pStyle w:val="ImageCaption"/>
       </w:pPr>
       <w:r>
-        <w:t xml:space="preserve">Figure 19. 10.2 What</w:t>
+        <w:t xml:space="preserve">Figure 20. 10.2 What</w:t>
       </w:r>
       <w:r>
         <w:t xml:space="preserve"> </w:t>
@@ -43312,18 +44678,18 @@
           <wp:inline>
             <wp:extent cx="2633472" cy="6717261"/>
             <wp:effectExtent b="0" l="0" r="0" t="0"/>
-            <wp:docPr descr="Figure 20. 10.5 Pipeline: deploying to both regions" title="" id="67" name="Picture"/>
+            <wp:docPr descr="Figure 21. 10.5 Pipeline: deploying to both regions" title="" id="70" name="Picture"/>
             <a:graphic>
               <a:graphicData uri="http://schemas.openxmlformats.org/drawingml/2006/picture">
                 <pic:pic>
                   <pic:nvPicPr>
-                    <pic:cNvPr descr="m19.png" id="68" name="Picture"/>
+                    <pic:cNvPr descr="m20.png" id="71" name="Picture"/>
                     <pic:cNvPicPr>
                       <a:picLocks noChangeArrowheads="1" noChangeAspect="1"/>
                     </pic:cNvPicPr>
                   </pic:nvPicPr>
                   <pic:blipFill>
-                    <a:blip r:embed="rId66"/>
+                    <a:blip r:embed="rId69"/>
                     <a:stretch>
                       <a:fillRect/>
                     </a:stretch>
@@ -43355,7 +44721,7 @@
         <w:pStyle w:val="ImageCaption"/>
       </w:pPr>
       <w:r>
-        <w:t xml:space="preserve">Figure 20. 10.5 Pipeline: deploying to both regions</w:t>
+        <w:t xml:space="preserve">Figure 21. 10.5 Pipeline: deploying to both regions</w:t>
       </w:r>
     </w:p>
     <w:p>
@@ -47705,18 +49071,18 @@
           <wp:inline>
             <wp:extent cx="5449824" cy="6631254"/>
             <wp:effectExtent b="0" l="0" r="0" t="0"/>
-            <wp:docPr descr="Figure 21. 11.3 Undo policy" title="" id="70" name="Picture"/>
+            <wp:docPr descr="Figure 22. 11.3 Undo policy" title="" id="73" name="Picture"/>
             <a:graphic>
               <a:graphicData uri="http://schemas.openxmlformats.org/drawingml/2006/picture">
                 <pic:pic>
                   <pic:nvPicPr>
-                    <pic:cNvPr descr="m20.png" id="71" name="Picture"/>
+                    <pic:cNvPr descr="m21.png" id="74" name="Picture"/>
                     <pic:cNvPicPr>
                       <a:picLocks noChangeArrowheads="1" noChangeAspect="1"/>
                     </pic:cNvPicPr>
                   </pic:nvPicPr>
                   <pic:blipFill>
-                    <a:blip r:embed="rId69"/>
+                    <a:blip r:embed="rId72"/>
                     <a:stretch>
                       <a:fillRect/>
                     </a:stretch>
@@ -47748,7 +49114,7 @@
         <w:pStyle w:val="ImageCaption"/>
       </w:pPr>
       <w:r>
-        <w:t xml:space="preserve">Figure 21. 11.3 Undo policy</w:t>
+        <w:t xml:space="preserve">Figure 22. 11.3 Undo policy</w:t>
       </w:r>
     </w:p>
     <w:p>
@@ -48785,8 +50151,8 @@
       </w:tblPr>
       <w:tblGrid>
         <w:gridCol w:w="950"/>
-        <w:gridCol w:w="2406"/>
-        <w:gridCol w:w="6724"/>
+        <w:gridCol w:w="2413"/>
+        <w:gridCol w:w="6717"/>
       </w:tblGrid>
       <w:tr>
         <w:trPr>
@@ -48807,7 +50173,7 @@
         </w:tc>
         <w:tc>
           <w:tcPr>
-            <w:tcW w:type="dxa" w:w="2406"/>
+            <w:tcW w:type="dxa" w:w="2413"/>
           </w:tcPr>
           <w:p>
             <w:pPr>
@@ -48820,7 +50186,7 @@
         </w:tc>
         <w:tc>
           <w:tcPr>
-            <w:tcW w:type="dxa" w:w="6724"/>
+            <w:tcW w:type="dxa" w:w="6717"/>
           </w:tcPr>
           <w:p>
             <w:pPr>
@@ -48848,7 +50214,7 @@
         </w:tc>
         <w:tc>
           <w:tcPr>
-            <w:tcW w:type="dxa" w:w="2406"/>
+            <w:tcW w:type="dxa" w:w="2413"/>
           </w:tcPr>
           <w:p>
             <w:pPr>
@@ -48861,7 +50227,7 @@
         </w:tc>
         <w:tc>
           <w:tcPr>
-            <w:tcW w:type="dxa" w:w="6724"/>
+            <w:tcW w:type="dxa" w:w="6717"/>
           </w:tcPr>
           <w:p>
             <w:pPr>
@@ -48893,7 +50259,7 @@
         </w:tc>
         <w:tc>
           <w:tcPr>
-            <w:tcW w:type="dxa" w:w="2406"/>
+            <w:tcW w:type="dxa" w:w="2413"/>
           </w:tcPr>
           <w:p>
             <w:pPr>
@@ -48906,7 +50272,7 @@
         </w:tc>
         <w:tc>
           <w:tcPr>
-            <w:tcW w:type="dxa" w:w="6724"/>
+            <w:tcW w:type="dxa" w:w="6717"/>
           </w:tcPr>
           <w:p>
             <w:pPr>
@@ -48944,7 +50310,7 @@
         </w:tc>
         <w:tc>
           <w:tcPr>
-            <w:tcW w:type="dxa" w:w="2406"/>
+            <w:tcW w:type="dxa" w:w="2413"/>
           </w:tcPr>
           <w:p>
             <w:pPr>
@@ -48957,7 +50323,7 @@
         </w:tc>
         <w:tc>
           <w:tcPr>
-            <w:tcW w:type="dxa" w:w="6724"/>
+            <w:tcW w:type="dxa" w:w="6717"/>
           </w:tcPr>
           <w:p>
             <w:pPr>
@@ -49003,7 +50369,7 @@
         </w:tc>
         <w:tc>
           <w:tcPr>
-            <w:tcW w:type="dxa" w:w="2406"/>
+            <w:tcW w:type="dxa" w:w="2413"/>
           </w:tcPr>
           <w:p>
             <w:pPr>
@@ -49016,7 +50382,7 @@
         </w:tc>
         <w:tc>
           <w:tcPr>
-            <w:tcW w:type="dxa" w:w="6724"/>
+            <w:tcW w:type="dxa" w:w="6717"/>
           </w:tcPr>
           <w:p>
             <w:pPr>
@@ -49054,7 +50420,7 @@
         </w:tc>
         <w:tc>
           <w:tcPr>
-            <w:tcW w:type="dxa" w:w="2406"/>
+            <w:tcW w:type="dxa" w:w="2413"/>
           </w:tcPr>
           <w:p>
             <w:pPr>
@@ -49067,7 +50433,7 @@
         </w:tc>
         <w:tc>
           <w:tcPr>
-            <w:tcW w:type="dxa" w:w="6724"/>
+            <w:tcW w:type="dxa" w:w="6717"/>
           </w:tcPr>
           <w:p>
             <w:pPr>
@@ -49105,7 +50471,7 @@
         </w:tc>
         <w:tc>
           <w:tcPr>
-            <w:tcW w:type="dxa" w:w="2406"/>
+            <w:tcW w:type="dxa" w:w="2413"/>
           </w:tcPr>
           <w:p>
             <w:pPr>
@@ -49118,7 +50484,7 @@
         </w:tc>
         <w:tc>
           <w:tcPr>
-            <w:tcW w:type="dxa" w:w="6724"/>
+            <w:tcW w:type="dxa" w:w="6717"/>
           </w:tcPr>
           <w:p>
             <w:pPr>
@@ -49153,7 +50519,7 @@
         </w:tc>
         <w:tc>
           <w:tcPr>
-            <w:tcW w:type="dxa" w:w="2406"/>
+            <w:tcW w:type="dxa" w:w="2413"/>
           </w:tcPr>
           <w:p>
             <w:pPr>
@@ -49166,7 +50532,7 @@
         </w:tc>
         <w:tc>
           <w:tcPr>
-            <w:tcW w:type="dxa" w:w="6724"/>
+            <w:tcW w:type="dxa" w:w="6717"/>
           </w:tcPr>
           <w:p>
             <w:pPr>
@@ -49204,7 +50570,7 @@
         </w:tc>
         <w:tc>
           <w:tcPr>
-            <w:tcW w:type="dxa" w:w="2406"/>
+            <w:tcW w:type="dxa" w:w="2413"/>
           </w:tcPr>
           <w:p>
             <w:pPr>
@@ -49217,7 +50583,7 @@
         </w:tc>
         <w:tc>
           <w:tcPr>
-            <w:tcW w:type="dxa" w:w="6724"/>
+            <w:tcW w:type="dxa" w:w="6717"/>
           </w:tcPr>
           <w:p>
             <w:pPr>
@@ -49245,7 +50611,7 @@
         </w:tc>
         <w:tc>
           <w:tcPr>
-            <w:tcW w:type="dxa" w:w="2406"/>
+            <w:tcW w:type="dxa" w:w="2413"/>
           </w:tcPr>
           <w:p>
             <w:pPr>
@@ -49258,7 +50624,7 @@
         </w:tc>
         <w:tc>
           <w:tcPr>
-            <w:tcW w:type="dxa" w:w="6724"/>
+            <w:tcW w:type="dxa" w:w="6717"/>
           </w:tcPr>
           <w:p>
             <w:pPr>
@@ -49296,7 +50662,7 @@
         </w:tc>
         <w:tc>
           <w:tcPr>
-            <w:tcW w:type="dxa" w:w="2406"/>
+            <w:tcW w:type="dxa" w:w="2413"/>
           </w:tcPr>
           <w:p>
             <w:pPr>
@@ -49309,7 +50675,7 @@
         </w:tc>
         <w:tc>
           <w:tcPr>
-            <w:tcW w:type="dxa" w:w="6724"/>
+            <w:tcW w:type="dxa" w:w="6717"/>
           </w:tcPr>
           <w:p>
             <w:pPr>
@@ -49347,7 +50713,7 @@
         </w:tc>
         <w:tc>
           <w:tcPr>
-            <w:tcW w:type="dxa" w:w="2406"/>
+            <w:tcW w:type="dxa" w:w="2413"/>
           </w:tcPr>
           <w:p>
             <w:pPr>
@@ -49360,7 +50726,7 @@
         </w:tc>
         <w:tc>
           <w:tcPr>
-            <w:tcW w:type="dxa" w:w="6724"/>
+            <w:tcW w:type="dxa" w:w="6717"/>
           </w:tcPr>
           <w:p>
             <w:pPr>
@@ -49403,7 +50769,7 @@
         </w:tc>
         <w:tc>
           <w:tcPr>
-            <w:tcW w:type="dxa" w:w="2406"/>
+            <w:tcW w:type="dxa" w:w="2413"/>
           </w:tcPr>
           <w:p>
             <w:pPr>
@@ -49416,7 +50782,7 @@
         </w:tc>
         <w:tc>
           <w:tcPr>
-            <w:tcW w:type="dxa" w:w="6724"/>
+            <w:tcW w:type="dxa" w:w="6717"/>
           </w:tcPr>
           <w:p>
             <w:pPr>
@@ -49444,7 +50810,7 @@
         </w:tc>
         <w:tc>
           <w:tcPr>
-            <w:tcW w:type="dxa" w:w="2406"/>
+            <w:tcW w:type="dxa" w:w="2413"/>
           </w:tcPr>
           <w:p>
             <w:pPr>
@@ -49457,7 +50823,7 @@
         </w:tc>
         <w:tc>
           <w:tcPr>
-            <w:tcW w:type="dxa" w:w="6724"/>
+            <w:tcW w:type="dxa" w:w="6717"/>
           </w:tcPr>
           <w:p>
             <w:pPr>
@@ -49495,7 +50861,7 @@
         </w:tc>
         <w:tc>
           <w:tcPr>
-            <w:tcW w:type="dxa" w:w="2406"/>
+            <w:tcW w:type="dxa" w:w="2413"/>
           </w:tcPr>
           <w:p>
             <w:pPr>
@@ -49508,7 +50874,7 @@
         </w:tc>
         <w:tc>
           <w:tcPr>
-            <w:tcW w:type="dxa" w:w="6724"/>
+            <w:tcW w:type="dxa" w:w="6717"/>
           </w:tcPr>
           <w:p>
             <w:pPr>
@@ -49552,7 +50918,7 @@
         </w:tc>
         <w:tc>
           <w:tcPr>
-            <w:tcW w:type="dxa" w:w="2406"/>
+            <w:tcW w:type="dxa" w:w="2413"/>
           </w:tcPr>
           <w:p>
             <w:pPr>
@@ -49565,7 +50931,7 @@
         </w:tc>
         <w:tc>
           <w:tcPr>
-            <w:tcW w:type="dxa" w:w="6724"/>
+            <w:tcW w:type="dxa" w:w="6717"/>
           </w:tcPr>
           <w:p>
             <w:pPr>
@@ -49593,7 +50959,7 @@
         </w:tc>
         <w:tc>
           <w:tcPr>
-            <w:tcW w:type="dxa" w:w="2406"/>
+            <w:tcW w:type="dxa" w:w="2413"/>
           </w:tcPr>
           <w:p>
             <w:pPr>
@@ -49606,7 +50972,7 @@
         </w:tc>
         <w:tc>
           <w:tcPr>
-            <w:tcW w:type="dxa" w:w="6724"/>
+            <w:tcW w:type="dxa" w:w="6717"/>
           </w:tcPr>
           <w:p>
             <w:pPr>
@@ -49634,7 +51000,7 @@
         </w:tc>
         <w:tc>
           <w:tcPr>
-            <w:tcW w:type="dxa" w:w="2406"/>
+            <w:tcW w:type="dxa" w:w="2413"/>
           </w:tcPr>
           <w:p>
             <w:pPr>
@@ -49647,7 +51013,7 @@
         </w:tc>
         <w:tc>
           <w:tcPr>
-            <w:tcW w:type="dxa" w:w="6724"/>
+            <w:tcW w:type="dxa" w:w="6717"/>
           </w:tcPr>
           <w:p>
             <w:pPr>
@@ -49675,7 +51041,7 @@
         </w:tc>
         <w:tc>
           <w:tcPr>
-            <w:tcW w:type="dxa" w:w="2406"/>
+            <w:tcW w:type="dxa" w:w="2413"/>
           </w:tcPr>
           <w:p>
             <w:pPr>
@@ -49688,7 +51054,7 @@
         </w:tc>
         <w:tc>
           <w:tcPr>
-            <w:tcW w:type="dxa" w:w="6724"/>
+            <w:tcW w:type="dxa" w:w="6717"/>
           </w:tcPr>
           <w:p>
             <w:pPr>
@@ -49726,7 +51092,7 @@
         </w:tc>
         <w:tc>
           <w:tcPr>
-            <w:tcW w:type="dxa" w:w="2406"/>
+            <w:tcW w:type="dxa" w:w="2413"/>
           </w:tcPr>
           <w:p>
             <w:pPr>
@@ -49739,7 +51105,7 @@
         </w:tc>
         <w:tc>
           <w:tcPr>
-            <w:tcW w:type="dxa" w:w="6724"/>
+            <w:tcW w:type="dxa" w:w="6717"/>
           </w:tcPr>
           <w:p>
             <w:pPr>
@@ -49767,7 +51133,7 @@
         </w:tc>
         <w:tc>
           <w:tcPr>
-            <w:tcW w:type="dxa" w:w="2406"/>
+            <w:tcW w:type="dxa" w:w="2413"/>
           </w:tcPr>
           <w:p>
             <w:pPr>
@@ -49780,7 +51146,7 @@
         </w:tc>
         <w:tc>
           <w:tcPr>
-            <w:tcW w:type="dxa" w:w="6724"/>
+            <w:tcW w:type="dxa" w:w="6717"/>
           </w:tcPr>
           <w:p>
             <w:pPr>
@@ -49830,7 +51196,7 @@
         </w:tc>
         <w:tc>
           <w:tcPr>
-            <w:tcW w:type="dxa" w:w="2406"/>
+            <w:tcW w:type="dxa" w:w="2413"/>
           </w:tcPr>
           <w:p>
             <w:pPr>
@@ -49843,7 +51209,7 @@
         </w:tc>
         <w:tc>
           <w:tcPr>
-            <w:tcW w:type="dxa" w:w="6724"/>
+            <w:tcW w:type="dxa" w:w="6717"/>
           </w:tcPr>
           <w:p>
             <w:pPr>
@@ -49871,7 +51237,7 @@
         </w:tc>
         <w:tc>
           <w:tcPr>
-            <w:tcW w:type="dxa" w:w="2406"/>
+            <w:tcW w:type="dxa" w:w="2413"/>
           </w:tcPr>
           <w:p>
             <w:pPr>
@@ -49884,7 +51250,7 @@
         </w:tc>
         <w:tc>
           <w:tcPr>
-            <w:tcW w:type="dxa" w:w="6724"/>
+            <w:tcW w:type="dxa" w:w="6717"/>
           </w:tcPr>
           <w:p>
             <w:pPr>
@@ -49924,7 +51290,7 @@
         </w:tc>
         <w:tc>
           <w:tcPr>
-            <w:tcW w:type="dxa" w:w="2406"/>
+            <w:tcW w:type="dxa" w:w="2413"/>
           </w:tcPr>
           <w:p>
             <w:pPr>
@@ -49937,7 +51303,7 @@
         </w:tc>
         <w:tc>
           <w:tcPr>
-            <w:tcW w:type="dxa" w:w="6724"/>
+            <w:tcW w:type="dxa" w:w="6717"/>
           </w:tcPr>
           <w:p>
             <w:pPr>
@@ -49965,7 +51331,7 @@
         </w:tc>
         <w:tc>
           <w:tcPr>
-            <w:tcW w:type="dxa" w:w="2406"/>
+            <w:tcW w:type="dxa" w:w="2413"/>
           </w:tcPr>
           <w:p>
             <w:pPr>
@@ -49978,7 +51344,7 @@
         </w:tc>
         <w:tc>
           <w:tcPr>
-            <w:tcW w:type="dxa" w:w="6724"/>
+            <w:tcW w:type="dxa" w:w="6717"/>
           </w:tcPr>
           <w:p>
             <w:pPr>
@@ -50006,7 +51372,7 @@
         </w:tc>
         <w:tc>
           <w:tcPr>
-            <w:tcW w:type="dxa" w:w="2406"/>
+            <w:tcW w:type="dxa" w:w="2413"/>
           </w:tcPr>
           <w:p>
             <w:pPr>
@@ -50019,7 +51385,7 @@
         </w:tc>
         <w:tc>
           <w:tcPr>
-            <w:tcW w:type="dxa" w:w="6724"/>
+            <w:tcW w:type="dxa" w:w="6717"/>
           </w:tcPr>
           <w:p>
             <w:pPr>
@@ -50047,7 +51413,7 @@
         </w:tc>
         <w:tc>
           <w:tcPr>
-            <w:tcW w:type="dxa" w:w="2406"/>
+            <w:tcW w:type="dxa" w:w="2413"/>
           </w:tcPr>
           <w:p>
             <w:pPr>
@@ -50060,7 +51426,7 @@
         </w:tc>
         <w:tc>
           <w:tcPr>
-            <w:tcW w:type="dxa" w:w="6724"/>
+            <w:tcW w:type="dxa" w:w="6717"/>
           </w:tcPr>
           <w:p>
             <w:pPr>
@@ -50088,7 +51454,7 @@
         </w:tc>
         <w:tc>
           <w:tcPr>
-            <w:tcW w:type="dxa" w:w="2406"/>
+            <w:tcW w:type="dxa" w:w="2413"/>
           </w:tcPr>
           <w:p>
             <w:pPr>
@@ -50101,7 +51467,7 @@
         </w:tc>
         <w:tc>
           <w:tcPr>
-            <w:tcW w:type="dxa" w:w="6724"/>
+            <w:tcW w:type="dxa" w:w="6717"/>
           </w:tcPr>
           <w:p>
             <w:pPr>
@@ -50129,7 +51495,7 @@
         </w:tc>
         <w:tc>
           <w:tcPr>
-            <w:tcW w:type="dxa" w:w="2406"/>
+            <w:tcW w:type="dxa" w:w="2413"/>
           </w:tcPr>
           <w:p>
             <w:pPr>
@@ -50142,7 +51508,7 @@
         </w:tc>
         <w:tc>
           <w:tcPr>
-            <w:tcW w:type="dxa" w:w="6724"/>
+            <w:tcW w:type="dxa" w:w="6717"/>
           </w:tcPr>
           <w:p>
             <w:pPr>
@@ -50170,7 +51536,7 @@
         </w:tc>
         <w:tc>
           <w:tcPr>
-            <w:tcW w:type="dxa" w:w="2406"/>
+            <w:tcW w:type="dxa" w:w="2413"/>
           </w:tcPr>
           <w:p>
             <w:pPr>
@@ -50183,7 +51549,7 @@
         </w:tc>
         <w:tc>
           <w:tcPr>
-            <w:tcW w:type="dxa" w:w="6724"/>
+            <w:tcW w:type="dxa" w:w="6717"/>
           </w:tcPr>
           <w:p>
             <w:pPr>
@@ -50211,7 +51577,7 @@
         </w:tc>
         <w:tc>
           <w:tcPr>
-            <w:tcW w:type="dxa" w:w="2406"/>
+            <w:tcW w:type="dxa" w:w="2413"/>
           </w:tcPr>
           <w:p>
             <w:pPr>
@@ -50224,7 +51590,7 @@
         </w:tc>
         <w:tc>
           <w:tcPr>
-            <w:tcW w:type="dxa" w:w="6724"/>
+            <w:tcW w:type="dxa" w:w="6717"/>
           </w:tcPr>
           <w:p>
             <w:pPr>
@@ -50262,7 +51628,7 @@
         </w:tc>
         <w:tc>
           <w:tcPr>
-            <w:tcW w:type="dxa" w:w="2406"/>
+            <w:tcW w:type="dxa" w:w="2413"/>
           </w:tcPr>
           <w:p>
             <w:pPr>
@@ -50275,7 +51641,7 @@
         </w:tc>
         <w:tc>
           <w:tcPr>
-            <w:tcW w:type="dxa" w:w="6724"/>
+            <w:tcW w:type="dxa" w:w="6717"/>
           </w:tcPr>
           <w:p>
             <w:pPr>
@@ -50303,7 +51669,7 @@
         </w:tc>
         <w:tc>
           <w:tcPr>
-            <w:tcW w:type="dxa" w:w="2406"/>
+            <w:tcW w:type="dxa" w:w="2413"/>
           </w:tcPr>
           <w:p>
             <w:pPr>
@@ -50316,7 +51682,7 @@
         </w:tc>
         <w:tc>
           <w:tcPr>
-            <w:tcW w:type="dxa" w:w="6724"/>
+            <w:tcW w:type="dxa" w:w="6717"/>
           </w:tcPr>
           <w:p>
             <w:pPr>
@@ -50344,7 +51710,7 @@
         </w:tc>
         <w:tc>
           <w:tcPr>
-            <w:tcW w:type="dxa" w:w="2406"/>
+            <w:tcW w:type="dxa" w:w="2413"/>
           </w:tcPr>
           <w:p>
             <w:pPr>
@@ -50357,7 +51723,7 @@
         </w:tc>
         <w:tc>
           <w:tcPr>
-            <w:tcW w:type="dxa" w:w="6724"/>
+            <w:tcW w:type="dxa" w:w="6717"/>
           </w:tcPr>
           <w:p>
             <w:pPr>
@@ -50385,7 +51751,7 @@
         </w:tc>
         <w:tc>
           <w:tcPr>
-            <w:tcW w:type="dxa" w:w="2406"/>
+            <w:tcW w:type="dxa" w:w="2413"/>
           </w:tcPr>
           <w:p>
             <w:pPr>
@@ -50398,7 +51764,7 @@
         </w:tc>
         <w:tc>
           <w:tcPr>
-            <w:tcW w:type="dxa" w:w="6724"/>
+            <w:tcW w:type="dxa" w:w="6717"/>
           </w:tcPr>
           <w:p>
             <w:pPr>
@@ -50426,7 +51792,7 @@
         </w:tc>
         <w:tc>
           <w:tcPr>
-            <w:tcW w:type="dxa" w:w="2406"/>
+            <w:tcW w:type="dxa" w:w="2413"/>
           </w:tcPr>
           <w:p>
             <w:pPr>
@@ -50439,7 +51805,7 @@
         </w:tc>
         <w:tc>
           <w:tcPr>
-            <w:tcW w:type="dxa" w:w="6724"/>
+            <w:tcW w:type="dxa" w:w="6717"/>
           </w:tcPr>
           <w:p>
             <w:pPr>
@@ -50479,7 +51845,7 @@
         </w:tc>
         <w:tc>
           <w:tcPr>
-            <w:tcW w:type="dxa" w:w="2406"/>
+            <w:tcW w:type="dxa" w:w="2413"/>
           </w:tcPr>
           <w:p>
             <w:pPr>
@@ -50492,7 +51858,7 @@
         </w:tc>
         <w:tc>
           <w:tcPr>
-            <w:tcW w:type="dxa" w:w="6724"/>
+            <w:tcW w:type="dxa" w:w="6717"/>
           </w:tcPr>
           <w:p>
             <w:pPr>
@@ -50520,7 +51886,7 @@
         </w:tc>
         <w:tc>
           <w:tcPr>
-            <w:tcW w:type="dxa" w:w="2406"/>
+            <w:tcW w:type="dxa" w:w="2413"/>
           </w:tcPr>
           <w:p>
             <w:pPr>
@@ -50533,7 +51899,7 @@
         </w:tc>
         <w:tc>
           <w:tcPr>
-            <w:tcW w:type="dxa" w:w="6724"/>
+            <w:tcW w:type="dxa" w:w="6717"/>
           </w:tcPr>
           <w:p>
             <w:pPr>
@@ -50571,6 +51937,59 @@
             </w:r>
             <w:r>
               <w:t xml:space="preserve">scope is allowed at all?</w:t>
+            </w:r>
+          </w:p>
+        </w:tc>
+      </w:tr>
+      <w:tr>
+        <w:tc>
+          <w:tcPr>
+            <w:tcW w:type="dxa" w:w="950"/>
+          </w:tcPr>
+          <w:p>
+            <w:pPr>
+              <w:pStyle w:val="Compact"/>
+            </w:pPr>
+            <w:r>
+              <w:t xml:space="preserve">D38</w:t>
+            </w:r>
+          </w:p>
+        </w:tc>
+        <w:tc>
+          <w:tcPr>
+            <w:tcW w:type="dxa" w:w="2413"/>
+          </w:tcPr>
+          <w:p>
+            <w:pPr>
+              <w:pStyle w:val="Compact"/>
+            </w:pPr>
+            <w:r>
+              <w:t xml:space="preserve">Sharing approval routing</w:t>
+            </w:r>
+          </w:p>
+        </w:tc>
+        <w:tc>
+          <w:tcPr>
+            <w:tcW w:type="dxa" w:w="6717"/>
+          </w:tcPr>
+          <w:p>
+            <w:pPr>
+              <w:pStyle w:val="Compact"/>
+            </w:pPr>
+            <w:r>
+              <w:t xml:space="preserve">Accept the default routing matrix (§4.11.6)? Allow providers to choose</w:t>
+            </w:r>
+            <w:r>
+              <w:t xml:space="preserve"> </w:t>
+            </w:r>
+            <w:r>
+              <w:rPr>
+                <w:rStyle w:val="VerbatimChar"/>
+              </w:rPr>
+              <w:t xml:space="preserve">org:share-approval=auto</w:t>
+            </w:r>
+            <w:r>
+              <w:t xml:space="preserve">, or require approval for every access request? Recertification frequency (default quarterly)?</w:t>
             </w:r>
           </w:p>
         </w:tc>
@@ -51225,7 +52644,7 @@
               <w:pStyle w:val="Compact"/>
             </w:pPr>
             <w:r>
-              <w:t xml:space="preserve">Sharing agreements (registry, UI, approvals), shareable-resource catalog, generators for patterns A–F, consumer contract</w:t>
+              <w:t xml:space="preserve">Sharing approval workflow (share offers, access requests, agreements, renewals, revocations), sharing agreements, shareable-resource catalog, generators for patterns A–F, consumer contract</w:t>
             </w:r>
             <w:r>
               <w:t xml:space="preserve"> </w:t>

</xml_diff>

<commit_message>
Add Appendix A with approval and workflow diagrams
Eleven diagrams covering the approval landscape, STAGE/PROD release in
default mode, release decision flow, high-risk override, sharing routing,
sharing access request, infrastructure change request, configuration change
(four-eyes), DR failover, sharing recertification and application release to
PROD, plus an approval summary table. Exported as PNG/SVG under
docs/diagrams/approvals and included in the Word document.
</commit_message>
<xml_diff>
--- a/docs/CloudInfraAutomation-Architecture.docx
+++ b/docs/CloudInfraAutomation-Architecture.docx
@@ -67,7 +67,7 @@
         <w:t xml:space="preserve"> </w:t>
       </w:r>
       <w:r>
-        <w:t xml:space="preserve">Draft v2.14 for review. No code is written until this design is approved.</w:t>
+        <w:t xml:space="preserve">Draft v2.15 for review. No code is written until this design is approved.</w:t>
       </w:r>
     </w:p>
     <w:p>
@@ -765,6 +765,34 @@
             </w:pPr>
             <w:r>
               <w:t xml:space="preserve">all sharing is granted through a sharing approval workflow (§4.11.6). Covers share offers, access requests, agreements, renewal and revocation, with risk-based routing, optional auto-approval within an approved tag offer, recertification and audit.</w:t>
+            </w:r>
+          </w:p>
+        </w:tc>
+      </w:tr>
+      <w:tr>
+        <w:tc>
+          <w:tcPr>
+            <w:tcW w:type="dxa" w:w="950"/>
+          </w:tcPr>
+          <w:p>
+            <w:pPr>
+              <w:pStyle w:val="Compact"/>
+            </w:pPr>
+            <w:r>
+              <w:t xml:space="preserve">v2.15</w:t>
+            </w:r>
+          </w:p>
+        </w:tc>
+        <w:tc>
+          <w:tcPr>
+            <w:tcW w:type="dxa" w:w="9130"/>
+          </w:tcPr>
+          <w:p>
+            <w:pPr>
+              <w:pStyle w:val="Compact"/>
+            </w:pPr>
+            <w:r>
+              <w:t xml:space="preserve">Appendix A (§19): a complete set of approval and workflow diagrams (landscape, release in default mode, release decision flow, override, sharing routing, access request, infrastructure change request, configuration change, DR failover, recertification, application release) plus an approval summary table.</w:t>
             </w:r>
           </w:p>
         </w:tc>
@@ -52739,6 +52767,1134 @@
       </w:r>
       <w:r>
         <w:t xml:space="preserve">review this document, answer §17, and approve a phase to start. No code will be written until then.</w:t>
+      </w:r>
+    </w:p>
+    <w:p>
+      <w:pPr>
+        <w:pStyle w:val="Heading1"/>
+      </w:pPr>
+      <w:r>
+        <w:t xml:space="preserve">19. Appendix A: Approval and workflow diagrams</w:t>
+      </w:r>
+    </w:p>
+    <w:p>
+      <w:pPr>
+        <w:pStyle w:val="FirstParagraph"/>
+      </w:pPr>
+      <w:r>
+        <w:t xml:space="preserve">This appendix collects every approval flow in the design in one place. Each diagram links back to the section that defines the rules. The same diagrams are available as PNG and SVG files in</w:t>
+      </w:r>
+      <w:r>
+        <w:t xml:space="preserve"> </w:t>
+      </w:r>
+      <w:r>
+        <w:rPr>
+          <w:rStyle w:val="VerbatimChar"/>
+        </w:rPr>
+        <w:t xml:space="preserve">docs/diagrams/approvals/</w:t>
+      </w:r>
+      <w:r>
+        <w:t xml:space="preserve">.</w:t>
+      </w:r>
+    </w:p>
+    <w:p>
+      <w:pPr>
+        <w:pStyle w:val="BodyText"/>
+      </w:pPr>
+      <w:r>
+        <w:rPr>
+          <w:b/>
+          <w:bCs/>
+        </w:rPr>
+        <w:t xml:space="preserve">Approval summary:</w:t>
+      </w:r>
+    </w:p>
+    <w:tbl>
+      <w:tblPr>
+        <w:tblStyle w:val="Table"/>
+        <w:tblW w:type="dxa" w:w="10080"/>
+        <w:tblLayout w:type="fixed"/>
+        <w:tblLook w:firstRow="1" w:lastRow="0" w:firstColumn="0" w:lastColumn="0" w:noHBand="0" w:noVBand="0" w:val="0020"/>
+      </w:tblPr>
+      <w:tblGrid>
+        <w:gridCol w:w="2771"/>
+        <w:gridCol w:w="3552"/>
+        <w:gridCol w:w="2807"/>
+        <w:gridCol w:w="950"/>
+      </w:tblGrid>
+      <w:tr>
+        <w:trPr>
+          <w:tblHeader w:val="on"/>
+        </w:trPr>
+        <w:tc>
+          <w:tcPr>
+            <w:tcW w:type="dxa" w:w="2771"/>
+          </w:tcPr>
+          <w:p>
+            <w:pPr>
+              <w:pStyle w:val="Compact"/>
+            </w:pPr>
+            <w:r>
+              <w:t xml:space="preserve">What needs approval</w:t>
+            </w:r>
+          </w:p>
+        </w:tc>
+        <w:tc>
+          <w:tcPr>
+            <w:tcW w:type="dxa" w:w="3552"/>
+          </w:tcPr>
+          <w:p>
+            <w:pPr>
+              <w:pStyle w:val="Compact"/>
+            </w:pPr>
+            <w:r>
+              <w:t xml:space="preserve">Approvers</w:t>
+            </w:r>
+          </w:p>
+        </w:tc>
+        <w:tc>
+          <w:tcPr>
+            <w:tcW w:type="dxa" w:w="2807"/>
+          </w:tcPr>
+          <w:p>
+            <w:pPr>
+              <w:pStyle w:val="Compact"/>
+            </w:pPr>
+            <w:r>
+              <w:t xml:space="preserve">Enforced by</w:t>
+            </w:r>
+          </w:p>
+        </w:tc>
+        <w:tc>
+          <w:tcPr>
+            <w:tcW w:type="dxa" w:w="950"/>
+          </w:tcPr>
+          <w:p>
+            <w:pPr>
+              <w:pStyle w:val="Compact"/>
+            </w:pPr>
+            <w:r>
+              <w:t xml:space="preserve">Defined in</w:t>
+            </w:r>
+          </w:p>
+        </w:tc>
+      </w:tr>
+      <w:tr>
+        <w:tc>
+          <w:tcPr>
+            <w:tcW w:type="dxa" w:w="2771"/>
+          </w:tcPr>
+          <w:p>
+            <w:pPr>
+              <w:pStyle w:val="Compact"/>
+            </w:pPr>
+            <w:r>
+              <w:t xml:space="preserve">STAGE / PROD release (infrastructure or application)</w:t>
+            </w:r>
+          </w:p>
+        </w:tc>
+        <w:tc>
+          <w:tcPr>
+            <w:tcW w:type="dxa" w:w="3552"/>
+          </w:tcPr>
+          <w:p>
+            <w:pPr>
+              <w:pStyle w:val="Compact"/>
+            </w:pPr>
+            <w:r>
+              <w:t xml:space="preserve">Product reviewers (QA for STAGE; product owner + change management for PROD)</w:t>
+            </w:r>
+          </w:p>
+        </w:tc>
+        <w:tc>
+          <w:tcPr>
+            <w:tcW w:type="dxa" w:w="2807"/>
+          </w:tcPr>
+          <w:p>
+            <w:pPr>
+              <w:pStyle w:val="Compact"/>
+            </w:pPr>
+            <w:r>
+              <w:t xml:space="preserve">Gate service first; release executor applies only the reviewed change</w:t>
+            </w:r>
+          </w:p>
+        </w:tc>
+        <w:tc>
+          <w:tcPr>
+            <w:tcW w:type="dxa" w:w="950"/>
+          </w:tcPr>
+          <w:p>
+            <w:pPr>
+              <w:pStyle w:val="Compact"/>
+            </w:pPr>
+            <w:r>
+              <w:t xml:space="preserve">§8.3, §8.4, §8.5</w:t>
+            </w:r>
+          </w:p>
+        </w:tc>
+      </w:tr>
+      <w:tr>
+        <w:tc>
+          <w:tcPr>
+            <w:tcW w:type="dxa" w:w="2771"/>
+          </w:tcPr>
+          <w:p>
+            <w:pPr>
+              <w:pStyle w:val="Compact"/>
+            </w:pPr>
+            <w:r>
+              <w:t xml:space="preserve">High-risk change override</w:t>
+            </w:r>
+          </w:p>
+        </w:tc>
+        <w:tc>
+          <w:tcPr>
+            <w:tcW w:type="dxa" w:w="3552"/>
+          </w:tcPr>
+          <w:p>
+            <w:pPr>
+              <w:pStyle w:val="Compact"/>
+            </w:pPr>
+            <w:r>
+              <w:t xml:space="preserve">Platform admin (not the requester)</w:t>
+            </w:r>
+          </w:p>
+        </w:tc>
+        <w:tc>
+          <w:tcPr>
+            <w:tcW w:type="dxa" w:w="2807"/>
+          </w:tcPr>
+          <w:p>
+            <w:pPr>
+              <w:pStyle w:val="Compact"/>
+            </w:pPr>
+            <w:r>
+              <w:t xml:space="preserve">Gate service blocks until the override is recorded</w:t>
+            </w:r>
+          </w:p>
+        </w:tc>
+        <w:tc>
+          <w:tcPr>
+            <w:tcW w:type="dxa" w:w="950"/>
+          </w:tcPr>
+          <w:p>
+            <w:pPr>
+              <w:pStyle w:val="Compact"/>
+            </w:pPr>
+            <w:r>
+              <w:t xml:space="preserve">§8.4.2</w:t>
+            </w:r>
+          </w:p>
+        </w:tc>
+      </w:tr>
+      <w:tr>
+        <w:tc>
+          <w:tcPr>
+            <w:tcW w:type="dxa" w:w="2771"/>
+          </w:tcPr>
+          <w:p>
+            <w:pPr>
+              <w:pStyle w:val="Compact"/>
+            </w:pPr>
+            <w:r>
+              <w:t xml:space="preserve">Sharing: offer, access request, agreement, renewal, revocation</w:t>
+            </w:r>
+          </w:p>
+        </w:tc>
+        <w:tc>
+          <w:tcPr>
+            <w:tcW w:type="dxa" w:w="3552"/>
+          </w:tcPr>
+          <w:p>
+            <w:pPr>
+              <w:pStyle w:val="Compact"/>
+            </w:pPr>
+            <w:r>
+              <w:t xml:space="preserve">Provider owner; + security / platform admin by risk; auto-approval only if the provider allows it</w:t>
+            </w:r>
+          </w:p>
+        </w:tc>
+        <w:tc>
+          <w:tcPr>
+            <w:tcW w:type="dxa" w:w="2807"/>
+          </w:tcPr>
+          <w:p>
+            <w:pPr>
+              <w:pStyle w:val="Compact"/>
+            </w:pPr>
+            <w:r>
+              <w:t xml:space="preserve">Sharing workflow, generated PRs, normal gates</w:t>
+            </w:r>
+          </w:p>
+        </w:tc>
+        <w:tc>
+          <w:tcPr>
+            <w:tcW w:type="dxa" w:w="950"/>
+          </w:tcPr>
+          <w:p>
+            <w:pPr>
+              <w:pStyle w:val="Compact"/>
+            </w:pPr>
+            <w:r>
+              <w:t xml:space="preserve">§4.11.6</w:t>
+            </w:r>
+          </w:p>
+        </w:tc>
+      </w:tr>
+      <w:tr>
+        <w:tc>
+          <w:tcPr>
+            <w:tcW w:type="dxa" w:w="2771"/>
+          </w:tcPr>
+          <w:p>
+            <w:pPr>
+              <w:pStyle w:val="Compact"/>
+            </w:pPr>
+            <w:r>
+              <w:t xml:space="preserve">Infrastructure change request (from a product team)</w:t>
+            </w:r>
+          </w:p>
+        </w:tc>
+        <w:tc>
+          <w:tcPr>
+            <w:tcW w:type="dxa" w:w="3552"/>
+          </w:tcPr>
+          <w:p>
+            <w:pPr>
+              <w:pStyle w:val="Compact"/>
+            </w:pPr>
+            <w:r>
+              <w:t xml:space="preserve">Platform team (code review), then release approvals per environment</w:t>
+            </w:r>
+          </w:p>
+        </w:tc>
+        <w:tc>
+          <w:tcPr>
+            <w:tcW w:type="dxa" w:w="2807"/>
+          </w:tcPr>
+          <w:p>
+            <w:pPr>
+              <w:pStyle w:val="Compact"/>
+            </w:pPr>
+            <w:r>
+              <w:t xml:space="preserve">Infra repo PR + gates</w:t>
+            </w:r>
+          </w:p>
+        </w:tc>
+        <w:tc>
+          <w:tcPr>
+            <w:tcW w:type="dxa" w:w="950"/>
+          </w:tcPr>
+          <w:p>
+            <w:pPr>
+              <w:pStyle w:val="Compact"/>
+            </w:pPr>
+            <w:r>
+              <w:t xml:space="preserve">§9.9.6</w:t>
+            </w:r>
+          </w:p>
+        </w:tc>
+      </w:tr>
+      <w:tr>
+        <w:tc>
+          <w:tcPr>
+            <w:tcW w:type="dxa" w:w="2771"/>
+          </w:tcPr>
+          <w:p>
+            <w:pPr>
+              <w:pStyle w:val="Compact"/>
+            </w:pPr>
+            <w:r>
+              <w:t xml:space="preserve">Environment, account binding or region change</w:t>
+            </w:r>
+          </w:p>
+        </w:tc>
+        <w:tc>
+          <w:tcPr>
+            <w:tcW w:type="dxa" w:w="3552"/>
+          </w:tcPr>
+          <w:p>
+            <w:pPr>
+              <w:pStyle w:val="Compact"/>
+            </w:pPr>
+            <w:r>
+              <w:t xml:space="preserve">Platform admin; + second platform admin for prod tier or the SCP region list</w:t>
+            </w:r>
+          </w:p>
+        </w:tc>
+        <w:tc>
+          <w:tcPr>
+            <w:tcW w:type="dxa" w:w="2807"/>
+          </w:tcPr>
+          <w:p>
+            <w:pPr>
+              <w:pStyle w:val="Compact"/>
+            </w:pPr>
+            <w:r>
+              <w:t xml:space="preserve">Configuration service (versioned, audited)</w:t>
+            </w:r>
+          </w:p>
+        </w:tc>
+        <w:tc>
+          <w:tcPr>
+            <w:tcW w:type="dxa" w:w="950"/>
+          </w:tcPr>
+          <w:p>
+            <w:pPr>
+              <w:pStyle w:val="Compact"/>
+            </w:pPr>
+            <w:r>
+              <w:t xml:space="preserve">§5.5.4, §10.9</w:t>
+            </w:r>
+          </w:p>
+        </w:tc>
+      </w:tr>
+      <w:tr>
+        <w:tc>
+          <w:tcPr>
+            <w:tcW w:type="dxa" w:w="2771"/>
+          </w:tcPr>
+          <w:p>
+            <w:pPr>
+              <w:pStyle w:val="Compact"/>
+            </w:pPr>
+            <w:r>
+              <w:t xml:space="preserve">DR failover / failback</w:t>
+            </w:r>
+          </w:p>
+        </w:tc>
+        <w:tc>
+          <w:tcPr>
+            <w:tcW w:type="dxa" w:w="3552"/>
+          </w:tcPr>
+          <w:p>
+            <w:pPr>
+              <w:pStyle w:val="Compact"/>
+            </w:pPr>
+            <w:r>
+              <w:t xml:space="preserve">Incident lead + second approver (break-glass)</w:t>
+            </w:r>
+          </w:p>
+        </w:tc>
+        <w:tc>
+          <w:tcPr>
+            <w:tcW w:type="dxa" w:w="2807"/>
+          </w:tcPr>
+          <w:p>
+            <w:pPr>
+              <w:pStyle w:val="Compact"/>
+            </w:pPr>
+            <w:r>
+              <w:t xml:space="preserve">Release executor runbook</w:t>
+            </w:r>
+          </w:p>
+        </w:tc>
+        <w:tc>
+          <w:tcPr>
+            <w:tcW w:type="dxa" w:w="950"/>
+          </w:tcPr>
+          <w:p>
+            <w:pPr>
+              <w:pStyle w:val="Compact"/>
+            </w:pPr>
+            <w:r>
+              <w:t xml:space="preserve">§10.6</w:t>
+            </w:r>
+          </w:p>
+        </w:tc>
+      </w:tr>
+    </w:tbl>
+    <w:p>
+      <w:pPr>
+        <w:pStyle w:val="Heading2"/>
+      </w:pPr>
+      <w:r>
+        <w:t xml:space="preserve">A.1 Approval landscape</w:t>
+      </w:r>
+    </w:p>
+    <w:p>
+      <w:pPr>
+        <w:pStyle w:val="CaptionedFigure"/>
+      </w:pPr>
+      <w:r>
+        <w:drawing>
+          <wp:inline>
+            <wp:extent cx="6309360" cy="6872695"/>
+            <wp:effectExtent b="0" l="0" r="0" t="0"/>
+            <wp:docPr descr="Figure 23. A.1 Approval landscape" title="" id="76" name="Picture"/>
+            <a:graphic>
+              <a:graphicData uri="http://schemas.openxmlformats.org/drawingml/2006/picture">
+                <pic:pic>
+                  <pic:nvPicPr>
+                    <pic:cNvPr descr="m22.png" id="77" name="Picture"/>
+                    <pic:cNvPicPr>
+                      <a:picLocks noChangeArrowheads="1" noChangeAspect="1"/>
+                    </pic:cNvPicPr>
+                  </pic:nvPicPr>
+                  <pic:blipFill>
+                    <a:blip r:embed="rId75"/>
+                    <a:stretch>
+                      <a:fillRect/>
+                    </a:stretch>
+                  </pic:blipFill>
+                  <pic:spPr bwMode="auto">
+                    <a:xfrm>
+                      <a:off x="0" y="0"/>
+                      <a:ext cx="6309360" cy="6872695"/>
+                    </a:xfrm>
+                    <a:prstGeom prst="rect">
+                      <a:avLst/>
+                    </a:prstGeom>
+                    <a:noFill/>
+                    <a:ln w="9525">
+                      <a:noFill/>
+                      <a:headEnd/>
+                      <a:tailEnd/>
+                    </a:ln>
+                  </pic:spPr>
+                </pic:pic>
+              </a:graphicData>
+            </a:graphic>
+          </wp:inline>
+        </w:drawing>
+      </w:r>
+    </w:p>
+    <w:p>
+      <w:pPr>
+        <w:pStyle w:val="ImageCaption"/>
+      </w:pPr>
+      <w:r>
+        <w:t xml:space="preserve">Figure 23. A.1 Approval landscape</w:t>
+      </w:r>
+    </w:p>
+    <w:p>
+      <w:pPr>
+        <w:pStyle w:val="Heading2"/>
+      </w:pPr>
+      <w:r>
+        <w:t xml:space="preserve">A.2 STAGE / PROD release: default mode (any GitHub plan)</w:t>
+      </w:r>
+    </w:p>
+    <w:p>
+      <w:pPr>
+        <w:pStyle w:val="CaptionedFigure"/>
+      </w:pPr>
+      <w:r>
+        <w:drawing>
+          <wp:inline>
+            <wp:extent cx="6309360" cy="3291223"/>
+            <wp:effectExtent b="0" l="0" r="0" t="0"/>
+            <wp:docPr descr="Figure 24. A.2 STAGE / PROD release: default mode (any GitHub plan)" title="" id="79" name="Picture"/>
+            <a:graphic>
+              <a:graphicData uri="http://schemas.openxmlformats.org/drawingml/2006/picture">
+                <pic:pic>
+                  <pic:nvPicPr>
+                    <pic:cNvPr descr="m23.png" id="80" name="Picture"/>
+                    <pic:cNvPicPr>
+                      <a:picLocks noChangeArrowheads="1" noChangeAspect="1"/>
+                    </pic:cNvPicPr>
+                  </pic:nvPicPr>
+                  <pic:blipFill>
+                    <a:blip r:embed="rId78"/>
+                    <a:stretch>
+                      <a:fillRect/>
+                    </a:stretch>
+                  </pic:blipFill>
+                  <pic:spPr bwMode="auto">
+                    <a:xfrm>
+                      <a:off x="0" y="0"/>
+                      <a:ext cx="6309360" cy="3291223"/>
+                    </a:xfrm>
+                    <a:prstGeom prst="rect">
+                      <a:avLst/>
+                    </a:prstGeom>
+                    <a:noFill/>
+                    <a:ln w="9525">
+                      <a:noFill/>
+                      <a:headEnd/>
+                      <a:tailEnd/>
+                    </a:ln>
+                  </pic:spPr>
+                </pic:pic>
+              </a:graphicData>
+            </a:graphic>
+          </wp:inline>
+        </w:drawing>
+      </w:r>
+    </w:p>
+    <w:p>
+      <w:pPr>
+        <w:pStyle w:val="ImageCaption"/>
+      </w:pPr>
+      <w:r>
+        <w:t xml:space="preserve">Figure 24. A.2 STAGE / PROD release: default mode (any GitHub plan)</w:t>
+      </w:r>
+    </w:p>
+    <w:p>
+      <w:pPr>
+        <w:pStyle w:val="Heading2"/>
+      </w:pPr>
+      <w:r>
+        <w:t xml:space="preserve">A.3 Release decision flow</w:t>
+      </w:r>
+    </w:p>
+    <w:p>
+      <w:pPr>
+        <w:pStyle w:val="CaptionedFigure"/>
+      </w:pPr>
+      <w:r>
+        <w:drawing>
+          <wp:inline>
+            <wp:extent cx="4325112" cy="7860453"/>
+            <wp:effectExtent b="0" l="0" r="0" t="0"/>
+            <wp:docPr descr="Figure 25. A.3 Release decision flow" title="" id="82" name="Picture"/>
+            <a:graphic>
+              <a:graphicData uri="http://schemas.openxmlformats.org/drawingml/2006/picture">
+                <pic:pic>
+                  <pic:nvPicPr>
+                    <pic:cNvPr descr="m24.png" id="83" name="Picture"/>
+                    <pic:cNvPicPr>
+                      <a:picLocks noChangeArrowheads="1" noChangeAspect="1"/>
+                    </pic:cNvPicPr>
+                  </pic:nvPicPr>
+                  <pic:blipFill>
+                    <a:blip r:embed="rId81"/>
+                    <a:stretch>
+                      <a:fillRect/>
+                    </a:stretch>
+                  </pic:blipFill>
+                  <pic:spPr bwMode="auto">
+                    <a:xfrm>
+                      <a:off x="0" y="0"/>
+                      <a:ext cx="4325112" cy="7860453"/>
+                    </a:xfrm>
+                    <a:prstGeom prst="rect">
+                      <a:avLst/>
+                    </a:prstGeom>
+                    <a:noFill/>
+                    <a:ln w="9525">
+                      <a:noFill/>
+                      <a:headEnd/>
+                      <a:tailEnd/>
+                    </a:ln>
+                  </pic:spPr>
+                </pic:pic>
+              </a:graphicData>
+            </a:graphic>
+          </wp:inline>
+        </w:drawing>
+      </w:r>
+    </w:p>
+    <w:p>
+      <w:pPr>
+        <w:pStyle w:val="ImageCaption"/>
+      </w:pPr>
+      <w:r>
+        <w:t xml:space="preserve">Figure 25. A.3 Release decision flow</w:t>
+      </w:r>
+    </w:p>
+    <w:p>
+      <w:pPr>
+        <w:pStyle w:val="Heading2"/>
+      </w:pPr>
+      <w:r>
+        <w:t xml:space="preserve">A.4 High-risk change override</w:t>
+      </w:r>
+    </w:p>
+    <w:p>
+      <w:pPr>
+        <w:pStyle w:val="CaptionedFigure"/>
+      </w:pPr>
+      <w:r>
+        <w:drawing>
+          <wp:inline>
+            <wp:extent cx="6309360" cy="3399542"/>
+            <wp:effectExtent b="0" l="0" r="0" t="0"/>
+            <wp:docPr descr="Figure 26. A.4 High-risk change override" title="" id="85" name="Picture"/>
+            <a:graphic>
+              <a:graphicData uri="http://schemas.openxmlformats.org/drawingml/2006/picture">
+                <pic:pic>
+                  <pic:nvPicPr>
+                    <pic:cNvPr descr="m25.png" id="86" name="Picture"/>
+                    <pic:cNvPicPr>
+                      <a:picLocks noChangeArrowheads="1" noChangeAspect="1"/>
+                    </pic:cNvPicPr>
+                  </pic:nvPicPr>
+                  <pic:blipFill>
+                    <a:blip r:embed="rId84"/>
+                    <a:stretch>
+                      <a:fillRect/>
+                    </a:stretch>
+                  </pic:blipFill>
+                  <pic:spPr bwMode="auto">
+                    <a:xfrm>
+                      <a:off x="0" y="0"/>
+                      <a:ext cx="6309360" cy="3399542"/>
+                    </a:xfrm>
+                    <a:prstGeom prst="rect">
+                      <a:avLst/>
+                    </a:prstGeom>
+                    <a:noFill/>
+                    <a:ln w="9525">
+                      <a:noFill/>
+                      <a:headEnd/>
+                      <a:tailEnd/>
+                    </a:ln>
+                  </pic:spPr>
+                </pic:pic>
+              </a:graphicData>
+            </a:graphic>
+          </wp:inline>
+        </w:drawing>
+      </w:r>
+    </w:p>
+    <w:p>
+      <w:pPr>
+        <w:pStyle w:val="ImageCaption"/>
+      </w:pPr>
+      <w:r>
+        <w:t xml:space="preserve">Figure 26. A.4 High-risk change override</w:t>
+      </w:r>
+    </w:p>
+    <w:p>
+      <w:pPr>
+        <w:pStyle w:val="Heading2"/>
+      </w:pPr>
+      <w:r>
+        <w:t xml:space="preserve">A.5 Sharing approval routing</w:t>
+      </w:r>
+    </w:p>
+    <w:p>
+      <w:pPr>
+        <w:pStyle w:val="CaptionedFigure"/>
+      </w:pPr>
+      <w:r>
+        <w:drawing>
+          <wp:inline>
+            <wp:extent cx="6309360" cy="3433502"/>
+            <wp:effectExtent b="0" l="0" r="0" t="0"/>
+            <wp:docPr descr="Figure 27. A.5 Sharing approval routing" title="" id="88" name="Picture"/>
+            <a:graphic>
+              <a:graphicData uri="http://schemas.openxmlformats.org/drawingml/2006/picture">
+                <pic:pic>
+                  <pic:nvPicPr>
+                    <pic:cNvPr descr="m26.png" id="89" name="Picture"/>
+                    <pic:cNvPicPr>
+                      <a:picLocks noChangeArrowheads="1" noChangeAspect="1"/>
+                    </pic:cNvPicPr>
+                  </pic:nvPicPr>
+                  <pic:blipFill>
+                    <a:blip r:embed="rId87"/>
+                    <a:stretch>
+                      <a:fillRect/>
+                    </a:stretch>
+                  </pic:blipFill>
+                  <pic:spPr bwMode="auto">
+                    <a:xfrm>
+                      <a:off x="0" y="0"/>
+                      <a:ext cx="6309360" cy="3433502"/>
+                    </a:xfrm>
+                    <a:prstGeom prst="rect">
+                      <a:avLst/>
+                    </a:prstGeom>
+                    <a:noFill/>
+                    <a:ln w="9525">
+                      <a:noFill/>
+                      <a:headEnd/>
+                      <a:tailEnd/>
+                    </a:ln>
+                  </pic:spPr>
+                </pic:pic>
+              </a:graphicData>
+            </a:graphic>
+          </wp:inline>
+        </w:drawing>
+      </w:r>
+    </w:p>
+    <w:p>
+      <w:pPr>
+        <w:pStyle w:val="ImageCaption"/>
+      </w:pPr>
+      <w:r>
+        <w:t xml:space="preserve">Figure 27. A.5 Sharing approval routing</w:t>
+      </w:r>
+    </w:p>
+    <w:p>
+      <w:pPr>
+        <w:pStyle w:val="Heading2"/>
+      </w:pPr>
+      <w:r>
+        <w:t xml:space="preserve">A.6 Access request to a shared resource</w:t>
+      </w:r>
+    </w:p>
+    <w:p>
+      <w:pPr>
+        <w:pStyle w:val="CaptionedFigure"/>
+      </w:pPr>
+      <w:r>
+        <w:drawing>
+          <wp:inline>
+            <wp:extent cx="6309360" cy="1910580"/>
+            <wp:effectExtent b="0" l="0" r="0" t="0"/>
+            <wp:docPr descr="Figure 28. A.6 Access request to a shared resource" title="" id="91" name="Picture"/>
+            <a:graphic>
+              <a:graphicData uri="http://schemas.openxmlformats.org/drawingml/2006/picture">
+                <pic:pic>
+                  <pic:nvPicPr>
+                    <pic:cNvPr descr="m27.png" id="92" name="Picture"/>
+                    <pic:cNvPicPr>
+                      <a:picLocks noChangeArrowheads="1" noChangeAspect="1"/>
+                    </pic:cNvPicPr>
+                  </pic:nvPicPr>
+                  <pic:blipFill>
+                    <a:blip r:embed="rId90"/>
+                    <a:stretch>
+                      <a:fillRect/>
+                    </a:stretch>
+                  </pic:blipFill>
+                  <pic:spPr bwMode="auto">
+                    <a:xfrm>
+                      <a:off x="0" y="0"/>
+                      <a:ext cx="6309360" cy="1910580"/>
+                    </a:xfrm>
+                    <a:prstGeom prst="rect">
+                      <a:avLst/>
+                    </a:prstGeom>
+                    <a:noFill/>
+                    <a:ln w="9525">
+                      <a:noFill/>
+                      <a:headEnd/>
+                      <a:tailEnd/>
+                    </a:ln>
+                  </pic:spPr>
+                </pic:pic>
+              </a:graphicData>
+            </a:graphic>
+          </wp:inline>
+        </w:drawing>
+      </w:r>
+    </w:p>
+    <w:p>
+      <w:pPr>
+        <w:pStyle w:val="ImageCaption"/>
+      </w:pPr>
+      <w:r>
+        <w:t xml:space="preserve">Figure 28. A.6 Access request to a shared resource</w:t>
+      </w:r>
+    </w:p>
+    <w:p>
+      <w:pPr>
+        <w:pStyle w:val="Heading2"/>
+      </w:pPr>
+      <w:r>
+        <w:t xml:space="preserve">A.7 Infrastructure change request from a product team</w:t>
+      </w:r>
+    </w:p>
+    <w:p>
+      <w:pPr>
+        <w:pStyle w:val="CaptionedFigure"/>
+      </w:pPr>
+      <w:r>
+        <w:drawing>
+          <wp:inline>
+            <wp:extent cx="6309360" cy="2018029"/>
+            <wp:effectExtent b="0" l="0" r="0" t="0"/>
+            <wp:docPr descr="Figure 29. A.7 Infrastructure change request from a product team" title="" id="94" name="Picture"/>
+            <a:graphic>
+              <a:graphicData uri="http://schemas.openxmlformats.org/drawingml/2006/picture">
+                <pic:pic>
+                  <pic:nvPicPr>
+                    <pic:cNvPr descr="m28.png" id="95" name="Picture"/>
+                    <pic:cNvPicPr>
+                      <a:picLocks noChangeArrowheads="1" noChangeAspect="1"/>
+                    </pic:cNvPicPr>
+                  </pic:nvPicPr>
+                  <pic:blipFill>
+                    <a:blip r:embed="rId93"/>
+                    <a:stretch>
+                      <a:fillRect/>
+                    </a:stretch>
+                  </pic:blipFill>
+                  <pic:spPr bwMode="auto">
+                    <a:xfrm>
+                      <a:off x="0" y="0"/>
+                      <a:ext cx="6309360" cy="2018029"/>
+                    </a:xfrm>
+                    <a:prstGeom prst="rect">
+                      <a:avLst/>
+                    </a:prstGeom>
+                    <a:noFill/>
+                    <a:ln w="9525">
+                      <a:noFill/>
+                      <a:headEnd/>
+                      <a:tailEnd/>
+                    </a:ln>
+                  </pic:spPr>
+                </pic:pic>
+              </a:graphicData>
+            </a:graphic>
+          </wp:inline>
+        </w:drawing>
+      </w:r>
+    </w:p>
+    <w:p>
+      <w:pPr>
+        <w:pStyle w:val="ImageCaption"/>
+      </w:pPr>
+      <w:r>
+        <w:t xml:space="preserve">Figure 29. A.7 Infrastructure change request from a product team</w:t>
+      </w:r>
+    </w:p>
+    <w:p>
+      <w:pPr>
+        <w:pStyle w:val="Heading2"/>
+      </w:pPr>
+      <w:r>
+        <w:t xml:space="preserve">A.8 Environment, account or region configuration change</w:t>
+      </w:r>
+    </w:p>
+    <w:p>
+      <w:pPr>
+        <w:pStyle w:val="CaptionedFigure"/>
+      </w:pPr>
+      <w:r>
+        <w:drawing>
+          <wp:inline>
+            <wp:extent cx="2916936" cy="7865668"/>
+            <wp:effectExtent b="0" l="0" r="0" t="0"/>
+            <wp:docPr descr="Figure 30. A.8 Environment, account or region configuration change" title="" id="97" name="Picture"/>
+            <a:graphic>
+              <a:graphicData uri="http://schemas.openxmlformats.org/drawingml/2006/picture">
+                <pic:pic>
+                  <pic:nvPicPr>
+                    <pic:cNvPr descr="m29.png" id="98" name="Picture"/>
+                    <pic:cNvPicPr>
+                      <a:picLocks noChangeArrowheads="1" noChangeAspect="1"/>
+                    </pic:cNvPicPr>
+                  </pic:nvPicPr>
+                  <pic:blipFill>
+                    <a:blip r:embed="rId96"/>
+                    <a:stretch>
+                      <a:fillRect/>
+                    </a:stretch>
+                  </pic:blipFill>
+                  <pic:spPr bwMode="auto">
+                    <a:xfrm>
+                      <a:off x="0" y="0"/>
+                      <a:ext cx="2916936" cy="7865668"/>
+                    </a:xfrm>
+                    <a:prstGeom prst="rect">
+                      <a:avLst/>
+                    </a:prstGeom>
+                    <a:noFill/>
+                    <a:ln w="9525">
+                      <a:noFill/>
+                      <a:headEnd/>
+                      <a:tailEnd/>
+                    </a:ln>
+                  </pic:spPr>
+                </pic:pic>
+              </a:graphicData>
+            </a:graphic>
+          </wp:inline>
+        </w:drawing>
+      </w:r>
+    </w:p>
+    <w:p>
+      <w:pPr>
+        <w:pStyle w:val="ImageCaption"/>
+      </w:pPr>
+      <w:r>
+        <w:t xml:space="preserve">Figure 30. A.8 Environment, account or region configuration change</w:t>
+      </w:r>
+    </w:p>
+    <w:p>
+      <w:pPr>
+        <w:pStyle w:val="Heading2"/>
+      </w:pPr>
+      <w:r>
+        <w:t xml:space="preserve">A.9 DR failover (break-glass)</w:t>
+      </w:r>
+    </w:p>
+    <w:p>
+      <w:pPr>
+        <w:pStyle w:val="CaptionedFigure"/>
+      </w:pPr>
+      <w:r>
+        <w:drawing>
+          <wp:inline>
+            <wp:extent cx="6309360" cy="2056480"/>
+            <wp:effectExtent b="0" l="0" r="0" t="0"/>
+            <wp:docPr descr="Figure 31. A.9 DR failover (break-glass)" title="" id="100" name="Picture"/>
+            <a:graphic>
+              <a:graphicData uri="http://schemas.openxmlformats.org/drawingml/2006/picture">
+                <pic:pic>
+                  <pic:nvPicPr>
+                    <pic:cNvPr descr="m30.png" id="101" name="Picture"/>
+                    <pic:cNvPicPr>
+                      <a:picLocks noChangeArrowheads="1" noChangeAspect="1"/>
+                    </pic:cNvPicPr>
+                  </pic:nvPicPr>
+                  <pic:blipFill>
+                    <a:blip r:embed="rId99"/>
+                    <a:stretch>
+                      <a:fillRect/>
+                    </a:stretch>
+                  </pic:blipFill>
+                  <pic:spPr bwMode="auto">
+                    <a:xfrm>
+                      <a:off x="0" y="0"/>
+                      <a:ext cx="6309360" cy="2056480"/>
+                    </a:xfrm>
+                    <a:prstGeom prst="rect">
+                      <a:avLst/>
+                    </a:prstGeom>
+                    <a:noFill/>
+                    <a:ln w="9525">
+                      <a:noFill/>
+                      <a:headEnd/>
+                      <a:tailEnd/>
+                    </a:ln>
+                  </pic:spPr>
+                </pic:pic>
+              </a:graphicData>
+            </a:graphic>
+          </wp:inline>
+        </w:drawing>
+      </w:r>
+    </w:p>
+    <w:p>
+      <w:pPr>
+        <w:pStyle w:val="ImageCaption"/>
+      </w:pPr>
+      <w:r>
+        <w:t xml:space="preserve">Figure 31. A.9 DR failover (break-glass)</w:t>
+      </w:r>
+    </w:p>
+    <w:p>
+      <w:pPr>
+        <w:pStyle w:val="Heading2"/>
+      </w:pPr>
+      <w:r>
+        <w:t xml:space="preserve">A.10 Sharing recertification and expiry</w:t>
+      </w:r>
+    </w:p>
+    <w:p>
+      <w:pPr>
+        <w:pStyle w:val="CaptionedFigure"/>
+      </w:pPr>
+      <w:r>
+        <w:drawing>
+          <wp:inline>
+            <wp:extent cx="6309360" cy="3253351"/>
+            <wp:effectExtent b="0" l="0" r="0" t="0"/>
+            <wp:docPr descr="Figure 32. A.10 Sharing recertification and expiry" title="" id="103" name="Picture"/>
+            <a:graphic>
+              <a:graphicData uri="http://schemas.openxmlformats.org/drawingml/2006/picture">
+                <pic:pic>
+                  <pic:nvPicPr>
+                    <pic:cNvPr descr="m31.png" id="104" name="Picture"/>
+                    <pic:cNvPicPr>
+                      <a:picLocks noChangeArrowheads="1" noChangeAspect="1"/>
+                    </pic:cNvPicPr>
+                  </pic:nvPicPr>
+                  <pic:blipFill>
+                    <a:blip r:embed="rId102"/>
+                    <a:stretch>
+                      <a:fillRect/>
+                    </a:stretch>
+                  </pic:blipFill>
+                  <pic:spPr bwMode="auto">
+                    <a:xfrm>
+                      <a:off x="0" y="0"/>
+                      <a:ext cx="6309360" cy="3253351"/>
+                    </a:xfrm>
+                    <a:prstGeom prst="rect">
+                      <a:avLst/>
+                    </a:prstGeom>
+                    <a:noFill/>
+                    <a:ln w="9525">
+                      <a:noFill/>
+                      <a:headEnd/>
+                      <a:tailEnd/>
+                    </a:ln>
+                  </pic:spPr>
+                </pic:pic>
+              </a:graphicData>
+            </a:graphic>
+          </wp:inline>
+        </w:drawing>
+      </w:r>
+    </w:p>
+    <w:p>
+      <w:pPr>
+        <w:pStyle w:val="ImageCaption"/>
+      </w:pPr>
+      <w:r>
+        <w:t xml:space="preserve">Figure 32. A.10 Sharing recertification and expiry</w:t>
+      </w:r>
+    </w:p>
+    <w:p>
+      <w:pPr>
+        <w:pStyle w:val="Heading2"/>
+      </w:pPr>
+      <w:r>
+        <w:t xml:space="preserve">A.11 Application release to PROD (default mode)</w:t>
+      </w:r>
+    </w:p>
+    <w:p>
+      <w:pPr>
+        <w:pStyle w:val="CaptionedFigure"/>
+      </w:pPr>
+      <w:r>
+        <w:drawing>
+          <wp:inline>
+            <wp:extent cx="6309360" cy="2398146"/>
+            <wp:effectExtent b="0" l="0" r="0" t="0"/>
+            <wp:docPr descr="Figure 33. A.11 Application release to PROD (default mode)" title="" id="106" name="Picture"/>
+            <a:graphic>
+              <a:graphicData uri="http://schemas.openxmlformats.org/drawingml/2006/picture">
+                <pic:pic>
+                  <pic:nvPicPr>
+                    <pic:cNvPr descr="m32.png" id="107" name="Picture"/>
+                    <pic:cNvPicPr>
+                      <a:picLocks noChangeArrowheads="1" noChangeAspect="1"/>
+                    </pic:cNvPicPr>
+                  </pic:nvPicPr>
+                  <pic:blipFill>
+                    <a:blip r:embed="rId105"/>
+                    <a:stretch>
+                      <a:fillRect/>
+                    </a:stretch>
+                  </pic:blipFill>
+                  <pic:spPr bwMode="auto">
+                    <a:xfrm>
+                      <a:off x="0" y="0"/>
+                      <a:ext cx="6309360" cy="2398146"/>
+                    </a:xfrm>
+                    <a:prstGeom prst="rect">
+                      <a:avLst/>
+                    </a:prstGeom>
+                    <a:noFill/>
+                    <a:ln w="9525">
+                      <a:noFill/>
+                      <a:headEnd/>
+                      <a:tailEnd/>
+                    </a:ln>
+                  </pic:spPr>
+                </pic:pic>
+              </a:graphicData>
+            </a:graphic>
+          </wp:inline>
+        </w:drawing>
+      </w:r>
+    </w:p>
+    <w:p>
+      <w:pPr>
+        <w:pStyle w:val="ImageCaption"/>
+      </w:pPr>
+      <w:r>
+        <w:t xml:space="preserve">Figure 33. A.11 Application release to PROD (default mode)</w:t>
       </w:r>
     </w:p>
     <w:sectPr>

</xml_diff>